<commit_message>
Sorteia campos por exemplo no treino e mede entidade_rate no eval
O SFT de 1 epoca piorou tudo (compile 0,16, runs 0,0), entao a troca de
entidade (class Membro no pedido de comentario) nao vem de excesso de treino.
Hipotese: campo preso a entidade. O split de teste fica identico (sha256
44be4950...). Linha de base do adapter atual: entidade_rate 0,5.
</commit_message>
<xml_diff>
--- a/docs/treino_cased.docx
+++ b/docs/treino_cased.docx
@@ -15,7 +15,7 @@
         <w:spacing w:after="120"/>
       </w:pPr>
       <w:r>
-        <w:t xml:space="preserve">Atualizado em 2026-10-01.</w:t>
+        <w:t xml:space="preserve">Atualizado em 2026-10-02.</w:t>
       </w:r>
     </w:p>
     <w:p>
@@ -950,7 +950,7 @@
       <w:r>
         <w:t xml:space="preserve">O ponto de partida é o </w:t>
       </w:r>
-      <w:hyperlink w:history="1" r:id="rIdhcfbz25a2fgbsxunrd3hk">
+      <w:hyperlink w:history="1" r:id="rIdp2zdymkczeo0222mjzk35">
         <w:r>
           <w:rPr>
             <w:rStyle w:val="Hyperlink"/>
@@ -1538,7 +1538,7 @@
             </w:tcMar>
           </w:tcPr>
           <w:p>
-            <w:hyperlink w:history="1" r:id="rIdrcogq8gvxevik5ihgnyyr">
+            <w:hyperlink w:history="1" r:id="rIdetn4g3xym8wsg_r0adycd">
               <w:r>
                 <w:rPr>
                   <w:rStyle w:val="Hyperlink"/>
@@ -1716,7 +1716,7 @@
             </w:tcMar>
           </w:tcPr>
           <w:p>
-            <w:hyperlink w:history="1" r:id="rIdhcqmdxsxys9tualdv9zrm">
+            <w:hyperlink w:history="1" r:id="rIdaywxoe-j_sxab1ggo10si">
               <w:r>
                 <w:rPr>
                   <w:rStyle w:val="Hyperlink"/>
@@ -1836,7 +1836,7 @@
             </w:tcMar>
           </w:tcPr>
           <w:p>
-            <w:hyperlink w:history="1" r:id="rId02ccgsfqvt5qzu_ssb7u3">
+            <w:hyperlink w:history="1" r:id="rIdyyrvmgjizbis0jbiuwd0m">
               <w:r>
                 <w:rPr>
                   <w:rStyle w:val="Hyperlink"/>
@@ -3387,6 +3387,67 @@
           </w:p>
         </w:tc>
       </w:tr>
+      <w:tr>
+        <w:trPr>
+          <w:tblHeader w:val="off"/>
+        </w:trPr>
+        <w:tc>
+          <w:tcPr>
+            <w:tcW w:type="dxa" w:w="4513"/>
+            <w:tcBorders>
+              <w:top w:val="single" w:color="BBBBBB" w:sz="4"/>
+              <w:left w:val="single" w:color="BBBBBB" w:sz="4"/>
+              <w:bottom w:val="single" w:color="BBBBBB" w:sz="4"/>
+              <w:right w:val="single" w:color="BBBBBB" w:sz="4"/>
+            </w:tcBorders>
+            <w:tcMar>
+              <w:top w:type="dxa" w:w="60"/>
+              <w:left w:type="dxa" w:w="100"/>
+              <w:bottom w:type="dxa" w:w="60"/>
+              <w:right w:type="dxa" w:w="100"/>
+            </w:tcMar>
+          </w:tcPr>
+          <w:p>
+            <w:r>
+              <w:rPr>
+                <w:b w:val="false"/>
+                <w:bCs w:val="false"/>
+                <w:sz w:val="18"/>
+                <w:szCs w:val="18"/>
+              </w:rPr>
+              <w:t xml:space="preserve">entidade_rate</w:t>
+            </w:r>
+          </w:p>
+        </w:tc>
+        <w:tc>
+          <w:tcPr>
+            <w:tcW w:type="dxa" w:w="4513"/>
+            <w:tcBorders>
+              <w:top w:val="single" w:color="BBBBBB" w:sz="4"/>
+              <w:left w:val="single" w:color="BBBBBB" w:sz="4"/>
+              <w:bottom w:val="single" w:color="BBBBBB" w:sz="4"/>
+              <w:right w:val="single" w:color="BBBBBB" w:sz="4"/>
+            </w:tcBorders>
+            <w:tcMar>
+              <w:top w:type="dxa" w:w="60"/>
+              <w:left w:type="dxa" w:w="100"/>
+              <w:bottom w:type="dxa" w:w="60"/>
+              <w:right w:type="dxa" w:w="100"/>
+            </w:tcMar>
+          </w:tcPr>
+          <w:p>
+            <w:r>
+              <w:rPr>
+                <w:b w:val="false"/>
+                <w:bCs w:val="false"/>
+                <w:sz w:val="18"/>
+                <w:szCs w:val="18"/>
+              </w:rPr>
+              <w:t xml:space="preserve">a classe do model SQLAlchemy é a entidade pedida</w:t>
+            </w:r>
+          </w:p>
+        </w:tc>
+      </w:tr>
     </w:tbl>
     <w:p/>
     <w:p>
@@ -3489,7 +3550,570 @@
         <w:spacing w:after="120"/>
       </w:pPr>
       <w:r>
-        <w:t xml:space="preserve">A hipótese mais barata é que o SFT decorou demais. A loss terminou em 0,034 depois de 3 épocas, e com um molde rígido o modelo pode estar colando na entidade de treino mais parecida quando aparece uma nova. Os próximos passos:</w:t>
+        <w:t xml:space="preserve">A primeira hipótese foi que o SFT tinha decorado demais, já que a loss terminou em 0,034 depois de 3 épocas. O teste foi refazer só o SFT com 1 época sobre o mesmo CPT, e o resultado piorou em tudo:</w:t>
+      </w:r>
+    </w:p>
+    <w:tbl>
+      <w:tblPr>
+        <w:tblW w:type="dxa" w:w="9024"/>
+        <w:tblBorders>
+          <w:top w:val="single" w:color="auto" w:sz="4"/>
+          <w:left w:val="single" w:color="auto" w:sz="4"/>
+          <w:bottom w:val="single" w:color="auto" w:sz="4"/>
+          <w:right w:val="single" w:color="auto" w:sz="4"/>
+          <w:insideH w:val="single" w:color="auto" w:sz="4"/>
+          <w:insideV w:val="single" w:color="auto" w:sz="4"/>
+        </w:tblBorders>
+      </w:tblPr>
+      <w:tblGrid>
+        <w:gridCol w:w="1504"/>
+        <w:gridCol w:w="1504"/>
+        <w:gridCol w:w="1504"/>
+        <w:gridCol w:w="1504"/>
+        <w:gridCol w:w="1504"/>
+        <w:gridCol w:w="1504"/>
+      </w:tblGrid>
+      <w:tr>
+        <w:trPr>
+          <w:tblHeader/>
+        </w:trPr>
+        <w:tc>
+          <w:tcPr>
+            <w:tcW w:type="dxa" w:w="1504"/>
+            <w:tcBorders>
+              <w:top w:val="single" w:color="BBBBBB" w:sz="4"/>
+              <w:left w:val="single" w:color="BBBBBB" w:sz="4"/>
+              <w:bottom w:val="single" w:color="BBBBBB" w:sz="4"/>
+              <w:right w:val="single" w:color="BBBBBB" w:sz="4"/>
+            </w:tcBorders>
+            <w:shd w:fill="E8EEF4" w:val="clear"/>
+            <w:tcMar>
+              <w:top w:type="dxa" w:w="60"/>
+              <w:left w:type="dxa" w:w="100"/>
+              <w:bottom w:type="dxa" w:w="60"/>
+              <w:right w:type="dxa" w:w="100"/>
+            </w:tcMar>
+          </w:tcPr>
+          <w:p>
+            <w:r>
+              <w:rPr>
+                <w:b/>
+                <w:bCs/>
+                <w:sz w:val="18"/>
+                <w:szCs w:val="18"/>
+              </w:rPr>
+              <w:t xml:space="preserve">SFT sobre o CPT grande</w:t>
+            </w:r>
+          </w:p>
+        </w:tc>
+        <w:tc>
+          <w:tcPr>
+            <w:tcW w:type="dxa" w:w="1504"/>
+            <w:tcBorders>
+              <w:top w:val="single" w:color="BBBBBB" w:sz="4"/>
+              <w:left w:val="single" w:color="BBBBBB" w:sz="4"/>
+              <w:bottom w:val="single" w:color="BBBBBB" w:sz="4"/>
+              <w:right w:val="single" w:color="BBBBBB" w:sz="4"/>
+            </w:tcBorders>
+            <w:shd w:fill="E8EEF4" w:val="clear"/>
+            <w:tcMar>
+              <w:top w:type="dxa" w:w="60"/>
+              <w:left w:type="dxa" w:w="100"/>
+              <w:bottom w:type="dxa" w:w="60"/>
+              <w:right w:type="dxa" w:w="100"/>
+            </w:tcMar>
+          </w:tcPr>
+          <w:p>
+            <w:r>
+              <w:rPr>
+                <w:b/>
+                <w:bCs/>
+                <w:sz w:val="18"/>
+                <w:szCs w:val="18"/>
+              </w:rPr>
+              <w:t xml:space="preserve">case_rate</w:t>
+            </w:r>
+          </w:p>
+        </w:tc>
+        <w:tc>
+          <w:tcPr>
+            <w:tcW w:type="dxa" w:w="1504"/>
+            <w:tcBorders>
+              <w:top w:val="single" w:color="BBBBBB" w:sz="4"/>
+              <w:left w:val="single" w:color="BBBBBB" w:sz="4"/>
+              <w:bottom w:val="single" w:color="BBBBBB" w:sz="4"/>
+              <w:right w:val="single" w:color="BBBBBB" w:sz="4"/>
+            </w:tcBorders>
+            <w:shd w:fill="E8EEF4" w:val="clear"/>
+            <w:tcMar>
+              <w:top w:type="dxa" w:w="60"/>
+              <w:left w:type="dxa" w:w="100"/>
+              <w:bottom w:type="dxa" w:w="60"/>
+              <w:right w:type="dxa" w:w="100"/>
+            </w:tcMar>
+          </w:tcPr>
+          <w:p>
+            <w:r>
+              <w:rPr>
+                <w:b/>
+                <w:bCs/>
+                <w:sz w:val="18"/>
+                <w:szCs w:val="18"/>
+              </w:rPr>
+              <w:t xml:space="preserve">rotas</w:t>
+            </w:r>
+          </w:p>
+        </w:tc>
+        <w:tc>
+          <w:tcPr>
+            <w:tcW w:type="dxa" w:w="1504"/>
+            <w:tcBorders>
+              <w:top w:val="single" w:color="BBBBBB" w:sz="4"/>
+              <w:left w:val="single" w:color="BBBBBB" w:sz="4"/>
+              <w:bottom w:val="single" w:color="BBBBBB" w:sz="4"/>
+              <w:right w:val="single" w:color="BBBBBB" w:sz="4"/>
+            </w:tcBorders>
+            <w:shd w:fill="E8EEF4" w:val="clear"/>
+            <w:tcMar>
+              <w:top w:type="dxa" w:w="60"/>
+              <w:left w:type="dxa" w:w="100"/>
+              <w:bottom w:type="dxa" w:w="60"/>
+              <w:right w:type="dxa" w:w="100"/>
+            </w:tcMar>
+          </w:tcPr>
+          <w:p>
+            <w:r>
+              <w:rPr>
+                <w:b/>
+                <w:bCs/>
+                <w:sz w:val="18"/>
+                <w:szCs w:val="18"/>
+              </w:rPr>
+              <w:t xml:space="preserve">compile_rate</w:t>
+            </w:r>
+          </w:p>
+        </w:tc>
+        <w:tc>
+          <w:tcPr>
+            <w:tcW w:type="dxa" w:w="1504"/>
+            <w:tcBorders>
+              <w:top w:val="single" w:color="BBBBBB" w:sz="4"/>
+              <w:left w:val="single" w:color="BBBBBB" w:sz="4"/>
+              <w:bottom w:val="single" w:color="BBBBBB" w:sz="4"/>
+              <w:right w:val="single" w:color="BBBBBB" w:sz="4"/>
+            </w:tcBorders>
+            <w:shd w:fill="E8EEF4" w:val="clear"/>
+            <w:tcMar>
+              <w:top w:type="dxa" w:w="60"/>
+              <w:left w:type="dxa" w:w="100"/>
+              <w:bottom w:type="dxa" w:w="60"/>
+              <w:right w:type="dxa" w:w="100"/>
+            </w:tcMar>
+          </w:tcPr>
+          <w:p>
+            <w:r>
+              <w:rPr>
+                <w:b/>
+                <w:bCs/>
+                <w:sz w:val="18"/>
+                <w:szCs w:val="18"/>
+              </w:rPr>
+              <w:t xml:space="preserve">runs_rate</w:t>
+            </w:r>
+          </w:p>
+        </w:tc>
+        <w:tc>
+          <w:tcPr>
+            <w:tcW w:type="dxa" w:w="1504"/>
+            <w:tcBorders>
+              <w:top w:val="single" w:color="BBBBBB" w:sz="4"/>
+              <w:left w:val="single" w:color="BBBBBB" w:sz="4"/>
+              <w:bottom w:val="single" w:color="BBBBBB" w:sz="4"/>
+              <w:right w:val="single" w:color="BBBBBB" w:sz="4"/>
+            </w:tcBorders>
+            <w:shd w:fill="E8EEF4" w:val="clear"/>
+            <w:tcMar>
+              <w:top w:type="dxa" w:w="60"/>
+              <w:left w:type="dxa" w:w="100"/>
+              <w:bottom w:type="dxa" w:w="60"/>
+              <w:right w:type="dxa" w:w="100"/>
+            </w:tcMar>
+          </w:tcPr>
+          <w:p>
+            <w:r>
+              <w:rPr>
+                <w:b/>
+                <w:bCs/>
+                <w:sz w:val="18"/>
+                <w:szCs w:val="18"/>
+              </w:rPr>
+              <w:t xml:space="preserve">docstring_rate</w:t>
+            </w:r>
+          </w:p>
+        </w:tc>
+      </w:tr>
+      <w:tr>
+        <w:trPr>
+          <w:tblHeader w:val="off"/>
+        </w:trPr>
+        <w:tc>
+          <w:tcPr>
+            <w:tcW w:type="dxa" w:w="1504"/>
+            <w:tcBorders>
+              <w:top w:val="single" w:color="BBBBBB" w:sz="4"/>
+              <w:left w:val="single" w:color="BBBBBB" w:sz="4"/>
+              <w:bottom w:val="single" w:color="BBBBBB" w:sz="4"/>
+              <w:right w:val="single" w:color="BBBBBB" w:sz="4"/>
+            </w:tcBorders>
+            <w:tcMar>
+              <w:top w:type="dxa" w:w="60"/>
+              <w:left w:type="dxa" w:w="100"/>
+              <w:bottom w:type="dxa" w:w="60"/>
+              <w:right w:type="dxa" w:w="100"/>
+            </w:tcMar>
+          </w:tcPr>
+          <w:p>
+            <w:r>
+              <w:rPr>
+                <w:b w:val="false"/>
+                <w:bCs w:val="false"/>
+                <w:sz w:val="18"/>
+                <w:szCs w:val="18"/>
+              </w:rPr>
+              <w:t xml:space="preserve">3 épocas (loss final 0,034)</w:t>
+            </w:r>
+          </w:p>
+        </w:tc>
+        <w:tc>
+          <w:tcPr>
+            <w:tcW w:type="dxa" w:w="1504"/>
+            <w:tcBorders>
+              <w:top w:val="single" w:color="BBBBBB" w:sz="4"/>
+              <w:left w:val="single" w:color="BBBBBB" w:sz="4"/>
+              <w:bottom w:val="single" w:color="BBBBBB" w:sz="4"/>
+              <w:right w:val="single" w:color="BBBBBB" w:sz="4"/>
+            </w:tcBorders>
+            <w:tcMar>
+              <w:top w:type="dxa" w:w="60"/>
+              <w:left w:type="dxa" w:w="100"/>
+              <w:bottom w:type="dxa" w:w="60"/>
+              <w:right w:type="dxa" w:w="100"/>
+            </w:tcMar>
+          </w:tcPr>
+          <w:p>
+            <w:r>
+              <w:rPr>
+                <w:b w:val="false"/>
+                <w:bCs w:val="false"/>
+                <w:sz w:val="18"/>
+                <w:szCs w:val="18"/>
+              </w:rPr>
+              <w:t xml:space="preserve">1,0</w:t>
+            </w:r>
+          </w:p>
+        </w:tc>
+        <w:tc>
+          <w:tcPr>
+            <w:tcW w:type="dxa" w:w="1504"/>
+            <w:tcBorders>
+              <w:top w:val="single" w:color="BBBBBB" w:sz="4"/>
+              <w:left w:val="single" w:color="BBBBBB" w:sz="4"/>
+              <w:bottom w:val="single" w:color="BBBBBB" w:sz="4"/>
+              <w:right w:val="single" w:color="BBBBBB" w:sz="4"/>
+            </w:tcBorders>
+            <w:tcMar>
+              <w:top w:type="dxa" w:w="60"/>
+              <w:left w:type="dxa" w:w="100"/>
+              <w:bottom w:type="dxa" w:w="60"/>
+              <w:right w:type="dxa" w:w="100"/>
+            </w:tcMar>
+          </w:tcPr>
+          <w:p>
+            <w:r>
+              <w:rPr>
+                <w:b w:val="false"/>
+                <w:bCs w:val="false"/>
+                <w:sz w:val="18"/>
+                <w:szCs w:val="18"/>
+              </w:rPr>
+              <w:t xml:space="preserve">0,875</w:t>
+            </w:r>
+          </w:p>
+        </w:tc>
+        <w:tc>
+          <w:tcPr>
+            <w:tcW w:type="dxa" w:w="1504"/>
+            <w:tcBorders>
+              <w:top w:val="single" w:color="BBBBBB" w:sz="4"/>
+              <w:left w:val="single" w:color="BBBBBB" w:sz="4"/>
+              <w:bottom w:val="single" w:color="BBBBBB" w:sz="4"/>
+              <w:right w:val="single" w:color="BBBBBB" w:sz="4"/>
+            </w:tcBorders>
+            <w:tcMar>
+              <w:top w:type="dxa" w:w="60"/>
+              <w:left w:type="dxa" w:w="100"/>
+              <w:bottom w:type="dxa" w:w="60"/>
+              <w:right w:type="dxa" w:w="100"/>
+            </w:tcMar>
+          </w:tcPr>
+          <w:p>
+            <w:r>
+              <w:rPr>
+                <w:b w:val="false"/>
+                <w:bCs w:val="false"/>
+                <w:sz w:val="18"/>
+                <w:szCs w:val="18"/>
+              </w:rPr>
+              <w:t xml:space="preserve">0,81</w:t>
+            </w:r>
+          </w:p>
+        </w:tc>
+        <w:tc>
+          <w:tcPr>
+            <w:tcW w:type="dxa" w:w="1504"/>
+            <w:tcBorders>
+              <w:top w:val="single" w:color="BBBBBB" w:sz="4"/>
+              <w:left w:val="single" w:color="BBBBBB" w:sz="4"/>
+              <w:bottom w:val="single" w:color="BBBBBB" w:sz="4"/>
+              <w:right w:val="single" w:color="BBBBBB" w:sz="4"/>
+            </w:tcBorders>
+            <w:tcMar>
+              <w:top w:type="dxa" w:w="60"/>
+              <w:left w:type="dxa" w:w="100"/>
+              <w:bottom w:type="dxa" w:w="60"/>
+              <w:right w:type="dxa" w:w="100"/>
+            </w:tcMar>
+          </w:tcPr>
+          <w:p>
+            <w:r>
+              <w:rPr>
+                <w:b w:val="false"/>
+                <w:bCs w:val="false"/>
+                <w:sz w:val="18"/>
+                <w:szCs w:val="18"/>
+              </w:rPr>
+              <w:t xml:space="preserve">0,72</w:t>
+            </w:r>
+          </w:p>
+        </w:tc>
+        <w:tc>
+          <w:tcPr>
+            <w:tcW w:type="dxa" w:w="1504"/>
+            <w:tcBorders>
+              <w:top w:val="single" w:color="BBBBBB" w:sz="4"/>
+              <w:left w:val="single" w:color="BBBBBB" w:sz="4"/>
+              <w:bottom w:val="single" w:color="BBBBBB" w:sz="4"/>
+              <w:right w:val="single" w:color="BBBBBB" w:sz="4"/>
+            </w:tcBorders>
+            <w:tcMar>
+              <w:top w:type="dxa" w:w="60"/>
+              <w:left w:type="dxa" w:w="100"/>
+              <w:bottom w:type="dxa" w:w="60"/>
+              <w:right w:type="dxa" w:w="100"/>
+            </w:tcMar>
+          </w:tcPr>
+          <w:p>
+            <w:r>
+              <w:rPr>
+                <w:b w:val="false"/>
+                <w:bCs w:val="false"/>
+                <w:sz w:val="18"/>
+                <w:szCs w:val="18"/>
+              </w:rPr>
+              <w:t xml:space="preserve">0,81</w:t>
+            </w:r>
+          </w:p>
+        </w:tc>
+      </w:tr>
+      <w:tr>
+        <w:trPr>
+          <w:tblHeader w:val="off"/>
+        </w:trPr>
+        <w:tc>
+          <w:tcPr>
+            <w:tcW w:type="dxa" w:w="1504"/>
+            <w:tcBorders>
+              <w:top w:val="single" w:color="BBBBBB" w:sz="4"/>
+              <w:left w:val="single" w:color="BBBBBB" w:sz="4"/>
+              <w:bottom w:val="single" w:color="BBBBBB" w:sz="4"/>
+              <w:right w:val="single" w:color="BBBBBB" w:sz="4"/>
+            </w:tcBorders>
+            <w:tcMar>
+              <w:top w:type="dxa" w:w="60"/>
+              <w:left w:type="dxa" w:w="100"/>
+              <w:bottom w:type="dxa" w:w="60"/>
+              <w:right w:type="dxa" w:w="100"/>
+            </w:tcMar>
+          </w:tcPr>
+          <w:p>
+            <w:r>
+              <w:rPr>
+                <w:b w:val="false"/>
+                <w:bCs w:val="false"/>
+                <w:sz w:val="18"/>
+                <w:szCs w:val="18"/>
+              </w:rPr>
+              <w:t xml:space="preserve">1 época (loss final 0,074)</w:t>
+            </w:r>
+          </w:p>
+        </w:tc>
+        <w:tc>
+          <w:tcPr>
+            <w:tcW w:type="dxa" w:w="1504"/>
+            <w:tcBorders>
+              <w:top w:val="single" w:color="BBBBBB" w:sz="4"/>
+              <w:left w:val="single" w:color="BBBBBB" w:sz="4"/>
+              <w:bottom w:val="single" w:color="BBBBBB" w:sz="4"/>
+              <w:right w:val="single" w:color="BBBBBB" w:sz="4"/>
+            </w:tcBorders>
+            <w:tcMar>
+              <w:top w:type="dxa" w:w="60"/>
+              <w:left w:type="dxa" w:w="100"/>
+              <w:bottom w:type="dxa" w:w="60"/>
+              <w:right w:type="dxa" w:w="100"/>
+            </w:tcMar>
+          </w:tcPr>
+          <w:p>
+            <w:r>
+              <w:rPr>
+                <w:b w:val="false"/>
+                <w:bCs w:val="false"/>
+                <w:sz w:val="18"/>
+                <w:szCs w:val="18"/>
+              </w:rPr>
+              <w:t xml:space="preserve">0,78</w:t>
+            </w:r>
+          </w:p>
+        </w:tc>
+        <w:tc>
+          <w:tcPr>
+            <w:tcW w:type="dxa" w:w="1504"/>
+            <w:tcBorders>
+              <w:top w:val="single" w:color="BBBBBB" w:sz="4"/>
+              <w:left w:val="single" w:color="BBBBBB" w:sz="4"/>
+              <w:bottom w:val="single" w:color="BBBBBB" w:sz="4"/>
+              <w:right w:val="single" w:color="BBBBBB" w:sz="4"/>
+            </w:tcBorders>
+            <w:tcMar>
+              <w:top w:type="dxa" w:w="60"/>
+              <w:left w:type="dxa" w:w="100"/>
+              <w:bottom w:type="dxa" w:w="60"/>
+              <w:right w:type="dxa" w:w="100"/>
+            </w:tcMar>
+          </w:tcPr>
+          <w:p>
+            <w:r>
+              <w:rPr>
+                <w:b w:val="false"/>
+                <w:bCs w:val="false"/>
+                <w:sz w:val="18"/>
+                <w:szCs w:val="18"/>
+              </w:rPr>
+              <w:t xml:space="preserve">0,78</w:t>
+            </w:r>
+          </w:p>
+        </w:tc>
+        <w:tc>
+          <w:tcPr>
+            <w:tcW w:type="dxa" w:w="1504"/>
+            <w:tcBorders>
+              <w:top w:val="single" w:color="BBBBBB" w:sz="4"/>
+              <w:left w:val="single" w:color="BBBBBB" w:sz="4"/>
+              <w:bottom w:val="single" w:color="BBBBBB" w:sz="4"/>
+              <w:right w:val="single" w:color="BBBBBB" w:sz="4"/>
+            </w:tcBorders>
+            <w:tcMar>
+              <w:top w:type="dxa" w:w="60"/>
+              <w:left w:type="dxa" w:w="100"/>
+              <w:bottom w:type="dxa" w:w="60"/>
+              <w:right w:type="dxa" w:w="100"/>
+            </w:tcMar>
+          </w:tcPr>
+          <w:p>
+            <w:r>
+              <w:rPr>
+                <w:b w:val="false"/>
+                <w:bCs w:val="false"/>
+                <w:sz w:val="18"/>
+                <w:szCs w:val="18"/>
+              </w:rPr>
+              <w:t xml:space="preserve">0,16</w:t>
+            </w:r>
+          </w:p>
+        </w:tc>
+        <w:tc>
+          <w:tcPr>
+            <w:tcW w:type="dxa" w:w="1504"/>
+            <w:tcBorders>
+              <w:top w:val="single" w:color="BBBBBB" w:sz="4"/>
+              <w:left w:val="single" w:color="BBBBBB" w:sz="4"/>
+              <w:bottom w:val="single" w:color="BBBBBB" w:sz="4"/>
+              <w:right w:val="single" w:color="BBBBBB" w:sz="4"/>
+            </w:tcBorders>
+            <w:tcMar>
+              <w:top w:type="dxa" w:w="60"/>
+              <w:left w:type="dxa" w:w="100"/>
+              <w:bottom w:type="dxa" w:w="60"/>
+              <w:right w:type="dxa" w:w="100"/>
+            </w:tcMar>
+          </w:tcPr>
+          <w:p>
+            <w:r>
+              <w:rPr>
+                <w:b w:val="false"/>
+                <w:bCs w:val="false"/>
+                <w:sz w:val="18"/>
+                <w:szCs w:val="18"/>
+              </w:rPr>
+              <w:t xml:space="preserve">0,0</w:t>
+            </w:r>
+          </w:p>
+        </w:tc>
+        <w:tc>
+          <w:tcPr>
+            <w:tcW w:type="dxa" w:w="1504"/>
+            <w:tcBorders>
+              <w:top w:val="single" w:color="BBBBBB" w:sz="4"/>
+              <w:left w:val="single" w:color="BBBBBB" w:sz="4"/>
+              <w:bottom w:val="single" w:color="BBBBBB" w:sz="4"/>
+              <w:right w:val="single" w:color="BBBBBB" w:sz="4"/>
+            </w:tcBorders>
+            <w:tcMar>
+              <w:top w:type="dxa" w:w="60"/>
+              <w:left w:type="dxa" w:w="100"/>
+              <w:bottom w:type="dxa" w:w="60"/>
+              <w:right w:type="dxa" w:w="100"/>
+            </w:tcMar>
+          </w:tcPr>
+          <w:p>
+            <w:r>
+              <w:rPr>
+                <w:b w:val="false"/>
+                <w:bCs w:val="false"/>
+                <w:sz w:val="18"/>
+                <w:szCs w:val="18"/>
+              </w:rPr>
+              <w:t xml:space="preserve">0,125</w:t>
+            </w:r>
+          </w:p>
+        </w:tc>
+      </w:tr>
+    </w:tbl>
+    <w:p/>
+    <w:p>
+      <w:pPr>
+        <w:spacing w:after="120"/>
+      </w:pPr>
+      <w:r>
+        <w:t xml:space="preserve">Com 1 época o modelo nem aprendeu o formato: a sintaxe quebra em quase todo pedido, não só no delete. O adapter de 3 épocas continua sendo o melhor, e a troca de entidade não vem de excesso de treino.</w:t>
+      </w:r>
+    </w:p>
+    <w:p>
+      <w:pPr>
+        <w:spacing w:after="120"/>
+      </w:pPr>
+      <w:r>
+        <w:t xml:space="preserve">A hipótese atual está no dataset. Cada entidade de treino aparecia sempre com o mesmo conjunto de campos, então o modelo pode ter aprendido a reconhecer a entidade pelos campos em vez de copiar o nome da instrução. Diante de uma entidade nova, ele recorre a uma de treino. Isso ainda não foi medido. As mudanças para testar:</w:t>
       </w:r>
     </w:p>
     <w:p>
@@ -3501,7 +4125,16 @@
         </w:numPr>
       </w:pPr>
       <w:r>
-        <w:t xml:space="preserve">Refazer só o SFT com 1 época sobre o mesmo CPT, o que leva cerca de 13 minutos.</w:t>
+        <w:t xml:space="preserve">O gerador agora sorteia o conjunto de campos a cada exemplo de treino. A entidade </w:t>
+      </w:r>
+      <w:r>
+        <w:rPr>
+          <w:rFonts w:ascii="Consolas" w:cs="Consolas" w:eastAsia="Consolas" w:hAnsi="Consolas"/>
+        </w:rPr>
+        <w:t xml:space="preserve">usuario</w:t>
+      </w:r>
+      <w:r>
+        <w:t xml:space="preserve">, por exemplo, aparece com os 14 conjuntos. As entidades de teste mantêm os campos fixos e o split de teste continua byte a byte igual ao medido (mesmo sha256), para que os números sigam comparáveis.</w:t>
       </w:r>
     </w:p>
     <w:p>
@@ -3513,7 +4146,42 @@
         </w:numPr>
       </w:pPr>
       <w:r>
-        <w:t xml:space="preserve">Acrescentar ao eval uma métrica que confere se a classe gerada é a entidade pedida na instrução.</w:t>
+        <w:t xml:space="preserve">O eval ganhou </w:t>
+      </w:r>
+      <w:r>
+        <w:rPr>
+          <w:rFonts w:ascii="Consolas" w:cs="Consolas" w:eastAsia="Consolas" w:hAnsi="Consolas"/>
+        </w:rPr>
+        <w:t xml:space="preserve">entidade_rate</w:t>
+      </w:r>
+      <w:r>
+        <w:t xml:space="preserve">: a classe do model SQLAlchemy precisa ser a da referência. Uma saída com </w:t>
+      </w:r>
+      <w:r>
+        <w:rPr>
+          <w:rFonts w:ascii="Consolas" w:cs="Consolas" w:eastAsia="Consolas" w:hAnsi="Consolas"/>
+        </w:rPr>
+        <w:t xml:space="preserve">class Membro(Base)</w:t>
+      </w:r>
+      <w:r>
+        <w:t xml:space="preserve"> num pedido de comentário agora reprova nessa métrica, mesmo compilando e rodando.</w:t>
+      </w:r>
+    </w:p>
+    <w:p>
+      <w:pPr>
+        <w:spacing w:after="120"/>
+      </w:pPr>
+      <w:r>
+        <w:t xml:space="preserve">O próximo passo é refazer o SFT de 3 épocas com o dataset novo, cerca de 40 minutos, e comparar </w:t>
+      </w:r>
+      <w:r>
+        <w:rPr>
+          <w:rFonts w:ascii="Consolas" w:cs="Consolas" w:eastAsia="Consolas" w:hAnsi="Consolas"/>
+        </w:rPr>
+        <w:t xml:space="preserve">entidade_rate</w:t>
+      </w:r>
+      <w:r>
+        <w:t xml:space="preserve"> com o adapter atual.</w:t>
       </w:r>
     </w:p>
     <w:p>
@@ -4201,7 +4869,7 @@
           <w:numId w:val="2"/>
         </w:numPr>
       </w:pPr>
-      <w:hyperlink w:history="1" r:id="rIdkodi7x5jnjupucduvpdph">
+      <w:hyperlink w:history="1" r:id="rIdiij6wv5a22mfnzfdgyo-a">
         <w:r>
           <w:rPr>
             <w:rStyle w:val="Hyperlink"/>
@@ -4221,7 +4889,7 @@
           <w:numId w:val="2"/>
         </w:numPr>
       </w:pPr>
-      <w:hyperlink w:history="1" r:id="rIdr0zxyxmbrxohquq8tr7q5">
+      <w:hyperlink w:history="1" r:id="rIdzxrw8posex1swtco7-qxs">
         <w:r>
           <w:rPr>
             <w:rStyle w:val="Hyperlink"/>
@@ -4241,7 +4909,7 @@
           <w:numId w:val="2"/>
         </w:numPr>
       </w:pPr>
-      <w:hyperlink w:history="1" r:id="rIdakhzfewo6gzmezdgmzblq">
+      <w:hyperlink w:history="1" r:id="rIdjydqoafrd5w8ifspczsux">
         <w:r>
           <w:rPr>
             <w:rStyle w:val="Hyperlink"/>
@@ -4267,7 +4935,7 @@
           <w:numId w:val="2"/>
         </w:numPr>
       </w:pPr>
-      <w:hyperlink w:history="1" r:id="rIdygs921sgm8itkgjpkkj0g">
+      <w:hyperlink w:history="1" r:id="rIdk3fvuyhtnuoctrj04tfai">
         <w:r>
           <w:rPr>
             <w:rStyle w:val="Hyperlink"/>
@@ -4290,7 +4958,7 @@
       <w:r>
         <w:t xml:space="preserve">Gururangan et al., </w:t>
       </w:r>
-      <w:hyperlink w:history="1" r:id="rIdsh9a8x08vkg2al2-tbbgc">
+      <w:hyperlink w:history="1" r:id="rIdbdrzd5kzocbiqnmcssu5z">
         <w:r>
           <w:rPr>
             <w:rStyle w:val="Hyperlink"/>
@@ -4313,7 +4981,7 @@
       <w:r>
         <w:t xml:space="preserve">Hu et al., </w:t>
       </w:r>
-      <w:hyperlink w:history="1" r:id="rId1mjkm9vbbxpqsyfywje8b">
+      <w:hyperlink w:history="1" r:id="rIdch21w3uhnzoyu99lgnbps">
         <w:r>
           <w:rPr>
             <w:rStyle w:val="Hyperlink"/>
@@ -4336,7 +5004,7 @@
       <w:r>
         <w:t xml:space="preserve">Dettmers et al., </w:t>
       </w:r>
-      <w:hyperlink w:history="1" r:id="rIdpsvhz-_mpkwbgujeis1yc">
+      <w:hyperlink w:history="1" r:id="rIdx6wkyukmvs33-ksaxxhm6">
         <w:r>
           <w:rPr>
             <w:rStyle w:val="Hyperlink"/>
@@ -4359,7 +5027,7 @@
       <w:r>
         <w:t xml:space="preserve">Kudo e Richardson, </w:t>
       </w:r>
-      <w:hyperlink w:history="1" r:id="rId_olyw_zep9p5f-24r3bem">
+      <w:hyperlink w:history="1" r:id="rId9_enjj4x1cnl8mtissiyk">
         <w:r>
           <w:rPr>
             <w:rStyle w:val="Hyperlink"/>

</xml_diff>

<commit_message>
Acrescenta 266 nomes extras de entidade ao SFT
Com campos sorteados o entidade_rate ficou em 0,5: Endereco 16/16 e
Comentario 0/16. Com os extras (6 exemplos cada, treino de 2336 para 3932)
subiu para 0,75, com compile, runs e docstring em 1,0. Os 8 erros saem
Contato. Os nomes vao para scripts/nomes_entidades.py; o split de teste
continua com o mesmo sha256.
</commit_message>
<xml_diff>
--- a/docs/treino_cased.docx
+++ b/docs/treino_cased.docx
@@ -31,12 +31,57 @@
         <w:spacing w:after="120"/>
       </w:pPr>
       <w:r>
-        <w:t xml:space="preserve">Depois de um pré-treino continuado grande e de um ajuste fino com QLoRA, o Manacá-1B escreve uma API FastAPI + SQLAlchemy em português, com a caixa certa e sem nenhum script de conserto depois. Nos 32 pedidos de teste, sobre duas entidades que o modelo nunca viu no treino, 81% das respostas compilam e 72% sobem e passam nas requisições do teste.</w:t>
+        <w:t xml:space="preserve">Depois de um pré-treino continuado grande e de um ajuste fino com QLoRA, o Manacá-1B escreve uma API FastAPI + SQLAlchemy em português, com a caixa certa e sem nenhum script de conserto depois. Nos 32 pedidos de teste, sobre duas entidades que o modelo nunca viu no treino, todas as respostas compilam, sobem e passam nas requisições do teste. O que ainda falta é o nome da classe: com </w:t>
+      </w:r>
+      <w:r>
+        <w:rPr>
+          <w:rFonts w:ascii="Consolas" w:cs="Consolas" w:eastAsia="Consolas" w:hAnsi="Consolas"/>
+        </w:rPr>
+        <w:t xml:space="preserve">endereco</w:t>
+      </w:r>
+      <w:r>
+        <w:t xml:space="preserve"> ele acerta </w:t>
+      </w:r>
+      <w:r>
+        <w:rPr>
+          <w:rFonts w:ascii="Consolas" w:cs="Consolas" w:eastAsia="Consolas" w:hAnsi="Consolas"/>
+        </w:rPr>
+        <w:t xml:space="preserve">Endereco</w:t>
+      </w:r>
+      <w:r>
+        <w:t xml:space="preserve"> em todos os pedidos, com </w:t>
+      </w:r>
+      <w:r>
+        <w:rPr>
+          <w:rFonts w:ascii="Consolas" w:cs="Consolas" w:eastAsia="Consolas" w:hAnsi="Consolas"/>
+        </w:rPr>
+        <w:t xml:space="preserve">comentario</w:t>
+      </w:r>
+      <w:r>
+        <w:t xml:space="preserve"> acerta </w:t>
+      </w:r>
+      <w:r>
+        <w:rPr>
+          <w:rFonts w:ascii="Consolas" w:cs="Consolas" w:eastAsia="Consolas" w:hAnsi="Consolas"/>
+        </w:rPr>
+        <w:t xml:space="preserve">Comentario</w:t>
+      </w:r>
+      <w:r>
+        <w:t xml:space="preserve"> em metade e escreve </w:t>
+      </w:r>
+      <w:r>
+        <w:rPr>
+          <w:rFonts w:ascii="Consolas" w:cs="Consolas" w:eastAsia="Consolas" w:hAnsi="Consolas"/>
+        </w:rPr>
+        <w:t xml:space="preserve">Contato</w:t>
+      </w:r>
+      <w:r>
+        <w:t xml:space="preserve"> na outra metade.</w:t>
       </w:r>
     </w:p>
     <w:tbl>
       <w:tblPr>
-        <w:tblW w:type="dxa" w:w="9024"/>
+        <w:tblW w:type="dxa" w:w="9023"/>
         <w:tblBorders>
           <w:top w:val="single" w:color="auto" w:sz="4"/>
           <w:left w:val="single" w:color="auto" w:sz="4"/>
@@ -47,12 +92,13 @@
         </w:tblBorders>
       </w:tblPr>
       <w:tblGrid>
-        <w:gridCol w:w="1504"/>
-        <w:gridCol w:w="1504"/>
-        <w:gridCol w:w="1504"/>
-        <w:gridCol w:w="1504"/>
-        <w:gridCol w:w="1504"/>
-        <w:gridCol w:w="1504"/>
+        <w:gridCol w:w="1289"/>
+        <w:gridCol w:w="1289"/>
+        <w:gridCol w:w="1289"/>
+        <w:gridCol w:w="1289"/>
+        <w:gridCol w:w="1289"/>
+        <w:gridCol w:w="1289"/>
+        <w:gridCol w:w="1289"/>
       </w:tblGrid>
       <w:tr>
         <w:trPr>
@@ -60,7 +106,7 @@
         </w:trPr>
         <w:tc>
           <w:tcPr>
-            <w:tcW w:type="dxa" w:w="1504"/>
+            <w:tcW w:type="dxa" w:w="1289"/>
             <w:tcBorders>
               <w:top w:val="single" w:color="BBBBBB" w:sz="4"/>
               <w:left w:val="single" w:color="BBBBBB" w:sz="4"/>
@@ -89,7 +135,7 @@
         </w:tc>
         <w:tc>
           <w:tcPr>
-            <w:tcW w:type="dxa" w:w="1504"/>
+            <w:tcW w:type="dxa" w:w="1289"/>
             <w:tcBorders>
               <w:top w:val="single" w:color="BBBBBB" w:sz="4"/>
               <w:left w:val="single" w:color="BBBBBB" w:sz="4"/>
@@ -118,7 +164,7 @@
         </w:tc>
         <w:tc>
           <w:tcPr>
-            <w:tcW w:type="dxa" w:w="1504"/>
+            <w:tcW w:type="dxa" w:w="1289"/>
             <w:tcBorders>
               <w:top w:val="single" w:color="BBBBBB" w:sz="4"/>
               <w:left w:val="single" w:color="BBBBBB" w:sz="4"/>
@@ -147,7 +193,7 @@
         </w:tc>
         <w:tc>
           <w:tcPr>
-            <w:tcW w:type="dxa" w:w="1504"/>
+            <w:tcW w:type="dxa" w:w="1289"/>
             <w:tcBorders>
               <w:top w:val="single" w:color="BBBBBB" w:sz="4"/>
               <w:left w:val="single" w:color="BBBBBB" w:sz="4"/>
@@ -170,13 +216,13 @@
                 <w:sz w:val="18"/>
                 <w:szCs w:val="18"/>
               </w:rPr>
-              <w:t xml:space="preserve">rotas</w:t>
-            </w:r>
-          </w:p>
-        </w:tc>
-        <w:tc>
-          <w:tcPr>
-            <w:tcW w:type="dxa" w:w="1504"/>
+              <w:t xml:space="preserve">entidade_rate</w:t>
+            </w:r>
+          </w:p>
+        </w:tc>
+        <w:tc>
+          <w:tcPr>
+            <w:tcW w:type="dxa" w:w="1289"/>
             <w:tcBorders>
               <w:top w:val="single" w:color="BBBBBB" w:sz="4"/>
               <w:left w:val="single" w:color="BBBBBB" w:sz="4"/>
@@ -199,13 +245,42 @@
                 <w:sz w:val="18"/>
                 <w:szCs w:val="18"/>
               </w:rPr>
+              <w:t xml:space="preserve">rotas</w:t>
+            </w:r>
+          </w:p>
+        </w:tc>
+        <w:tc>
+          <w:tcPr>
+            <w:tcW w:type="dxa" w:w="1289"/>
+            <w:tcBorders>
+              <w:top w:val="single" w:color="BBBBBB" w:sz="4"/>
+              <w:left w:val="single" w:color="BBBBBB" w:sz="4"/>
+              <w:bottom w:val="single" w:color="BBBBBB" w:sz="4"/>
+              <w:right w:val="single" w:color="BBBBBB" w:sz="4"/>
+            </w:tcBorders>
+            <w:shd w:fill="E8EEF4" w:val="clear"/>
+            <w:tcMar>
+              <w:top w:type="dxa" w:w="60"/>
+              <w:left w:type="dxa" w:w="100"/>
+              <w:bottom w:type="dxa" w:w="60"/>
+              <w:right w:type="dxa" w:w="100"/>
+            </w:tcMar>
+          </w:tcPr>
+          <w:p>
+            <w:r>
+              <w:rPr>
+                <w:b/>
+                <w:bCs/>
+                <w:sz w:val="18"/>
+                <w:szCs w:val="18"/>
+              </w:rPr>
               <w:t xml:space="preserve">compile_rate</w:t>
             </w:r>
           </w:p>
         </w:tc>
         <w:tc>
           <w:tcPr>
-            <w:tcW w:type="dxa" w:w="1504"/>
+            <w:tcW w:type="dxa" w:w="1289"/>
             <w:tcBorders>
               <w:top w:val="single" w:color="BBBBBB" w:sz="4"/>
               <w:left w:val="single" w:color="BBBBBB" w:sz="4"/>
@@ -239,7 +314,7 @@
         </w:trPr>
         <w:tc>
           <w:tcPr>
-            <w:tcW w:type="dxa" w:w="1504"/>
+            <w:tcW w:type="dxa" w:w="1289"/>
             <w:tcBorders>
               <w:top w:val="single" w:color="BBBBBB" w:sz="4"/>
               <w:left w:val="single" w:color="BBBBBB" w:sz="4"/>
@@ -267,7 +342,7 @@
         </w:tc>
         <w:tc>
           <w:tcPr>
-            <w:tcW w:type="dxa" w:w="1504"/>
+            <w:tcW w:type="dxa" w:w="1289"/>
             <w:tcBorders>
               <w:top w:val="single" w:color="BBBBBB" w:sz="4"/>
               <w:left w:val="single" w:color="BBBBBB" w:sz="4"/>
@@ -295,7 +370,7 @@
         </w:tc>
         <w:tc>
           <w:tcPr>
-            <w:tcW w:type="dxa" w:w="1504"/>
+            <w:tcW w:type="dxa" w:w="1289"/>
             <w:tcBorders>
               <w:top w:val="single" w:color="BBBBBB" w:sz="4"/>
               <w:left w:val="single" w:color="BBBBBB" w:sz="4"/>
@@ -323,7 +398,35 @@
         </w:tc>
         <w:tc>
           <w:tcPr>
-            <w:tcW w:type="dxa" w:w="1504"/>
+            <w:tcW w:type="dxa" w:w="1289"/>
+            <w:tcBorders>
+              <w:top w:val="single" w:color="BBBBBB" w:sz="4"/>
+              <w:left w:val="single" w:color="BBBBBB" w:sz="4"/>
+              <w:bottom w:val="single" w:color="BBBBBB" w:sz="4"/>
+              <w:right w:val="single" w:color="BBBBBB" w:sz="4"/>
+            </w:tcBorders>
+            <w:tcMar>
+              <w:top w:type="dxa" w:w="60"/>
+              <w:left w:type="dxa" w:w="100"/>
+              <w:bottom w:type="dxa" w:w="60"/>
+              <w:right w:type="dxa" w:w="100"/>
+            </w:tcMar>
+          </w:tcPr>
+          <w:p>
+            <w:r>
+              <w:rPr>
+                <w:b w:val="false"/>
+                <w:bCs w:val="false"/>
+                <w:sz w:val="18"/>
+                <w:szCs w:val="18"/>
+              </w:rPr>
+              <w:t xml:space="preserve">n/d</w:t>
+            </w:r>
+          </w:p>
+        </w:tc>
+        <w:tc>
+          <w:tcPr>
+            <w:tcW w:type="dxa" w:w="1289"/>
             <w:tcBorders>
               <w:top w:val="single" w:color="BBBBBB" w:sz="4"/>
               <w:left w:val="single" w:color="BBBBBB" w:sz="4"/>
@@ -351,7 +454,7 @@
         </w:tc>
         <w:tc>
           <w:tcPr>
-            <w:tcW w:type="dxa" w:w="1504"/>
+            <w:tcW w:type="dxa" w:w="1289"/>
             <w:tcBorders>
               <w:top w:val="single" w:color="BBBBBB" w:sz="4"/>
               <w:left w:val="single" w:color="BBBBBB" w:sz="4"/>
@@ -379,7 +482,7 @@
         </w:tc>
         <w:tc>
           <w:tcPr>
-            <w:tcW w:type="dxa" w:w="1504"/>
+            <w:tcW w:type="dxa" w:w="1289"/>
             <w:tcBorders>
               <w:top w:val="single" w:color="BBBBBB" w:sz="4"/>
               <w:left w:val="single" w:color="BBBBBB" w:sz="4"/>
@@ -412,7 +515,7 @@
         </w:trPr>
         <w:tc>
           <w:tcPr>
-            <w:tcW w:type="dxa" w:w="1504"/>
+            <w:tcW w:type="dxa" w:w="1289"/>
             <w:tcBorders>
               <w:top w:val="single" w:color="BBBBBB" w:sz="4"/>
               <w:left w:val="single" w:color="BBBBBB" w:sz="4"/>
@@ -440,7 +543,7 @@
         </w:tc>
         <w:tc>
           <w:tcPr>
-            <w:tcW w:type="dxa" w:w="1504"/>
+            <w:tcW w:type="dxa" w:w="1289"/>
             <w:tcBorders>
               <w:top w:val="single" w:color="BBBBBB" w:sz="4"/>
               <w:left w:val="single" w:color="BBBBBB" w:sz="4"/>
@@ -468,7 +571,7 @@
         </w:tc>
         <w:tc>
           <w:tcPr>
-            <w:tcW w:type="dxa" w:w="1504"/>
+            <w:tcW w:type="dxa" w:w="1289"/>
             <w:tcBorders>
               <w:top w:val="single" w:color="BBBBBB" w:sz="4"/>
               <w:left w:val="single" w:color="BBBBBB" w:sz="4"/>
@@ -496,7 +599,35 @@
         </w:tc>
         <w:tc>
           <w:tcPr>
-            <w:tcW w:type="dxa" w:w="1504"/>
+            <w:tcW w:type="dxa" w:w="1289"/>
+            <w:tcBorders>
+              <w:top w:val="single" w:color="BBBBBB" w:sz="4"/>
+              <w:left w:val="single" w:color="BBBBBB" w:sz="4"/>
+              <w:bottom w:val="single" w:color="BBBBBB" w:sz="4"/>
+              <w:right w:val="single" w:color="BBBBBB" w:sz="4"/>
+            </w:tcBorders>
+            <w:tcMar>
+              <w:top w:type="dxa" w:w="60"/>
+              <w:left w:type="dxa" w:w="100"/>
+              <w:bottom w:type="dxa" w:w="60"/>
+              <w:right w:type="dxa" w:w="100"/>
+            </w:tcMar>
+          </w:tcPr>
+          <w:p>
+            <w:r>
+              <w:rPr>
+                <w:b w:val="false"/>
+                <w:bCs w:val="false"/>
+                <w:sz w:val="18"/>
+                <w:szCs w:val="18"/>
+              </w:rPr>
+              <w:t xml:space="preserve">n/d</w:t>
+            </w:r>
+          </w:p>
+        </w:tc>
+        <w:tc>
+          <w:tcPr>
+            <w:tcW w:type="dxa" w:w="1289"/>
             <w:tcBorders>
               <w:top w:val="single" w:color="BBBBBB" w:sz="4"/>
               <w:left w:val="single" w:color="BBBBBB" w:sz="4"/>
@@ -524,7 +655,7 @@
         </w:tc>
         <w:tc>
           <w:tcPr>
-            <w:tcW w:type="dxa" w:w="1504"/>
+            <w:tcW w:type="dxa" w:w="1289"/>
             <w:tcBorders>
               <w:top w:val="single" w:color="BBBBBB" w:sz="4"/>
               <w:left w:val="single" w:color="BBBBBB" w:sz="4"/>
@@ -552,7 +683,7 @@
         </w:tc>
         <w:tc>
           <w:tcPr>
-            <w:tcW w:type="dxa" w:w="1504"/>
+            <w:tcW w:type="dxa" w:w="1289"/>
             <w:tcBorders>
               <w:top w:val="single" w:color="BBBBBB" w:sz="4"/>
               <w:left w:val="single" w:color="BBBBBB" w:sz="4"/>
@@ -585,7 +716,7 @@
         </w:trPr>
         <w:tc>
           <w:tcPr>
-            <w:tcW w:type="dxa" w:w="1504"/>
+            <w:tcW w:type="dxa" w:w="1289"/>
             <w:tcBorders>
               <w:top w:val="single" w:color="BBBBBB" w:sz="4"/>
               <w:left w:val="single" w:color="BBBBBB" w:sz="4"/>
@@ -613,7 +744,7 @@
         </w:tc>
         <w:tc>
           <w:tcPr>
-            <w:tcW w:type="dxa" w:w="1504"/>
+            <w:tcW w:type="dxa" w:w="1289"/>
             <w:tcBorders>
               <w:top w:val="single" w:color="BBBBBB" w:sz="4"/>
               <w:left w:val="single" w:color="BBBBBB" w:sz="4"/>
@@ -641,7 +772,7 @@
         </w:tc>
         <w:tc>
           <w:tcPr>
-            <w:tcW w:type="dxa" w:w="1504"/>
+            <w:tcW w:type="dxa" w:w="1289"/>
             <w:tcBorders>
               <w:top w:val="single" w:color="BBBBBB" w:sz="4"/>
               <w:left w:val="single" w:color="BBBBBB" w:sz="4"/>
@@ -669,7 +800,35 @@
         </w:tc>
         <w:tc>
           <w:tcPr>
-            <w:tcW w:type="dxa" w:w="1504"/>
+            <w:tcW w:type="dxa" w:w="1289"/>
+            <w:tcBorders>
+              <w:top w:val="single" w:color="BBBBBB" w:sz="4"/>
+              <w:left w:val="single" w:color="BBBBBB" w:sz="4"/>
+              <w:bottom w:val="single" w:color="BBBBBB" w:sz="4"/>
+              <w:right w:val="single" w:color="BBBBBB" w:sz="4"/>
+            </w:tcBorders>
+            <w:tcMar>
+              <w:top w:type="dxa" w:w="60"/>
+              <w:left w:type="dxa" w:w="100"/>
+              <w:bottom w:type="dxa" w:w="60"/>
+              <w:right w:type="dxa" w:w="100"/>
+            </w:tcMar>
+          </w:tcPr>
+          <w:p>
+            <w:r>
+              <w:rPr>
+                <w:b w:val="false"/>
+                <w:bCs w:val="false"/>
+                <w:sz w:val="18"/>
+                <w:szCs w:val="18"/>
+              </w:rPr>
+              <w:t xml:space="preserve">n/d</w:t>
+            </w:r>
+          </w:p>
+        </w:tc>
+        <w:tc>
+          <w:tcPr>
+            <w:tcW w:type="dxa" w:w="1289"/>
             <w:tcBorders>
               <w:top w:val="single" w:color="BBBBBB" w:sz="4"/>
               <w:left w:val="single" w:color="BBBBBB" w:sz="4"/>
@@ -697,7 +856,7 @@
         </w:tc>
         <w:tc>
           <w:tcPr>
-            <w:tcW w:type="dxa" w:w="1504"/>
+            <w:tcW w:type="dxa" w:w="1289"/>
             <w:tcBorders>
               <w:top w:val="single" w:color="BBBBBB" w:sz="4"/>
               <w:left w:val="single" w:color="BBBBBB" w:sz="4"/>
@@ -725,7 +884,7 @@
         </w:tc>
         <w:tc>
           <w:tcPr>
-            <w:tcW w:type="dxa" w:w="1504"/>
+            <w:tcW w:type="dxa" w:w="1289"/>
             <w:tcBorders>
               <w:top w:val="single" w:color="BBBBBB" w:sz="4"/>
               <w:left w:val="single" w:color="BBBBBB" w:sz="4"/>
@@ -758,7 +917,7 @@
         </w:trPr>
         <w:tc>
           <w:tcPr>
-            <w:tcW w:type="dxa" w:w="1504"/>
+            <w:tcW w:type="dxa" w:w="1289"/>
             <w:tcBorders>
               <w:top w:val="single" w:color="BBBBBB" w:sz="4"/>
               <w:left w:val="single" w:color="BBBBBB" w:sz="4"/>
@@ -786,7 +945,7 @@
         </w:tc>
         <w:tc>
           <w:tcPr>
-            <w:tcW w:type="dxa" w:w="1504"/>
+            <w:tcW w:type="dxa" w:w="1289"/>
             <w:tcBorders>
               <w:top w:val="single" w:color="BBBBBB" w:sz="4"/>
               <w:left w:val="single" w:color="BBBBBB" w:sz="4"/>
@@ -814,7 +973,7 @@
         </w:tc>
         <w:tc>
           <w:tcPr>
-            <w:tcW w:type="dxa" w:w="1504"/>
+            <w:tcW w:type="dxa" w:w="1289"/>
             <w:tcBorders>
               <w:top w:val="single" w:color="BBBBBB" w:sz="4"/>
               <w:left w:val="single" w:color="BBBBBB" w:sz="4"/>
@@ -842,7 +1001,35 @@
         </w:tc>
         <w:tc>
           <w:tcPr>
-            <w:tcW w:type="dxa" w:w="1504"/>
+            <w:tcW w:type="dxa" w:w="1289"/>
+            <w:tcBorders>
+              <w:top w:val="single" w:color="BBBBBB" w:sz="4"/>
+              <w:left w:val="single" w:color="BBBBBB" w:sz="4"/>
+              <w:bottom w:val="single" w:color="BBBBBB" w:sz="4"/>
+              <w:right w:val="single" w:color="BBBBBB" w:sz="4"/>
+            </w:tcBorders>
+            <w:tcMar>
+              <w:top w:type="dxa" w:w="60"/>
+              <w:left w:type="dxa" w:w="100"/>
+              <w:bottom w:type="dxa" w:w="60"/>
+              <w:right w:type="dxa" w:w="100"/>
+            </w:tcMar>
+          </w:tcPr>
+          <w:p>
+            <w:r>
+              <w:rPr>
+                <w:b w:val="false"/>
+                <w:bCs w:val="false"/>
+                <w:sz w:val="18"/>
+                <w:szCs w:val="18"/>
+              </w:rPr>
+              <w:t xml:space="preserve">0,5</w:t>
+            </w:r>
+          </w:p>
+        </w:tc>
+        <w:tc>
+          <w:tcPr>
+            <w:tcW w:type="dxa" w:w="1289"/>
             <w:tcBorders>
               <w:top w:val="single" w:color="BBBBBB" w:sz="4"/>
               <w:left w:val="single" w:color="BBBBBB" w:sz="4"/>
@@ -870,7 +1057,7 @@
         </w:tc>
         <w:tc>
           <w:tcPr>
-            <w:tcW w:type="dxa" w:w="1504"/>
+            <w:tcW w:type="dxa" w:w="1289"/>
             <w:tcBorders>
               <w:top w:val="single" w:color="BBBBBB" w:sz="4"/>
               <w:left w:val="single" w:color="BBBBBB" w:sz="4"/>
@@ -898,7 +1085,7 @@
         </w:tc>
         <w:tc>
           <w:tcPr>
-            <w:tcW w:type="dxa" w:w="1504"/>
+            <w:tcW w:type="dxa" w:w="1289"/>
             <w:tcBorders>
               <w:top w:val="single" w:color="BBBBBB" w:sz="4"/>
               <w:left w:val="single" w:color="BBBBBB" w:sz="4"/>
@@ -921,6 +1108,408 @@
                 <w:szCs w:val="18"/>
               </w:rPr>
               <w:t xml:space="preserve">0,72</w:t>
+            </w:r>
+          </w:p>
+        </w:tc>
+      </w:tr>
+      <w:tr>
+        <w:trPr>
+          <w:tblHeader w:val="off"/>
+        </w:trPr>
+        <w:tc>
+          <w:tcPr>
+            <w:tcW w:type="dxa" w:w="1289"/>
+            <w:tcBorders>
+              <w:top w:val="single" w:color="BBBBBB" w:sz="4"/>
+              <w:left w:val="single" w:color="BBBBBB" w:sz="4"/>
+              <w:bottom w:val="single" w:color="BBBBBB" w:sz="4"/>
+              <w:right w:val="single" w:color="BBBBBB" w:sz="4"/>
+            </w:tcBorders>
+            <w:tcMar>
+              <w:top w:type="dxa" w:w="60"/>
+              <w:left w:type="dxa" w:w="100"/>
+              <w:bottom w:type="dxa" w:w="60"/>
+              <w:right w:type="dxa" w:w="100"/>
+            </w:tcMar>
+          </w:tcPr>
+          <w:p>
+            <w:r>
+              <w:rPr>
+                <w:b w:val="false"/>
+                <w:bCs w:val="false"/>
+                <w:sz w:val="18"/>
+                <w:szCs w:val="18"/>
+              </w:rPr>
+              <w:t xml:space="preserve">Idem, com campos sorteados no SFT</w:t>
+            </w:r>
+          </w:p>
+        </w:tc>
+        <w:tc>
+          <w:tcPr>
+            <w:tcW w:type="dxa" w:w="1289"/>
+            <w:tcBorders>
+              <w:top w:val="single" w:color="BBBBBB" w:sz="4"/>
+              <w:left w:val="single" w:color="BBBBBB" w:sz="4"/>
+              <w:bottom w:val="single" w:color="BBBBBB" w:sz="4"/>
+              <w:right w:val="single" w:color="BBBBBB" w:sz="4"/>
+            </w:tcBorders>
+            <w:tcMar>
+              <w:top w:type="dxa" w:w="60"/>
+              <w:left w:type="dxa" w:w="100"/>
+              <w:bottom w:type="dxa" w:w="60"/>
+              <w:right w:type="dxa" w:w="100"/>
+            </w:tcMar>
+          </w:tcPr>
+          <w:p>
+            <w:r>
+              <w:rPr>
+                <w:b w:val="false"/>
+                <w:bCs w:val="false"/>
+                <w:sz w:val="18"/>
+                <w:szCs w:val="18"/>
+              </w:rPr>
+              <w:t xml:space="preserve">nenhum</w:t>
+            </w:r>
+          </w:p>
+        </w:tc>
+        <w:tc>
+          <w:tcPr>
+            <w:tcW w:type="dxa" w:w="1289"/>
+            <w:tcBorders>
+              <w:top w:val="single" w:color="BBBBBB" w:sz="4"/>
+              <w:left w:val="single" w:color="BBBBBB" w:sz="4"/>
+              <w:bottom w:val="single" w:color="BBBBBB" w:sz="4"/>
+              <w:right w:val="single" w:color="BBBBBB" w:sz="4"/>
+            </w:tcBorders>
+            <w:tcMar>
+              <w:top w:type="dxa" w:w="60"/>
+              <w:left w:type="dxa" w:w="100"/>
+              <w:bottom w:type="dxa" w:w="60"/>
+              <w:right w:type="dxa" w:w="100"/>
+            </w:tcMar>
+          </w:tcPr>
+          <w:p>
+            <w:r>
+              <w:rPr>
+                <w:b w:val="false"/>
+                <w:bCs w:val="false"/>
+                <w:sz w:val="18"/>
+                <w:szCs w:val="18"/>
+              </w:rPr>
+              <w:t xml:space="preserve">1,0</w:t>
+            </w:r>
+          </w:p>
+        </w:tc>
+        <w:tc>
+          <w:tcPr>
+            <w:tcW w:type="dxa" w:w="1289"/>
+            <w:tcBorders>
+              <w:top w:val="single" w:color="BBBBBB" w:sz="4"/>
+              <w:left w:val="single" w:color="BBBBBB" w:sz="4"/>
+              <w:bottom w:val="single" w:color="BBBBBB" w:sz="4"/>
+              <w:right w:val="single" w:color="BBBBBB" w:sz="4"/>
+            </w:tcBorders>
+            <w:tcMar>
+              <w:top w:type="dxa" w:w="60"/>
+              <w:left w:type="dxa" w:w="100"/>
+              <w:bottom w:type="dxa" w:w="60"/>
+              <w:right w:type="dxa" w:w="100"/>
+            </w:tcMar>
+          </w:tcPr>
+          <w:p>
+            <w:r>
+              <w:rPr>
+                <w:b w:val="false"/>
+                <w:bCs w:val="false"/>
+                <w:sz w:val="18"/>
+                <w:szCs w:val="18"/>
+              </w:rPr>
+              <w:t xml:space="preserve">0,5</w:t>
+            </w:r>
+          </w:p>
+        </w:tc>
+        <w:tc>
+          <w:tcPr>
+            <w:tcW w:type="dxa" w:w="1289"/>
+            <w:tcBorders>
+              <w:top w:val="single" w:color="BBBBBB" w:sz="4"/>
+              <w:left w:val="single" w:color="BBBBBB" w:sz="4"/>
+              <w:bottom w:val="single" w:color="BBBBBB" w:sz="4"/>
+              <w:right w:val="single" w:color="BBBBBB" w:sz="4"/>
+            </w:tcBorders>
+            <w:tcMar>
+              <w:top w:type="dxa" w:w="60"/>
+              <w:left w:type="dxa" w:w="100"/>
+              <w:bottom w:type="dxa" w:w="60"/>
+              <w:right w:type="dxa" w:w="100"/>
+            </w:tcMar>
+          </w:tcPr>
+          <w:p>
+            <w:r>
+              <w:rPr>
+                <w:b w:val="false"/>
+                <w:bCs w:val="false"/>
+                <w:sz w:val="18"/>
+                <w:szCs w:val="18"/>
+              </w:rPr>
+              <w:t xml:space="preserve">0,94</w:t>
+            </w:r>
+          </w:p>
+        </w:tc>
+        <w:tc>
+          <w:tcPr>
+            <w:tcW w:type="dxa" w:w="1289"/>
+            <w:tcBorders>
+              <w:top w:val="single" w:color="BBBBBB" w:sz="4"/>
+              <w:left w:val="single" w:color="BBBBBB" w:sz="4"/>
+              <w:bottom w:val="single" w:color="BBBBBB" w:sz="4"/>
+              <w:right w:val="single" w:color="BBBBBB" w:sz="4"/>
+            </w:tcBorders>
+            <w:tcMar>
+              <w:top w:type="dxa" w:w="60"/>
+              <w:left w:type="dxa" w:w="100"/>
+              <w:bottom w:type="dxa" w:w="60"/>
+              <w:right w:type="dxa" w:w="100"/>
+            </w:tcMar>
+          </w:tcPr>
+          <w:p>
+            <w:r>
+              <w:rPr>
+                <w:b w:val="false"/>
+                <w:bCs w:val="false"/>
+                <w:sz w:val="18"/>
+                <w:szCs w:val="18"/>
+              </w:rPr>
+              <w:t xml:space="preserve">0,97</w:t>
+            </w:r>
+          </w:p>
+        </w:tc>
+        <w:tc>
+          <w:tcPr>
+            <w:tcW w:type="dxa" w:w="1289"/>
+            <w:tcBorders>
+              <w:top w:val="single" w:color="BBBBBB" w:sz="4"/>
+              <w:left w:val="single" w:color="BBBBBB" w:sz="4"/>
+              <w:bottom w:val="single" w:color="BBBBBB" w:sz="4"/>
+              <w:right w:val="single" w:color="BBBBBB" w:sz="4"/>
+            </w:tcBorders>
+            <w:tcMar>
+              <w:top w:type="dxa" w:w="60"/>
+              <w:left w:type="dxa" w:w="100"/>
+              <w:bottom w:type="dxa" w:w="60"/>
+              <w:right w:type="dxa" w:w="100"/>
+            </w:tcMar>
+          </w:tcPr>
+          <w:p>
+            <w:r>
+              <w:rPr>
+                <w:b w:val="false"/>
+                <w:bCs w:val="false"/>
+                <w:sz w:val="18"/>
+                <w:szCs w:val="18"/>
+              </w:rPr>
+              <w:t xml:space="preserve">0,97</w:t>
+            </w:r>
+          </w:p>
+        </w:tc>
+      </w:tr>
+      <w:tr>
+        <w:trPr>
+          <w:tblHeader w:val="off"/>
+        </w:trPr>
+        <w:tc>
+          <w:tcPr>
+            <w:tcW w:type="dxa" w:w="1289"/>
+            <w:tcBorders>
+              <w:top w:val="single" w:color="BBBBBB" w:sz="4"/>
+              <w:left w:val="single" w:color="BBBBBB" w:sz="4"/>
+              <w:bottom w:val="single" w:color="BBBBBB" w:sz="4"/>
+              <w:right w:val="single" w:color="BBBBBB" w:sz="4"/>
+            </w:tcBorders>
+            <w:tcMar>
+              <w:top w:type="dxa" w:w="60"/>
+              <w:left w:type="dxa" w:w="100"/>
+              <w:bottom w:type="dxa" w:w="60"/>
+              <w:right w:type="dxa" w:w="100"/>
+            </w:tcMar>
+          </w:tcPr>
+          <w:p>
+            <w:r>
+              <w:rPr>
+                <w:b w:val="false"/>
+                <w:bCs w:val="false"/>
+                <w:sz w:val="18"/>
+                <w:szCs w:val="18"/>
+              </w:rPr>
+              <w:t xml:space="preserve">Idem, com 266 nomes extras no SFT</w:t>
+            </w:r>
+          </w:p>
+        </w:tc>
+        <w:tc>
+          <w:tcPr>
+            <w:tcW w:type="dxa" w:w="1289"/>
+            <w:tcBorders>
+              <w:top w:val="single" w:color="BBBBBB" w:sz="4"/>
+              <w:left w:val="single" w:color="BBBBBB" w:sz="4"/>
+              <w:bottom w:val="single" w:color="BBBBBB" w:sz="4"/>
+              <w:right w:val="single" w:color="BBBBBB" w:sz="4"/>
+            </w:tcBorders>
+            <w:tcMar>
+              <w:top w:type="dxa" w:w="60"/>
+              <w:left w:type="dxa" w:w="100"/>
+              <w:bottom w:type="dxa" w:w="60"/>
+              <w:right w:type="dxa" w:w="100"/>
+            </w:tcMar>
+          </w:tcPr>
+          <w:p>
+            <w:r>
+              <w:rPr>
+                <w:b w:val="false"/>
+                <w:bCs w:val="false"/>
+                <w:sz w:val="18"/>
+                <w:szCs w:val="18"/>
+              </w:rPr>
+              <w:t xml:space="preserve">nenhum</w:t>
+            </w:r>
+          </w:p>
+        </w:tc>
+        <w:tc>
+          <w:tcPr>
+            <w:tcW w:type="dxa" w:w="1289"/>
+            <w:tcBorders>
+              <w:top w:val="single" w:color="BBBBBB" w:sz="4"/>
+              <w:left w:val="single" w:color="BBBBBB" w:sz="4"/>
+              <w:bottom w:val="single" w:color="BBBBBB" w:sz="4"/>
+              <w:right w:val="single" w:color="BBBBBB" w:sz="4"/>
+            </w:tcBorders>
+            <w:tcMar>
+              <w:top w:type="dxa" w:w="60"/>
+              <w:left w:type="dxa" w:w="100"/>
+              <w:bottom w:type="dxa" w:w="60"/>
+              <w:right w:type="dxa" w:w="100"/>
+            </w:tcMar>
+          </w:tcPr>
+          <w:p>
+            <w:r>
+              <w:rPr>
+                <w:b w:val="false"/>
+                <w:bCs w:val="false"/>
+                <w:sz w:val="18"/>
+                <w:szCs w:val="18"/>
+              </w:rPr>
+              <w:t xml:space="preserve">1,0</w:t>
+            </w:r>
+          </w:p>
+        </w:tc>
+        <w:tc>
+          <w:tcPr>
+            <w:tcW w:type="dxa" w:w="1289"/>
+            <w:tcBorders>
+              <w:top w:val="single" w:color="BBBBBB" w:sz="4"/>
+              <w:left w:val="single" w:color="BBBBBB" w:sz="4"/>
+              <w:bottom w:val="single" w:color="BBBBBB" w:sz="4"/>
+              <w:right w:val="single" w:color="BBBBBB" w:sz="4"/>
+            </w:tcBorders>
+            <w:tcMar>
+              <w:top w:type="dxa" w:w="60"/>
+              <w:left w:type="dxa" w:w="100"/>
+              <w:bottom w:type="dxa" w:w="60"/>
+              <w:right w:type="dxa" w:w="100"/>
+            </w:tcMar>
+          </w:tcPr>
+          <w:p>
+            <w:r>
+              <w:rPr>
+                <w:b w:val="false"/>
+                <w:bCs w:val="false"/>
+                <w:sz w:val="18"/>
+                <w:szCs w:val="18"/>
+              </w:rPr>
+              <w:t xml:space="preserve">0,75</w:t>
+            </w:r>
+          </w:p>
+        </w:tc>
+        <w:tc>
+          <w:tcPr>
+            <w:tcW w:type="dxa" w:w="1289"/>
+            <w:tcBorders>
+              <w:top w:val="single" w:color="BBBBBB" w:sz="4"/>
+              <w:left w:val="single" w:color="BBBBBB" w:sz="4"/>
+              <w:bottom w:val="single" w:color="BBBBBB" w:sz="4"/>
+              <w:right w:val="single" w:color="BBBBBB" w:sz="4"/>
+            </w:tcBorders>
+            <w:tcMar>
+              <w:top w:type="dxa" w:w="60"/>
+              <w:left w:type="dxa" w:w="100"/>
+              <w:bottom w:type="dxa" w:w="60"/>
+              <w:right w:type="dxa" w:w="100"/>
+            </w:tcMar>
+          </w:tcPr>
+          <w:p>
+            <w:r>
+              <w:rPr>
+                <w:b w:val="false"/>
+                <w:bCs w:val="false"/>
+                <w:sz w:val="18"/>
+                <w:szCs w:val="18"/>
+              </w:rPr>
+              <w:t xml:space="preserve">0,94</w:t>
+            </w:r>
+          </w:p>
+        </w:tc>
+        <w:tc>
+          <w:tcPr>
+            <w:tcW w:type="dxa" w:w="1289"/>
+            <w:tcBorders>
+              <w:top w:val="single" w:color="BBBBBB" w:sz="4"/>
+              <w:left w:val="single" w:color="BBBBBB" w:sz="4"/>
+              <w:bottom w:val="single" w:color="BBBBBB" w:sz="4"/>
+              <w:right w:val="single" w:color="BBBBBB" w:sz="4"/>
+            </w:tcBorders>
+            <w:tcMar>
+              <w:top w:type="dxa" w:w="60"/>
+              <w:left w:type="dxa" w:w="100"/>
+              <w:bottom w:type="dxa" w:w="60"/>
+              <w:right w:type="dxa" w:w="100"/>
+            </w:tcMar>
+          </w:tcPr>
+          <w:p>
+            <w:r>
+              <w:rPr>
+                <w:b w:val="false"/>
+                <w:bCs w:val="false"/>
+                <w:sz w:val="18"/>
+                <w:szCs w:val="18"/>
+              </w:rPr>
+              <w:t xml:space="preserve">1,0</w:t>
+            </w:r>
+          </w:p>
+        </w:tc>
+        <w:tc>
+          <w:tcPr>
+            <w:tcW w:type="dxa" w:w="1289"/>
+            <w:tcBorders>
+              <w:top w:val="single" w:color="BBBBBB" w:sz="4"/>
+              <w:left w:val="single" w:color="BBBBBB" w:sz="4"/>
+              <w:bottom w:val="single" w:color="BBBBBB" w:sz="4"/>
+              <w:right w:val="single" w:color="BBBBBB" w:sz="4"/>
+            </w:tcBorders>
+            <w:tcMar>
+              <w:top w:type="dxa" w:w="60"/>
+              <w:left w:type="dxa" w:w="100"/>
+              <w:bottom w:type="dxa" w:w="60"/>
+              <w:right w:type="dxa" w:w="100"/>
+            </w:tcMar>
+          </w:tcPr>
+          <w:p>
+            <w:r>
+              <w:rPr>
+                <w:b w:val="false"/>
+                <w:bCs w:val="false"/>
+                <w:sz w:val="18"/>
+                <w:szCs w:val="18"/>
+              </w:rPr>
+              <w:t xml:space="preserve">1,0</w:t>
             </w:r>
           </w:p>
         </w:tc>
@@ -932,7 +1521,7 @@
         <w:spacing w:after="120"/>
       </w:pPr>
       <w:r>
-        <w:t xml:space="preserve">A primeira linha ainda tem o melhor runs_rate, mas só chega lá com dois scripts que corrigem a saída. A última é a primeira rodada em que o próprio modelo acerta a caixa e a entidade nova.</w:t>
+        <w:t xml:space="preserve">A primeira linha só chega a runs_rate 1,0 com dois scripts que corrigem a saída. O runs_rate das três últimas conta como sucesso um app que roda com a classe errada, por isso a coluna entidade_rate entrou depois: ela foi medida de novo sobre as predições já salvas da antepenúltima rodada.</w:t>
       </w:r>
     </w:p>
     <w:p>
@@ -950,7 +1539,7 @@
       <w:r>
         <w:t xml:space="preserve">O ponto de partida é o </w:t>
       </w:r>
-      <w:hyperlink w:history="1" r:id="rIdp2zdymkczeo0222mjzk35">
+      <w:hyperlink w:history="1" r:id="rIdh0_xpig-b6r_qnm9shinh">
         <w:r>
           <w:rPr>
             <w:rStyle w:val="Hyperlink"/>
@@ -1538,7 +2127,7 @@
             </w:tcMar>
           </w:tcPr>
           <w:p>
-            <w:hyperlink w:history="1" r:id="rIdetn4g3xym8wsg_r0adycd">
+            <w:hyperlink w:history="1" r:id="rIdtz4gioecv73_pv6kpqsh5">
               <w:r>
                 <w:rPr>
                   <w:rStyle w:val="Hyperlink"/>
@@ -1716,7 +2305,7 @@
             </w:tcMar>
           </w:tcPr>
           <w:p>
-            <w:hyperlink w:history="1" r:id="rIdaywxoe-j_sxab1ggo10si">
+            <w:hyperlink w:history="1" r:id="rId11xav3balw2s_ci0xtn6w">
               <w:r>
                 <w:rPr>
                   <w:rStyle w:val="Hyperlink"/>
@@ -1836,7 +2425,7 @@
             </w:tcMar>
           </w:tcPr>
           <w:p>
-            <w:hyperlink w:history="1" r:id="rIdyyrvmgjizbis0jbiuwd0m">
+            <w:hyperlink w:history="1" r:id="rIdycsa1y5ws0xwcovomkcmc">
               <w:r>
                 <w:rPr>
                   <w:rStyle w:val="Hyperlink"/>
@@ -3463,99 +4052,12 @@
         <w:spacing w:after="120"/>
       </w:pPr>
       <w:r>
-        <w:t xml:space="preserve">Das 9 falhas da rodada atual, 6 são erro de sintaxe e todas estão em rotas de delete. O modelo escreve </w:t>
-      </w:r>
-      <w:r>
-        <w:rPr>
-          <w:rFonts w:ascii="Consolas" w:cs="Consolas" w:eastAsia="Consolas" w:hAnsi="Consolas"/>
-        </w:rPr>
-        <w:t xml:space="preserve">def deletar_comentario(item_id: int, sessao.query(Membro)):</w:t>
-      </w:r>
-      <w:r>
-        <w:t xml:space="preserve">, pulando a assinatura direto para o corpo. Os 438 exemplos de delete do treino têm a mesma assinatura correta, então o erro não vem de dado inconsistente.</w:t>
-      </w:r>
-    </w:p>
-    <w:p>
-      <w:pPr>
-        <w:spacing w:after="120"/>
-      </w:pPr>
-      <w:r>
-        <w:t xml:space="preserve">No mesmo exemplo, a classe saiu como </w:t>
-      </w:r>
-      <w:r>
-        <w:rPr>
-          <w:rFonts w:ascii="Consolas" w:cs="Consolas" w:eastAsia="Consolas" w:hAnsi="Consolas"/>
-        </w:rPr>
-        <w:t xml:space="preserve">Membro</w:t>
-      </w:r>
-      <w:r>
-        <w:t xml:space="preserve">, uma entidade do treino, com os campos de </w:t>
-      </w:r>
-      <w:r>
-        <w:rPr>
-          <w:rFonts w:ascii="Consolas" w:cs="Consolas" w:eastAsia="Consolas" w:hAnsi="Consolas"/>
-        </w:rPr>
-        <w:t xml:space="preserve">endereco</w:t>
-      </w:r>
-      <w:r>
-        <w:t xml:space="preserve">. O </w:t>
-      </w:r>
-      <w:r>
-        <w:rPr>
-          <w:rFonts w:ascii="Consolas" w:cs="Consolas" w:eastAsia="Consolas" w:hAnsi="Consolas"/>
-        </w:rPr>
-        <w:t xml:space="preserve">comentario</w:t>
-      </w:r>
-      <w:r>
-        <w:t xml:space="preserve"> só aparece no nome da rota e da função. O case_rate não pega isso, porque </w:t>
-      </w:r>
-      <w:r>
-        <w:rPr>
-          <w:rFonts w:ascii="Consolas" w:cs="Consolas" w:eastAsia="Consolas" w:hAnsi="Consolas"/>
-        </w:rPr>
-        <w:t xml:space="preserve">Membro</w:t>
-      </w:r>
-      <w:r>
-        <w:t xml:space="preserve"> tem a caixa certa.</w:t>
-      </w:r>
-    </w:p>
-    <w:p>
-      <w:pPr>
-        <w:spacing w:after="120"/>
-      </w:pPr>
-      <w:r>
-        <w:t xml:space="preserve">Outras duas falhas usam </w:t>
-      </w:r>
-      <w:r>
-        <w:rPr>
-          <w:rFonts w:ascii="Consolas" w:cs="Consolas" w:eastAsia="Consolas" w:hAnsi="Consolas"/>
-        </w:rPr>
-        <w:t xml:space="preserve">response_model=EnderecoResposta</w:t>
-      </w:r>
-      <w:r>
-        <w:t xml:space="preserve"> numa rota de listar, onde o certo é </w:t>
-      </w:r>
-      <w:r>
-        <w:rPr>
-          <w:rFonts w:ascii="Consolas" w:cs="Consolas" w:eastAsia="Consolas" w:hAnsi="Consolas"/>
-        </w:rPr>
-        <w:t xml:space="preserve">list[EnderecoResposta]</w:t>
-      </w:r>
-      <w:r>
-        <w:t xml:space="preserve">. A última usa um nome de parâmetro na rota e outro no corpo.</w:t>
-      </w:r>
-    </w:p>
-    <w:p>
-      <w:pPr>
-        <w:spacing w:after="120"/>
-      </w:pPr>
-      <w:r>
-        <w:t xml:space="preserve">A primeira hipótese foi que o SFT tinha decorado demais, já que a loss terminou em 0,034 depois de 3 épocas. O teste foi refazer só o SFT com 1 época sobre o mesmo CPT, e o resultado piorou em tudo:</w:t>
+        <w:t xml:space="preserve">A investigação passou por quatro rodadas de SFT sobre o mesmo CPT grande.</w:t>
       </w:r>
     </w:p>
     <w:tbl>
       <w:tblPr>
-        <w:tblW w:type="dxa" w:w="9024"/>
+        <w:tblW w:type="dxa" w:w="9023"/>
         <w:tblBorders>
           <w:top w:val="single" w:color="auto" w:sz="4"/>
           <w:left w:val="single" w:color="auto" w:sz="4"/>
@@ -3566,12 +4068,13 @@
         </w:tblBorders>
       </w:tblPr>
       <w:tblGrid>
-        <w:gridCol w:w="1504"/>
-        <w:gridCol w:w="1504"/>
-        <w:gridCol w:w="1504"/>
-        <w:gridCol w:w="1504"/>
-        <w:gridCol w:w="1504"/>
-        <w:gridCol w:w="1504"/>
+        <w:gridCol w:w="1289"/>
+        <w:gridCol w:w="1289"/>
+        <w:gridCol w:w="1289"/>
+        <w:gridCol w:w="1289"/>
+        <w:gridCol w:w="1289"/>
+        <w:gridCol w:w="1289"/>
+        <w:gridCol w:w="1289"/>
       </w:tblGrid>
       <w:tr>
         <w:trPr>
@@ -3579,7 +4082,7 @@
         </w:trPr>
         <w:tc>
           <w:tcPr>
-            <w:tcW w:type="dxa" w:w="1504"/>
+            <w:tcW w:type="dxa" w:w="1289"/>
             <w:tcBorders>
               <w:top w:val="single" w:color="BBBBBB" w:sz="4"/>
               <w:left w:val="single" w:color="BBBBBB" w:sz="4"/>
@@ -3608,7 +4111,7 @@
         </w:tc>
         <w:tc>
           <w:tcPr>
-            <w:tcW w:type="dxa" w:w="1504"/>
+            <w:tcW w:type="dxa" w:w="1289"/>
             <w:tcBorders>
               <w:top w:val="single" w:color="BBBBBB" w:sz="4"/>
               <w:left w:val="single" w:color="BBBBBB" w:sz="4"/>
@@ -3637,7 +4140,7 @@
         </w:tc>
         <w:tc>
           <w:tcPr>
-            <w:tcW w:type="dxa" w:w="1504"/>
+            <w:tcW w:type="dxa" w:w="1289"/>
             <w:tcBorders>
               <w:top w:val="single" w:color="BBBBBB" w:sz="4"/>
               <w:left w:val="single" w:color="BBBBBB" w:sz="4"/>
@@ -3660,13 +4163,13 @@
                 <w:sz w:val="18"/>
                 <w:szCs w:val="18"/>
               </w:rPr>
-              <w:t xml:space="preserve">rotas</w:t>
-            </w:r>
-          </w:p>
-        </w:tc>
-        <w:tc>
-          <w:tcPr>
-            <w:tcW w:type="dxa" w:w="1504"/>
+              <w:t xml:space="preserve">entidade_rate</w:t>
+            </w:r>
+          </w:p>
+        </w:tc>
+        <w:tc>
+          <w:tcPr>
+            <w:tcW w:type="dxa" w:w="1289"/>
             <w:tcBorders>
               <w:top w:val="single" w:color="BBBBBB" w:sz="4"/>
               <w:left w:val="single" w:color="BBBBBB" w:sz="4"/>
@@ -3689,13 +4192,13 @@
                 <w:sz w:val="18"/>
                 <w:szCs w:val="18"/>
               </w:rPr>
-              <w:t xml:space="preserve">compile_rate</w:t>
-            </w:r>
-          </w:p>
-        </w:tc>
-        <w:tc>
-          <w:tcPr>
-            <w:tcW w:type="dxa" w:w="1504"/>
+              <w:t xml:space="preserve">rotas</w:t>
+            </w:r>
+          </w:p>
+        </w:tc>
+        <w:tc>
+          <w:tcPr>
+            <w:tcW w:type="dxa" w:w="1289"/>
             <w:tcBorders>
               <w:top w:val="single" w:color="BBBBBB" w:sz="4"/>
               <w:left w:val="single" w:color="BBBBBB" w:sz="4"/>
@@ -3718,13 +4221,42 @@
                 <w:sz w:val="18"/>
                 <w:szCs w:val="18"/>
               </w:rPr>
+              <w:t xml:space="preserve">compile_rate</w:t>
+            </w:r>
+          </w:p>
+        </w:tc>
+        <w:tc>
+          <w:tcPr>
+            <w:tcW w:type="dxa" w:w="1289"/>
+            <w:tcBorders>
+              <w:top w:val="single" w:color="BBBBBB" w:sz="4"/>
+              <w:left w:val="single" w:color="BBBBBB" w:sz="4"/>
+              <w:bottom w:val="single" w:color="BBBBBB" w:sz="4"/>
+              <w:right w:val="single" w:color="BBBBBB" w:sz="4"/>
+            </w:tcBorders>
+            <w:shd w:fill="E8EEF4" w:val="clear"/>
+            <w:tcMar>
+              <w:top w:type="dxa" w:w="60"/>
+              <w:left w:type="dxa" w:w="100"/>
+              <w:bottom w:type="dxa" w:w="60"/>
+              <w:right w:type="dxa" w:w="100"/>
+            </w:tcMar>
+          </w:tcPr>
+          <w:p>
+            <w:r>
+              <w:rPr>
+                <w:b/>
+                <w:bCs/>
+                <w:sz w:val="18"/>
+                <w:szCs w:val="18"/>
+              </w:rPr>
               <w:t xml:space="preserve">runs_rate</w:t>
             </w:r>
           </w:p>
         </w:tc>
         <w:tc>
           <w:tcPr>
-            <w:tcW w:type="dxa" w:w="1504"/>
+            <w:tcW w:type="dxa" w:w="1289"/>
             <w:tcBorders>
               <w:top w:val="single" w:color="BBBBBB" w:sz="4"/>
               <w:left w:val="single" w:color="BBBBBB" w:sz="4"/>
@@ -3758,35 +4290,35 @@
         </w:trPr>
         <w:tc>
           <w:tcPr>
-            <w:tcW w:type="dxa" w:w="1504"/>
-            <w:tcBorders>
-              <w:top w:val="single" w:color="BBBBBB" w:sz="4"/>
-              <w:left w:val="single" w:color="BBBBBB" w:sz="4"/>
-              <w:bottom w:val="single" w:color="BBBBBB" w:sz="4"/>
-              <w:right w:val="single" w:color="BBBBBB" w:sz="4"/>
-            </w:tcBorders>
-            <w:tcMar>
-              <w:top w:type="dxa" w:w="60"/>
-              <w:left w:type="dxa" w:w="100"/>
-              <w:bottom w:type="dxa" w:w="60"/>
-              <w:right w:type="dxa" w:w="100"/>
-            </w:tcMar>
-          </w:tcPr>
-          <w:p>
-            <w:r>
-              <w:rPr>
-                <w:b w:val="false"/>
-                <w:bCs w:val="false"/>
-                <w:sz w:val="18"/>
-                <w:szCs w:val="18"/>
-              </w:rPr>
-              <w:t xml:space="preserve">3 épocas (loss final 0,034)</w:t>
-            </w:r>
-          </w:p>
-        </w:tc>
-        <w:tc>
-          <w:tcPr>
-            <w:tcW w:type="dxa" w:w="1504"/>
+            <w:tcW w:type="dxa" w:w="1289"/>
+            <w:tcBorders>
+              <w:top w:val="single" w:color="BBBBBB" w:sz="4"/>
+              <w:left w:val="single" w:color="BBBBBB" w:sz="4"/>
+              <w:bottom w:val="single" w:color="BBBBBB" w:sz="4"/>
+              <w:right w:val="single" w:color="BBBBBB" w:sz="4"/>
+            </w:tcBorders>
+            <w:tcMar>
+              <w:top w:type="dxa" w:w="60"/>
+              <w:left w:type="dxa" w:w="100"/>
+              <w:bottom w:type="dxa" w:w="60"/>
+              <w:right w:type="dxa" w:w="100"/>
+            </w:tcMar>
+          </w:tcPr>
+          <w:p>
+            <w:r>
+              <w:rPr>
+                <w:b w:val="false"/>
+                <w:bCs w:val="false"/>
+                <w:sz w:val="18"/>
+                <w:szCs w:val="18"/>
+              </w:rPr>
+              <w:t xml:space="preserve">3 épocas, campos fixos por entidade (loss final 0,034)</w:t>
+            </w:r>
+          </w:p>
+        </w:tc>
+        <w:tc>
+          <w:tcPr>
+            <w:tcW w:type="dxa" w:w="1289"/>
             <w:tcBorders>
               <w:top w:val="single" w:color="BBBBBB" w:sz="4"/>
               <w:left w:val="single" w:color="BBBBBB" w:sz="4"/>
@@ -3814,7 +4346,35 @@
         </w:tc>
         <w:tc>
           <w:tcPr>
-            <w:tcW w:type="dxa" w:w="1504"/>
+            <w:tcW w:type="dxa" w:w="1289"/>
+            <w:tcBorders>
+              <w:top w:val="single" w:color="BBBBBB" w:sz="4"/>
+              <w:left w:val="single" w:color="BBBBBB" w:sz="4"/>
+              <w:bottom w:val="single" w:color="BBBBBB" w:sz="4"/>
+              <w:right w:val="single" w:color="BBBBBB" w:sz="4"/>
+            </w:tcBorders>
+            <w:tcMar>
+              <w:top w:type="dxa" w:w="60"/>
+              <w:left w:type="dxa" w:w="100"/>
+              <w:bottom w:type="dxa" w:w="60"/>
+              <w:right w:type="dxa" w:w="100"/>
+            </w:tcMar>
+          </w:tcPr>
+          <w:p>
+            <w:r>
+              <w:rPr>
+                <w:b w:val="false"/>
+                <w:bCs w:val="false"/>
+                <w:sz w:val="18"/>
+                <w:szCs w:val="18"/>
+              </w:rPr>
+              <w:t xml:space="preserve">0,5</w:t>
+            </w:r>
+          </w:p>
+        </w:tc>
+        <w:tc>
+          <w:tcPr>
+            <w:tcW w:type="dxa" w:w="1289"/>
             <w:tcBorders>
               <w:top w:val="single" w:color="BBBBBB" w:sz="4"/>
               <w:left w:val="single" w:color="BBBBBB" w:sz="4"/>
@@ -3842,7 +4402,7 @@
         </w:tc>
         <w:tc>
           <w:tcPr>
-            <w:tcW w:type="dxa" w:w="1504"/>
+            <w:tcW w:type="dxa" w:w="1289"/>
             <w:tcBorders>
               <w:top w:val="single" w:color="BBBBBB" w:sz="4"/>
               <w:left w:val="single" w:color="BBBBBB" w:sz="4"/>
@@ -3870,7 +4430,7 @@
         </w:tc>
         <w:tc>
           <w:tcPr>
-            <w:tcW w:type="dxa" w:w="1504"/>
+            <w:tcW w:type="dxa" w:w="1289"/>
             <w:tcBorders>
               <w:top w:val="single" w:color="BBBBBB" w:sz="4"/>
               <w:left w:val="single" w:color="BBBBBB" w:sz="4"/>
@@ -3898,7 +4458,7 @@
         </w:tc>
         <w:tc>
           <w:tcPr>
-            <w:tcW w:type="dxa" w:w="1504"/>
+            <w:tcW w:type="dxa" w:w="1289"/>
             <w:tcBorders>
               <w:top w:val="single" w:color="BBBBBB" w:sz="4"/>
               <w:left w:val="single" w:color="BBBBBB" w:sz="4"/>
@@ -3931,35 +4491,35 @@
         </w:trPr>
         <w:tc>
           <w:tcPr>
-            <w:tcW w:type="dxa" w:w="1504"/>
-            <w:tcBorders>
-              <w:top w:val="single" w:color="BBBBBB" w:sz="4"/>
-              <w:left w:val="single" w:color="BBBBBB" w:sz="4"/>
-              <w:bottom w:val="single" w:color="BBBBBB" w:sz="4"/>
-              <w:right w:val="single" w:color="BBBBBB" w:sz="4"/>
-            </w:tcBorders>
-            <w:tcMar>
-              <w:top w:type="dxa" w:w="60"/>
-              <w:left w:type="dxa" w:w="100"/>
-              <w:bottom w:type="dxa" w:w="60"/>
-              <w:right w:type="dxa" w:w="100"/>
-            </w:tcMar>
-          </w:tcPr>
-          <w:p>
-            <w:r>
-              <w:rPr>
-                <w:b w:val="false"/>
-                <w:bCs w:val="false"/>
-                <w:sz w:val="18"/>
-                <w:szCs w:val="18"/>
-              </w:rPr>
-              <w:t xml:space="preserve">1 época (loss final 0,074)</w:t>
-            </w:r>
-          </w:p>
-        </w:tc>
-        <w:tc>
-          <w:tcPr>
-            <w:tcW w:type="dxa" w:w="1504"/>
+            <w:tcW w:type="dxa" w:w="1289"/>
+            <w:tcBorders>
+              <w:top w:val="single" w:color="BBBBBB" w:sz="4"/>
+              <w:left w:val="single" w:color="BBBBBB" w:sz="4"/>
+              <w:bottom w:val="single" w:color="BBBBBB" w:sz="4"/>
+              <w:right w:val="single" w:color="BBBBBB" w:sz="4"/>
+            </w:tcBorders>
+            <w:tcMar>
+              <w:top w:type="dxa" w:w="60"/>
+              <w:left w:type="dxa" w:w="100"/>
+              <w:bottom w:type="dxa" w:w="60"/>
+              <w:right w:type="dxa" w:w="100"/>
+            </w:tcMar>
+          </w:tcPr>
+          <w:p>
+            <w:r>
+              <w:rPr>
+                <w:b w:val="false"/>
+                <w:bCs w:val="false"/>
+                <w:sz w:val="18"/>
+                <w:szCs w:val="18"/>
+              </w:rPr>
+              <w:t xml:space="preserve">1 época, campos fixos (loss final 0,074)</w:t>
+            </w:r>
+          </w:p>
+        </w:tc>
+        <w:tc>
+          <w:tcPr>
+            <w:tcW w:type="dxa" w:w="1289"/>
             <w:tcBorders>
               <w:top w:val="single" w:color="BBBBBB" w:sz="4"/>
               <w:left w:val="single" w:color="BBBBBB" w:sz="4"/>
@@ -3987,7 +4547,35 @@
         </w:tc>
         <w:tc>
           <w:tcPr>
-            <w:tcW w:type="dxa" w:w="1504"/>
+            <w:tcW w:type="dxa" w:w="1289"/>
+            <w:tcBorders>
+              <w:top w:val="single" w:color="BBBBBB" w:sz="4"/>
+              <w:left w:val="single" w:color="BBBBBB" w:sz="4"/>
+              <w:bottom w:val="single" w:color="BBBBBB" w:sz="4"/>
+              <w:right w:val="single" w:color="BBBBBB" w:sz="4"/>
+            </w:tcBorders>
+            <w:tcMar>
+              <w:top w:type="dxa" w:w="60"/>
+              <w:left w:type="dxa" w:w="100"/>
+              <w:bottom w:type="dxa" w:w="60"/>
+              <w:right w:type="dxa" w:w="100"/>
+            </w:tcMar>
+          </w:tcPr>
+          <w:p>
+            <w:r>
+              <w:rPr>
+                <w:b w:val="false"/>
+                <w:bCs w:val="false"/>
+                <w:sz w:val="18"/>
+                <w:szCs w:val="18"/>
+              </w:rPr>
+              <w:t xml:space="preserve">n/d</w:t>
+            </w:r>
+          </w:p>
+        </w:tc>
+        <w:tc>
+          <w:tcPr>
+            <w:tcW w:type="dxa" w:w="1289"/>
             <w:tcBorders>
               <w:top w:val="single" w:color="BBBBBB" w:sz="4"/>
               <w:left w:val="single" w:color="BBBBBB" w:sz="4"/>
@@ -4015,7 +4603,7 @@
         </w:tc>
         <w:tc>
           <w:tcPr>
-            <w:tcW w:type="dxa" w:w="1504"/>
+            <w:tcW w:type="dxa" w:w="1289"/>
             <w:tcBorders>
               <w:top w:val="single" w:color="BBBBBB" w:sz="4"/>
               <w:left w:val="single" w:color="BBBBBB" w:sz="4"/>
@@ -4043,7 +4631,7 @@
         </w:tc>
         <w:tc>
           <w:tcPr>
-            <w:tcW w:type="dxa" w:w="1504"/>
+            <w:tcW w:type="dxa" w:w="1289"/>
             <w:tcBorders>
               <w:top w:val="single" w:color="BBBBBB" w:sz="4"/>
               <w:left w:val="single" w:color="BBBBBB" w:sz="4"/>
@@ -4071,7 +4659,7 @@
         </w:tc>
         <w:tc>
           <w:tcPr>
-            <w:tcW w:type="dxa" w:w="1504"/>
+            <w:tcW w:type="dxa" w:w="1289"/>
             <w:tcBorders>
               <w:top w:val="single" w:color="BBBBBB" w:sz="4"/>
               <w:left w:val="single" w:color="BBBBBB" w:sz="4"/>
@@ -4094,6 +4682,408 @@
                 <w:szCs w:val="18"/>
               </w:rPr>
               <w:t xml:space="preserve">0,125</w:t>
+            </w:r>
+          </w:p>
+        </w:tc>
+      </w:tr>
+      <w:tr>
+        <w:trPr>
+          <w:tblHeader w:val="off"/>
+        </w:trPr>
+        <w:tc>
+          <w:tcPr>
+            <w:tcW w:type="dxa" w:w="1289"/>
+            <w:tcBorders>
+              <w:top w:val="single" w:color="BBBBBB" w:sz="4"/>
+              <w:left w:val="single" w:color="BBBBBB" w:sz="4"/>
+              <w:bottom w:val="single" w:color="BBBBBB" w:sz="4"/>
+              <w:right w:val="single" w:color="BBBBBB" w:sz="4"/>
+            </w:tcBorders>
+            <w:tcMar>
+              <w:top w:type="dxa" w:w="60"/>
+              <w:left w:type="dxa" w:w="100"/>
+              <w:bottom w:type="dxa" w:w="60"/>
+              <w:right w:type="dxa" w:w="100"/>
+            </w:tcMar>
+          </w:tcPr>
+          <w:p>
+            <w:r>
+              <w:rPr>
+                <w:b w:val="false"/>
+                <w:bCs w:val="false"/>
+                <w:sz w:val="18"/>
+                <w:szCs w:val="18"/>
+              </w:rPr>
+              <w:t xml:space="preserve">3 épocas, campos sorteados (loss final 0,039)</w:t>
+            </w:r>
+          </w:p>
+        </w:tc>
+        <w:tc>
+          <w:tcPr>
+            <w:tcW w:type="dxa" w:w="1289"/>
+            <w:tcBorders>
+              <w:top w:val="single" w:color="BBBBBB" w:sz="4"/>
+              <w:left w:val="single" w:color="BBBBBB" w:sz="4"/>
+              <w:bottom w:val="single" w:color="BBBBBB" w:sz="4"/>
+              <w:right w:val="single" w:color="BBBBBB" w:sz="4"/>
+            </w:tcBorders>
+            <w:tcMar>
+              <w:top w:type="dxa" w:w="60"/>
+              <w:left w:type="dxa" w:w="100"/>
+              <w:bottom w:type="dxa" w:w="60"/>
+              <w:right w:type="dxa" w:w="100"/>
+            </w:tcMar>
+          </w:tcPr>
+          <w:p>
+            <w:r>
+              <w:rPr>
+                <w:b w:val="false"/>
+                <w:bCs w:val="false"/>
+                <w:sz w:val="18"/>
+                <w:szCs w:val="18"/>
+              </w:rPr>
+              <w:t xml:space="preserve">1,0</w:t>
+            </w:r>
+          </w:p>
+        </w:tc>
+        <w:tc>
+          <w:tcPr>
+            <w:tcW w:type="dxa" w:w="1289"/>
+            <w:tcBorders>
+              <w:top w:val="single" w:color="BBBBBB" w:sz="4"/>
+              <w:left w:val="single" w:color="BBBBBB" w:sz="4"/>
+              <w:bottom w:val="single" w:color="BBBBBB" w:sz="4"/>
+              <w:right w:val="single" w:color="BBBBBB" w:sz="4"/>
+            </w:tcBorders>
+            <w:tcMar>
+              <w:top w:type="dxa" w:w="60"/>
+              <w:left w:type="dxa" w:w="100"/>
+              <w:bottom w:type="dxa" w:w="60"/>
+              <w:right w:type="dxa" w:w="100"/>
+            </w:tcMar>
+          </w:tcPr>
+          <w:p>
+            <w:r>
+              <w:rPr>
+                <w:b w:val="false"/>
+                <w:bCs w:val="false"/>
+                <w:sz w:val="18"/>
+                <w:szCs w:val="18"/>
+              </w:rPr>
+              <w:t xml:space="preserve">0,5</w:t>
+            </w:r>
+          </w:p>
+        </w:tc>
+        <w:tc>
+          <w:tcPr>
+            <w:tcW w:type="dxa" w:w="1289"/>
+            <w:tcBorders>
+              <w:top w:val="single" w:color="BBBBBB" w:sz="4"/>
+              <w:left w:val="single" w:color="BBBBBB" w:sz="4"/>
+              <w:bottom w:val="single" w:color="BBBBBB" w:sz="4"/>
+              <w:right w:val="single" w:color="BBBBBB" w:sz="4"/>
+            </w:tcBorders>
+            <w:tcMar>
+              <w:top w:type="dxa" w:w="60"/>
+              <w:left w:type="dxa" w:w="100"/>
+              <w:bottom w:type="dxa" w:w="60"/>
+              <w:right w:type="dxa" w:w="100"/>
+            </w:tcMar>
+          </w:tcPr>
+          <w:p>
+            <w:r>
+              <w:rPr>
+                <w:b w:val="false"/>
+                <w:bCs w:val="false"/>
+                <w:sz w:val="18"/>
+                <w:szCs w:val="18"/>
+              </w:rPr>
+              <w:t xml:space="preserve">0,94</w:t>
+            </w:r>
+          </w:p>
+        </w:tc>
+        <w:tc>
+          <w:tcPr>
+            <w:tcW w:type="dxa" w:w="1289"/>
+            <w:tcBorders>
+              <w:top w:val="single" w:color="BBBBBB" w:sz="4"/>
+              <w:left w:val="single" w:color="BBBBBB" w:sz="4"/>
+              <w:bottom w:val="single" w:color="BBBBBB" w:sz="4"/>
+              <w:right w:val="single" w:color="BBBBBB" w:sz="4"/>
+            </w:tcBorders>
+            <w:tcMar>
+              <w:top w:type="dxa" w:w="60"/>
+              <w:left w:type="dxa" w:w="100"/>
+              <w:bottom w:type="dxa" w:w="60"/>
+              <w:right w:type="dxa" w:w="100"/>
+            </w:tcMar>
+          </w:tcPr>
+          <w:p>
+            <w:r>
+              <w:rPr>
+                <w:b w:val="false"/>
+                <w:bCs w:val="false"/>
+                <w:sz w:val="18"/>
+                <w:szCs w:val="18"/>
+              </w:rPr>
+              <w:t xml:space="preserve">0,97</w:t>
+            </w:r>
+          </w:p>
+        </w:tc>
+        <w:tc>
+          <w:tcPr>
+            <w:tcW w:type="dxa" w:w="1289"/>
+            <w:tcBorders>
+              <w:top w:val="single" w:color="BBBBBB" w:sz="4"/>
+              <w:left w:val="single" w:color="BBBBBB" w:sz="4"/>
+              <w:bottom w:val="single" w:color="BBBBBB" w:sz="4"/>
+              <w:right w:val="single" w:color="BBBBBB" w:sz="4"/>
+            </w:tcBorders>
+            <w:tcMar>
+              <w:top w:type="dxa" w:w="60"/>
+              <w:left w:type="dxa" w:w="100"/>
+              <w:bottom w:type="dxa" w:w="60"/>
+              <w:right w:type="dxa" w:w="100"/>
+            </w:tcMar>
+          </w:tcPr>
+          <w:p>
+            <w:r>
+              <w:rPr>
+                <w:b w:val="false"/>
+                <w:bCs w:val="false"/>
+                <w:sz w:val="18"/>
+                <w:szCs w:val="18"/>
+              </w:rPr>
+              <w:t xml:space="preserve">0,97</w:t>
+            </w:r>
+          </w:p>
+        </w:tc>
+        <w:tc>
+          <w:tcPr>
+            <w:tcW w:type="dxa" w:w="1289"/>
+            <w:tcBorders>
+              <w:top w:val="single" w:color="BBBBBB" w:sz="4"/>
+              <w:left w:val="single" w:color="BBBBBB" w:sz="4"/>
+              <w:bottom w:val="single" w:color="BBBBBB" w:sz="4"/>
+              <w:right w:val="single" w:color="BBBBBB" w:sz="4"/>
+            </w:tcBorders>
+            <w:tcMar>
+              <w:top w:type="dxa" w:w="60"/>
+              <w:left w:type="dxa" w:w="100"/>
+              <w:bottom w:type="dxa" w:w="60"/>
+              <w:right w:type="dxa" w:w="100"/>
+            </w:tcMar>
+          </w:tcPr>
+          <w:p>
+            <w:r>
+              <w:rPr>
+                <w:b w:val="false"/>
+                <w:bCs w:val="false"/>
+                <w:sz w:val="18"/>
+                <w:szCs w:val="18"/>
+              </w:rPr>
+              <w:t xml:space="preserve">0,97</w:t>
+            </w:r>
+          </w:p>
+        </w:tc>
+      </w:tr>
+      <w:tr>
+        <w:trPr>
+          <w:tblHeader w:val="off"/>
+        </w:trPr>
+        <w:tc>
+          <w:tcPr>
+            <w:tcW w:type="dxa" w:w="1289"/>
+            <w:tcBorders>
+              <w:top w:val="single" w:color="BBBBBB" w:sz="4"/>
+              <w:left w:val="single" w:color="BBBBBB" w:sz="4"/>
+              <w:bottom w:val="single" w:color="BBBBBB" w:sz="4"/>
+              <w:right w:val="single" w:color="BBBBBB" w:sz="4"/>
+            </w:tcBorders>
+            <w:tcMar>
+              <w:top w:type="dxa" w:w="60"/>
+              <w:left w:type="dxa" w:w="100"/>
+              <w:bottom w:type="dxa" w:w="60"/>
+              <w:right w:type="dxa" w:w="100"/>
+            </w:tcMar>
+          </w:tcPr>
+          <w:p>
+            <w:r>
+              <w:rPr>
+                <w:b w:val="false"/>
+                <w:bCs w:val="false"/>
+                <w:sz w:val="18"/>
+                <w:szCs w:val="18"/>
+              </w:rPr>
+              <w:t xml:space="preserve">3 épocas, campos sorteados + 266 nomes extras (loss final 0,033)</w:t>
+            </w:r>
+          </w:p>
+        </w:tc>
+        <w:tc>
+          <w:tcPr>
+            <w:tcW w:type="dxa" w:w="1289"/>
+            <w:tcBorders>
+              <w:top w:val="single" w:color="BBBBBB" w:sz="4"/>
+              <w:left w:val="single" w:color="BBBBBB" w:sz="4"/>
+              <w:bottom w:val="single" w:color="BBBBBB" w:sz="4"/>
+              <w:right w:val="single" w:color="BBBBBB" w:sz="4"/>
+            </w:tcBorders>
+            <w:tcMar>
+              <w:top w:type="dxa" w:w="60"/>
+              <w:left w:type="dxa" w:w="100"/>
+              <w:bottom w:type="dxa" w:w="60"/>
+              <w:right w:type="dxa" w:w="100"/>
+            </w:tcMar>
+          </w:tcPr>
+          <w:p>
+            <w:r>
+              <w:rPr>
+                <w:b w:val="false"/>
+                <w:bCs w:val="false"/>
+                <w:sz w:val="18"/>
+                <w:szCs w:val="18"/>
+              </w:rPr>
+              <w:t xml:space="preserve">1,0</w:t>
+            </w:r>
+          </w:p>
+        </w:tc>
+        <w:tc>
+          <w:tcPr>
+            <w:tcW w:type="dxa" w:w="1289"/>
+            <w:tcBorders>
+              <w:top w:val="single" w:color="BBBBBB" w:sz="4"/>
+              <w:left w:val="single" w:color="BBBBBB" w:sz="4"/>
+              <w:bottom w:val="single" w:color="BBBBBB" w:sz="4"/>
+              <w:right w:val="single" w:color="BBBBBB" w:sz="4"/>
+            </w:tcBorders>
+            <w:tcMar>
+              <w:top w:type="dxa" w:w="60"/>
+              <w:left w:type="dxa" w:w="100"/>
+              <w:bottom w:type="dxa" w:w="60"/>
+              <w:right w:type="dxa" w:w="100"/>
+            </w:tcMar>
+          </w:tcPr>
+          <w:p>
+            <w:r>
+              <w:rPr>
+                <w:b w:val="false"/>
+                <w:bCs w:val="false"/>
+                <w:sz w:val="18"/>
+                <w:szCs w:val="18"/>
+              </w:rPr>
+              <w:t xml:space="preserve">0,75</w:t>
+            </w:r>
+          </w:p>
+        </w:tc>
+        <w:tc>
+          <w:tcPr>
+            <w:tcW w:type="dxa" w:w="1289"/>
+            <w:tcBorders>
+              <w:top w:val="single" w:color="BBBBBB" w:sz="4"/>
+              <w:left w:val="single" w:color="BBBBBB" w:sz="4"/>
+              <w:bottom w:val="single" w:color="BBBBBB" w:sz="4"/>
+              <w:right w:val="single" w:color="BBBBBB" w:sz="4"/>
+            </w:tcBorders>
+            <w:tcMar>
+              <w:top w:type="dxa" w:w="60"/>
+              <w:left w:type="dxa" w:w="100"/>
+              <w:bottom w:type="dxa" w:w="60"/>
+              <w:right w:type="dxa" w:w="100"/>
+            </w:tcMar>
+          </w:tcPr>
+          <w:p>
+            <w:r>
+              <w:rPr>
+                <w:b w:val="false"/>
+                <w:bCs w:val="false"/>
+                <w:sz w:val="18"/>
+                <w:szCs w:val="18"/>
+              </w:rPr>
+              <w:t xml:space="preserve">0,94</w:t>
+            </w:r>
+          </w:p>
+        </w:tc>
+        <w:tc>
+          <w:tcPr>
+            <w:tcW w:type="dxa" w:w="1289"/>
+            <w:tcBorders>
+              <w:top w:val="single" w:color="BBBBBB" w:sz="4"/>
+              <w:left w:val="single" w:color="BBBBBB" w:sz="4"/>
+              <w:bottom w:val="single" w:color="BBBBBB" w:sz="4"/>
+              <w:right w:val="single" w:color="BBBBBB" w:sz="4"/>
+            </w:tcBorders>
+            <w:tcMar>
+              <w:top w:type="dxa" w:w="60"/>
+              <w:left w:type="dxa" w:w="100"/>
+              <w:bottom w:type="dxa" w:w="60"/>
+              <w:right w:type="dxa" w:w="100"/>
+            </w:tcMar>
+          </w:tcPr>
+          <w:p>
+            <w:r>
+              <w:rPr>
+                <w:b w:val="false"/>
+                <w:bCs w:val="false"/>
+                <w:sz w:val="18"/>
+                <w:szCs w:val="18"/>
+              </w:rPr>
+              <w:t xml:space="preserve">1,0</w:t>
+            </w:r>
+          </w:p>
+        </w:tc>
+        <w:tc>
+          <w:tcPr>
+            <w:tcW w:type="dxa" w:w="1289"/>
+            <w:tcBorders>
+              <w:top w:val="single" w:color="BBBBBB" w:sz="4"/>
+              <w:left w:val="single" w:color="BBBBBB" w:sz="4"/>
+              <w:bottom w:val="single" w:color="BBBBBB" w:sz="4"/>
+              <w:right w:val="single" w:color="BBBBBB" w:sz="4"/>
+            </w:tcBorders>
+            <w:tcMar>
+              <w:top w:type="dxa" w:w="60"/>
+              <w:left w:type="dxa" w:w="100"/>
+              <w:bottom w:type="dxa" w:w="60"/>
+              <w:right w:type="dxa" w:w="100"/>
+            </w:tcMar>
+          </w:tcPr>
+          <w:p>
+            <w:r>
+              <w:rPr>
+                <w:b w:val="false"/>
+                <w:bCs w:val="false"/>
+                <w:sz w:val="18"/>
+                <w:szCs w:val="18"/>
+              </w:rPr>
+              <w:t xml:space="preserve">1,0</w:t>
+            </w:r>
+          </w:p>
+        </w:tc>
+        <w:tc>
+          <w:tcPr>
+            <w:tcW w:type="dxa" w:w="1289"/>
+            <w:tcBorders>
+              <w:top w:val="single" w:color="BBBBBB" w:sz="4"/>
+              <w:left w:val="single" w:color="BBBBBB" w:sz="4"/>
+              <w:bottom w:val="single" w:color="BBBBBB" w:sz="4"/>
+              <w:right w:val="single" w:color="BBBBBB" w:sz="4"/>
+            </w:tcBorders>
+            <w:tcMar>
+              <w:top w:type="dxa" w:w="60"/>
+              <w:left w:type="dxa" w:w="100"/>
+              <w:bottom w:type="dxa" w:w="60"/>
+              <w:right w:type="dxa" w:w="100"/>
+            </w:tcMar>
+          </w:tcPr>
+          <w:p>
+            <w:r>
+              <w:rPr>
+                <w:b w:val="false"/>
+                <w:bCs w:val="false"/>
+                <w:sz w:val="18"/>
+                <w:szCs w:val="18"/>
+              </w:rPr>
+              <w:t xml:space="preserve">1,0</w:t>
             </w:r>
           </w:p>
         </w:tc>
@@ -4105,7 +5095,25 @@
         <w:spacing w:after="120"/>
       </w:pPr>
       <w:r>
-        <w:t xml:space="preserve">Com 1 época o modelo nem aprendeu o formato: a sintaxe quebra em quase todo pedido, não só no delete. O adapter de 3 épocas continua sendo o melhor, e a troca de entidade não vem de excesso de treino.</w:t>
+        <w:t xml:space="preserve">Na primeira, 6 das 9 falhas eram erro de sintaxe em rotas de delete, como </w:t>
+      </w:r>
+      <w:r>
+        <w:rPr>
+          <w:rFonts w:ascii="Consolas" w:cs="Consolas" w:eastAsia="Consolas" w:hAnsi="Consolas"/>
+        </w:rPr>
+        <w:t xml:space="preserve">def deletar_comentario(item_id: int, sessao.query(Membro)):</w:t>
+      </w:r>
+      <w:r>
+        <w:t xml:space="preserve">. A classe também saiu </w:t>
+      </w:r>
+      <w:r>
+        <w:rPr>
+          <w:rFonts w:ascii="Consolas" w:cs="Consolas" w:eastAsia="Consolas" w:hAnsi="Consolas"/>
+        </w:rPr>
+        <w:t xml:space="preserve">Membro</w:t>
+      </w:r>
+      <w:r>
+        <w:t xml:space="preserve">, uma entidade do treino. A primeira hipótese foi excesso de treino, e o SFT de 1 época derrubou essa hipótese: o modelo nem aprendeu o formato.</w:t>
       </w:r>
     </w:p>
     <w:p>
@@ -4113,58 +5121,7 @@
         <w:spacing w:after="120"/>
       </w:pPr>
       <w:r>
-        <w:t xml:space="preserve">A hipótese atual está no dataset. Cada entidade de treino aparecia sempre com o mesmo conjunto de campos, então o modelo pode ter aprendido a reconhecer a entidade pelos campos em vez de copiar o nome da instrução. Diante de uma entidade nova, ele recorre a uma de treino. Isso ainda não foi medido. As mudanças para testar:</w:t>
-      </w:r>
-    </w:p>
-    <w:p>
-      <w:pPr>
-        <w:pStyle w:val="ListParagraph"/>
-        <w:numPr>
-          <w:ilvl w:val="0"/>
-          <w:numId w:val="2"/>
-        </w:numPr>
-      </w:pPr>
-      <w:r>
-        <w:t xml:space="preserve">O gerador agora sorteia o conjunto de campos a cada exemplo de treino. A entidade </w:t>
-      </w:r>
-      <w:r>
-        <w:rPr>
-          <w:rFonts w:ascii="Consolas" w:cs="Consolas" w:eastAsia="Consolas" w:hAnsi="Consolas"/>
-        </w:rPr>
-        <w:t xml:space="preserve">usuario</w:t>
-      </w:r>
-      <w:r>
-        <w:t xml:space="preserve">, por exemplo, aparece com os 14 conjuntos. As entidades de teste mantêm os campos fixos e o split de teste continua byte a byte igual ao medido (mesmo sha256), para que os números sigam comparáveis.</w:t>
-      </w:r>
-    </w:p>
-    <w:p>
-      <w:pPr>
-        <w:pStyle w:val="ListParagraph"/>
-        <w:numPr>
-          <w:ilvl w:val="0"/>
-          <w:numId w:val="2"/>
-        </w:numPr>
-      </w:pPr>
-      <w:r>
-        <w:t xml:space="preserve">O eval ganhou </w:t>
-      </w:r>
-      <w:r>
-        <w:rPr>
-          <w:rFonts w:ascii="Consolas" w:cs="Consolas" w:eastAsia="Consolas" w:hAnsi="Consolas"/>
-        </w:rPr>
-        <w:t xml:space="preserve">entidade_rate</w:t>
-      </w:r>
-      <w:r>
-        <w:t xml:space="preserve">: a classe do model SQLAlchemy precisa ser a da referência. Uma saída com </w:t>
-      </w:r>
-      <w:r>
-        <w:rPr>
-          <w:rFonts w:ascii="Consolas" w:cs="Consolas" w:eastAsia="Consolas" w:hAnsi="Consolas"/>
-        </w:rPr>
-        <w:t xml:space="preserve">class Membro(Base)</w:t>
-      </w:r>
-      <w:r>
-        <w:t xml:space="preserve"> num pedido de comentário agora reprova nessa métrica, mesmo compilando e rodando.</w:t>
+        <w:t xml:space="preserve">A segunda hipótese foi que cada entidade de treino aparecia sempre com os mesmos campos, e o modelo reconheceria a entidade pelos campos. O gerador passou a sortear os campos a cada exemplo, e as entidades de teste mantiveram os campos fixos, com o split de teste byte a byte igual (mesmo sha256). A sintaxe melhorou muito, mas o entidade_rate ficou exatamente em 0,5.</w:t>
       </w:r>
     </w:p>
     <w:p>
@@ -4172,24 +5129,7 @@
         <w:spacing w:after="120"/>
       </w:pPr>
       <w:r>
-        <w:t xml:space="preserve">O próximo passo é refazer o SFT de 3 épocas com o dataset novo, cerca de 40 minutos, e comparar </w:t>
-      </w:r>
-      <w:r>
-        <w:rPr>
-          <w:rFonts w:ascii="Consolas" w:cs="Consolas" w:eastAsia="Consolas" w:hAnsi="Consolas"/>
-        </w:rPr>
-        <w:t xml:space="preserve">entidade_rate</w:t>
-      </w:r>
-      <w:r>
-        <w:t xml:space="preserve"> com o adapter atual.</w:t>
-      </w:r>
-    </w:p>
-    <w:p>
-      <w:pPr>
-        <w:pStyle w:val="Heading1"/>
-      </w:pPr>
-      <w:r>
-        <w:t xml:space="preserve">Problemas encontrados no caminho</w:t>
+        <w:t xml:space="preserve">Separando por entidade, o 0,5 tem uma causa só:</w:t>
       </w:r>
     </w:p>
     <w:tbl>
@@ -4238,7 +5178,7 @@
                 <w:sz w:val="18"/>
                 <w:szCs w:val="18"/>
               </w:rPr>
-              <w:t xml:space="preserve">Problema</w:t>
+              <w:t xml:space="preserve">Pedido</w:t>
             </w:r>
           </w:p>
         </w:tc>
@@ -4267,7 +5207,7 @@
                 <w:sz w:val="18"/>
                 <w:szCs w:val="18"/>
               </w:rPr>
-              <w:t xml:space="preserve">Causa</w:t>
+              <w:t xml:space="preserve">Classe gerada</w:t>
             </w:r>
           </w:p>
         </w:tc>
@@ -4296,7 +5236,7 @@
                 <w:sz w:val="18"/>
                 <w:szCs w:val="18"/>
               </w:rPr>
-              <w:t xml:space="preserve">Correção</w:t>
+              <w:t xml:space="preserve">Função gerada</w:t>
             </w:r>
           </w:p>
         </w:tc>
@@ -4329,7 +5269,7 @@
                 <w:sz w:val="18"/>
                 <w:szCs w:val="18"/>
               </w:rPr>
-              <w:t xml:space="preserve">Conjunto de teste vazio</w:t>
+              <w:t xml:space="preserve">endereco (16)</w:t>
             </w:r>
           </w:p>
         </w:tc>
@@ -4352,31 +5292,22 @@
           <w:p>
             <w:r>
               <w:rPr>
-                <w:b w:val="false"/>
-                <w:bCs w:val="false"/>
-                <w:sz w:val="18"/>
-                <w:szCs w:val="18"/>
-              </w:rPr>
-              <w:t xml:space="preserve">o filtro procurava </w:t>
-            </w:r>
-            <w:r>
-              <w:rPr>
                 <w:rFonts w:ascii="Consolas" w:cs="Consolas" w:eastAsia="Consolas" w:hAnsi="Consolas"/>
                 <w:b w:val="false"/>
                 <w:bCs w:val="false"/>
                 <w:sz w:val="18"/>
                 <w:szCs w:val="18"/>
               </w:rPr>
-              <w:t xml:space="preserve">class comentario</w:t>
-            </w:r>
-            <w:r>
-              <w:rPr>
-                <w:b w:val="false"/>
-                <w:bCs w:val="false"/>
-                <w:sz w:val="18"/>
-                <w:szCs w:val="18"/>
-              </w:rPr>
-              <w:t xml:space="preserve"> em minúsculas</w:t>
+              <w:t xml:space="preserve">Endereco</w:t>
+            </w:r>
+            <w:r>
+              <w:rPr>
+                <w:b w:val="false"/>
+                <w:bCs w:val="false"/>
+                <w:sz w:val="18"/>
+                <w:szCs w:val="18"/>
+              </w:rPr>
+              <w:t xml:space="preserve"> em 16</w:t>
             </w:r>
           </w:p>
         </w:tc>
@@ -4399,31 +5330,22 @@
           <w:p>
             <w:r>
               <w:rPr>
-                <w:b w:val="false"/>
-                <w:bCs w:val="false"/>
-                <w:sz w:val="18"/>
-                <w:szCs w:val="18"/>
-              </w:rPr>
-              <w:t xml:space="preserve">usa o mesmo </w:t>
-            </w:r>
-            <w:r>
-              <w:rPr>
                 <w:rFonts w:ascii="Consolas" w:cs="Consolas" w:eastAsia="Consolas" w:hAnsi="Consolas"/>
                 <w:b w:val="false"/>
                 <w:bCs w:val="false"/>
                 <w:sz w:val="18"/>
                 <w:szCs w:val="18"/>
               </w:rPr>
-              <w:t xml:space="preserve">nome_de_classe</w:t>
-            </w:r>
-            <w:r>
-              <w:rPr>
-                <w:b w:val="false"/>
-                <w:bCs w:val="false"/>
-                <w:sz w:val="18"/>
-                <w:szCs w:val="18"/>
-              </w:rPr>
-              <w:t xml:space="preserve"> do gerador, com teste de regressão</w:t>
+              <w:t xml:space="preserve">deletar_enderco</w:t>
+            </w:r>
+            <w:r>
+              <w:rPr>
+                <w:b w:val="false"/>
+                <w:bCs w:val="false"/>
+                <w:sz w:val="18"/>
+                <w:szCs w:val="18"/>
+              </w:rPr>
+              <w:t xml:space="preserve">, sem um "e", no singular; o plural sai certo</w:t>
             </w:r>
           </w:p>
         </w:tc>
@@ -4456,7 +5378,7 @@
                 <w:sz w:val="18"/>
                 <w:szCs w:val="18"/>
               </w:rPr>
-              <w:t xml:space="preserve">Resposta 422 contada como sucesso na sandbox</w:t>
+              <w:t xml:space="preserve">comentario (16)</w:t>
             </w:r>
           </w:p>
         </w:tc>
@@ -4479,31 +5401,89 @@
           <w:p>
             <w:r>
               <w:rPr>
-                <w:b w:val="false"/>
-                <w:bCs w:val="false"/>
-                <w:sz w:val="18"/>
-                <w:szCs w:val="18"/>
-              </w:rPr>
-              <w:t xml:space="preserve">o filtro de schema de entrada não reconhecia </w:t>
-            </w:r>
-            <w:r>
-              <w:rPr>
                 <w:rFonts w:ascii="Consolas" w:cs="Consolas" w:eastAsia="Consolas" w:hAnsi="Consolas"/>
                 <w:b w:val="false"/>
                 <w:bCs w:val="false"/>
                 <w:sz w:val="18"/>
                 <w:szCs w:val="18"/>
               </w:rPr>
-              <w:t xml:space="preserve">UsuarioCriar</w:t>
-            </w:r>
-            <w:r>
-              <w:rPr>
-                <w:b w:val="false"/>
-                <w:bCs w:val="false"/>
-                <w:sz w:val="18"/>
-                <w:szCs w:val="18"/>
-              </w:rPr>
-              <w:t xml:space="preserve"> com maiúscula</w:t>
+              <w:t xml:space="preserve">Perfil</w:t>
+            </w:r>
+            <w:r>
+              <w:rPr>
+                <w:b w:val="false"/>
+                <w:bCs w:val="false"/>
+                <w:sz w:val="18"/>
+                <w:szCs w:val="18"/>
+              </w:rPr>
+              <w:t xml:space="preserve"> 10, </w:t>
+            </w:r>
+            <w:r>
+              <w:rPr>
+                <w:rFonts w:ascii="Consolas" w:cs="Consolas" w:eastAsia="Consolas" w:hAnsi="Consolas"/>
+                <w:b w:val="false"/>
+                <w:bCs w:val="false"/>
+                <w:sz w:val="18"/>
+                <w:szCs w:val="18"/>
+              </w:rPr>
+              <w:t xml:space="preserve">Paciente</w:t>
+            </w:r>
+            <w:r>
+              <w:rPr>
+                <w:b w:val="false"/>
+                <w:bCs w:val="false"/>
+                <w:sz w:val="18"/>
+                <w:szCs w:val="18"/>
+              </w:rPr>
+              <w:t xml:space="preserve"> 3, </w:t>
+            </w:r>
+            <w:r>
+              <w:rPr>
+                <w:rFonts w:ascii="Consolas" w:cs="Consolas" w:eastAsia="Consolas" w:hAnsi="Consolas"/>
+                <w:b w:val="false"/>
+                <w:bCs w:val="false"/>
+                <w:sz w:val="18"/>
+                <w:szCs w:val="18"/>
+              </w:rPr>
+              <w:t xml:space="preserve">Curso</w:t>
+            </w:r>
+            <w:r>
+              <w:rPr>
+                <w:b w:val="false"/>
+                <w:bCs w:val="false"/>
+                <w:sz w:val="18"/>
+                <w:szCs w:val="18"/>
+              </w:rPr>
+              <w:t xml:space="preserve">, </w:t>
+            </w:r>
+            <w:r>
+              <w:rPr>
+                <w:rFonts w:ascii="Consolas" w:cs="Consolas" w:eastAsia="Consolas" w:hAnsi="Consolas"/>
+                <w:b w:val="false"/>
+                <w:bCs w:val="false"/>
+                <w:sz w:val="18"/>
+                <w:szCs w:val="18"/>
+              </w:rPr>
+              <w:t xml:space="preserve">comenta</w:t>
+            </w:r>
+            <w:r>
+              <w:rPr>
+                <w:b w:val="false"/>
+                <w:bCs w:val="false"/>
+                <w:sz w:val="18"/>
+                <w:szCs w:val="18"/>
+              </w:rPr>
+              <w:t xml:space="preserve">, </w:t>
+            </w:r>
+            <w:r>
+              <w:rPr>
+                <w:rFonts w:ascii="Consolas" w:cs="Consolas" w:eastAsia="Consolas" w:hAnsi="Consolas"/>
+                <w:b w:val="false"/>
+                <w:bCs w:val="false"/>
+                <w:sz w:val="18"/>
+                <w:szCs w:val="18"/>
+              </w:rPr>
+              <w:t xml:space="preserve">miguelonte</w:t>
             </w:r>
           </w:p>
         </w:tc>
@@ -4526,12 +5506,353 @@
           <w:p>
             <w:r>
               <w:rPr>
-                <w:b w:val="false"/>
-                <w:bCs w:val="false"/>
-                <w:sz w:val="18"/>
-                <w:szCs w:val="18"/>
-              </w:rPr>
-              <w:t xml:space="preserve">comparação sem diferenciar caixa</w:t>
+                <w:rFonts w:ascii="Consolas" w:cs="Consolas" w:eastAsia="Consolas" w:hAnsi="Consolas"/>
+                <w:b w:val="false"/>
+                <w:bCs w:val="false"/>
+                <w:sz w:val="18"/>
+                <w:szCs w:val="18"/>
+              </w:rPr>
+              <w:t xml:space="preserve">deletar_comentario</w:t>
+            </w:r>
+            <w:r>
+              <w:rPr>
+                <w:b w:val="false"/>
+                <w:bCs w:val="false"/>
+                <w:sz w:val="18"/>
+                <w:szCs w:val="18"/>
+              </w:rPr>
+              <w:t xml:space="preserve"> certo em 16</w:t>
+            </w:r>
+          </w:p>
+        </w:tc>
+      </w:tr>
+    </w:tbl>
+    <w:p/>
+    <w:p>
+      <w:pPr>
+        <w:spacing w:after="120"/>
+      </w:pPr>
+      <w:r>
+        <w:t xml:space="preserve">O tokenizer v2 explica a diferença. A palavra da instrução e o nome da função usam uma peça só, </w:t>
+      </w:r>
+      <w:r>
+        <w:rPr>
+          <w:rFonts w:ascii="Consolas" w:cs="Consolas" w:eastAsia="Consolas" w:hAnsi="Consolas"/>
+        </w:rPr>
+        <w:t xml:space="preserve">comentario</w:t>
+      </w:r>
+      <w:r>
+        <w:t xml:space="preserve">. A classe vira </w:t>
+      </w:r>
+      <w:r>
+        <w:rPr>
+          <w:rFonts w:ascii="Consolas" w:cs="Consolas" w:eastAsia="Consolas" w:hAnsi="Consolas"/>
+        </w:rPr>
+        <w:t xml:space="preserve">▁Com</w:t>
+      </w:r>
+      <w:r>
+        <w:t xml:space="preserve"> </w:t>
+      </w:r>
+      <w:r>
+        <w:rPr>
+          <w:rFonts w:ascii="Consolas" w:cs="Consolas" w:eastAsia="Consolas" w:hAnsi="Consolas"/>
+        </w:rPr>
+        <w:t xml:space="preserve">enta</w:t>
+      </w:r>
+      <w:r>
+        <w:t xml:space="preserve"> </w:t>
+      </w:r>
+      <w:r>
+        <w:rPr>
+          <w:rFonts w:ascii="Consolas" w:cs="Consolas" w:eastAsia="Consolas" w:hAnsi="Consolas"/>
+        </w:rPr>
+        <w:t xml:space="preserve">rio</w:t>
+      </w:r>
+      <w:r>
+        <w:t xml:space="preserve">, três peças sem nada em comum com a primeira. Com </w:t>
+      </w:r>
+      <w:r>
+        <w:rPr>
+          <w:rFonts w:ascii="Consolas" w:cs="Consolas" w:eastAsia="Consolas" w:hAnsi="Consolas"/>
+        </w:rPr>
+        <w:t xml:space="preserve">endereco</w:t>
+      </w:r>
+      <w:r>
+        <w:t xml:space="preserve"> acontece o mesmo (</w:t>
+      </w:r>
+      <w:r>
+        <w:rPr>
+          <w:rFonts w:ascii="Consolas" w:cs="Consolas" w:eastAsia="Consolas" w:hAnsi="Consolas"/>
+        </w:rPr>
+        <w:t xml:space="preserve">▁Ende</w:t>
+      </w:r>
+      <w:r>
+        <w:t xml:space="preserve"> </w:t>
+      </w:r>
+      <w:r>
+        <w:rPr>
+          <w:rFonts w:ascii="Consolas" w:cs="Consolas" w:eastAsia="Consolas" w:hAnsi="Consolas"/>
+        </w:rPr>
+        <w:t xml:space="preserve">reco</w:t>
+      </w:r>
+      <w:r>
+        <w:t xml:space="preserve">), e mesmo assim ele acerta. A frequência no corpus do CPT não separa os dois casos: </w:t>
+      </w:r>
+      <w:r>
+        <w:rPr>
+          <w:rFonts w:ascii="Consolas" w:cs="Consolas" w:eastAsia="Consolas" w:hAnsi="Consolas"/>
+        </w:rPr>
+        <w:t xml:space="preserve">Comentario</w:t>
+      </w:r>
+      <w:r>
+        <w:t xml:space="preserve"> aparece 94 vezes e </w:t>
+      </w:r>
+      <w:r>
+        <w:rPr>
+          <w:rFonts w:ascii="Consolas" w:cs="Consolas" w:eastAsia="Consolas" w:hAnsi="Consolas"/>
+        </w:rPr>
+        <w:t xml:space="preserve">Endereco</w:t>
+      </w:r>
+      <w:r>
+        <w:t xml:space="preserve"> 146. O SFT ensinava a tradução de minúscula para classe entidade por entidade, e numa entidade inédita ela só funciona quando o caminho de peças já é provável por acaso.</w:t>
+      </w:r>
+    </w:p>
+    <w:p>
+      <w:pPr>
+        <w:spacing w:after="120"/>
+      </w:pPr>
+      <w:r>
+        <w:t xml:space="preserve">A primeira mudança foi dar ao SFT 266 nomes extras de entidade, com 6 exemplos sorteados cada (</w:t>
+      </w:r>
+      <w:r>
+        <w:rPr>
+          <w:rFonts w:ascii="Consolas" w:cs="Consolas" w:eastAsia="Consolas" w:hAnsi="Consolas"/>
+        </w:rPr>
+        <w:t xml:space="preserve">scripts/nomes_entidades.py</w:t>
+      </w:r>
+      <w:r>
+        <w:t xml:space="preserve">). O treino passou de 2.336 para 3.932 exemplos, e o split de teste não mudou. Com centenas de pares de minúscula e classe, o modelo tem mais chance de aprender a regra em vez de decorar a tabela.</w:t>
+      </w:r>
+    </w:p>
+    <w:p>
+      <w:pPr>
+        <w:spacing w:after="120"/>
+      </w:pPr>
+      <w:r>
+        <w:t xml:space="preserve">O entidade_rate subiu de 0,5 para 0,75, e o defeito do </w:t>
+      </w:r>
+      <w:r>
+        <w:rPr>
+          <w:rFonts w:ascii="Consolas" w:cs="Consolas" w:eastAsia="Consolas" w:hAnsi="Consolas"/>
+        </w:rPr>
+        <w:t xml:space="preserve">enderco</w:t>
+      </w:r>
+      <w:r>
+        <w:t xml:space="preserve"> sumiu. </w:t>
+      </w:r>
+      <w:r>
+        <w:rPr>
+          <w:rFonts w:ascii="Consolas" w:cs="Consolas" w:eastAsia="Consolas" w:hAnsi="Consolas"/>
+        </w:rPr>
+        <w:t xml:space="preserve">Endereco</w:t>
+      </w:r>
+      <w:r>
+        <w:t xml:space="preserve"> continua certo em 16 de 16. </w:t>
+      </w:r>
+      <w:r>
+        <w:rPr>
+          <w:rFonts w:ascii="Consolas" w:cs="Consolas" w:eastAsia="Consolas" w:hAnsi="Consolas"/>
+        </w:rPr>
+        <w:t xml:space="preserve">Comentario</w:t>
+      </w:r>
+      <w:r>
+        <w:t xml:space="preserve"> sai certo em 8 de 16, e os outros 8 saem </w:t>
+      </w:r>
+      <w:r>
+        <w:rPr>
+          <w:rFonts w:ascii="Consolas" w:cs="Consolas" w:eastAsia="Consolas" w:hAnsi="Consolas"/>
+        </w:rPr>
+        <w:t xml:space="preserve">Contato</w:t>
+      </w:r>
+      <w:r>
+        <w:t xml:space="preserve">, um dos nomes extras. A classe certa e a errada começam com peças parecidas (</w:t>
+      </w:r>
+      <w:r>
+        <w:rPr>
+          <w:rFonts w:ascii="Consolas" w:cs="Consolas" w:eastAsia="Consolas" w:hAnsi="Consolas"/>
+        </w:rPr>
+        <w:t xml:space="preserve">▁Com</w:t>
+      </w:r>
+      <w:r>
+        <w:t xml:space="preserve"> e </w:t>
+      </w:r>
+      <w:r>
+        <w:rPr>
+          <w:rFonts w:ascii="Consolas" w:cs="Consolas" w:eastAsia="Consolas" w:hAnsi="Consolas"/>
+        </w:rPr>
+        <w:t xml:space="preserve">▁Con</w:t>
+      </w:r>
+      <w:r>
+        <w:t xml:space="preserve">). Os erros se concentram nos pedidos de listar, que trazem só o plural </w:t>
+      </w:r>
+      <w:r>
+        <w:rPr>
+          <w:rFonts w:ascii="Consolas" w:cs="Consolas" w:eastAsia="Consolas" w:hAnsi="Consolas"/>
+        </w:rPr>
+        <w:t xml:space="preserve">comentarios</w:t>
+      </w:r>
+      <w:r>
+        <w:t xml:space="preserve"> na instrução.</w:t>
+      </w:r>
+    </w:p>
+    <w:p>
+      <w:pPr>
+        <w:spacing w:after="120"/>
+      </w:pPr>
+      <w:r>
+        <w:t xml:space="preserve">Com só duas entidades de teste, a diferença entre 0,5 e 0,75 é de 8 pedidos de uma única entidade, pouco para escolher entre estratégias. O próximo passo é separar mais entidades inéditas para o teste antes de decidir se vale a correção estrutural: o tokenizer marcar a maiúscula com uma peça própria, de modo que </w:t>
+      </w:r>
+      <w:r>
+        <w:rPr>
+          <w:rFonts w:ascii="Consolas" w:cs="Consolas" w:eastAsia="Consolas" w:hAnsi="Consolas"/>
+        </w:rPr>
+        <w:t xml:space="preserve">Comentario</w:t>
+      </w:r>
+      <w:r>
+        <w:t xml:space="preserve"> vire </w:t>
+      </w:r>
+      <w:r>
+        <w:rPr>
+          <w:rFonts w:ascii="Consolas" w:cs="Consolas" w:eastAsia="Consolas" w:hAnsi="Consolas"/>
+        </w:rPr>
+        <w:t xml:space="preserve">&lt;maiúscula&gt;</w:t>
+      </w:r>
+      <w:r>
+        <w:t xml:space="preserve"> seguido da mesma peça </w:t>
+      </w:r>
+      <w:r>
+        <w:rPr>
+          <w:rFonts w:ascii="Consolas" w:cs="Consolas" w:eastAsia="Consolas" w:hAnsi="Consolas"/>
+        </w:rPr>
+        <w:t xml:space="preserve">comentario</w:t>
+      </w:r>
+      <w:r>
+        <w:t xml:space="preserve"> da instrução. Isso tornaria a classe uma cópia, mas exige refazer o tokenizer e o CPT e passa a precisar de um passo de decodificação fora do modelo.</w:t>
+      </w:r>
+    </w:p>
+    <w:p>
+      <w:pPr>
+        <w:pStyle w:val="Heading1"/>
+      </w:pPr>
+      <w:r>
+        <w:t xml:space="preserve">Problemas encontrados no caminho</w:t>
+      </w:r>
+    </w:p>
+    <w:tbl>
+      <w:tblPr>
+        <w:tblW w:type="dxa" w:w="9024"/>
+        <w:tblBorders>
+          <w:top w:val="single" w:color="auto" w:sz="4"/>
+          <w:left w:val="single" w:color="auto" w:sz="4"/>
+          <w:bottom w:val="single" w:color="auto" w:sz="4"/>
+          <w:right w:val="single" w:color="auto" w:sz="4"/>
+          <w:insideH w:val="single" w:color="auto" w:sz="4"/>
+          <w:insideV w:val="single" w:color="auto" w:sz="4"/>
+        </w:tblBorders>
+      </w:tblPr>
+      <w:tblGrid>
+        <w:gridCol w:w="3008"/>
+        <w:gridCol w:w="3008"/>
+        <w:gridCol w:w="3008"/>
+      </w:tblGrid>
+      <w:tr>
+        <w:trPr>
+          <w:tblHeader/>
+        </w:trPr>
+        <w:tc>
+          <w:tcPr>
+            <w:tcW w:type="dxa" w:w="3008"/>
+            <w:tcBorders>
+              <w:top w:val="single" w:color="BBBBBB" w:sz="4"/>
+              <w:left w:val="single" w:color="BBBBBB" w:sz="4"/>
+              <w:bottom w:val="single" w:color="BBBBBB" w:sz="4"/>
+              <w:right w:val="single" w:color="BBBBBB" w:sz="4"/>
+            </w:tcBorders>
+            <w:shd w:fill="E8EEF4" w:val="clear"/>
+            <w:tcMar>
+              <w:top w:type="dxa" w:w="60"/>
+              <w:left w:type="dxa" w:w="100"/>
+              <w:bottom w:type="dxa" w:w="60"/>
+              <w:right w:type="dxa" w:w="100"/>
+            </w:tcMar>
+          </w:tcPr>
+          <w:p>
+            <w:r>
+              <w:rPr>
+                <w:b/>
+                <w:bCs/>
+                <w:sz w:val="18"/>
+                <w:szCs w:val="18"/>
+              </w:rPr>
+              <w:t xml:space="preserve">Problema</w:t>
+            </w:r>
+          </w:p>
+        </w:tc>
+        <w:tc>
+          <w:tcPr>
+            <w:tcW w:type="dxa" w:w="3008"/>
+            <w:tcBorders>
+              <w:top w:val="single" w:color="BBBBBB" w:sz="4"/>
+              <w:left w:val="single" w:color="BBBBBB" w:sz="4"/>
+              <w:bottom w:val="single" w:color="BBBBBB" w:sz="4"/>
+              <w:right w:val="single" w:color="BBBBBB" w:sz="4"/>
+            </w:tcBorders>
+            <w:shd w:fill="E8EEF4" w:val="clear"/>
+            <w:tcMar>
+              <w:top w:type="dxa" w:w="60"/>
+              <w:left w:type="dxa" w:w="100"/>
+              <w:bottom w:type="dxa" w:w="60"/>
+              <w:right w:type="dxa" w:w="100"/>
+            </w:tcMar>
+          </w:tcPr>
+          <w:p>
+            <w:r>
+              <w:rPr>
+                <w:b/>
+                <w:bCs/>
+                <w:sz w:val="18"/>
+                <w:szCs w:val="18"/>
+              </w:rPr>
+              <w:t xml:space="preserve">Causa</w:t>
+            </w:r>
+          </w:p>
+        </w:tc>
+        <w:tc>
+          <w:tcPr>
+            <w:tcW w:type="dxa" w:w="3008"/>
+            <w:tcBorders>
+              <w:top w:val="single" w:color="BBBBBB" w:sz="4"/>
+              <w:left w:val="single" w:color="BBBBBB" w:sz="4"/>
+              <w:bottom w:val="single" w:color="BBBBBB" w:sz="4"/>
+              <w:right w:val="single" w:color="BBBBBB" w:sz="4"/>
+            </w:tcBorders>
+            <w:shd w:fill="E8EEF4" w:val="clear"/>
+            <w:tcMar>
+              <w:top w:type="dxa" w:w="60"/>
+              <w:left w:type="dxa" w:w="100"/>
+              <w:bottom w:type="dxa" w:w="60"/>
+              <w:right w:type="dxa" w:w="100"/>
+            </w:tcMar>
+          </w:tcPr>
+          <w:p>
+            <w:r>
+              <w:rPr>
+                <w:b/>
+                <w:bCs/>
+                <w:sz w:val="18"/>
+                <w:szCs w:val="18"/>
+              </w:rPr>
+              <w:t xml:space="preserve">Correção</w:t>
             </w:r>
           </w:p>
         </w:tc>
@@ -4564,7 +5885,7 @@
                 <w:sz w:val="18"/>
                 <w:szCs w:val="18"/>
               </w:rPr>
-              <w:t xml:space="preserve">Erro ao expandir o embedding</w:t>
+              <w:t xml:space="preserve">Conjunto de teste vazio</w:t>
             </w:r>
           </w:p>
         </w:tc>
@@ -4592,7 +5913,26 @@
                 <w:sz w:val="18"/>
                 <w:szCs w:val="18"/>
               </w:rPr>
-              <w:t xml:space="preserve">matriz com 64.128 linhas, não 64.000</w:t>
+              <w:t xml:space="preserve">o filtro procurava </w:t>
+            </w:r>
+            <w:r>
+              <w:rPr>
+                <w:rFonts w:ascii="Consolas" w:cs="Consolas" w:eastAsia="Consolas" w:hAnsi="Consolas"/>
+                <w:b w:val="false"/>
+                <w:bCs w:val="false"/>
+                <w:sz w:val="18"/>
+                <w:szCs w:val="18"/>
+              </w:rPr>
+              <w:t xml:space="preserve">class comentario</w:t>
+            </w:r>
+            <w:r>
+              <w:rPr>
+                <w:b w:val="false"/>
+                <w:bCs w:val="false"/>
+                <w:sz w:val="18"/>
+                <w:szCs w:val="18"/>
+              </w:rPr>
+              <w:t xml:space="preserve"> em minúsculas</w:t>
             </w:r>
           </w:p>
         </w:tc>
@@ -4620,7 +5960,26 @@
                 <w:sz w:val="18"/>
                 <w:szCs w:val="18"/>
               </w:rPr>
-              <w:t xml:space="preserve">aceita o preenchimento, recusa só matriz menor</w:t>
+              <w:t xml:space="preserve">usa o mesmo </w:t>
+            </w:r>
+            <w:r>
+              <w:rPr>
+                <w:rFonts w:ascii="Consolas" w:cs="Consolas" w:eastAsia="Consolas" w:hAnsi="Consolas"/>
+                <w:b w:val="false"/>
+                <w:bCs w:val="false"/>
+                <w:sz w:val="18"/>
+                <w:szCs w:val="18"/>
+              </w:rPr>
+              <w:t xml:space="preserve">nome_de_classe</w:t>
+            </w:r>
+            <w:r>
+              <w:rPr>
+                <w:b w:val="false"/>
+                <w:bCs w:val="false"/>
+                <w:sz w:val="18"/>
+                <w:szCs w:val="18"/>
+              </w:rPr>
+              <w:t xml:space="preserve"> do gerador, com teste de regressão</w:t>
             </w:r>
           </w:p>
         </w:tc>
@@ -4653,6 +6012,203 @@
                 <w:sz w:val="18"/>
                 <w:szCs w:val="18"/>
               </w:rPr>
+              <w:t xml:space="preserve">Resposta 422 contada como sucesso na sandbox</w:t>
+            </w:r>
+          </w:p>
+        </w:tc>
+        <w:tc>
+          <w:tcPr>
+            <w:tcW w:type="dxa" w:w="3008"/>
+            <w:tcBorders>
+              <w:top w:val="single" w:color="BBBBBB" w:sz="4"/>
+              <w:left w:val="single" w:color="BBBBBB" w:sz="4"/>
+              <w:bottom w:val="single" w:color="BBBBBB" w:sz="4"/>
+              <w:right w:val="single" w:color="BBBBBB" w:sz="4"/>
+            </w:tcBorders>
+            <w:tcMar>
+              <w:top w:type="dxa" w:w="60"/>
+              <w:left w:type="dxa" w:w="100"/>
+              <w:bottom w:type="dxa" w:w="60"/>
+              <w:right w:type="dxa" w:w="100"/>
+            </w:tcMar>
+          </w:tcPr>
+          <w:p>
+            <w:r>
+              <w:rPr>
+                <w:b w:val="false"/>
+                <w:bCs w:val="false"/>
+                <w:sz w:val="18"/>
+                <w:szCs w:val="18"/>
+              </w:rPr>
+              <w:t xml:space="preserve">o filtro de schema de entrada não reconhecia </w:t>
+            </w:r>
+            <w:r>
+              <w:rPr>
+                <w:rFonts w:ascii="Consolas" w:cs="Consolas" w:eastAsia="Consolas" w:hAnsi="Consolas"/>
+                <w:b w:val="false"/>
+                <w:bCs w:val="false"/>
+                <w:sz w:val="18"/>
+                <w:szCs w:val="18"/>
+              </w:rPr>
+              <w:t xml:space="preserve">UsuarioCriar</w:t>
+            </w:r>
+            <w:r>
+              <w:rPr>
+                <w:b w:val="false"/>
+                <w:bCs w:val="false"/>
+                <w:sz w:val="18"/>
+                <w:szCs w:val="18"/>
+              </w:rPr>
+              <w:t xml:space="preserve"> com maiúscula</w:t>
+            </w:r>
+          </w:p>
+        </w:tc>
+        <w:tc>
+          <w:tcPr>
+            <w:tcW w:type="dxa" w:w="3008"/>
+            <w:tcBorders>
+              <w:top w:val="single" w:color="BBBBBB" w:sz="4"/>
+              <w:left w:val="single" w:color="BBBBBB" w:sz="4"/>
+              <w:bottom w:val="single" w:color="BBBBBB" w:sz="4"/>
+              <w:right w:val="single" w:color="BBBBBB" w:sz="4"/>
+            </w:tcBorders>
+            <w:tcMar>
+              <w:top w:type="dxa" w:w="60"/>
+              <w:left w:type="dxa" w:w="100"/>
+              <w:bottom w:type="dxa" w:w="60"/>
+              <w:right w:type="dxa" w:w="100"/>
+            </w:tcMar>
+          </w:tcPr>
+          <w:p>
+            <w:r>
+              <w:rPr>
+                <w:b w:val="false"/>
+                <w:bCs w:val="false"/>
+                <w:sz w:val="18"/>
+                <w:szCs w:val="18"/>
+              </w:rPr>
+              <w:t xml:space="preserve">comparação sem diferenciar caixa</w:t>
+            </w:r>
+          </w:p>
+        </w:tc>
+      </w:tr>
+      <w:tr>
+        <w:trPr>
+          <w:tblHeader w:val="off"/>
+        </w:trPr>
+        <w:tc>
+          <w:tcPr>
+            <w:tcW w:type="dxa" w:w="3008"/>
+            <w:tcBorders>
+              <w:top w:val="single" w:color="BBBBBB" w:sz="4"/>
+              <w:left w:val="single" w:color="BBBBBB" w:sz="4"/>
+              <w:bottom w:val="single" w:color="BBBBBB" w:sz="4"/>
+              <w:right w:val="single" w:color="BBBBBB" w:sz="4"/>
+            </w:tcBorders>
+            <w:tcMar>
+              <w:top w:type="dxa" w:w="60"/>
+              <w:left w:type="dxa" w:w="100"/>
+              <w:bottom w:type="dxa" w:w="60"/>
+              <w:right w:type="dxa" w:w="100"/>
+            </w:tcMar>
+          </w:tcPr>
+          <w:p>
+            <w:r>
+              <w:rPr>
+                <w:b w:val="false"/>
+                <w:bCs w:val="false"/>
+                <w:sz w:val="18"/>
+                <w:szCs w:val="18"/>
+              </w:rPr>
+              <w:t xml:space="preserve">Erro ao expandir o embedding</w:t>
+            </w:r>
+          </w:p>
+        </w:tc>
+        <w:tc>
+          <w:tcPr>
+            <w:tcW w:type="dxa" w:w="3008"/>
+            <w:tcBorders>
+              <w:top w:val="single" w:color="BBBBBB" w:sz="4"/>
+              <w:left w:val="single" w:color="BBBBBB" w:sz="4"/>
+              <w:bottom w:val="single" w:color="BBBBBB" w:sz="4"/>
+              <w:right w:val="single" w:color="BBBBBB" w:sz="4"/>
+            </w:tcBorders>
+            <w:tcMar>
+              <w:top w:type="dxa" w:w="60"/>
+              <w:left w:type="dxa" w:w="100"/>
+              <w:bottom w:type="dxa" w:w="60"/>
+              <w:right w:type="dxa" w:w="100"/>
+            </w:tcMar>
+          </w:tcPr>
+          <w:p>
+            <w:r>
+              <w:rPr>
+                <w:b w:val="false"/>
+                <w:bCs w:val="false"/>
+                <w:sz w:val="18"/>
+                <w:szCs w:val="18"/>
+              </w:rPr>
+              <w:t xml:space="preserve">matriz com 64.128 linhas, não 64.000</w:t>
+            </w:r>
+          </w:p>
+        </w:tc>
+        <w:tc>
+          <w:tcPr>
+            <w:tcW w:type="dxa" w:w="3008"/>
+            <w:tcBorders>
+              <w:top w:val="single" w:color="BBBBBB" w:sz="4"/>
+              <w:left w:val="single" w:color="BBBBBB" w:sz="4"/>
+              <w:bottom w:val="single" w:color="BBBBBB" w:sz="4"/>
+              <w:right w:val="single" w:color="BBBBBB" w:sz="4"/>
+            </w:tcBorders>
+            <w:tcMar>
+              <w:top w:type="dxa" w:w="60"/>
+              <w:left w:type="dxa" w:w="100"/>
+              <w:bottom w:type="dxa" w:w="60"/>
+              <w:right w:type="dxa" w:w="100"/>
+            </w:tcMar>
+          </w:tcPr>
+          <w:p>
+            <w:r>
+              <w:rPr>
+                <w:b w:val="false"/>
+                <w:bCs w:val="false"/>
+                <w:sz w:val="18"/>
+                <w:szCs w:val="18"/>
+              </w:rPr>
+              <w:t xml:space="preserve">aceita o preenchimento, recusa só matriz menor</w:t>
+            </w:r>
+          </w:p>
+        </w:tc>
+      </w:tr>
+      <w:tr>
+        <w:trPr>
+          <w:tblHeader w:val="off"/>
+        </w:trPr>
+        <w:tc>
+          <w:tcPr>
+            <w:tcW w:type="dxa" w:w="3008"/>
+            <w:tcBorders>
+              <w:top w:val="single" w:color="BBBBBB" w:sz="4"/>
+              <w:left w:val="single" w:color="BBBBBB" w:sz="4"/>
+              <w:bottom w:val="single" w:color="BBBBBB" w:sz="4"/>
+              <w:right w:val="single" w:color="BBBBBB" w:sz="4"/>
+            </w:tcBorders>
+            <w:tcMar>
+              <w:top w:type="dxa" w:w="60"/>
+              <w:left w:type="dxa" w:w="100"/>
+              <w:bottom w:type="dxa" w:w="60"/>
+              <w:right w:type="dxa" w:w="100"/>
+            </w:tcMar>
+          </w:tcPr>
+          <w:p>
+            <w:r>
+              <w:rPr>
+                <w:b w:val="false"/>
+                <w:bCs w:val="false"/>
+                <w:sz w:val="18"/>
+                <w:szCs w:val="18"/>
+              </w:rPr>
               <w:t xml:space="preserve">JSON quebrado na linha 3.131 do corpus</w:t>
             </w:r>
           </w:p>
@@ -4701,8 +6257,7 @@
                 <w:sz w:val="18"/>
                 <w:szCs w:val="18"/>
               </w:rPr>
-              <w:t xml:space="preserve"> -</w:t>
+              <w:t xml:space="preserve">\u2028</w:t>
             </w:r>
             <w:r>
               <w:rPr>
@@ -4869,7 +6424,7 @@
           <w:numId w:val="2"/>
         </w:numPr>
       </w:pPr>
-      <w:hyperlink w:history="1" r:id="rIdiij6wv5a22mfnzfdgyo-a">
+      <w:hyperlink w:history="1" r:id="rIdwla0njmz9h_sm4th5fgnf">
         <w:r>
           <w:rPr>
             <w:rStyle w:val="Hyperlink"/>
@@ -4889,7 +6444,7 @@
           <w:numId w:val="2"/>
         </w:numPr>
       </w:pPr>
-      <w:hyperlink w:history="1" r:id="rIdzxrw8posex1swtco7-qxs">
+      <w:hyperlink w:history="1" r:id="rIdlsnompe_bvthnh4hlin2i">
         <w:r>
           <w:rPr>
             <w:rStyle w:val="Hyperlink"/>
@@ -4909,7 +6464,7 @@
           <w:numId w:val="2"/>
         </w:numPr>
       </w:pPr>
-      <w:hyperlink w:history="1" r:id="rIdjydqoafrd5w8ifspczsux">
+      <w:hyperlink w:history="1" r:id="rIdsj-zjde7fjqdoiclud9gy">
         <w:r>
           <w:rPr>
             <w:rStyle w:val="Hyperlink"/>
@@ -4935,7 +6490,7 @@
           <w:numId w:val="2"/>
         </w:numPr>
       </w:pPr>
-      <w:hyperlink w:history="1" r:id="rIdk3fvuyhtnuoctrj04tfai">
+      <w:hyperlink w:history="1" r:id="rId6rbe6ovmyc8k_8bytptcq">
         <w:r>
           <w:rPr>
             <w:rStyle w:val="Hyperlink"/>
@@ -4958,7 +6513,7 @@
       <w:r>
         <w:t xml:space="preserve">Gururangan et al., </w:t>
       </w:r>
-      <w:hyperlink w:history="1" r:id="rIdbdrzd5kzocbiqnmcssu5z">
+      <w:hyperlink w:history="1" r:id="rIdhfhrlhxohwn4zps1jerhd">
         <w:r>
           <w:rPr>
             <w:rStyle w:val="Hyperlink"/>
@@ -4981,7 +6536,7 @@
       <w:r>
         <w:t xml:space="preserve">Hu et al., </w:t>
       </w:r>
-      <w:hyperlink w:history="1" r:id="rIdch21w3uhnzoyu99lgnbps">
+      <w:hyperlink w:history="1" r:id="rIdxojttblfpl_hhqy1ffqmo">
         <w:r>
           <w:rPr>
             <w:rStyle w:val="Hyperlink"/>
@@ -5004,7 +6559,7 @@
       <w:r>
         <w:t xml:space="preserve">Dettmers et al., </w:t>
       </w:r>
-      <w:hyperlink w:history="1" r:id="rIdx6wkyukmvs33-ksaxxhm6">
+      <w:hyperlink w:history="1" r:id="rIdj9ie0rsofjch3za5ud1zz">
         <w:r>
           <w:rPr>
             <w:rStyle w:val="Hyperlink"/>
@@ -5027,7 +6582,7 @@
       <w:r>
         <w:t xml:space="preserve">Kudo e Richardson, </w:t>
       </w:r>
-      <w:hyperlink w:history="1" r:id="rId9_enjj4x1cnl8mtissiyk">
+      <w:hyperlink w:history="1" r:id="rIdztrusy5grthcalezcf0_c">
         <w:r>
           <w:rPr>
             <w:rStyle w:val="Hyperlink"/>

</xml_diff>

<commit_message>
Registra o resultado dos tres adapters no teste amplo
</commit_message>
<xml_diff>
--- a/docs/treino_cased.docx
+++ b/docs/treino_cased.docx
@@ -31,52 +31,7 @@
         <w:spacing w:after="120"/>
       </w:pPr>
       <w:r>
-        <w:t xml:space="preserve">Depois de um pré-treino continuado grande e de um ajuste fino com QLoRA, o Manacá-1B escreve uma API FastAPI + SQLAlchemy em português, com a caixa certa e sem nenhum script de conserto depois. Nos 32 pedidos de teste, sobre duas entidades que o modelo nunca viu no treino, todas as respostas compilam, sobem e passam nas requisições do teste. O que ainda falta é o nome da classe: com </w:t>
-      </w:r>
-      <w:r>
-        <w:rPr>
-          <w:rFonts w:ascii="Consolas" w:cs="Consolas" w:eastAsia="Consolas" w:hAnsi="Consolas"/>
-        </w:rPr>
-        <w:t xml:space="preserve">endereco</w:t>
-      </w:r>
-      <w:r>
-        <w:t xml:space="preserve"> ele acerta </w:t>
-      </w:r>
-      <w:r>
-        <w:rPr>
-          <w:rFonts w:ascii="Consolas" w:cs="Consolas" w:eastAsia="Consolas" w:hAnsi="Consolas"/>
-        </w:rPr>
-        <w:t xml:space="preserve">Endereco</w:t>
-      </w:r>
-      <w:r>
-        <w:t xml:space="preserve"> em todos os pedidos, com </w:t>
-      </w:r>
-      <w:r>
-        <w:rPr>
-          <w:rFonts w:ascii="Consolas" w:cs="Consolas" w:eastAsia="Consolas" w:hAnsi="Consolas"/>
-        </w:rPr>
-        <w:t xml:space="preserve">comentario</w:t>
-      </w:r>
-      <w:r>
-        <w:t xml:space="preserve"> acerta </w:t>
-      </w:r>
-      <w:r>
-        <w:rPr>
-          <w:rFonts w:ascii="Consolas" w:cs="Consolas" w:eastAsia="Consolas" w:hAnsi="Consolas"/>
-        </w:rPr>
-        <w:t xml:space="preserve">Comentario</w:t>
-      </w:r>
-      <w:r>
-        <w:t xml:space="preserve"> em metade e escreve </w:t>
-      </w:r>
-      <w:r>
-        <w:rPr>
-          <w:rFonts w:ascii="Consolas" w:cs="Consolas" w:eastAsia="Consolas" w:hAnsi="Consolas"/>
-        </w:rPr>
-        <w:t xml:space="preserve">Contato</w:t>
-      </w:r>
-      <w:r>
-        <w:t xml:space="preserve"> na outra metade.</w:t>
+        <w:t xml:space="preserve">Depois de um pré-treino continuado grande e de um ajuste fino com QLoRA, o Manacá-1B escreve uma API FastAPI + SQLAlchemy em português, com a caixa certa e sem nenhum script de conserto depois. Nos 32 pedidos de teste, sobre duas entidades que o modelo nunca viu no treino, todas as respostas compilam, sobem e passam nas requisições do teste. Num teste mais amplo, com 12 entidades inéditas, esses números caem para 81% e 75%, e a classe sai com o nome certo em só 29% dos pedidos. O nome da classe é o problema em aberto.</w:t>
       </w:r>
     </w:p>
     <w:tbl>
@@ -1539,7 +1494,7 @@
       <w:r>
         <w:t xml:space="preserve">O ponto de partida é o </w:t>
       </w:r>
-      <w:hyperlink w:history="1" r:id="rIdh0_xpig-b6r_qnm9shinh">
+      <w:hyperlink w:history="1" r:id="rId9cb_loa4durckkufuib8o">
         <w:r>
           <w:rPr>
             <w:rStyle w:val="Hyperlink"/>
@@ -2127,7 +2082,7 @@
             </w:tcMar>
           </w:tcPr>
           <w:p>
-            <w:hyperlink w:history="1" r:id="rIdtz4gioecv73_pv6kpqsh5">
+            <w:hyperlink w:history="1" r:id="rIdri6zn0wbgcnxrrjol9kay">
               <w:r>
                 <w:rPr>
                   <w:rStyle w:val="Hyperlink"/>
@@ -2305,7 +2260,7 @@
             </w:tcMar>
           </w:tcPr>
           <w:p>
-            <w:hyperlink w:history="1" r:id="rId11xav3balw2s_ci0xtn6w">
+            <w:hyperlink w:history="1" r:id="rIdy9ybokwgsr4hmuab2oher">
               <w:r>
                 <w:rPr>
                   <w:rStyle w:val="Hyperlink"/>
@@ -2425,7 +2380,7 @@
             </w:tcMar>
           </w:tcPr>
           <w:p>
-            <w:hyperlink w:history="1" r:id="rIdycsa1y5ws0xwcovomkcmc">
+            <w:hyperlink w:history="1" r:id="rIdykyhr6mkz8qg5kseard3g">
               <w:r>
                 <w:rPr>
                   <w:rStyle w:val="Hyperlink"/>
@@ -5710,7 +5665,770 @@
         <w:spacing w:after="120"/>
       </w:pPr>
       <w:r>
-        <w:t xml:space="preserve">Com só duas entidades de teste, a diferença entre 0,5 e 0,75 é de 8 pedidos de uma única entidade, pouco para escolher entre estratégias. O próximo passo é separar mais entidades inéditas para o teste antes de decidir se vale a correção estrutural: o tokenizer marcar a maiúscula com uma peça própria, de modo que </w:t>
+        <w:t xml:space="preserve">Com só duas entidades de teste, a diferença entre 0,5 e 0,75 era de 8 pedidos de uma única entidade. Por isso entrou um teste amplo (</w:t>
+      </w:r>
+      <w:r>
+        <w:rPr>
+          <w:rFonts w:ascii="Consolas" w:cs="Consolas" w:eastAsia="Consolas" w:hAnsi="Consolas"/>
+        </w:rPr>
+        <w:t xml:space="preserve">data/fastapi_ptbr_teste_amplo.jsonl</w:t>
+      </w:r>
+      <w:r>
+        <w:t xml:space="preserve">): o teste original mais 10 entidades que nunca entram no treino, 182 pedidos distintos. Sete das 10 classes novas nunca aparecem como </w:t>
+      </w:r>
+      <w:r>
+        <w:rPr>
+          <w:rFonts w:ascii="Consolas" w:cs="Consolas" w:eastAsia="Consolas" w:hAnsi="Consolas"/>
+        </w:rPr>
+        <w:t xml:space="preserve">class X(</w:t>
+      </w:r>
+      <w:r>
+        <w:t xml:space="preserve"> no corpus do CPT, e as outras três aparecem no máximo duas vezes. Como o treino não mudou, os três adapters foram medidos de novo sem treinar nada:</w:t>
+      </w:r>
+    </w:p>
+    <w:tbl>
+      <w:tblPr>
+        <w:tblW w:type="dxa" w:w="9024"/>
+        <w:tblBorders>
+          <w:top w:val="single" w:color="auto" w:sz="4"/>
+          <w:left w:val="single" w:color="auto" w:sz="4"/>
+          <w:bottom w:val="single" w:color="auto" w:sz="4"/>
+          <w:right w:val="single" w:color="auto" w:sz="4"/>
+          <w:insideH w:val="single" w:color="auto" w:sz="4"/>
+          <w:insideV w:val="single" w:color="auto" w:sz="4"/>
+        </w:tblBorders>
+      </w:tblPr>
+      <w:tblGrid>
+        <w:gridCol w:w="1504"/>
+        <w:gridCol w:w="1504"/>
+        <w:gridCol w:w="1504"/>
+        <w:gridCol w:w="1504"/>
+        <w:gridCol w:w="1504"/>
+        <w:gridCol w:w="1504"/>
+      </w:tblGrid>
+      <w:tr>
+        <w:trPr>
+          <w:tblHeader/>
+        </w:trPr>
+        <w:tc>
+          <w:tcPr>
+            <w:tcW w:type="dxa" w:w="1504"/>
+            <w:tcBorders>
+              <w:top w:val="single" w:color="BBBBBB" w:sz="4"/>
+              <w:left w:val="single" w:color="BBBBBB" w:sz="4"/>
+              <w:bottom w:val="single" w:color="BBBBBB" w:sz="4"/>
+              <w:right w:val="single" w:color="BBBBBB" w:sz="4"/>
+            </w:tcBorders>
+            <w:shd w:fill="E8EEF4" w:val="clear"/>
+            <w:tcMar>
+              <w:top w:type="dxa" w:w="60"/>
+              <w:left w:type="dxa" w:w="100"/>
+              <w:bottom w:type="dxa" w:w="60"/>
+              <w:right w:type="dxa" w:w="100"/>
+            </w:tcMar>
+          </w:tcPr>
+          <w:p>
+            <w:r>
+              <w:rPr>
+                <w:b/>
+                <w:bCs/>
+                <w:sz w:val="18"/>
+                <w:szCs w:val="18"/>
+              </w:rPr>
+              <w:t xml:space="preserve">Adapter</w:t>
+            </w:r>
+          </w:p>
+        </w:tc>
+        <w:tc>
+          <w:tcPr>
+            <w:tcW w:type="dxa" w:w="1504"/>
+            <w:tcBorders>
+              <w:top w:val="single" w:color="BBBBBB" w:sz="4"/>
+              <w:left w:val="single" w:color="BBBBBB" w:sz="4"/>
+              <w:bottom w:val="single" w:color="BBBBBB" w:sz="4"/>
+              <w:right w:val="single" w:color="BBBBBB" w:sz="4"/>
+            </w:tcBorders>
+            <w:shd w:fill="E8EEF4" w:val="clear"/>
+            <w:tcMar>
+              <w:top w:type="dxa" w:w="60"/>
+              <w:left w:type="dxa" w:w="100"/>
+              <w:bottom w:type="dxa" w:w="60"/>
+              <w:right w:type="dxa" w:w="100"/>
+            </w:tcMar>
+          </w:tcPr>
+          <w:p>
+            <w:r>
+              <w:rPr>
+                <w:b/>
+                <w:bCs/>
+                <w:sz w:val="18"/>
+                <w:szCs w:val="18"/>
+              </w:rPr>
+              <w:t xml:space="preserve">entidade_rate (12 entidades)</w:t>
+            </w:r>
+          </w:p>
+        </w:tc>
+        <w:tc>
+          <w:tcPr>
+            <w:tcW w:type="dxa" w:w="1504"/>
+            <w:tcBorders>
+              <w:top w:val="single" w:color="BBBBBB" w:sz="4"/>
+              <w:left w:val="single" w:color="BBBBBB" w:sz="4"/>
+              <w:bottom w:val="single" w:color="BBBBBB" w:sz="4"/>
+              <w:right w:val="single" w:color="BBBBBB" w:sz="4"/>
+            </w:tcBorders>
+            <w:shd w:fill="E8EEF4" w:val="clear"/>
+            <w:tcMar>
+              <w:top w:type="dxa" w:w="60"/>
+              <w:left w:type="dxa" w:w="100"/>
+              <w:bottom w:type="dxa" w:w="60"/>
+              <w:right w:type="dxa" w:w="100"/>
+            </w:tcMar>
+          </w:tcPr>
+          <w:p>
+            <w:r>
+              <w:rPr>
+                <w:b/>
+                <w:bCs/>
+                <w:sz w:val="18"/>
+                <w:szCs w:val="18"/>
+              </w:rPr>
+              <w:t xml:space="preserve">compile_rate</w:t>
+            </w:r>
+          </w:p>
+        </w:tc>
+        <w:tc>
+          <w:tcPr>
+            <w:tcW w:type="dxa" w:w="1504"/>
+            <w:tcBorders>
+              <w:top w:val="single" w:color="BBBBBB" w:sz="4"/>
+              <w:left w:val="single" w:color="BBBBBB" w:sz="4"/>
+              <w:bottom w:val="single" w:color="BBBBBB" w:sz="4"/>
+              <w:right w:val="single" w:color="BBBBBB" w:sz="4"/>
+            </w:tcBorders>
+            <w:shd w:fill="E8EEF4" w:val="clear"/>
+            <w:tcMar>
+              <w:top w:type="dxa" w:w="60"/>
+              <w:left w:type="dxa" w:w="100"/>
+              <w:bottom w:type="dxa" w:w="60"/>
+              <w:right w:type="dxa" w:w="100"/>
+            </w:tcMar>
+          </w:tcPr>
+          <w:p>
+            <w:r>
+              <w:rPr>
+                <w:b/>
+                <w:bCs/>
+                <w:sz w:val="18"/>
+                <w:szCs w:val="18"/>
+              </w:rPr>
+              <w:t xml:space="preserve">runs_rate</w:t>
+            </w:r>
+          </w:p>
+        </w:tc>
+        <w:tc>
+          <w:tcPr>
+            <w:tcW w:type="dxa" w:w="1504"/>
+            <w:tcBorders>
+              <w:top w:val="single" w:color="BBBBBB" w:sz="4"/>
+              <w:left w:val="single" w:color="BBBBBB" w:sz="4"/>
+              <w:bottom w:val="single" w:color="BBBBBB" w:sz="4"/>
+              <w:right w:val="single" w:color="BBBBBB" w:sz="4"/>
+            </w:tcBorders>
+            <w:shd w:fill="E8EEF4" w:val="clear"/>
+            <w:tcMar>
+              <w:top w:type="dxa" w:w="60"/>
+              <w:left w:type="dxa" w:w="100"/>
+              <w:bottom w:type="dxa" w:w="60"/>
+              <w:right w:type="dxa" w:w="100"/>
+            </w:tcMar>
+          </w:tcPr>
+          <w:p>
+            <w:r>
+              <w:rPr>
+                <w:b/>
+                <w:bCs/>
+                <w:sz w:val="18"/>
+                <w:szCs w:val="18"/>
+              </w:rPr>
+              <w:t xml:space="preserve">docstring_rate</w:t>
+            </w:r>
+          </w:p>
+        </w:tc>
+        <w:tc>
+          <w:tcPr>
+            <w:tcW w:type="dxa" w:w="1504"/>
+            <w:tcBorders>
+              <w:top w:val="single" w:color="BBBBBB" w:sz="4"/>
+              <w:left w:val="single" w:color="BBBBBB" w:sz="4"/>
+              <w:bottom w:val="single" w:color="BBBBBB" w:sz="4"/>
+              <w:right w:val="single" w:color="BBBBBB" w:sz="4"/>
+            </w:tcBorders>
+            <w:shd w:fill="E8EEF4" w:val="clear"/>
+            <w:tcMar>
+              <w:top w:type="dxa" w:w="60"/>
+              <w:left w:type="dxa" w:w="100"/>
+              <w:bottom w:type="dxa" w:w="60"/>
+              <w:right w:type="dxa" w:w="100"/>
+            </w:tcMar>
+          </w:tcPr>
+          <w:p>
+            <w:r>
+              <w:rPr>
+                <w:b/>
+                <w:bCs/>
+                <w:sz w:val="18"/>
+                <w:szCs w:val="18"/>
+              </w:rPr>
+              <w:t xml:space="preserve">entidade_rate (2 entidades)</w:t>
+            </w:r>
+          </w:p>
+        </w:tc>
+      </w:tr>
+      <w:tr>
+        <w:trPr>
+          <w:tblHeader w:val="off"/>
+        </w:trPr>
+        <w:tc>
+          <w:tcPr>
+            <w:tcW w:type="dxa" w:w="1504"/>
+            <w:tcBorders>
+              <w:top w:val="single" w:color="BBBBBB" w:sz="4"/>
+              <w:left w:val="single" w:color="BBBBBB" w:sz="4"/>
+              <w:bottom w:val="single" w:color="BBBBBB" w:sz="4"/>
+              <w:right w:val="single" w:color="BBBBBB" w:sz="4"/>
+            </w:tcBorders>
+            <w:tcMar>
+              <w:top w:type="dxa" w:w="60"/>
+              <w:left w:type="dxa" w:w="100"/>
+              <w:bottom w:type="dxa" w:w="60"/>
+              <w:right w:type="dxa" w:w="100"/>
+            </w:tcMar>
+          </w:tcPr>
+          <w:p>
+            <w:r>
+              <w:rPr>
+                <w:b w:val="false"/>
+                <w:bCs w:val="false"/>
+                <w:sz w:val="18"/>
+                <w:szCs w:val="18"/>
+              </w:rPr>
+              <w:t xml:space="preserve">campos fixos por entidade</w:t>
+            </w:r>
+          </w:p>
+        </w:tc>
+        <w:tc>
+          <w:tcPr>
+            <w:tcW w:type="dxa" w:w="1504"/>
+            <w:tcBorders>
+              <w:top w:val="single" w:color="BBBBBB" w:sz="4"/>
+              <w:left w:val="single" w:color="BBBBBB" w:sz="4"/>
+              <w:bottom w:val="single" w:color="BBBBBB" w:sz="4"/>
+              <w:right w:val="single" w:color="BBBBBB" w:sz="4"/>
+            </w:tcBorders>
+            <w:tcMar>
+              <w:top w:type="dxa" w:w="60"/>
+              <w:left w:type="dxa" w:w="100"/>
+              <w:bottom w:type="dxa" w:w="60"/>
+              <w:right w:type="dxa" w:w="100"/>
+            </w:tcMar>
+          </w:tcPr>
+          <w:p>
+            <w:r>
+              <w:rPr>
+                <w:b w:val="false"/>
+                <w:bCs w:val="false"/>
+                <w:sz w:val="18"/>
+                <w:szCs w:val="18"/>
+              </w:rPr>
+              <w:t xml:space="preserve">0,14</w:t>
+            </w:r>
+          </w:p>
+        </w:tc>
+        <w:tc>
+          <w:tcPr>
+            <w:tcW w:type="dxa" w:w="1504"/>
+            <w:tcBorders>
+              <w:top w:val="single" w:color="BBBBBB" w:sz="4"/>
+              <w:left w:val="single" w:color="BBBBBB" w:sz="4"/>
+              <w:bottom w:val="single" w:color="BBBBBB" w:sz="4"/>
+              <w:right w:val="single" w:color="BBBBBB" w:sz="4"/>
+            </w:tcBorders>
+            <w:tcMar>
+              <w:top w:type="dxa" w:w="60"/>
+              <w:left w:type="dxa" w:w="100"/>
+              <w:bottom w:type="dxa" w:w="60"/>
+              <w:right w:type="dxa" w:w="100"/>
+            </w:tcMar>
+          </w:tcPr>
+          <w:p>
+            <w:r>
+              <w:rPr>
+                <w:b w:val="false"/>
+                <w:bCs w:val="false"/>
+                <w:sz w:val="18"/>
+                <w:szCs w:val="18"/>
+              </w:rPr>
+              <w:t xml:space="preserve">0,68</w:t>
+            </w:r>
+          </w:p>
+        </w:tc>
+        <w:tc>
+          <w:tcPr>
+            <w:tcW w:type="dxa" w:w="1504"/>
+            <w:tcBorders>
+              <w:top w:val="single" w:color="BBBBBB" w:sz="4"/>
+              <w:left w:val="single" w:color="BBBBBB" w:sz="4"/>
+              <w:bottom w:val="single" w:color="BBBBBB" w:sz="4"/>
+              <w:right w:val="single" w:color="BBBBBB" w:sz="4"/>
+            </w:tcBorders>
+            <w:tcMar>
+              <w:top w:type="dxa" w:w="60"/>
+              <w:left w:type="dxa" w:w="100"/>
+              <w:bottom w:type="dxa" w:w="60"/>
+              <w:right w:type="dxa" w:w="100"/>
+            </w:tcMar>
+          </w:tcPr>
+          <w:p>
+            <w:r>
+              <w:rPr>
+                <w:b w:val="false"/>
+                <w:bCs w:val="false"/>
+                <w:sz w:val="18"/>
+                <w:szCs w:val="18"/>
+              </w:rPr>
+              <w:t xml:space="preserve">0,64</w:t>
+            </w:r>
+          </w:p>
+        </w:tc>
+        <w:tc>
+          <w:tcPr>
+            <w:tcW w:type="dxa" w:w="1504"/>
+            <w:tcBorders>
+              <w:top w:val="single" w:color="BBBBBB" w:sz="4"/>
+              <w:left w:val="single" w:color="BBBBBB" w:sz="4"/>
+              <w:bottom w:val="single" w:color="BBBBBB" w:sz="4"/>
+              <w:right w:val="single" w:color="BBBBBB" w:sz="4"/>
+            </w:tcBorders>
+            <w:tcMar>
+              <w:top w:type="dxa" w:w="60"/>
+              <w:left w:type="dxa" w:w="100"/>
+              <w:bottom w:type="dxa" w:w="60"/>
+              <w:right w:type="dxa" w:w="100"/>
+            </w:tcMar>
+          </w:tcPr>
+          <w:p>
+            <w:r>
+              <w:rPr>
+                <w:b w:val="false"/>
+                <w:bCs w:val="false"/>
+                <w:sz w:val="18"/>
+                <w:szCs w:val="18"/>
+              </w:rPr>
+              <w:t xml:space="preserve">0,67</w:t>
+            </w:r>
+          </w:p>
+        </w:tc>
+        <w:tc>
+          <w:tcPr>
+            <w:tcW w:type="dxa" w:w="1504"/>
+            <w:tcBorders>
+              <w:top w:val="single" w:color="BBBBBB" w:sz="4"/>
+              <w:left w:val="single" w:color="BBBBBB" w:sz="4"/>
+              <w:bottom w:val="single" w:color="BBBBBB" w:sz="4"/>
+              <w:right w:val="single" w:color="BBBBBB" w:sz="4"/>
+            </w:tcBorders>
+            <w:tcMar>
+              <w:top w:type="dxa" w:w="60"/>
+              <w:left w:type="dxa" w:w="100"/>
+              <w:bottom w:type="dxa" w:w="60"/>
+              <w:right w:type="dxa" w:w="100"/>
+            </w:tcMar>
+          </w:tcPr>
+          <w:p>
+            <w:r>
+              <w:rPr>
+                <w:b w:val="false"/>
+                <w:bCs w:val="false"/>
+                <w:sz w:val="18"/>
+                <w:szCs w:val="18"/>
+              </w:rPr>
+              <w:t xml:space="preserve">0,5</w:t>
+            </w:r>
+          </w:p>
+        </w:tc>
+      </w:tr>
+      <w:tr>
+        <w:trPr>
+          <w:tblHeader w:val="off"/>
+        </w:trPr>
+        <w:tc>
+          <w:tcPr>
+            <w:tcW w:type="dxa" w:w="1504"/>
+            <w:tcBorders>
+              <w:top w:val="single" w:color="BBBBBB" w:sz="4"/>
+              <w:left w:val="single" w:color="BBBBBB" w:sz="4"/>
+              <w:bottom w:val="single" w:color="BBBBBB" w:sz="4"/>
+              <w:right w:val="single" w:color="BBBBBB" w:sz="4"/>
+            </w:tcBorders>
+            <w:tcMar>
+              <w:top w:type="dxa" w:w="60"/>
+              <w:left w:type="dxa" w:w="100"/>
+              <w:bottom w:type="dxa" w:w="60"/>
+              <w:right w:type="dxa" w:w="100"/>
+            </w:tcMar>
+          </w:tcPr>
+          <w:p>
+            <w:r>
+              <w:rPr>
+                <w:b w:val="false"/>
+                <w:bCs w:val="false"/>
+                <w:sz w:val="18"/>
+                <w:szCs w:val="18"/>
+              </w:rPr>
+              <w:t xml:space="preserve">campos sorteados</w:t>
+            </w:r>
+          </w:p>
+        </w:tc>
+        <w:tc>
+          <w:tcPr>
+            <w:tcW w:type="dxa" w:w="1504"/>
+            <w:tcBorders>
+              <w:top w:val="single" w:color="BBBBBB" w:sz="4"/>
+              <w:left w:val="single" w:color="BBBBBB" w:sz="4"/>
+              <w:bottom w:val="single" w:color="BBBBBB" w:sz="4"/>
+              <w:right w:val="single" w:color="BBBBBB" w:sz="4"/>
+            </w:tcBorders>
+            <w:tcMar>
+              <w:top w:type="dxa" w:w="60"/>
+              <w:left w:type="dxa" w:w="100"/>
+              <w:bottom w:type="dxa" w:w="60"/>
+              <w:right w:type="dxa" w:w="100"/>
+            </w:tcMar>
+          </w:tcPr>
+          <w:p>
+            <w:r>
+              <w:rPr>
+                <w:b w:val="false"/>
+                <w:bCs w:val="false"/>
+                <w:sz w:val="18"/>
+                <w:szCs w:val="18"/>
+              </w:rPr>
+              <w:t xml:space="preserve">0,13</w:t>
+            </w:r>
+          </w:p>
+        </w:tc>
+        <w:tc>
+          <w:tcPr>
+            <w:tcW w:type="dxa" w:w="1504"/>
+            <w:tcBorders>
+              <w:top w:val="single" w:color="BBBBBB" w:sz="4"/>
+              <w:left w:val="single" w:color="BBBBBB" w:sz="4"/>
+              <w:bottom w:val="single" w:color="BBBBBB" w:sz="4"/>
+              <w:right w:val="single" w:color="BBBBBB" w:sz="4"/>
+            </w:tcBorders>
+            <w:tcMar>
+              <w:top w:type="dxa" w:w="60"/>
+              <w:left w:type="dxa" w:w="100"/>
+              <w:bottom w:type="dxa" w:w="60"/>
+              <w:right w:type="dxa" w:w="100"/>
+            </w:tcMar>
+          </w:tcPr>
+          <w:p>
+            <w:r>
+              <w:rPr>
+                <w:b w:val="false"/>
+                <w:bCs w:val="false"/>
+                <w:sz w:val="18"/>
+                <w:szCs w:val="18"/>
+              </w:rPr>
+              <w:t xml:space="preserve">0,86</w:t>
+            </w:r>
+          </w:p>
+        </w:tc>
+        <w:tc>
+          <w:tcPr>
+            <w:tcW w:type="dxa" w:w="1504"/>
+            <w:tcBorders>
+              <w:top w:val="single" w:color="BBBBBB" w:sz="4"/>
+              <w:left w:val="single" w:color="BBBBBB" w:sz="4"/>
+              <w:bottom w:val="single" w:color="BBBBBB" w:sz="4"/>
+              <w:right w:val="single" w:color="BBBBBB" w:sz="4"/>
+            </w:tcBorders>
+            <w:tcMar>
+              <w:top w:type="dxa" w:w="60"/>
+              <w:left w:type="dxa" w:w="100"/>
+              <w:bottom w:type="dxa" w:w="60"/>
+              <w:right w:type="dxa" w:w="100"/>
+            </w:tcMar>
+          </w:tcPr>
+          <w:p>
+            <w:r>
+              <w:rPr>
+                <w:b w:val="false"/>
+                <w:bCs w:val="false"/>
+                <w:sz w:val="18"/>
+                <w:szCs w:val="18"/>
+              </w:rPr>
+              <w:t xml:space="preserve">0,84</w:t>
+            </w:r>
+          </w:p>
+        </w:tc>
+        <w:tc>
+          <w:tcPr>
+            <w:tcW w:type="dxa" w:w="1504"/>
+            <w:tcBorders>
+              <w:top w:val="single" w:color="BBBBBB" w:sz="4"/>
+              <w:left w:val="single" w:color="BBBBBB" w:sz="4"/>
+              <w:bottom w:val="single" w:color="BBBBBB" w:sz="4"/>
+              <w:right w:val="single" w:color="BBBBBB" w:sz="4"/>
+            </w:tcBorders>
+            <w:tcMar>
+              <w:top w:type="dxa" w:w="60"/>
+              <w:left w:type="dxa" w:w="100"/>
+              <w:bottom w:type="dxa" w:w="60"/>
+              <w:right w:type="dxa" w:w="100"/>
+            </w:tcMar>
+          </w:tcPr>
+          <w:p>
+            <w:r>
+              <w:rPr>
+                <w:b w:val="false"/>
+                <w:bCs w:val="false"/>
+                <w:sz w:val="18"/>
+                <w:szCs w:val="18"/>
+              </w:rPr>
+              <w:t xml:space="preserve">0,86</w:t>
+            </w:r>
+          </w:p>
+        </w:tc>
+        <w:tc>
+          <w:tcPr>
+            <w:tcW w:type="dxa" w:w="1504"/>
+            <w:tcBorders>
+              <w:top w:val="single" w:color="BBBBBB" w:sz="4"/>
+              <w:left w:val="single" w:color="BBBBBB" w:sz="4"/>
+              <w:bottom w:val="single" w:color="BBBBBB" w:sz="4"/>
+              <w:right w:val="single" w:color="BBBBBB" w:sz="4"/>
+            </w:tcBorders>
+            <w:tcMar>
+              <w:top w:type="dxa" w:w="60"/>
+              <w:left w:type="dxa" w:w="100"/>
+              <w:bottom w:type="dxa" w:w="60"/>
+              <w:right w:type="dxa" w:w="100"/>
+            </w:tcMar>
+          </w:tcPr>
+          <w:p>
+            <w:r>
+              <w:rPr>
+                <w:b w:val="false"/>
+                <w:bCs w:val="false"/>
+                <w:sz w:val="18"/>
+                <w:szCs w:val="18"/>
+              </w:rPr>
+              <w:t xml:space="preserve">0,5</w:t>
+            </w:r>
+          </w:p>
+        </w:tc>
+      </w:tr>
+      <w:tr>
+        <w:trPr>
+          <w:tblHeader w:val="off"/>
+        </w:trPr>
+        <w:tc>
+          <w:tcPr>
+            <w:tcW w:type="dxa" w:w="1504"/>
+            <w:tcBorders>
+              <w:top w:val="single" w:color="BBBBBB" w:sz="4"/>
+              <w:left w:val="single" w:color="BBBBBB" w:sz="4"/>
+              <w:bottom w:val="single" w:color="BBBBBB" w:sz="4"/>
+              <w:right w:val="single" w:color="BBBBBB" w:sz="4"/>
+            </w:tcBorders>
+            <w:tcMar>
+              <w:top w:type="dxa" w:w="60"/>
+              <w:left w:type="dxa" w:w="100"/>
+              <w:bottom w:type="dxa" w:w="60"/>
+              <w:right w:type="dxa" w:w="100"/>
+            </w:tcMar>
+          </w:tcPr>
+          <w:p>
+            <w:r>
+              <w:rPr>
+                <w:b w:val="false"/>
+                <w:bCs w:val="false"/>
+                <w:sz w:val="18"/>
+                <w:szCs w:val="18"/>
+              </w:rPr>
+              <w:t xml:space="preserve">campos sorteados + 266 nomes extras</w:t>
+            </w:r>
+          </w:p>
+        </w:tc>
+        <w:tc>
+          <w:tcPr>
+            <w:tcW w:type="dxa" w:w="1504"/>
+            <w:tcBorders>
+              <w:top w:val="single" w:color="BBBBBB" w:sz="4"/>
+              <w:left w:val="single" w:color="BBBBBB" w:sz="4"/>
+              <w:bottom w:val="single" w:color="BBBBBB" w:sz="4"/>
+              <w:right w:val="single" w:color="BBBBBB" w:sz="4"/>
+            </w:tcBorders>
+            <w:tcMar>
+              <w:top w:type="dxa" w:w="60"/>
+              <w:left w:type="dxa" w:w="100"/>
+              <w:bottom w:type="dxa" w:w="60"/>
+              <w:right w:type="dxa" w:w="100"/>
+            </w:tcMar>
+          </w:tcPr>
+          <w:p>
+            <w:r>
+              <w:rPr>
+                <w:b w:val="false"/>
+                <w:bCs w:val="false"/>
+                <w:sz w:val="18"/>
+                <w:szCs w:val="18"/>
+              </w:rPr>
+              <w:t xml:space="preserve">0,29</w:t>
+            </w:r>
+          </w:p>
+        </w:tc>
+        <w:tc>
+          <w:tcPr>
+            <w:tcW w:type="dxa" w:w="1504"/>
+            <w:tcBorders>
+              <w:top w:val="single" w:color="BBBBBB" w:sz="4"/>
+              <w:left w:val="single" w:color="BBBBBB" w:sz="4"/>
+              <w:bottom w:val="single" w:color="BBBBBB" w:sz="4"/>
+              <w:right w:val="single" w:color="BBBBBB" w:sz="4"/>
+            </w:tcBorders>
+            <w:tcMar>
+              <w:top w:type="dxa" w:w="60"/>
+              <w:left w:type="dxa" w:w="100"/>
+              <w:bottom w:type="dxa" w:w="60"/>
+              <w:right w:type="dxa" w:w="100"/>
+            </w:tcMar>
+          </w:tcPr>
+          <w:p>
+            <w:r>
+              <w:rPr>
+                <w:b w:val="false"/>
+                <w:bCs w:val="false"/>
+                <w:sz w:val="18"/>
+                <w:szCs w:val="18"/>
+              </w:rPr>
+              <w:t xml:space="preserve">0,81</w:t>
+            </w:r>
+          </w:p>
+        </w:tc>
+        <w:tc>
+          <w:tcPr>
+            <w:tcW w:type="dxa" w:w="1504"/>
+            <w:tcBorders>
+              <w:top w:val="single" w:color="BBBBBB" w:sz="4"/>
+              <w:left w:val="single" w:color="BBBBBB" w:sz="4"/>
+              <w:bottom w:val="single" w:color="BBBBBB" w:sz="4"/>
+              <w:right w:val="single" w:color="BBBBBB" w:sz="4"/>
+            </w:tcBorders>
+            <w:tcMar>
+              <w:top w:type="dxa" w:w="60"/>
+              <w:left w:type="dxa" w:w="100"/>
+              <w:bottom w:type="dxa" w:w="60"/>
+              <w:right w:type="dxa" w:w="100"/>
+            </w:tcMar>
+          </w:tcPr>
+          <w:p>
+            <w:r>
+              <w:rPr>
+                <w:b w:val="false"/>
+                <w:bCs w:val="false"/>
+                <w:sz w:val="18"/>
+                <w:szCs w:val="18"/>
+              </w:rPr>
+              <w:t xml:space="preserve">0,75</w:t>
+            </w:r>
+          </w:p>
+        </w:tc>
+        <w:tc>
+          <w:tcPr>
+            <w:tcW w:type="dxa" w:w="1504"/>
+            <w:tcBorders>
+              <w:top w:val="single" w:color="BBBBBB" w:sz="4"/>
+              <w:left w:val="single" w:color="BBBBBB" w:sz="4"/>
+              <w:bottom w:val="single" w:color="BBBBBB" w:sz="4"/>
+              <w:right w:val="single" w:color="BBBBBB" w:sz="4"/>
+            </w:tcBorders>
+            <w:tcMar>
+              <w:top w:type="dxa" w:w="60"/>
+              <w:left w:type="dxa" w:w="100"/>
+              <w:bottom w:type="dxa" w:w="60"/>
+              <w:right w:type="dxa" w:w="100"/>
+            </w:tcMar>
+          </w:tcPr>
+          <w:p>
+            <w:r>
+              <w:rPr>
+                <w:b w:val="false"/>
+                <w:bCs w:val="false"/>
+                <w:sz w:val="18"/>
+                <w:szCs w:val="18"/>
+              </w:rPr>
+              <w:t xml:space="preserve">0,81</w:t>
+            </w:r>
+          </w:p>
+        </w:tc>
+        <w:tc>
+          <w:tcPr>
+            <w:tcW w:type="dxa" w:w="1504"/>
+            <w:tcBorders>
+              <w:top w:val="single" w:color="BBBBBB" w:sz="4"/>
+              <w:left w:val="single" w:color="BBBBBB" w:sz="4"/>
+              <w:bottom w:val="single" w:color="BBBBBB" w:sz="4"/>
+              <w:right w:val="single" w:color="BBBBBB" w:sz="4"/>
+            </w:tcBorders>
+            <w:tcMar>
+              <w:top w:type="dxa" w:w="60"/>
+              <w:left w:type="dxa" w:w="100"/>
+              <w:bottom w:type="dxa" w:w="60"/>
+              <w:right w:type="dxa" w:w="100"/>
+            </w:tcMar>
+          </w:tcPr>
+          <w:p>
+            <w:r>
+              <w:rPr>
+                <w:b w:val="false"/>
+                <w:bCs w:val="false"/>
+                <w:sz w:val="18"/>
+                <w:szCs w:val="18"/>
+              </w:rPr>
+              <w:t xml:space="preserve">0,75</w:t>
+            </w:r>
+          </w:p>
+        </w:tc>
+      </w:tr>
+    </w:tbl>
+    <w:p/>
+    <w:p>
+      <w:pPr>
+        <w:spacing w:after="120"/>
+      </w:pPr>
+      <w:r>
+        <w:t xml:space="preserve">O teste de duas entidades era otimista: </w:t>
+      </w:r>
+      <w:r>
+        <w:rPr>
+          <w:rFonts w:ascii="Consolas" w:cs="Consolas" w:eastAsia="Consolas" w:hAnsi="Consolas"/>
+        </w:rPr>
+        <w:t xml:space="preserve">Endereco</w:t>
+      </w:r>
+      <w:r>
+        <w:t xml:space="preserve"> saía certo por sorte do caminho de peças, não por regra aprendida. Sortear os campos melhorou a sintaxe e não mudou a cópia do nome. Os nomes extras dobraram o entidade_rate, mas a partir de um patamar baixo.</w:t>
+      </w:r>
+    </w:p>
+    <w:p>
+      <w:pPr>
+        <w:spacing w:after="120"/>
+      </w:pPr>
+      <w:r>
+        <w:t xml:space="preserve">Os próximos passos possíveis são escalar os nomes em dez vezes, colhendo nomes de classe em português do código já colhido, ou mudar o tokenizer para marcar a maiúscula com uma peça própria, de modo que </w:t>
       </w:r>
       <w:r>
         <w:rPr>
@@ -5737,7 +6455,7 @@
         <w:t xml:space="preserve">comentario</w:t>
       </w:r>
       <w:r>
-        <w:t xml:space="preserve"> da instrução. Isso tornaria a classe uma cópia, mas exige refazer o tokenizer e o CPT e passa a precisar de um passo de decodificação fora do modelo.</w:t>
+        <w:t xml:space="preserve"> da instrução. O segundo ataca a causa, mas exige refazer o tokenizer e o CPT e passa a precisar de um passo de decodificação fora do modelo.</w:t>
       </w:r>
     </w:p>
     <w:p>
@@ -6424,7 +7142,7 @@
           <w:numId w:val="2"/>
         </w:numPr>
       </w:pPr>
-      <w:hyperlink w:history="1" r:id="rIdwla0njmz9h_sm4th5fgnf">
+      <w:hyperlink w:history="1" r:id="rIdq4uxeknprq-e3iebjwmhy">
         <w:r>
           <w:rPr>
             <w:rStyle w:val="Hyperlink"/>
@@ -6444,7 +7162,7 @@
           <w:numId w:val="2"/>
         </w:numPr>
       </w:pPr>
-      <w:hyperlink w:history="1" r:id="rIdlsnompe_bvthnh4hlin2i">
+      <w:hyperlink w:history="1" r:id="rIdfuhcps7_ymbjqg_rfcu-k">
         <w:r>
           <w:rPr>
             <w:rStyle w:val="Hyperlink"/>
@@ -6464,7 +7182,7 @@
           <w:numId w:val="2"/>
         </w:numPr>
       </w:pPr>
-      <w:hyperlink w:history="1" r:id="rIdsj-zjde7fjqdoiclud9gy">
+      <w:hyperlink w:history="1" r:id="rIdqyn-rb8va_d5_cwy0urqt">
         <w:r>
           <w:rPr>
             <w:rStyle w:val="Hyperlink"/>
@@ -6490,7 +7208,7 @@
           <w:numId w:val="2"/>
         </w:numPr>
       </w:pPr>
-      <w:hyperlink w:history="1" r:id="rId6rbe6ovmyc8k_8bytptcq">
+      <w:hyperlink w:history="1" r:id="rIdeatkmsuzzrz0-pinhsn75">
         <w:r>
           <w:rPr>
             <w:rStyle w:val="Hyperlink"/>
@@ -6513,7 +7231,7 @@
       <w:r>
         <w:t xml:space="preserve">Gururangan et al., </w:t>
       </w:r>
-      <w:hyperlink w:history="1" r:id="rIdhfhrlhxohwn4zps1jerhd">
+      <w:hyperlink w:history="1" r:id="rIdze5omcfdtjmbf4qdh3eas">
         <w:r>
           <w:rPr>
             <w:rStyle w:val="Hyperlink"/>
@@ -6536,7 +7254,7 @@
       <w:r>
         <w:t xml:space="preserve">Hu et al., </w:t>
       </w:r>
-      <w:hyperlink w:history="1" r:id="rIdxojttblfpl_hhqy1ffqmo">
+      <w:hyperlink w:history="1" r:id="rIdnhq3rpuvqzrybfza1j_sl">
         <w:r>
           <w:rPr>
             <w:rStyle w:val="Hyperlink"/>
@@ -6559,7 +7277,7 @@
       <w:r>
         <w:t xml:space="preserve">Dettmers et al., </w:t>
       </w:r>
-      <w:hyperlink w:history="1" r:id="rIdj9ie0rsofjch3za5ud1zz">
+      <w:hyperlink w:history="1" r:id="rIddzxj4bky2prif7rsif0nd">
         <w:r>
           <w:rPr>
             <w:rStyle w:val="Hyperlink"/>
@@ -6582,7 +7300,7 @@
       <w:r>
         <w:t xml:space="preserve">Kudo e Richardson, </w:t>
       </w:r>
-      <w:hyperlink w:history="1" r:id="rIdztrusy5grthcalezcf0_c">
+      <w:hyperlink w:history="1" r:id="rIddafpuytelj7d2twa0dmx8">
         <w:r>
           <w:rPr>
             <w:rStyle w:val="Hyperlink"/>

</xml_diff>

<commit_message>
Registra a rodada dos 2000 nomes colhidos no teste amplo
</commit_message>
<xml_diff>
--- a/docs/treino_cased.docx
+++ b/docs/treino_cased.docx
@@ -15,7 +15,7 @@
         <w:spacing w:after="120"/>
       </w:pPr>
       <w:r>
-        <w:t xml:space="preserve">Atualizado em 2026-10-02.</w:t>
+        <w:t xml:space="preserve">Atualizado em 2026-10-03.</w:t>
       </w:r>
     </w:p>
     <w:p>
@@ -31,7 +31,7 @@
         <w:spacing w:after="120"/>
       </w:pPr>
       <w:r>
-        <w:t xml:space="preserve">Depois de um pré-treino continuado grande e de um ajuste fino com QLoRA, o Manacá-1B escreve uma API FastAPI + SQLAlchemy em português, com a caixa certa e sem nenhum script de conserto depois. Nos 32 pedidos de teste, sobre duas entidades que o modelo nunca viu no treino, todas as respostas compilam, sobem e passam nas requisições do teste. Num teste mais amplo, com 12 entidades inéditas, esses números caem para 81% e 75%, e a classe sai com o nome certo em só 29% dos pedidos. O nome da classe é o problema em aberto.</w:t>
+        <w:t xml:space="preserve">Depois de um pré-treino continuado grande e de um ajuste fino com QLoRA, o Manacá-1B escreve uma API FastAPI + SQLAlchemy em português, com a caixa certa e sem nenhum script de conserto depois. Nos 32 pedidos de teste, sobre duas entidades que o modelo nunca viu no treino, todas as respostas compilam, sobem e passam nas requisições do teste. Num teste mais amplo, com 12 entidades inéditas, o melhor adapter compila 88% e roda 87%, mas a classe sai com o nome certo em só 32% dos pedidos. O nome da classe é o problema em aberto.</w:t>
       </w:r>
     </w:p>
     <w:tbl>
@@ -1494,7 +1494,7 @@
       <w:r>
         <w:t xml:space="preserve">O ponto de partida é o </w:t>
       </w:r>
-      <w:hyperlink w:history="1" r:id="rId9cb_loa4durckkufuib8o">
+      <w:hyperlink w:history="1" r:id="rIdgptrwi5ya9wvulrstyncb">
         <w:r>
           <w:rPr>
             <w:rStyle w:val="Hyperlink"/>
@@ -2082,7 +2082,7 @@
             </w:tcMar>
           </w:tcPr>
           <w:p>
-            <w:hyperlink w:history="1" r:id="rIdri6zn0wbgcnxrrjol9kay">
+            <w:hyperlink w:history="1" r:id="rIdwbnntvjlj3fowwpitrh8r">
               <w:r>
                 <w:rPr>
                   <w:rStyle w:val="Hyperlink"/>
@@ -2260,7 +2260,7 @@
             </w:tcMar>
           </w:tcPr>
           <w:p>
-            <w:hyperlink w:history="1" r:id="rIdy9ybokwgsr4hmuab2oher">
+            <w:hyperlink w:history="1" r:id="rIdewg1wmaweggmegh2hagyi">
               <w:r>
                 <w:rPr>
                   <w:rStyle w:val="Hyperlink"/>
@@ -2380,7 +2380,7 @@
             </w:tcMar>
           </w:tcPr>
           <w:p>
-            <w:hyperlink w:history="1" r:id="rIdykyhr6mkz8qg5kseard3g">
+            <w:hyperlink w:history="1" r:id="rIda6obe-ondydmmtzeycs3s">
               <w:r>
                 <w:rPr>
                   <w:rStyle w:val="Hyperlink"/>
@@ -6404,6 +6404,179 @@
           </w:p>
         </w:tc>
       </w:tr>
+      <w:tr>
+        <w:trPr>
+          <w:tblHeader w:val="off"/>
+        </w:trPr>
+        <w:tc>
+          <w:tcPr>
+            <w:tcW w:type="dxa" w:w="1504"/>
+            <w:tcBorders>
+              <w:top w:val="single" w:color="BBBBBB" w:sz="4"/>
+              <w:left w:val="single" w:color="BBBBBB" w:sz="4"/>
+              <w:bottom w:val="single" w:color="BBBBBB" w:sz="4"/>
+              <w:right w:val="single" w:color="BBBBBB" w:sz="4"/>
+            </w:tcBorders>
+            <w:tcMar>
+              <w:top w:type="dxa" w:w="60"/>
+              <w:left w:type="dxa" w:w="100"/>
+              <w:bottom w:type="dxa" w:w="60"/>
+              <w:right w:type="dxa" w:w="100"/>
+            </w:tcMar>
+          </w:tcPr>
+          <w:p>
+            <w:r>
+              <w:rPr>
+                <w:b w:val="false"/>
+                <w:bCs w:val="false"/>
+                <w:sz w:val="18"/>
+                <w:szCs w:val="18"/>
+              </w:rPr>
+              <w:t xml:space="preserve">campos sorteados + 266 extras + 2.000 nomes colhidos</w:t>
+            </w:r>
+          </w:p>
+        </w:tc>
+        <w:tc>
+          <w:tcPr>
+            <w:tcW w:type="dxa" w:w="1504"/>
+            <w:tcBorders>
+              <w:top w:val="single" w:color="BBBBBB" w:sz="4"/>
+              <w:left w:val="single" w:color="BBBBBB" w:sz="4"/>
+              <w:bottom w:val="single" w:color="BBBBBB" w:sz="4"/>
+              <w:right w:val="single" w:color="BBBBBB" w:sz="4"/>
+            </w:tcBorders>
+            <w:tcMar>
+              <w:top w:type="dxa" w:w="60"/>
+              <w:left w:type="dxa" w:w="100"/>
+              <w:bottom w:type="dxa" w:w="60"/>
+              <w:right w:type="dxa" w:w="100"/>
+            </w:tcMar>
+          </w:tcPr>
+          <w:p>
+            <w:r>
+              <w:rPr>
+                <w:b w:val="false"/>
+                <w:bCs w:val="false"/>
+                <w:sz w:val="18"/>
+                <w:szCs w:val="18"/>
+              </w:rPr>
+              <w:t xml:space="preserve">0,32</w:t>
+            </w:r>
+          </w:p>
+        </w:tc>
+        <w:tc>
+          <w:tcPr>
+            <w:tcW w:type="dxa" w:w="1504"/>
+            <w:tcBorders>
+              <w:top w:val="single" w:color="BBBBBB" w:sz="4"/>
+              <w:left w:val="single" w:color="BBBBBB" w:sz="4"/>
+              <w:bottom w:val="single" w:color="BBBBBB" w:sz="4"/>
+              <w:right w:val="single" w:color="BBBBBB" w:sz="4"/>
+            </w:tcBorders>
+            <w:tcMar>
+              <w:top w:type="dxa" w:w="60"/>
+              <w:left w:type="dxa" w:w="100"/>
+              <w:bottom w:type="dxa" w:w="60"/>
+              <w:right w:type="dxa" w:w="100"/>
+            </w:tcMar>
+          </w:tcPr>
+          <w:p>
+            <w:r>
+              <w:rPr>
+                <w:b w:val="false"/>
+                <w:bCs w:val="false"/>
+                <w:sz w:val="18"/>
+                <w:szCs w:val="18"/>
+              </w:rPr>
+              <w:t xml:space="preserve">0,88</w:t>
+            </w:r>
+          </w:p>
+        </w:tc>
+        <w:tc>
+          <w:tcPr>
+            <w:tcW w:type="dxa" w:w="1504"/>
+            <w:tcBorders>
+              <w:top w:val="single" w:color="BBBBBB" w:sz="4"/>
+              <w:left w:val="single" w:color="BBBBBB" w:sz="4"/>
+              <w:bottom w:val="single" w:color="BBBBBB" w:sz="4"/>
+              <w:right w:val="single" w:color="BBBBBB" w:sz="4"/>
+            </w:tcBorders>
+            <w:tcMar>
+              <w:top w:type="dxa" w:w="60"/>
+              <w:left w:type="dxa" w:w="100"/>
+              <w:bottom w:type="dxa" w:w="60"/>
+              <w:right w:type="dxa" w:w="100"/>
+            </w:tcMar>
+          </w:tcPr>
+          <w:p>
+            <w:r>
+              <w:rPr>
+                <w:b w:val="false"/>
+                <w:bCs w:val="false"/>
+                <w:sz w:val="18"/>
+                <w:szCs w:val="18"/>
+              </w:rPr>
+              <w:t xml:space="preserve">0,87</w:t>
+            </w:r>
+          </w:p>
+        </w:tc>
+        <w:tc>
+          <w:tcPr>
+            <w:tcW w:type="dxa" w:w="1504"/>
+            <w:tcBorders>
+              <w:top w:val="single" w:color="BBBBBB" w:sz="4"/>
+              <w:left w:val="single" w:color="BBBBBB" w:sz="4"/>
+              <w:bottom w:val="single" w:color="BBBBBB" w:sz="4"/>
+              <w:right w:val="single" w:color="BBBBBB" w:sz="4"/>
+            </w:tcBorders>
+            <w:tcMar>
+              <w:top w:type="dxa" w:w="60"/>
+              <w:left w:type="dxa" w:w="100"/>
+              <w:bottom w:type="dxa" w:w="60"/>
+              <w:right w:type="dxa" w:w="100"/>
+            </w:tcMar>
+          </w:tcPr>
+          <w:p>
+            <w:r>
+              <w:rPr>
+                <w:b w:val="false"/>
+                <w:bCs w:val="false"/>
+                <w:sz w:val="18"/>
+                <w:szCs w:val="18"/>
+              </w:rPr>
+              <w:t xml:space="preserve">0,88</w:t>
+            </w:r>
+          </w:p>
+        </w:tc>
+        <w:tc>
+          <w:tcPr>
+            <w:tcW w:type="dxa" w:w="1504"/>
+            <w:tcBorders>
+              <w:top w:val="single" w:color="BBBBBB" w:sz="4"/>
+              <w:left w:val="single" w:color="BBBBBB" w:sz="4"/>
+              <w:bottom w:val="single" w:color="BBBBBB" w:sz="4"/>
+              <w:right w:val="single" w:color="BBBBBB" w:sz="4"/>
+            </w:tcBorders>
+            <w:tcMar>
+              <w:top w:type="dxa" w:w="60"/>
+              <w:left w:type="dxa" w:w="100"/>
+              <w:bottom w:type="dxa" w:w="60"/>
+              <w:right w:type="dxa" w:w="100"/>
+            </w:tcMar>
+          </w:tcPr>
+          <w:p>
+            <w:r>
+              <w:rPr>
+                <w:b w:val="false"/>
+                <w:bCs w:val="false"/>
+                <w:sz w:val="18"/>
+                <w:szCs w:val="18"/>
+              </w:rPr>
+              <w:t xml:space="preserve">n/d</w:t>
+            </w:r>
+          </w:p>
+        </w:tc>
+      </w:tr>
     </w:tbl>
     <w:p/>
     <w:p>
@@ -6428,7 +6601,51 @@
         <w:spacing w:after="120"/>
       </w:pPr>
       <w:r>
-        <w:t xml:space="preserve">Os próximos passos possíveis são escalar os nomes em dez vezes, colhendo nomes de classe em português do código já colhido, ou mudar o tokenizer para marcar a maiúscula com uma peça própria, de modo que </w:t>
+        <w:t xml:space="preserve">A última linha testou a escala. O script </w:t>
+      </w:r>
+      <w:r>
+        <w:rPr>
+          <w:rFonts w:ascii="Consolas" w:cs="Consolas" w:eastAsia="Consolas" w:hAnsi="Consolas"/>
+        </w:rPr>
+        <w:t xml:space="preserve">colher_nomes_classe.py</w:t>
+      </w:r>
+      <w:r>
+        <w:t xml:space="preserve"> juntou 2.000 nomes de duas fontes: classes de uma palavra do código colhido e palavras da Wikipédia com sufixo de substantivo (</w:t>
+      </w:r>
+      <w:r>
+        <w:rPr>
+          <w:rFonts w:ascii="Consolas" w:cs="Consolas" w:eastAsia="Consolas" w:hAnsi="Consolas"/>
+        </w:rPr>
+        <w:t xml:space="preserve">-ção</w:t>
+      </w:r>
+      <w:r>
+        <w:t xml:space="preserve">, </w:t>
+      </w:r>
+      <w:r>
+        <w:rPr>
+          <w:rFonts w:ascii="Consolas" w:cs="Consolas" w:eastAsia="Consolas" w:hAnsi="Consolas"/>
+        </w:rPr>
+        <w:t xml:space="preserve">-mento</w:t>
+      </w:r>
+      <w:r>
+        <w:t xml:space="preserve">, </w:t>
+      </w:r>
+      <w:r>
+        <w:rPr>
+          <w:rFonts w:ascii="Consolas" w:cs="Consolas" w:eastAsia="Consolas" w:hAnsi="Consolas"/>
+        </w:rPr>
+        <w:t xml:space="preserve">-dade</w:t>
+      </w:r>
+      <w:r>
+        <w:t xml:space="preserve">). Cada nome entrou com 2 exemplos, e o treino foi de 3.932 para 7.932 exemplos, com 2 h 11 de SFT. Sintaxe e execução melhoraram (compile_rate 0,88, runs_rate 0,87), mas o entidade_rate passou só de 0,29 para 0,32. Seis vezes mais nomes quase não mexeram na cópia do nome.</w:t>
+      </w:r>
+    </w:p>
+    <w:p>
+      <w:pPr>
+        <w:spacing w:after="120"/>
+      </w:pPr>
+      <w:r>
+        <w:t xml:space="preserve">Com isso a escala de dados fica descartada como solução para o nome da classe. O passo seguinte é o tokenizer marcar a maiúscula com uma peça própria, de modo que </w:t>
       </w:r>
       <w:r>
         <w:rPr>
@@ -6455,7 +6672,7 @@
         <w:t xml:space="preserve">comentario</w:t>
       </w:r>
       <w:r>
-        <w:t xml:space="preserve"> da instrução. O segundo ataca a causa, mas exige refazer o tokenizer e o CPT e passa a precisar de um passo de decodificação fora do modelo.</w:t>
+        <w:t xml:space="preserve"> da instrução. Isso exige refazer o tokenizer e o CPT e passa a precisar de um passo de decodificação fora do modelo.</w:t>
       </w:r>
     </w:p>
     <w:p>
@@ -7142,7 +7359,7 @@
           <w:numId w:val="2"/>
         </w:numPr>
       </w:pPr>
-      <w:hyperlink w:history="1" r:id="rIdq4uxeknprq-e3iebjwmhy">
+      <w:hyperlink w:history="1" r:id="rIdyyuqg99pnafhzamj3pmy8">
         <w:r>
           <w:rPr>
             <w:rStyle w:val="Hyperlink"/>
@@ -7162,7 +7379,7 @@
           <w:numId w:val="2"/>
         </w:numPr>
       </w:pPr>
-      <w:hyperlink w:history="1" r:id="rIdfuhcps7_ymbjqg_rfcu-k">
+      <w:hyperlink w:history="1" r:id="rIds8f9byprrywmcgsl_95q8">
         <w:r>
           <w:rPr>
             <w:rStyle w:val="Hyperlink"/>
@@ -7182,7 +7399,7 @@
           <w:numId w:val="2"/>
         </w:numPr>
       </w:pPr>
-      <w:hyperlink w:history="1" r:id="rIdqyn-rb8va_d5_cwy0urqt">
+      <w:hyperlink w:history="1" r:id="rIdmtiwxhqkk8zk3xtxssl8u">
         <w:r>
           <w:rPr>
             <w:rStyle w:val="Hyperlink"/>
@@ -7208,7 +7425,7 @@
           <w:numId w:val="2"/>
         </w:numPr>
       </w:pPr>
-      <w:hyperlink w:history="1" r:id="rIdeatkmsuzzrz0-pinhsn75">
+      <w:hyperlink w:history="1" r:id="rIdpyubvyf478njamvsttjpe">
         <w:r>
           <w:rPr>
             <w:rStyle w:val="Hyperlink"/>
@@ -7231,7 +7448,7 @@
       <w:r>
         <w:t xml:space="preserve">Gururangan et al., </w:t>
       </w:r>
-      <w:hyperlink w:history="1" r:id="rIdze5omcfdtjmbf4qdh3eas">
+      <w:hyperlink w:history="1" r:id="rIdpoa25j-kkfbh9rbh8hwj9">
         <w:r>
           <w:rPr>
             <w:rStyle w:val="Hyperlink"/>
@@ -7254,7 +7471,7 @@
       <w:r>
         <w:t xml:space="preserve">Hu et al., </w:t>
       </w:r>
-      <w:hyperlink w:history="1" r:id="rIdnhq3rpuvqzrybfza1j_sl">
+      <w:hyperlink w:history="1" r:id="rIdcpfs03qiuadmdjxjsovnt">
         <w:r>
           <w:rPr>
             <w:rStyle w:val="Hyperlink"/>
@@ -7277,7 +7494,7 @@
       <w:r>
         <w:t xml:space="preserve">Dettmers et al., </w:t>
       </w:r>
-      <w:hyperlink w:history="1" r:id="rIddzxj4bky2prif7rsif0nd">
+      <w:hyperlink w:history="1" r:id="rIde9pizmmubs0_9q7bhwtgv">
         <w:r>
           <w:rPr>
             <w:rStyle w:val="Hyperlink"/>
@@ -7300,7 +7517,7 @@
       <w:r>
         <w:t xml:space="preserve">Kudo e Richardson, </w:t>
       </w:r>
-      <w:hyperlink w:history="1" r:id="rIddafpuytelj7d2twa0dmx8">
+      <w:hyperlink w:history="1" r:id="rIdbt0qfwwao9duzub-cezld">
         <w:r>
           <w:rPr>
             <w:rStyle w:val="Hyperlink"/>

</xml_diff>

<commit_message>
Controle com Qwen2.5-0.5B: pad distinto do eos e corte da geracao
O Qwen2.5 e o Qwen3 base usam <|endoftext|> como pad e eos; o collator do
transformers 4.46.3 poe -100 em todo label igual ao pad e apagaria o EOS.
garantir_pad_distinto troca o pad por um token existente. O eval corta
cada saida no primeiro eos ou pad, porque <|fim_pad|> nao e especial.
No teste amplo o Qwen2.5-0.5B deu entidade_rate 1,0 contra 0,32 do
Manaca; o doc registra o resultado e o plano do marcador de maiuscula.
</commit_message>
<xml_diff>
--- a/docs/treino_cased.docx
+++ b/docs/treino_cased.docx
@@ -31,7 +31,7 @@
         <w:spacing w:after="120"/>
       </w:pPr>
       <w:r>
-        <w:t xml:space="preserve">Depois de um pré-treino continuado grande e de um ajuste fino com QLoRA, o Manacá-1B escreve uma API FastAPI + SQLAlchemy em português, com a caixa certa e sem nenhum script de conserto depois. Nos 32 pedidos de teste, sobre duas entidades que o modelo nunca viu no treino, todas as respostas compilam, sobem e passam nas requisições do teste. Num teste mais amplo, com 12 entidades inéditas, o melhor adapter compila 88% e roda 87%, mas a classe sai com o nome certo em só 32% dos pedidos. O nome da classe é o problema em aberto.</w:t>
+        <w:t xml:space="preserve">Depois de um pré-treino continuado grande e de um ajuste fino com QLoRA, o Manacá-1B escreve uma API FastAPI + SQLAlchemy em português, com a caixa certa e sem nenhum script de conserto depois. Nos 32 pedidos de teste, sobre duas entidades que o modelo nunca viu no treino, todas as respostas compilam, sobem e passam nas requisições do teste. Num teste mais amplo, com 12 entidades inéditas, o melhor adapter do Manacá compila 88% e roda 87%, mas a classe sai com o nome certo em só 32% dos pedidos. O Qwen2.5-0.5B, treinado no mesmo dataset, acerta 100%. O nome da classe é o problema em aberto.</w:t>
       </w:r>
     </w:p>
     <w:tbl>
@@ -1494,7 +1494,7 @@
       <w:r>
         <w:t xml:space="preserve">O ponto de partida é o </w:t>
       </w:r>
-      <w:hyperlink w:history="1" r:id="rIdgptrwi5ya9wvulrstyncb">
+      <w:hyperlink w:history="1" r:id="rIdzlf2eq87ratvwswmrkp0z">
         <w:r>
           <w:rPr>
             <w:rStyle w:val="Hyperlink"/>
@@ -2082,7 +2082,7 @@
             </w:tcMar>
           </w:tcPr>
           <w:p>
-            <w:hyperlink w:history="1" r:id="rIdwbnntvjlj3fowwpitrh8r">
+            <w:hyperlink w:history="1" r:id="rIdcbzyfgu52llwimjpreqie">
               <w:r>
                 <w:rPr>
                   <w:rStyle w:val="Hyperlink"/>
@@ -2260,7 +2260,7 @@
             </w:tcMar>
           </w:tcPr>
           <w:p>
-            <w:hyperlink w:history="1" r:id="rIdewg1wmaweggmegh2hagyi">
+            <w:hyperlink w:history="1" r:id="rId2w6djzm_munmqmhzo3_ae">
               <w:r>
                 <w:rPr>
                   <w:rStyle w:val="Hyperlink"/>
@@ -2380,7 +2380,7 @@
             </w:tcMar>
           </w:tcPr>
           <w:p>
-            <w:hyperlink w:history="1" r:id="rIda6obe-ondydmmtzeycs3s">
+            <w:hyperlink w:history="1" r:id="rId3toexxab9gh9gtpjxzzyv">
               <w:r>
                 <w:rPr>
                   <w:rStyle w:val="Hyperlink"/>
@@ -6645,7 +6645,723 @@
         <w:spacing w:after="120"/>
       </w:pPr>
       <w:r>
-        <w:t xml:space="preserve">Com isso a escala de dados fica descartada como solução para o nome da classe. O passo seguinte é o tokenizer marcar a maiúscula com uma peça própria, de modo que </w:t>
+        <w:t xml:space="preserve">Com isso a escala de dados fica descartada como solução para o nome da classe.</w:t>
+      </w:r>
+    </w:p>
+    <w:p>
+      <w:pPr>
+        <w:spacing w:after="120"/>
+      </w:pPr>
+      <w:r>
+        <w:t xml:space="preserve">Para saber se o limite era do dataset ou do Manacá, o mesmo SFT (7.932 exemplos, 3 épocas, QLoRA) rodou no </w:t>
+      </w:r>
+      <w:hyperlink w:history="1" r:id="rIdfc66tsj03yxckunby3nhr">
+        <w:r>
+          <w:rPr>
+            <w:rStyle w:val="Hyperlink"/>
+          </w:rPr>
+          <w:t xml:space="preserve">Qwen2.5-0.5B</w:t>
+        </w:r>
+      </w:hyperlink>
+      <w:r>
+        <w:t xml:space="preserve"> base, que tem metade do tamanho, licença Apache 2.0 e um tokenizer BPE de bytes que já trata maiúsculas. Sem nenhum CPT:</w:t>
+      </w:r>
+    </w:p>
+    <w:tbl>
+      <w:tblPr>
+        <w:tblW w:type="dxa" w:w="9023"/>
+        <w:tblBorders>
+          <w:top w:val="single" w:color="auto" w:sz="4"/>
+          <w:left w:val="single" w:color="auto" w:sz="4"/>
+          <w:bottom w:val="single" w:color="auto" w:sz="4"/>
+          <w:right w:val="single" w:color="auto" w:sz="4"/>
+          <w:insideH w:val="single" w:color="auto" w:sz="4"/>
+          <w:insideV w:val="single" w:color="auto" w:sz="4"/>
+        </w:tblBorders>
+      </w:tblPr>
+      <w:tblGrid>
+        <w:gridCol w:w="1289"/>
+        <w:gridCol w:w="1289"/>
+        <w:gridCol w:w="1289"/>
+        <w:gridCol w:w="1289"/>
+        <w:gridCol w:w="1289"/>
+        <w:gridCol w:w="1289"/>
+        <w:gridCol w:w="1289"/>
+      </w:tblGrid>
+      <w:tr>
+        <w:trPr>
+          <w:tblHeader/>
+        </w:trPr>
+        <w:tc>
+          <w:tcPr>
+            <w:tcW w:type="dxa" w:w="1289"/>
+            <w:tcBorders>
+              <w:top w:val="single" w:color="BBBBBB" w:sz="4"/>
+              <w:left w:val="single" w:color="BBBBBB" w:sz="4"/>
+              <w:bottom w:val="single" w:color="BBBBBB" w:sz="4"/>
+              <w:right w:val="single" w:color="BBBBBB" w:sz="4"/>
+            </w:tcBorders>
+            <w:shd w:fill="E8EEF4" w:val="clear"/>
+            <w:tcMar>
+              <w:top w:type="dxa" w:w="60"/>
+              <w:left w:type="dxa" w:w="100"/>
+              <w:bottom w:type="dxa" w:w="60"/>
+              <w:right w:type="dxa" w:w="100"/>
+            </w:tcMar>
+          </w:tcPr>
+          <w:p>
+            <w:r>
+              <w:rPr>
+                <w:b/>
+                <w:bCs/>
+                <w:sz w:val="18"/>
+                <w:szCs w:val="18"/>
+              </w:rPr>
+              <w:t xml:space="preserve">Teste amplo (182 pedidos)</w:t>
+            </w:r>
+          </w:p>
+        </w:tc>
+        <w:tc>
+          <w:tcPr>
+            <w:tcW w:type="dxa" w:w="1289"/>
+            <w:tcBorders>
+              <w:top w:val="single" w:color="BBBBBB" w:sz="4"/>
+              <w:left w:val="single" w:color="BBBBBB" w:sz="4"/>
+              <w:bottom w:val="single" w:color="BBBBBB" w:sz="4"/>
+              <w:right w:val="single" w:color="BBBBBB" w:sz="4"/>
+            </w:tcBorders>
+            <w:shd w:fill="E8EEF4" w:val="clear"/>
+            <w:tcMar>
+              <w:top w:type="dxa" w:w="60"/>
+              <w:left w:type="dxa" w:w="100"/>
+              <w:bottom w:type="dxa" w:w="60"/>
+              <w:right w:type="dxa" w:w="100"/>
+            </w:tcMar>
+          </w:tcPr>
+          <w:p>
+            <w:r>
+              <w:rPr>
+                <w:b/>
+                <w:bCs/>
+                <w:sz w:val="18"/>
+                <w:szCs w:val="18"/>
+              </w:rPr>
+              <w:t xml:space="preserve">entidade_rate</w:t>
+            </w:r>
+          </w:p>
+        </w:tc>
+        <w:tc>
+          <w:tcPr>
+            <w:tcW w:type="dxa" w:w="1289"/>
+            <w:tcBorders>
+              <w:top w:val="single" w:color="BBBBBB" w:sz="4"/>
+              <w:left w:val="single" w:color="BBBBBB" w:sz="4"/>
+              <w:bottom w:val="single" w:color="BBBBBB" w:sz="4"/>
+              <w:right w:val="single" w:color="BBBBBB" w:sz="4"/>
+            </w:tcBorders>
+            <w:shd w:fill="E8EEF4" w:val="clear"/>
+            <w:tcMar>
+              <w:top w:type="dxa" w:w="60"/>
+              <w:left w:type="dxa" w:w="100"/>
+              <w:bottom w:type="dxa" w:w="60"/>
+              <w:right w:type="dxa" w:w="100"/>
+            </w:tcMar>
+          </w:tcPr>
+          <w:p>
+            <w:r>
+              <w:rPr>
+                <w:b/>
+                <w:bCs/>
+                <w:sz w:val="18"/>
+                <w:szCs w:val="18"/>
+              </w:rPr>
+              <w:t xml:space="preserve">compile_rate</w:t>
+            </w:r>
+          </w:p>
+        </w:tc>
+        <w:tc>
+          <w:tcPr>
+            <w:tcW w:type="dxa" w:w="1289"/>
+            <w:tcBorders>
+              <w:top w:val="single" w:color="BBBBBB" w:sz="4"/>
+              <w:left w:val="single" w:color="BBBBBB" w:sz="4"/>
+              <w:bottom w:val="single" w:color="BBBBBB" w:sz="4"/>
+              <w:right w:val="single" w:color="BBBBBB" w:sz="4"/>
+            </w:tcBorders>
+            <w:shd w:fill="E8EEF4" w:val="clear"/>
+            <w:tcMar>
+              <w:top w:type="dxa" w:w="60"/>
+              <w:left w:type="dxa" w:w="100"/>
+              <w:bottom w:type="dxa" w:w="60"/>
+              <w:right w:type="dxa" w:w="100"/>
+            </w:tcMar>
+          </w:tcPr>
+          <w:p>
+            <w:r>
+              <w:rPr>
+                <w:b/>
+                <w:bCs/>
+                <w:sz w:val="18"/>
+                <w:szCs w:val="18"/>
+              </w:rPr>
+              <w:t xml:space="preserve">runs_rate</w:t>
+            </w:r>
+          </w:p>
+        </w:tc>
+        <w:tc>
+          <w:tcPr>
+            <w:tcW w:type="dxa" w:w="1289"/>
+            <w:tcBorders>
+              <w:top w:val="single" w:color="BBBBBB" w:sz="4"/>
+              <w:left w:val="single" w:color="BBBBBB" w:sz="4"/>
+              <w:bottom w:val="single" w:color="BBBBBB" w:sz="4"/>
+              <w:right w:val="single" w:color="BBBBBB" w:sz="4"/>
+            </w:tcBorders>
+            <w:shd w:fill="E8EEF4" w:val="clear"/>
+            <w:tcMar>
+              <w:top w:type="dxa" w:w="60"/>
+              <w:left w:type="dxa" w:w="100"/>
+              <w:bottom w:type="dxa" w:w="60"/>
+              <w:right w:type="dxa" w:w="100"/>
+            </w:tcMar>
+          </w:tcPr>
+          <w:p>
+            <w:r>
+              <w:rPr>
+                <w:b/>
+                <w:bCs/>
+                <w:sz w:val="18"/>
+                <w:szCs w:val="18"/>
+              </w:rPr>
+              <w:t xml:space="preserve">docstring_rate</w:t>
+            </w:r>
+          </w:p>
+        </w:tc>
+        <w:tc>
+          <w:tcPr>
+            <w:tcW w:type="dxa" w:w="1289"/>
+            <w:tcBorders>
+              <w:top w:val="single" w:color="BBBBBB" w:sz="4"/>
+              <w:left w:val="single" w:color="BBBBBB" w:sz="4"/>
+              <w:bottom w:val="single" w:color="BBBBBB" w:sz="4"/>
+              <w:right w:val="single" w:color="BBBBBB" w:sz="4"/>
+            </w:tcBorders>
+            <w:shd w:fill="E8EEF4" w:val="clear"/>
+            <w:tcMar>
+              <w:top w:type="dxa" w:w="60"/>
+              <w:left w:type="dxa" w:w="100"/>
+              <w:bottom w:type="dxa" w:w="60"/>
+              <w:right w:type="dxa" w:w="100"/>
+            </w:tcMar>
+          </w:tcPr>
+          <w:p>
+            <w:r>
+              <w:rPr>
+                <w:b/>
+                <w:bCs/>
+                <w:sz w:val="18"/>
+                <w:szCs w:val="18"/>
+              </w:rPr>
+              <w:t xml:space="preserve">rotas</w:t>
+            </w:r>
+          </w:p>
+        </w:tc>
+        <w:tc>
+          <w:tcPr>
+            <w:tcW w:type="dxa" w:w="1289"/>
+            <w:tcBorders>
+              <w:top w:val="single" w:color="BBBBBB" w:sz="4"/>
+              <w:left w:val="single" w:color="BBBBBB" w:sz="4"/>
+              <w:bottom w:val="single" w:color="BBBBBB" w:sz="4"/>
+              <w:right w:val="single" w:color="BBBBBB" w:sz="4"/>
+            </w:tcBorders>
+            <w:shd w:fill="E8EEF4" w:val="clear"/>
+            <w:tcMar>
+              <w:top w:type="dxa" w:w="60"/>
+              <w:left w:type="dxa" w:w="100"/>
+              <w:bottom w:type="dxa" w:w="60"/>
+              <w:right w:type="dxa" w:w="100"/>
+            </w:tcMar>
+          </w:tcPr>
+          <w:p>
+            <w:r>
+              <w:rPr>
+                <w:b/>
+                <w:bCs/>
+                <w:sz w:val="18"/>
+                <w:szCs w:val="18"/>
+              </w:rPr>
+              <w:t xml:space="preserve">tempo de SFT</w:t>
+            </w:r>
+          </w:p>
+        </w:tc>
+      </w:tr>
+      <w:tr>
+        <w:trPr>
+          <w:tblHeader w:val="off"/>
+        </w:trPr>
+        <w:tc>
+          <w:tcPr>
+            <w:tcW w:type="dxa" w:w="1289"/>
+            <w:tcBorders>
+              <w:top w:val="single" w:color="BBBBBB" w:sz="4"/>
+              <w:left w:val="single" w:color="BBBBBB" w:sz="4"/>
+              <w:bottom w:val="single" w:color="BBBBBB" w:sz="4"/>
+              <w:right w:val="single" w:color="BBBBBB" w:sz="4"/>
+            </w:tcBorders>
+            <w:tcMar>
+              <w:top w:type="dxa" w:w="60"/>
+              <w:left w:type="dxa" w:w="100"/>
+              <w:bottom w:type="dxa" w:w="60"/>
+              <w:right w:type="dxa" w:w="100"/>
+            </w:tcMar>
+          </w:tcPr>
+          <w:p>
+            <w:r>
+              <w:rPr>
+                <w:b w:val="false"/>
+                <w:bCs w:val="false"/>
+                <w:sz w:val="18"/>
+                <w:szCs w:val="18"/>
+              </w:rPr>
+              <w:t xml:space="preserve">Manacá-1B + CPT grande + 2.000 nomes</w:t>
+            </w:r>
+          </w:p>
+        </w:tc>
+        <w:tc>
+          <w:tcPr>
+            <w:tcW w:type="dxa" w:w="1289"/>
+            <w:tcBorders>
+              <w:top w:val="single" w:color="BBBBBB" w:sz="4"/>
+              <w:left w:val="single" w:color="BBBBBB" w:sz="4"/>
+              <w:bottom w:val="single" w:color="BBBBBB" w:sz="4"/>
+              <w:right w:val="single" w:color="BBBBBB" w:sz="4"/>
+            </w:tcBorders>
+            <w:tcMar>
+              <w:top w:type="dxa" w:w="60"/>
+              <w:left w:type="dxa" w:w="100"/>
+              <w:bottom w:type="dxa" w:w="60"/>
+              <w:right w:type="dxa" w:w="100"/>
+            </w:tcMar>
+          </w:tcPr>
+          <w:p>
+            <w:r>
+              <w:rPr>
+                <w:b w:val="false"/>
+                <w:bCs w:val="false"/>
+                <w:sz w:val="18"/>
+                <w:szCs w:val="18"/>
+              </w:rPr>
+              <w:t xml:space="preserve">0,32</w:t>
+            </w:r>
+          </w:p>
+        </w:tc>
+        <w:tc>
+          <w:tcPr>
+            <w:tcW w:type="dxa" w:w="1289"/>
+            <w:tcBorders>
+              <w:top w:val="single" w:color="BBBBBB" w:sz="4"/>
+              <w:left w:val="single" w:color="BBBBBB" w:sz="4"/>
+              <w:bottom w:val="single" w:color="BBBBBB" w:sz="4"/>
+              <w:right w:val="single" w:color="BBBBBB" w:sz="4"/>
+            </w:tcBorders>
+            <w:tcMar>
+              <w:top w:type="dxa" w:w="60"/>
+              <w:left w:type="dxa" w:w="100"/>
+              <w:bottom w:type="dxa" w:w="60"/>
+              <w:right w:type="dxa" w:w="100"/>
+            </w:tcMar>
+          </w:tcPr>
+          <w:p>
+            <w:r>
+              <w:rPr>
+                <w:b w:val="false"/>
+                <w:bCs w:val="false"/>
+                <w:sz w:val="18"/>
+                <w:szCs w:val="18"/>
+              </w:rPr>
+              <w:t xml:space="preserve">0,88</w:t>
+            </w:r>
+          </w:p>
+        </w:tc>
+        <w:tc>
+          <w:tcPr>
+            <w:tcW w:type="dxa" w:w="1289"/>
+            <w:tcBorders>
+              <w:top w:val="single" w:color="BBBBBB" w:sz="4"/>
+              <w:left w:val="single" w:color="BBBBBB" w:sz="4"/>
+              <w:bottom w:val="single" w:color="BBBBBB" w:sz="4"/>
+              <w:right w:val="single" w:color="BBBBBB" w:sz="4"/>
+            </w:tcBorders>
+            <w:tcMar>
+              <w:top w:type="dxa" w:w="60"/>
+              <w:left w:type="dxa" w:w="100"/>
+              <w:bottom w:type="dxa" w:w="60"/>
+              <w:right w:type="dxa" w:w="100"/>
+            </w:tcMar>
+          </w:tcPr>
+          <w:p>
+            <w:r>
+              <w:rPr>
+                <w:b w:val="false"/>
+                <w:bCs w:val="false"/>
+                <w:sz w:val="18"/>
+                <w:szCs w:val="18"/>
+              </w:rPr>
+              <w:t xml:space="preserve">0,87</w:t>
+            </w:r>
+          </w:p>
+        </w:tc>
+        <w:tc>
+          <w:tcPr>
+            <w:tcW w:type="dxa" w:w="1289"/>
+            <w:tcBorders>
+              <w:top w:val="single" w:color="BBBBBB" w:sz="4"/>
+              <w:left w:val="single" w:color="BBBBBB" w:sz="4"/>
+              <w:bottom w:val="single" w:color="BBBBBB" w:sz="4"/>
+              <w:right w:val="single" w:color="BBBBBB" w:sz="4"/>
+            </w:tcBorders>
+            <w:tcMar>
+              <w:top w:type="dxa" w:w="60"/>
+              <w:left w:type="dxa" w:w="100"/>
+              <w:bottom w:type="dxa" w:w="60"/>
+              <w:right w:type="dxa" w:w="100"/>
+            </w:tcMar>
+          </w:tcPr>
+          <w:p>
+            <w:r>
+              <w:rPr>
+                <w:b w:val="false"/>
+                <w:bCs w:val="false"/>
+                <w:sz w:val="18"/>
+                <w:szCs w:val="18"/>
+              </w:rPr>
+              <w:t xml:space="preserve">0,88</w:t>
+            </w:r>
+          </w:p>
+        </w:tc>
+        <w:tc>
+          <w:tcPr>
+            <w:tcW w:type="dxa" w:w="1289"/>
+            <w:tcBorders>
+              <w:top w:val="single" w:color="BBBBBB" w:sz="4"/>
+              <w:left w:val="single" w:color="BBBBBB" w:sz="4"/>
+              <w:bottom w:val="single" w:color="BBBBBB" w:sz="4"/>
+              <w:right w:val="single" w:color="BBBBBB" w:sz="4"/>
+            </w:tcBorders>
+            <w:tcMar>
+              <w:top w:type="dxa" w:w="60"/>
+              <w:left w:type="dxa" w:w="100"/>
+              <w:bottom w:type="dxa" w:w="60"/>
+              <w:right w:type="dxa" w:w="100"/>
+            </w:tcMar>
+          </w:tcPr>
+          <w:p>
+            <w:r>
+              <w:rPr>
+                <w:b w:val="false"/>
+                <w:bCs w:val="false"/>
+                <w:sz w:val="18"/>
+                <w:szCs w:val="18"/>
+              </w:rPr>
+              <w:t xml:space="preserve">0,74</w:t>
+            </w:r>
+          </w:p>
+        </w:tc>
+        <w:tc>
+          <w:tcPr>
+            <w:tcW w:type="dxa" w:w="1289"/>
+            <w:tcBorders>
+              <w:top w:val="single" w:color="BBBBBB" w:sz="4"/>
+              <w:left w:val="single" w:color="BBBBBB" w:sz="4"/>
+              <w:bottom w:val="single" w:color="BBBBBB" w:sz="4"/>
+              <w:right w:val="single" w:color="BBBBBB" w:sz="4"/>
+            </w:tcBorders>
+            <w:tcMar>
+              <w:top w:type="dxa" w:w="60"/>
+              <w:left w:type="dxa" w:w="100"/>
+              <w:bottom w:type="dxa" w:w="60"/>
+              <w:right w:type="dxa" w:w="100"/>
+            </w:tcMar>
+          </w:tcPr>
+          <w:p>
+            <w:r>
+              <w:rPr>
+                <w:b w:val="false"/>
+                <w:bCs w:val="false"/>
+                <w:sz w:val="18"/>
+                <w:szCs w:val="18"/>
+              </w:rPr>
+              <w:t xml:space="preserve">2 h 11</w:t>
+            </w:r>
+          </w:p>
+        </w:tc>
+      </w:tr>
+      <w:tr>
+        <w:trPr>
+          <w:tblHeader w:val="off"/>
+        </w:trPr>
+        <w:tc>
+          <w:tcPr>
+            <w:tcW w:type="dxa" w:w="1289"/>
+            <w:tcBorders>
+              <w:top w:val="single" w:color="BBBBBB" w:sz="4"/>
+              <w:left w:val="single" w:color="BBBBBB" w:sz="4"/>
+              <w:bottom w:val="single" w:color="BBBBBB" w:sz="4"/>
+              <w:right w:val="single" w:color="BBBBBB" w:sz="4"/>
+            </w:tcBorders>
+            <w:tcMar>
+              <w:top w:type="dxa" w:w="60"/>
+              <w:left w:type="dxa" w:w="100"/>
+              <w:bottom w:type="dxa" w:w="60"/>
+              <w:right w:type="dxa" w:w="100"/>
+            </w:tcMar>
+          </w:tcPr>
+          <w:p>
+            <w:r>
+              <w:rPr>
+                <w:b w:val="false"/>
+                <w:bCs w:val="false"/>
+                <w:sz w:val="18"/>
+                <w:szCs w:val="18"/>
+              </w:rPr>
+              <w:t xml:space="preserve">Qwen2.5-0.5B, sem CPT</w:t>
+            </w:r>
+          </w:p>
+        </w:tc>
+        <w:tc>
+          <w:tcPr>
+            <w:tcW w:type="dxa" w:w="1289"/>
+            <w:tcBorders>
+              <w:top w:val="single" w:color="BBBBBB" w:sz="4"/>
+              <w:left w:val="single" w:color="BBBBBB" w:sz="4"/>
+              <w:bottom w:val="single" w:color="BBBBBB" w:sz="4"/>
+              <w:right w:val="single" w:color="BBBBBB" w:sz="4"/>
+            </w:tcBorders>
+            <w:tcMar>
+              <w:top w:type="dxa" w:w="60"/>
+              <w:left w:type="dxa" w:w="100"/>
+              <w:bottom w:type="dxa" w:w="60"/>
+              <w:right w:type="dxa" w:w="100"/>
+            </w:tcMar>
+          </w:tcPr>
+          <w:p>
+            <w:r>
+              <w:rPr>
+                <w:b w:val="false"/>
+                <w:bCs w:val="false"/>
+                <w:sz w:val="18"/>
+                <w:szCs w:val="18"/>
+              </w:rPr>
+              <w:t xml:space="preserve">1,0</w:t>
+            </w:r>
+          </w:p>
+        </w:tc>
+        <w:tc>
+          <w:tcPr>
+            <w:tcW w:type="dxa" w:w="1289"/>
+            <w:tcBorders>
+              <w:top w:val="single" w:color="BBBBBB" w:sz="4"/>
+              <w:left w:val="single" w:color="BBBBBB" w:sz="4"/>
+              <w:bottom w:val="single" w:color="BBBBBB" w:sz="4"/>
+              <w:right w:val="single" w:color="BBBBBB" w:sz="4"/>
+            </w:tcBorders>
+            <w:tcMar>
+              <w:top w:type="dxa" w:w="60"/>
+              <w:left w:type="dxa" w:w="100"/>
+              <w:bottom w:type="dxa" w:w="60"/>
+              <w:right w:type="dxa" w:w="100"/>
+            </w:tcMar>
+          </w:tcPr>
+          <w:p>
+            <w:r>
+              <w:rPr>
+                <w:b w:val="false"/>
+                <w:bCs w:val="false"/>
+                <w:sz w:val="18"/>
+                <w:szCs w:val="18"/>
+              </w:rPr>
+              <w:t xml:space="preserve">1,0</w:t>
+            </w:r>
+          </w:p>
+        </w:tc>
+        <w:tc>
+          <w:tcPr>
+            <w:tcW w:type="dxa" w:w="1289"/>
+            <w:tcBorders>
+              <w:top w:val="single" w:color="BBBBBB" w:sz="4"/>
+              <w:left w:val="single" w:color="BBBBBB" w:sz="4"/>
+              <w:bottom w:val="single" w:color="BBBBBB" w:sz="4"/>
+              <w:right w:val="single" w:color="BBBBBB" w:sz="4"/>
+            </w:tcBorders>
+            <w:tcMar>
+              <w:top w:type="dxa" w:w="60"/>
+              <w:left w:type="dxa" w:w="100"/>
+              <w:bottom w:type="dxa" w:w="60"/>
+              <w:right w:type="dxa" w:w="100"/>
+            </w:tcMar>
+          </w:tcPr>
+          <w:p>
+            <w:r>
+              <w:rPr>
+                <w:b w:val="false"/>
+                <w:bCs w:val="false"/>
+                <w:sz w:val="18"/>
+                <w:szCs w:val="18"/>
+              </w:rPr>
+              <w:t xml:space="preserve">1,0</w:t>
+            </w:r>
+          </w:p>
+        </w:tc>
+        <w:tc>
+          <w:tcPr>
+            <w:tcW w:type="dxa" w:w="1289"/>
+            <w:tcBorders>
+              <w:top w:val="single" w:color="BBBBBB" w:sz="4"/>
+              <w:left w:val="single" w:color="BBBBBB" w:sz="4"/>
+              <w:bottom w:val="single" w:color="BBBBBB" w:sz="4"/>
+              <w:right w:val="single" w:color="BBBBBB" w:sz="4"/>
+            </w:tcBorders>
+            <w:tcMar>
+              <w:top w:type="dxa" w:w="60"/>
+              <w:left w:type="dxa" w:w="100"/>
+              <w:bottom w:type="dxa" w:w="60"/>
+              <w:right w:type="dxa" w:w="100"/>
+            </w:tcMar>
+          </w:tcPr>
+          <w:p>
+            <w:r>
+              <w:rPr>
+                <w:b w:val="false"/>
+                <w:bCs w:val="false"/>
+                <w:sz w:val="18"/>
+                <w:szCs w:val="18"/>
+              </w:rPr>
+              <w:t xml:space="preserve">1,0</w:t>
+            </w:r>
+          </w:p>
+        </w:tc>
+        <w:tc>
+          <w:tcPr>
+            <w:tcW w:type="dxa" w:w="1289"/>
+            <w:tcBorders>
+              <w:top w:val="single" w:color="BBBBBB" w:sz="4"/>
+              <w:left w:val="single" w:color="BBBBBB" w:sz="4"/>
+              <w:bottom w:val="single" w:color="BBBBBB" w:sz="4"/>
+              <w:right w:val="single" w:color="BBBBBB" w:sz="4"/>
+            </w:tcBorders>
+            <w:tcMar>
+              <w:top w:type="dxa" w:w="60"/>
+              <w:left w:type="dxa" w:w="100"/>
+              <w:bottom w:type="dxa" w:w="60"/>
+              <w:right w:type="dxa" w:w="100"/>
+            </w:tcMar>
+          </w:tcPr>
+          <w:p>
+            <w:r>
+              <w:rPr>
+                <w:b w:val="false"/>
+                <w:bCs w:val="false"/>
+                <w:sz w:val="18"/>
+                <w:szCs w:val="18"/>
+              </w:rPr>
+              <w:t xml:space="preserve">0,945</w:t>
+            </w:r>
+          </w:p>
+        </w:tc>
+        <w:tc>
+          <w:tcPr>
+            <w:tcW w:type="dxa" w:w="1289"/>
+            <w:tcBorders>
+              <w:top w:val="single" w:color="BBBBBB" w:sz="4"/>
+              <w:left w:val="single" w:color="BBBBBB" w:sz="4"/>
+              <w:bottom w:val="single" w:color="BBBBBB" w:sz="4"/>
+              <w:right w:val="single" w:color="BBBBBB" w:sz="4"/>
+            </w:tcBorders>
+            <w:tcMar>
+              <w:top w:type="dxa" w:w="60"/>
+              <w:left w:type="dxa" w:w="100"/>
+              <w:bottom w:type="dxa" w:w="60"/>
+              <w:right w:type="dxa" w:w="100"/>
+            </w:tcMar>
+          </w:tcPr>
+          <w:p>
+            <w:r>
+              <w:rPr>
+                <w:b w:val="false"/>
+                <w:bCs w:val="false"/>
+                <w:sz w:val="18"/>
+                <w:szCs w:val="18"/>
+              </w:rPr>
+              <w:t xml:space="preserve">54 min</w:t>
+            </w:r>
+          </w:p>
+        </w:tc>
+      </w:tr>
+    </w:tbl>
+    <w:p/>
+    <w:p>
+      <w:pPr>
+        <w:spacing w:after="120"/>
+      </w:pPr>
+      <w:r>
+        <w:t xml:space="preserve">O dataset e o eval estão certos: um modelo que já sabe caixa aprende a tarefa inteira só com o SFT. O limite é o pré-treino do Manacá, todo em minúsculas, que 35 milhões de tokens de CPT não corrigem. O Qwen3, por comparação, foi pré-treinado em 36 trilhões de tokens (</w:t>
+      </w:r>
+      <w:hyperlink w:history="1" r:id="rIdx9oe9emhtsu-rpkixxd8x">
+        <w:r>
+          <w:rPr>
+            <w:rStyle w:val="Hyperlink"/>
+          </w:rPr>
+          <w:t xml:space="preserve">relatório técnico</w:t>
+        </w:r>
+      </w:hyperlink>
+      <w:r>
+        <w:t xml:space="preserve">). O Qwen3 ficou de fora do controle porque exige transformers 4.51, e o stack da 3090 usa o 4.46.3.</w:t>
+      </w:r>
+    </w:p>
+    <w:p>
+      <w:pPr>
+        <w:spacing w:after="120"/>
+      </w:pPr>
+      <w:r>
+        <w:t xml:space="preserve">Para rodar o Qwen, o </w:t>
+      </w:r>
+      <w:r>
+        <w:rPr>
+          <w:rFonts w:ascii="Consolas" w:cs="Consolas" w:eastAsia="Consolas" w:hAnsi="Consolas"/>
+        </w:rPr>
+        <w:t xml:space="preserve">train_qlora.py</w:t>
+      </w:r>
+      <w:r>
+        <w:t xml:space="preserve"> passou a trocar o pad quando ele é o próprio EOS (no Qwen os dois são </w:t>
+      </w:r>
+      <w:r>
+        <w:rPr>
+          <w:rFonts w:ascii="Consolas" w:cs="Consolas" w:eastAsia="Consolas" w:hAnsi="Consolas"/>
+        </w:rPr>
+        <w:t xml:space="preserve">&lt;|endoftext|&gt;</w:t>
+      </w:r>
+      <w:r>
+        <w:t xml:space="preserve">, e o collator apagaria o EOS dos labels), e o eval passou a cortar a saída no primeiro EOS ou pad.</w:t>
+      </w:r>
+    </w:p>
+    <w:p>
+      <w:pPr>
+        <w:spacing w:after="120"/>
+      </w:pPr>
+      <w:r>
+        <w:t xml:space="preserve">O próximo passo, para manter o Manacá como base, é o tokenizer marcar a maiúscula com uma peça própria, como em </w:t>
+      </w:r>
+      <w:hyperlink w:history="1" r:id="rIdo73vetwqixv_ecd3zdlgd">
+        <w:r>
+          <w:rPr>
+            <w:rStyle w:val="Hyperlink"/>
+          </w:rPr>
+          <w:t xml:space="preserve">Land e Meister</w:t>
+        </w:r>
+      </w:hyperlink>
+      <w:r>
+        <w:t xml:space="preserve">: </w:t>
       </w:r>
       <w:r>
         <w:rPr>
@@ -6654,7 +7370,7 @@
         <w:t xml:space="preserve">Comentario</w:t>
       </w:r>
       <w:r>
-        <w:t xml:space="preserve"> vire </w:t>
+        <w:t xml:space="preserve"> vira </w:t>
       </w:r>
       <w:r>
         <w:rPr>
@@ -6672,7 +7388,27 @@
         <w:t xml:space="preserve">comentario</w:t>
       </w:r>
       <w:r>
-        <w:t xml:space="preserve"> da instrução. Isso exige refazer o tokenizer e o CPT e passa a precisar de um passo de decodificação fora do modelo.</w:t>
+        <w:t xml:space="preserve"> da instrução. O marcador vai antes do espaço que precede a palavra, para que a peça continue sendo </w:t>
+      </w:r>
+      <w:r>
+        <w:rPr>
+          <w:rFonts w:ascii="Consolas" w:cs="Consolas" w:eastAsia="Consolas" w:hAnsi="Consolas"/>
+        </w:rPr>
+        <w:t xml:space="preserve">▁comentario</w:t>
+      </w:r>
+      <w:r>
+        <w:t xml:space="preserve">. O CPT do marcador vai usar cerca de 100 milhões de tokens a mais de português do </w:t>
+      </w:r>
+      <w:hyperlink w:history="1" r:id="rIdoh4onk_k9mti6qk8ghly1">
+        <w:r>
+          <w:rPr>
+            <w:rStyle w:val="Hyperlink"/>
+          </w:rPr>
+          <w:t xml:space="preserve">GigaVerbo-v2</w:t>
+        </w:r>
+      </w:hyperlink>
+      <w:r>
+        <w:t xml:space="preserve">, o corpus do projeto Tucano 2, filtrado por qualidade.</w:t>
       </w:r>
     </w:p>
     <w:p>
@@ -7359,7 +8095,7 @@
           <w:numId w:val="2"/>
         </w:numPr>
       </w:pPr>
-      <w:hyperlink w:history="1" r:id="rIdyyuqg99pnafhzamj3pmy8">
+      <w:hyperlink w:history="1" r:id="rIdrpijqvcwk1r0_9zamnrt3">
         <w:r>
           <w:rPr>
             <w:rStyle w:val="Hyperlink"/>
@@ -7379,7 +8115,7 @@
           <w:numId w:val="2"/>
         </w:numPr>
       </w:pPr>
-      <w:hyperlink w:history="1" r:id="rIds8f9byprrywmcgsl_95q8">
+      <w:hyperlink w:history="1" r:id="rId0dxrmkmpasu_tg834rleo">
         <w:r>
           <w:rPr>
             <w:rStyle w:val="Hyperlink"/>
@@ -7399,7 +8135,7 @@
           <w:numId w:val="2"/>
         </w:numPr>
       </w:pPr>
-      <w:hyperlink w:history="1" r:id="rIdmtiwxhqkk8zk3xtxssl8u">
+      <w:hyperlink w:history="1" r:id="rIddwlxoz-smskdmypkeeova">
         <w:r>
           <w:rPr>
             <w:rStyle w:val="Hyperlink"/>
@@ -7425,7 +8161,7 @@
           <w:numId w:val="2"/>
         </w:numPr>
       </w:pPr>
-      <w:hyperlink w:history="1" r:id="rIdpyubvyf478njamvsttjpe">
+      <w:hyperlink w:history="1" r:id="rIdlz5dye8mvvonbirhopha2">
         <w:r>
           <w:rPr>
             <w:rStyle w:val="Hyperlink"/>
@@ -7448,7 +8184,7 @@
       <w:r>
         <w:t xml:space="preserve">Gururangan et al., </w:t>
       </w:r>
-      <w:hyperlink w:history="1" r:id="rIdpoa25j-kkfbh9rbh8hwj9">
+      <w:hyperlink w:history="1" r:id="rId84ap45ac3fqhetrftblw5">
         <w:r>
           <w:rPr>
             <w:rStyle w:val="Hyperlink"/>
@@ -7471,7 +8207,7 @@
       <w:r>
         <w:t xml:space="preserve">Hu et al., </w:t>
       </w:r>
-      <w:hyperlink w:history="1" r:id="rIdcpfs03qiuadmdjxjsovnt">
+      <w:hyperlink w:history="1" r:id="rIdslbzapu94h0iddi3niafi">
         <w:r>
           <w:rPr>
             <w:rStyle w:val="Hyperlink"/>
@@ -7494,7 +8230,7 @@
       <w:r>
         <w:t xml:space="preserve">Dettmers et al., </w:t>
       </w:r>
-      <w:hyperlink w:history="1" r:id="rIde9pizmmubs0_9q7bhwtgv">
+      <w:hyperlink w:history="1" r:id="rId5kgw93yhqunplerj7_cgq">
         <w:r>
           <w:rPr>
             <w:rStyle w:val="Hyperlink"/>
@@ -7517,7 +8253,7 @@
       <w:r>
         <w:t xml:space="preserve">Kudo e Richardson, </w:t>
       </w:r>
-      <w:hyperlink w:history="1" r:id="rIdbt0qfwwao9duzub-cezld">
+      <w:hyperlink w:history="1" r:id="rId8smqx2qkfttyjbfypyrk_">
         <w:r>
           <w:rPr>
             <w:rStyle w:val="Hyperlink"/>

</xml_diff>

<commit_message>
Rodar o v4 fora da 3090: NF4 simulado, fusao, GGUF e chat por ids
nf4_simulado arredonda os pesos para a grade NF4 em torch puro, para o
adapter ver os pesos do treino sem bitsandbytes. fundir_adapter funde o
adapter nesse base e alimenta o convert_hf_to_gguf do llama.cpp. O
tokenizer do llama.cpp nao reproduz o Unigram com byte fallback do Manaca
(6 de 100 textos identicos), entao chat_gguf conversa com o llama-server
por ids. Q8_0: 10 de 10 no teste amplo, ~15 tokens/s na GPU Intel; Q4_K_M
quebra. O doc registra tudo e a receita do instruct do LNCC como proximo
passo.
</commit_message>
<xml_diff>
--- a/docs/treino_cased.docx
+++ b/docs/treino_cased.docx
@@ -2749,7 +2749,7 @@
       <w:r>
         <w:t xml:space="preserve">O ponto de partida é o </w:t>
       </w:r>
-      <w:hyperlink w:history="1" r:id="rIdbi6qnd_8y89krmgjrc5t5">
+      <w:hyperlink w:history="1" r:id="rId9fabbknerltso8jt5e4lr">
         <w:r>
           <w:rPr>
             <w:rStyle w:val="Hyperlink"/>
@@ -3337,7 +3337,7 @@
             </w:tcMar>
           </w:tcPr>
           <w:p>
-            <w:hyperlink w:history="1" r:id="rIdufzirnqmlerkf8rt5tudu">
+            <w:hyperlink w:history="1" r:id="rIdrcc93osc5vwzbopsnecvv">
               <w:r>
                 <w:rPr>
                   <w:rStyle w:val="Hyperlink"/>
@@ -3515,7 +3515,7 @@
             </w:tcMar>
           </w:tcPr>
           <w:p>
-            <w:hyperlink w:history="1" r:id="rIdeqprtcncclifxjt3eb5g_">
+            <w:hyperlink w:history="1" r:id="rIdh1tm-t9ripagbjt4-aibe">
               <w:r>
                 <w:rPr>
                   <w:rStyle w:val="Hyperlink"/>
@@ -3635,7 +3635,7 @@
             </w:tcMar>
           </w:tcPr>
           <w:p>
-            <w:hyperlink w:history="1" r:id="rIdu5ntke5tacetq7gkbak3-">
+            <w:hyperlink w:history="1" r:id="rIdp62v1uzb8jwfjum3xsi02">
               <w:r>
                 <w:rPr>
                   <w:rStyle w:val="Hyperlink"/>
@@ -7910,7 +7910,7 @@
       <w:r>
         <w:t xml:space="preserve">Para saber se o limite era do dataset ou do Manacá, o mesmo SFT (7.932 exemplos, 3 épocas, QLoRA) rodou no </w:t>
       </w:r>
-      <w:hyperlink w:history="1" r:id="rIdekicpoxl6vxm7o5sv7dp2">
+      <w:hyperlink w:history="1" r:id="rIdinhuybyotsr11kysszvyz">
         <w:r>
           <w:rPr>
             <w:rStyle w:val="Hyperlink"/>
@@ -8562,7 +8562,7 @@
       <w:r>
         <w:t xml:space="preserve">O dataset e o eval estão certos: um modelo que já sabe caixa aprende a tarefa inteira só com o SFT. O limite é o pré-treino do Manacá, todo em minúsculas, que 35 milhões de tokens de CPT não corrigem. O Qwen3, por comparação, foi pré-treinado em 36 trilhões de tokens (</w:t>
       </w:r>
-      <w:hyperlink w:history="1" r:id="rIdfbjqph9u0uu1ceqd570sm">
+      <w:hyperlink w:history="1" r:id="rIdxluypbobwd5y1athc3orr">
         <w:r>
           <w:rPr>
             <w:rStyle w:val="Hyperlink"/>
@@ -8607,7 +8607,7 @@
       <w:r>
         <w:t xml:space="preserve">Para manter o Manacá como base, o tokenizer v3 passou a marcar a maiúscula com uma peça própria, como em </w:t>
       </w:r>
-      <w:hyperlink w:history="1" r:id="rIdwzo0xcy5czjjk66cxrir4">
+      <w:hyperlink w:history="1" r:id="rIdi7rotsndrymmjwwhfznct">
         <w:r>
           <w:rPr>
             <w:rStyle w:val="Hyperlink"/>
@@ -8689,7 +8689,7 @@
       <w:r>
         <w:t xml:space="preserve">O v3 tem as 64.000 peças originais do Manacá (que baixam a caixa), as 43.120 peças sem espaço do v2 e os 2 marcadores, 107.122 tokens no total. O CPT partiu do CPT grande, com as linhas do embedding copiadas peça por peça, e os marcadores começaram pela média das letras maiúsculas do v2. O corpus juntou o código e a Wikipédia de antes com 65 milhões de tokens do </w:t>
       </w:r>
-      <w:hyperlink w:history="1" r:id="rId82twaa4ffhtoylwchgews">
+      <w:hyperlink w:history="1" r:id="rIdxwp55byqnxeiz4jjh4_uj">
         <w:r>
           <w:rPr>
             <w:rStyle w:val="Hyperlink"/>
@@ -9875,7 +9875,7 @@
         <w:pStyle w:val="Heading1"/>
       </w:pPr>
       <w:r>
-        <w:t xml:space="preserve">Licenças</w:t>
+        <w:t xml:space="preserve">Rodar o modelo fora da 3090</w:t>
       </w:r>
     </w:p>
     <w:p>
@@ -9883,7 +9883,937 @@
         <w:spacing w:after="120"/>
       </w:pPr>
       <w:r>
-        <w:t xml:space="preserve">O dataset de ajuste fino é CC0. O código do FastAPI e o código colhido do GitHub têm licenças permissivas, registradas por documento no corpus. A Wikipedia é CC BY-SA 3.0, que exige atribuição e compartilhamento pela mesma licença. Isso precisa ser resolvido antes de distribuir pesos treinados com ela. O modelo base é CC BY 4.0 e exige atribuição ao LNCC.</w:t>
+        <w:t xml:space="preserve">O modelo final são duas peças: </w:t>
+      </w:r>
+      <w:r>
+        <w:rPr>
+          <w:rFonts w:ascii="Consolas" w:cs="Consolas" w:eastAsia="Consolas" w:hAnsi="Consolas"/>
+        </w:rPr>
+        <w:t xml:space="preserve">checkpoints/manaca-cpt-v4</w:t>
+      </w:r>
+      <w:r>
+        <w:t xml:space="preserve"> (o modelo depois do CPT, 1,72 bilhão de parâmetros em bf16, 3,4 GB) e </w:t>
+      </w:r>
+      <w:r>
+        <w:rPr>
+          <w:rFonts w:ascii="Consolas" w:cs="Consolas" w:eastAsia="Consolas" w:hAnsi="Consolas"/>
+        </w:rPr>
+        <w:t xml:space="preserve">checkpoints/manaca-fastapi-v4</w:t>
+      </w:r>
+      <w:r>
+        <w:t xml:space="preserve"> (o adapter LoRA do SFT, 134 MB). As duas ficam fora do git.</w:t>
+      </w:r>
+    </w:p>
+    <w:p>
+      <w:pPr>
+        <w:spacing w:after="120"/>
+      </w:pPr>
+      <w:r>
+        <w:t xml:space="preserve">O adapter foi treinado sobre o base quantizado em NF4 (QLoRA) e só acerta sobre esse base. Sem GPU NVIDIA não há bitsandbytes, então </w:t>
+      </w:r>
+      <w:r>
+        <w:rPr>
+          <w:rFonts w:ascii="Consolas" w:cs="Consolas" w:eastAsia="Consolas" w:hAnsi="Consolas"/>
+        </w:rPr>
+        <w:t xml:space="preserve">scripts/nf4_simulado.py</w:t>
+      </w:r>
+      <w:r>
+        <w:t xml:space="preserve"> arredonda os pesos para a grade NF4 em torch puro (os 16 valores e o bloco de 64 do bitsandbytes), e o adapter vê os pesos do treino. </w:t>
+      </w:r>
+      <w:r>
+        <w:rPr>
+          <w:rFonts w:ascii="Consolas" w:cs="Consolas" w:eastAsia="Consolas" w:hAnsi="Consolas"/>
+        </w:rPr>
+        <w:t xml:space="preserve">scripts/chat_fastapi.py</w:t>
+      </w:r>
+      <w:r>
+        <w:t xml:space="preserve"> usa isso em CPU, mas leva mais de 10 minutos por resposta.</w:t>
+      </w:r>
+    </w:p>
+    <w:p>
+      <w:pPr>
+        <w:spacing w:after="120"/>
+      </w:pPr>
+      <w:r>
+        <w:t xml:space="preserve">Para usar a GPU Intel desta máquina, o adapter é fundido no base já arredondado (</w:t>
+      </w:r>
+      <w:r>
+        <w:rPr>
+          <w:rFonts w:ascii="Consolas" w:cs="Consolas" w:eastAsia="Consolas" w:hAnsi="Consolas"/>
+        </w:rPr>
+        <w:t xml:space="preserve">scripts/fundir_adapter.py</w:t>
+      </w:r>
+      <w:r>
+        <w:t xml:space="preserve">) e convertido para GGUF pelo </w:t>
+      </w:r>
+      <w:r>
+        <w:rPr>
+          <w:rFonts w:ascii="Consolas" w:cs="Consolas" w:eastAsia="Consolas" w:hAnsi="Consolas"/>
+        </w:rPr>
+        <w:t xml:space="preserve">convert_hf_to_gguf.py</w:t>
+      </w:r>
+      <w:r>
+        <w:t xml:space="preserve"> do llama.cpp. O tokenizer do GGUF não serve: o Manacá é Unigram com byte fallback, e o llama.cpp não tem essa combinação. No modo Unigram (</w:t>
+      </w:r>
+      <w:r>
+        <w:rPr>
+          <w:rFonts w:ascii="Consolas" w:cs="Consolas" w:eastAsia="Consolas" w:hAnsi="Consolas"/>
+        </w:rPr>
+        <w:t xml:space="preserve">t5</w:t>
+      </w:r>
+      <w:r>
+        <w:t xml:space="preserve">), </w:t>
+      </w:r>
+      <w:r>
+        <w:rPr>
+          <w:rFonts w:ascii="Consolas" w:cs="Consolas" w:eastAsia="Consolas" w:hAnsi="Consolas"/>
+        </w:rPr>
+        <w:t xml:space="preserve">\n</w:t>
+      </w:r>
+      <w:r>
+        <w:t xml:space="preserve"> vira </w:t>
+      </w:r>
+      <w:r>
+        <w:rPr>
+          <w:rFonts w:ascii="Consolas" w:cs="Consolas" w:eastAsia="Consolas" w:hAnsi="Consolas"/>
+        </w:rPr>
+        <w:t xml:space="preserve">&lt;unk&gt;</w:t>
+      </w:r>
+      <w:r>
+        <w:t xml:space="preserve">; no modo SentencePiece (</w:t>
+      </w:r>
+      <w:r>
+        <w:rPr>
+          <w:rFonts w:ascii="Consolas" w:cs="Consolas" w:eastAsia="Consolas" w:hAnsi="Consolas"/>
+        </w:rPr>
+        <w:t xml:space="preserve">llama</w:t>
+      </w:r>
+      <w:r>
+        <w:t xml:space="preserve">), a segmentação sai por fusões. Em 100 textos, 6 saíram idênticos ao tokenizer do treino em cada modo. Por isso </w:t>
+      </w:r>
+      <w:r>
+        <w:rPr>
+          <w:rFonts w:ascii="Consolas" w:cs="Consolas" w:eastAsia="Consolas" w:hAnsi="Consolas"/>
+        </w:rPr>
+        <w:t xml:space="preserve">scripts/chat_gguf.py</w:t>
+      </w:r>
+      <w:r>
+        <w:t xml:space="preserve"> tokeniza do lado do Python e conversa com o </w:t>
+      </w:r>
+      <w:r>
+        <w:rPr>
+          <w:rFonts w:ascii="Consolas" w:cs="Consolas" w:eastAsia="Consolas" w:hAnsi="Consolas"/>
+        </w:rPr>
+        <w:t xml:space="preserve">llama-server</w:t>
+      </w:r>
+      <w:r>
+        <w:t xml:space="preserve"> por ids (o </w:t>
+      </w:r>
+      <w:r>
+        <w:rPr>
+          <w:rFonts w:ascii="Consolas" w:cs="Consolas" w:eastAsia="Consolas" w:hAnsi="Consolas"/>
+        </w:rPr>
+        <w:t xml:space="preserve">/completion</w:t>
+      </w:r>
+      <w:r>
+        <w:t xml:space="preserve"> aceita o prompt como lista de ids e devolve os ids gerados). Pelo mesmo motivo o Ollama não serve: ele só aceita texto.</w:t>
+      </w:r>
+    </w:p>
+    <w:p>
+      <w:r>
+        <w:rPr>
+          <w:rFonts w:ascii="Consolas" w:cs="Consolas" w:eastAsia="Consolas" w:hAnsi="Consolas"/>
+          <w:sz w:val="18"/>
+          <w:szCs w:val="18"/>
+        </w:rPr>
+        <w:t xml:space="preserve">llama-server -m models/manaca-fastapi-v4-q8_0.gguf --port 8080 -ngl 99 -c 4096</w:t>
+      </w:r>
+    </w:p>
+    <w:p>
+      <w:r>
+        <w:rPr>
+          <w:rFonts w:ascii="Consolas" w:cs="Consolas" w:eastAsia="Consolas" w:hAnsi="Consolas"/>
+          <w:sz w:val="18"/>
+          <w:szCs w:val="18"/>
+        </w:rPr>
+        <w:t xml:space="preserve">uv run --with transformers==4.46.3 python scripts/chat_gguf.py</w:t>
+      </w:r>
+    </w:p>
+    <w:p>
+      <w:pPr>
+        <w:spacing w:after="120"/>
+      </w:pPr>
+      <w:r>
+        <w:t xml:space="preserve">Quantizado pelo </w:t>
+      </w:r>
+      <w:r>
+        <w:rPr>
+          <w:rFonts w:ascii="Consolas" w:cs="Consolas" w:eastAsia="Consolas" w:hAnsi="Consolas"/>
+        </w:rPr>
+        <w:t xml:space="preserve">llama-quantize</w:t>
+      </w:r>
+      <w:r>
+        <w:t xml:space="preserve">, sobre o GGUF F16 fundido, na GPU Intel Arc desta máquina:</w:t>
+      </w:r>
+    </w:p>
+    <w:tbl>
+      <w:tblPr>
+        <w:tblW w:type="dxa" w:w="9024"/>
+        <w:tblBorders>
+          <w:top w:val="single" w:color="auto" w:sz="4"/>
+          <w:left w:val="single" w:color="auto" w:sz="4"/>
+          <w:bottom w:val="single" w:color="auto" w:sz="4"/>
+          <w:right w:val="single" w:color="auto" w:sz="4"/>
+          <w:insideH w:val="single" w:color="auto" w:sz="4"/>
+          <w:insideV w:val="single" w:color="auto" w:sz="4"/>
+        </w:tblBorders>
+      </w:tblPr>
+      <w:tblGrid>
+        <w:gridCol w:w="2256"/>
+        <w:gridCol w:w="2256"/>
+        <w:gridCol w:w="2256"/>
+        <w:gridCol w:w="2256"/>
+      </w:tblGrid>
+      <w:tr>
+        <w:trPr>
+          <w:tblHeader/>
+        </w:trPr>
+        <w:tc>
+          <w:tcPr>
+            <w:tcW w:type="dxa" w:w="2256"/>
+            <w:tcBorders>
+              <w:top w:val="single" w:color="BBBBBB" w:sz="4"/>
+              <w:left w:val="single" w:color="BBBBBB" w:sz="4"/>
+              <w:bottom w:val="single" w:color="BBBBBB" w:sz="4"/>
+              <w:right w:val="single" w:color="BBBBBB" w:sz="4"/>
+            </w:tcBorders>
+            <w:shd w:fill="E8EEF4" w:val="clear"/>
+            <w:tcMar>
+              <w:top w:type="dxa" w:w="60"/>
+              <w:left w:type="dxa" w:w="100"/>
+              <w:bottom w:type="dxa" w:w="60"/>
+              <w:right w:type="dxa" w:w="100"/>
+            </w:tcMar>
+          </w:tcPr>
+          <w:p>
+            <w:r>
+              <w:rPr>
+                <w:b/>
+                <w:bCs/>
+                <w:sz w:val="18"/>
+                <w:szCs w:val="18"/>
+              </w:rPr>
+              <w:t xml:space="preserve">Arquivo</w:t>
+            </w:r>
+          </w:p>
+        </w:tc>
+        <w:tc>
+          <w:tcPr>
+            <w:tcW w:type="dxa" w:w="2256"/>
+            <w:tcBorders>
+              <w:top w:val="single" w:color="BBBBBB" w:sz="4"/>
+              <w:left w:val="single" w:color="BBBBBB" w:sz="4"/>
+              <w:bottom w:val="single" w:color="BBBBBB" w:sz="4"/>
+              <w:right w:val="single" w:color="BBBBBB" w:sz="4"/>
+            </w:tcBorders>
+            <w:shd w:fill="E8EEF4" w:val="clear"/>
+            <w:tcMar>
+              <w:top w:type="dxa" w:w="60"/>
+              <w:left w:type="dxa" w:w="100"/>
+              <w:bottom w:type="dxa" w:w="60"/>
+              <w:right w:type="dxa" w:w="100"/>
+            </w:tcMar>
+          </w:tcPr>
+          <w:p>
+            <w:r>
+              <w:rPr>
+                <w:b/>
+                <w:bCs/>
+                <w:sz w:val="18"/>
+                <w:szCs w:val="18"/>
+              </w:rPr>
+              <w:t xml:space="preserve">Tamanho</w:t>
+            </w:r>
+          </w:p>
+        </w:tc>
+        <w:tc>
+          <w:tcPr>
+            <w:tcW w:type="dxa" w:w="2256"/>
+            <w:tcBorders>
+              <w:top w:val="single" w:color="BBBBBB" w:sz="4"/>
+              <w:left w:val="single" w:color="BBBBBB" w:sz="4"/>
+              <w:bottom w:val="single" w:color="BBBBBB" w:sz="4"/>
+              <w:right w:val="single" w:color="BBBBBB" w:sz="4"/>
+            </w:tcBorders>
+            <w:shd w:fill="E8EEF4" w:val="clear"/>
+            <w:tcMar>
+              <w:top w:type="dxa" w:w="60"/>
+              <w:left w:type="dxa" w:w="100"/>
+              <w:bottom w:type="dxa" w:w="60"/>
+              <w:right w:type="dxa" w:w="100"/>
+            </w:tcMar>
+          </w:tcPr>
+          <w:p>
+            <w:r>
+              <w:rPr>
+                <w:b/>
+                <w:bCs/>
+                <w:sz w:val="18"/>
+                <w:szCs w:val="18"/>
+              </w:rPr>
+              <w:t xml:space="preserve">Velocidade</w:t>
+            </w:r>
+          </w:p>
+        </w:tc>
+        <w:tc>
+          <w:tcPr>
+            <w:tcW w:type="dxa" w:w="2256"/>
+            <w:tcBorders>
+              <w:top w:val="single" w:color="BBBBBB" w:sz="4"/>
+              <w:left w:val="single" w:color="BBBBBB" w:sz="4"/>
+              <w:bottom w:val="single" w:color="BBBBBB" w:sz="4"/>
+              <w:right w:val="single" w:color="BBBBBB" w:sz="4"/>
+            </w:tcBorders>
+            <w:shd w:fill="E8EEF4" w:val="clear"/>
+            <w:tcMar>
+              <w:top w:type="dxa" w:w="60"/>
+              <w:left w:type="dxa" w:w="100"/>
+              <w:bottom w:type="dxa" w:w="60"/>
+              <w:right w:type="dxa" w:w="100"/>
+            </w:tcMar>
+          </w:tcPr>
+          <w:p>
+            <w:r>
+              <w:rPr>
+                <w:b/>
+                <w:bCs/>
+                <w:sz w:val="18"/>
+                <w:szCs w:val="18"/>
+              </w:rPr>
+              <w:t xml:space="preserve">Resultado medido</w:t>
+            </w:r>
+          </w:p>
+        </w:tc>
+      </w:tr>
+      <w:tr>
+        <w:trPr>
+          <w:tblHeader w:val="off"/>
+        </w:trPr>
+        <w:tc>
+          <w:tcPr>
+            <w:tcW w:type="dxa" w:w="2256"/>
+            <w:tcBorders>
+              <w:top w:val="single" w:color="BBBBBB" w:sz="4"/>
+              <w:left w:val="single" w:color="BBBBBB" w:sz="4"/>
+              <w:bottom w:val="single" w:color="BBBBBB" w:sz="4"/>
+              <w:right w:val="single" w:color="BBBBBB" w:sz="4"/>
+            </w:tcBorders>
+            <w:tcMar>
+              <w:top w:type="dxa" w:w="60"/>
+              <w:left w:type="dxa" w:w="100"/>
+              <w:bottom w:type="dxa" w:w="60"/>
+              <w:right w:type="dxa" w:w="100"/>
+            </w:tcMar>
+          </w:tcPr>
+          <w:p>
+            <w:r>
+              <w:rPr>
+                <w:b w:val="false"/>
+                <w:bCs w:val="false"/>
+                <w:sz w:val="18"/>
+                <w:szCs w:val="18"/>
+              </w:rPr>
+              <w:t xml:space="preserve">F16</w:t>
+            </w:r>
+          </w:p>
+        </w:tc>
+        <w:tc>
+          <w:tcPr>
+            <w:tcW w:type="dxa" w:w="2256"/>
+            <w:tcBorders>
+              <w:top w:val="single" w:color="BBBBBB" w:sz="4"/>
+              <w:left w:val="single" w:color="BBBBBB" w:sz="4"/>
+              <w:bottom w:val="single" w:color="BBBBBB" w:sz="4"/>
+              <w:right w:val="single" w:color="BBBBBB" w:sz="4"/>
+            </w:tcBorders>
+            <w:tcMar>
+              <w:top w:type="dxa" w:w="60"/>
+              <w:left w:type="dxa" w:w="100"/>
+              <w:bottom w:type="dxa" w:w="60"/>
+              <w:right w:type="dxa" w:w="100"/>
+            </w:tcMar>
+          </w:tcPr>
+          <w:p>
+            <w:r>
+              <w:rPr>
+                <w:b w:val="false"/>
+                <w:bCs w:val="false"/>
+                <w:sz w:val="18"/>
+                <w:szCs w:val="18"/>
+              </w:rPr>
+              <w:t xml:space="preserve">3,4 GB</w:t>
+            </w:r>
+          </w:p>
+        </w:tc>
+        <w:tc>
+          <w:tcPr>
+            <w:tcW w:type="dxa" w:w="2256"/>
+            <w:tcBorders>
+              <w:top w:val="single" w:color="BBBBBB" w:sz="4"/>
+              <w:left w:val="single" w:color="BBBBBB" w:sz="4"/>
+              <w:bottom w:val="single" w:color="BBBBBB" w:sz="4"/>
+              <w:right w:val="single" w:color="BBBBBB" w:sz="4"/>
+            </w:tcBorders>
+            <w:tcMar>
+              <w:top w:type="dxa" w:w="60"/>
+              <w:left w:type="dxa" w:w="100"/>
+              <w:bottom w:type="dxa" w:w="60"/>
+              <w:right w:type="dxa" w:w="100"/>
+            </w:tcMar>
+          </w:tcPr>
+          <w:p>
+            <w:r>
+              <w:rPr>
+                <w:b w:val="false"/>
+                <w:bCs w:val="false"/>
+                <w:sz w:val="18"/>
+                <w:szCs w:val="18"/>
+              </w:rPr>
+              <w:t xml:space="preserve">~10 tokens/s</w:t>
+            </w:r>
+          </w:p>
+        </w:tc>
+        <w:tc>
+          <w:tcPr>
+            <w:tcW w:type="dxa" w:w="2256"/>
+            <w:tcBorders>
+              <w:top w:val="single" w:color="BBBBBB" w:sz="4"/>
+              <w:left w:val="single" w:color="BBBBBB" w:sz="4"/>
+              <w:bottom w:val="single" w:color="BBBBBB" w:sz="4"/>
+              <w:right w:val="single" w:color="BBBBBB" w:sz="4"/>
+            </w:tcBorders>
+            <w:tcMar>
+              <w:top w:type="dxa" w:w="60"/>
+              <w:left w:type="dxa" w:w="100"/>
+              <w:bottom w:type="dxa" w:w="60"/>
+              <w:right w:type="dxa" w:w="100"/>
+            </w:tcMar>
+          </w:tcPr>
+          <w:p>
+            <w:r>
+              <w:rPr>
+                <w:b w:val="false"/>
+                <w:bCs w:val="false"/>
+                <w:sz w:val="18"/>
+                <w:szCs w:val="18"/>
+              </w:rPr>
+              <w:t xml:space="preserve">referência; app do pedido de teste sobe na sandbox</w:t>
+            </w:r>
+          </w:p>
+        </w:tc>
+      </w:tr>
+      <w:tr>
+        <w:trPr>
+          <w:tblHeader w:val="off"/>
+        </w:trPr>
+        <w:tc>
+          <w:tcPr>
+            <w:tcW w:type="dxa" w:w="2256"/>
+            <w:tcBorders>
+              <w:top w:val="single" w:color="BBBBBB" w:sz="4"/>
+              <w:left w:val="single" w:color="BBBBBB" w:sz="4"/>
+              <w:bottom w:val="single" w:color="BBBBBB" w:sz="4"/>
+              <w:right w:val="single" w:color="BBBBBB" w:sz="4"/>
+            </w:tcBorders>
+            <w:tcMar>
+              <w:top w:type="dxa" w:w="60"/>
+              <w:left w:type="dxa" w:w="100"/>
+              <w:bottom w:type="dxa" w:w="60"/>
+              <w:right w:type="dxa" w:w="100"/>
+            </w:tcMar>
+          </w:tcPr>
+          <w:p>
+            <w:r>
+              <w:rPr>
+                <w:b w:val="false"/>
+                <w:bCs w:val="false"/>
+                <w:sz w:val="18"/>
+                <w:szCs w:val="18"/>
+              </w:rPr>
+              <w:t xml:space="preserve">Q8_0</w:t>
+            </w:r>
+          </w:p>
+        </w:tc>
+        <w:tc>
+          <w:tcPr>
+            <w:tcW w:type="dxa" w:w="2256"/>
+            <w:tcBorders>
+              <w:top w:val="single" w:color="BBBBBB" w:sz="4"/>
+              <w:left w:val="single" w:color="BBBBBB" w:sz="4"/>
+              <w:bottom w:val="single" w:color="BBBBBB" w:sz="4"/>
+              <w:right w:val="single" w:color="BBBBBB" w:sz="4"/>
+            </w:tcBorders>
+            <w:tcMar>
+              <w:top w:type="dxa" w:w="60"/>
+              <w:left w:type="dxa" w:w="100"/>
+              <w:bottom w:type="dxa" w:w="60"/>
+              <w:right w:type="dxa" w:w="100"/>
+            </w:tcMar>
+          </w:tcPr>
+          <w:p>
+            <w:r>
+              <w:rPr>
+                <w:b w:val="false"/>
+                <w:bCs w:val="false"/>
+                <w:sz w:val="18"/>
+                <w:szCs w:val="18"/>
+              </w:rPr>
+              <w:t xml:space="preserve">1,8 GB</w:t>
+            </w:r>
+          </w:p>
+        </w:tc>
+        <w:tc>
+          <w:tcPr>
+            <w:tcW w:type="dxa" w:w="2256"/>
+            <w:tcBorders>
+              <w:top w:val="single" w:color="BBBBBB" w:sz="4"/>
+              <w:left w:val="single" w:color="BBBBBB" w:sz="4"/>
+              <w:bottom w:val="single" w:color="BBBBBB" w:sz="4"/>
+              <w:right w:val="single" w:color="BBBBBB" w:sz="4"/>
+            </w:tcBorders>
+            <w:tcMar>
+              <w:top w:type="dxa" w:w="60"/>
+              <w:left w:type="dxa" w:w="100"/>
+              <w:bottom w:type="dxa" w:w="60"/>
+              <w:right w:type="dxa" w:w="100"/>
+            </w:tcMar>
+          </w:tcPr>
+          <w:p>
+            <w:r>
+              <w:rPr>
+                <w:b w:val="false"/>
+                <w:bCs w:val="false"/>
+                <w:sz w:val="18"/>
+                <w:szCs w:val="18"/>
+              </w:rPr>
+              <w:t xml:space="preserve">~15 tokens/s</w:t>
+            </w:r>
+          </w:p>
+        </w:tc>
+        <w:tc>
+          <w:tcPr>
+            <w:tcW w:type="dxa" w:w="2256"/>
+            <w:tcBorders>
+              <w:top w:val="single" w:color="BBBBBB" w:sz="4"/>
+              <w:left w:val="single" w:color="BBBBBB" w:sz="4"/>
+              <w:bottom w:val="single" w:color="BBBBBB" w:sz="4"/>
+              <w:right w:val="single" w:color="BBBBBB" w:sz="4"/>
+            </w:tcBorders>
+            <w:tcMar>
+              <w:top w:type="dxa" w:w="60"/>
+              <w:left w:type="dxa" w:w="100"/>
+              <w:bottom w:type="dxa" w:w="60"/>
+              <w:right w:type="dxa" w:w="100"/>
+            </w:tcMar>
+          </w:tcPr>
+          <w:p>
+            <w:r>
+              <w:rPr>
+                <w:b w:val="false"/>
+                <w:bCs w:val="false"/>
+                <w:sz w:val="18"/>
+                <w:szCs w:val="18"/>
+              </w:rPr>
+              <w:t xml:space="preserve">10 de 10 pedidos do teste amplo (5 entidades) compilam, sobem e acertam a classe; saída idêntica à do F16 no pedido de teste</w:t>
+            </w:r>
+          </w:p>
+        </w:tc>
+      </w:tr>
+      <w:tr>
+        <w:trPr>
+          <w:tblHeader w:val="off"/>
+        </w:trPr>
+        <w:tc>
+          <w:tcPr>
+            <w:tcW w:type="dxa" w:w="2256"/>
+            <w:tcBorders>
+              <w:top w:val="single" w:color="BBBBBB" w:sz="4"/>
+              <w:left w:val="single" w:color="BBBBBB" w:sz="4"/>
+              <w:bottom w:val="single" w:color="BBBBBB" w:sz="4"/>
+              <w:right w:val="single" w:color="BBBBBB" w:sz="4"/>
+            </w:tcBorders>
+            <w:tcMar>
+              <w:top w:type="dxa" w:w="60"/>
+              <w:left w:type="dxa" w:w="100"/>
+              <w:bottom w:type="dxa" w:w="60"/>
+              <w:right w:type="dxa" w:w="100"/>
+            </w:tcMar>
+          </w:tcPr>
+          <w:p>
+            <w:r>
+              <w:rPr>
+                <w:b w:val="false"/>
+                <w:bCs w:val="false"/>
+                <w:sz w:val="18"/>
+                <w:szCs w:val="18"/>
+              </w:rPr>
+              <w:t xml:space="preserve">Q6_K</w:t>
+            </w:r>
+          </w:p>
+        </w:tc>
+        <w:tc>
+          <w:tcPr>
+            <w:tcW w:type="dxa" w:w="2256"/>
+            <w:tcBorders>
+              <w:top w:val="single" w:color="BBBBBB" w:sz="4"/>
+              <w:left w:val="single" w:color="BBBBBB" w:sz="4"/>
+              <w:bottom w:val="single" w:color="BBBBBB" w:sz="4"/>
+              <w:right w:val="single" w:color="BBBBBB" w:sz="4"/>
+            </w:tcBorders>
+            <w:tcMar>
+              <w:top w:type="dxa" w:w="60"/>
+              <w:left w:type="dxa" w:w="100"/>
+              <w:bottom w:type="dxa" w:w="60"/>
+              <w:right w:type="dxa" w:w="100"/>
+            </w:tcMar>
+          </w:tcPr>
+          <w:p>
+            <w:r>
+              <w:rPr>
+                <w:b w:val="false"/>
+                <w:bCs w:val="false"/>
+                <w:sz w:val="18"/>
+                <w:szCs w:val="18"/>
+              </w:rPr>
+              <w:t xml:space="preserve">1,4 GB</w:t>
+            </w:r>
+          </w:p>
+        </w:tc>
+        <w:tc>
+          <w:tcPr>
+            <w:tcW w:type="dxa" w:w="2256"/>
+            <w:tcBorders>
+              <w:top w:val="single" w:color="BBBBBB" w:sz="4"/>
+              <w:left w:val="single" w:color="BBBBBB" w:sz="4"/>
+              <w:bottom w:val="single" w:color="BBBBBB" w:sz="4"/>
+              <w:right w:val="single" w:color="BBBBBB" w:sz="4"/>
+            </w:tcBorders>
+            <w:tcMar>
+              <w:top w:type="dxa" w:w="60"/>
+              <w:left w:type="dxa" w:w="100"/>
+              <w:bottom w:type="dxa" w:w="60"/>
+              <w:right w:type="dxa" w:w="100"/>
+            </w:tcMar>
+          </w:tcPr>
+          <w:p>
+            <w:r>
+              <w:rPr>
+                <w:b w:val="false"/>
+                <w:bCs w:val="false"/>
+                <w:sz w:val="18"/>
+                <w:szCs w:val="18"/>
+              </w:rPr>
+              <w:t xml:space="preserve">n/d</w:t>
+            </w:r>
+          </w:p>
+        </w:tc>
+        <w:tc>
+          <w:tcPr>
+            <w:tcW w:type="dxa" w:w="2256"/>
+            <w:tcBorders>
+              <w:top w:val="single" w:color="BBBBBB" w:sz="4"/>
+              <w:left w:val="single" w:color="BBBBBB" w:sz="4"/>
+              <w:bottom w:val="single" w:color="BBBBBB" w:sz="4"/>
+              <w:right w:val="single" w:color="BBBBBB" w:sz="4"/>
+            </w:tcBorders>
+            <w:tcMar>
+              <w:top w:type="dxa" w:w="60"/>
+              <w:left w:type="dxa" w:w="100"/>
+              <w:bottom w:type="dxa" w:w="60"/>
+              <w:right w:type="dxa" w:w="100"/>
+            </w:tcMar>
+          </w:tcPr>
+          <w:p>
+            <w:r>
+              <w:rPr>
+                <w:b w:val="false"/>
+                <w:bCs w:val="false"/>
+                <w:sz w:val="18"/>
+                <w:szCs w:val="18"/>
+              </w:rPr>
+              <w:t xml:space="preserve">não medido</w:t>
+            </w:r>
+          </w:p>
+        </w:tc>
+      </w:tr>
+      <w:tr>
+        <w:trPr>
+          <w:tblHeader w:val="off"/>
+        </w:trPr>
+        <w:tc>
+          <w:tcPr>
+            <w:tcW w:type="dxa" w:w="2256"/>
+            <w:tcBorders>
+              <w:top w:val="single" w:color="BBBBBB" w:sz="4"/>
+              <w:left w:val="single" w:color="BBBBBB" w:sz="4"/>
+              <w:bottom w:val="single" w:color="BBBBBB" w:sz="4"/>
+              <w:right w:val="single" w:color="BBBBBB" w:sz="4"/>
+            </w:tcBorders>
+            <w:tcMar>
+              <w:top w:type="dxa" w:w="60"/>
+              <w:left w:type="dxa" w:w="100"/>
+              <w:bottom w:type="dxa" w:w="60"/>
+              <w:right w:type="dxa" w:w="100"/>
+            </w:tcMar>
+          </w:tcPr>
+          <w:p>
+            <w:r>
+              <w:rPr>
+                <w:b w:val="false"/>
+                <w:bCs w:val="false"/>
+                <w:sz w:val="18"/>
+                <w:szCs w:val="18"/>
+              </w:rPr>
+              <w:t xml:space="preserve">Q5_K_M</w:t>
+            </w:r>
+          </w:p>
+        </w:tc>
+        <w:tc>
+          <w:tcPr>
+            <w:tcW w:type="dxa" w:w="2256"/>
+            <w:tcBorders>
+              <w:top w:val="single" w:color="BBBBBB" w:sz="4"/>
+              <w:left w:val="single" w:color="BBBBBB" w:sz="4"/>
+              <w:bottom w:val="single" w:color="BBBBBB" w:sz="4"/>
+              <w:right w:val="single" w:color="BBBBBB" w:sz="4"/>
+            </w:tcBorders>
+            <w:tcMar>
+              <w:top w:type="dxa" w:w="60"/>
+              <w:left w:type="dxa" w:w="100"/>
+              <w:bottom w:type="dxa" w:w="60"/>
+              <w:right w:type="dxa" w:w="100"/>
+            </w:tcMar>
+          </w:tcPr>
+          <w:p>
+            <w:r>
+              <w:rPr>
+                <w:b w:val="false"/>
+                <w:bCs w:val="false"/>
+                <w:sz w:val="18"/>
+                <w:szCs w:val="18"/>
+              </w:rPr>
+              <w:t xml:space="preserve">1,2 GB</w:t>
+            </w:r>
+          </w:p>
+        </w:tc>
+        <w:tc>
+          <w:tcPr>
+            <w:tcW w:type="dxa" w:w="2256"/>
+            <w:tcBorders>
+              <w:top w:val="single" w:color="BBBBBB" w:sz="4"/>
+              <w:left w:val="single" w:color="BBBBBB" w:sz="4"/>
+              <w:bottom w:val="single" w:color="BBBBBB" w:sz="4"/>
+              <w:right w:val="single" w:color="BBBBBB" w:sz="4"/>
+            </w:tcBorders>
+            <w:tcMar>
+              <w:top w:type="dxa" w:w="60"/>
+              <w:left w:type="dxa" w:w="100"/>
+              <w:bottom w:type="dxa" w:w="60"/>
+              <w:right w:type="dxa" w:w="100"/>
+            </w:tcMar>
+          </w:tcPr>
+          <w:p>
+            <w:r>
+              <w:rPr>
+                <w:b w:val="false"/>
+                <w:bCs w:val="false"/>
+                <w:sz w:val="18"/>
+                <w:szCs w:val="18"/>
+              </w:rPr>
+              <w:t xml:space="preserve">n/d</w:t>
+            </w:r>
+          </w:p>
+        </w:tc>
+        <w:tc>
+          <w:tcPr>
+            <w:tcW w:type="dxa" w:w="2256"/>
+            <w:tcBorders>
+              <w:top w:val="single" w:color="BBBBBB" w:sz="4"/>
+              <w:left w:val="single" w:color="BBBBBB" w:sz="4"/>
+              <w:bottom w:val="single" w:color="BBBBBB" w:sz="4"/>
+              <w:right w:val="single" w:color="BBBBBB" w:sz="4"/>
+            </w:tcBorders>
+            <w:tcMar>
+              <w:top w:type="dxa" w:w="60"/>
+              <w:left w:type="dxa" w:w="100"/>
+              <w:bottom w:type="dxa" w:w="60"/>
+              <w:right w:type="dxa" w:w="100"/>
+            </w:tcMar>
+          </w:tcPr>
+          <w:p>
+            <w:r>
+              <w:rPr>
+                <w:b w:val="false"/>
+                <w:bCs w:val="false"/>
+                <w:sz w:val="18"/>
+                <w:szCs w:val="18"/>
+              </w:rPr>
+              <w:t xml:space="preserve">não medido</w:t>
+            </w:r>
+          </w:p>
+        </w:tc>
+      </w:tr>
+      <w:tr>
+        <w:trPr>
+          <w:tblHeader w:val="off"/>
+        </w:trPr>
+        <w:tc>
+          <w:tcPr>
+            <w:tcW w:type="dxa" w:w="2256"/>
+            <w:tcBorders>
+              <w:top w:val="single" w:color="BBBBBB" w:sz="4"/>
+              <w:left w:val="single" w:color="BBBBBB" w:sz="4"/>
+              <w:bottom w:val="single" w:color="BBBBBB" w:sz="4"/>
+              <w:right w:val="single" w:color="BBBBBB" w:sz="4"/>
+            </w:tcBorders>
+            <w:tcMar>
+              <w:top w:type="dxa" w:w="60"/>
+              <w:left w:type="dxa" w:w="100"/>
+              <w:bottom w:type="dxa" w:w="60"/>
+              <w:right w:type="dxa" w:w="100"/>
+            </w:tcMar>
+          </w:tcPr>
+          <w:p>
+            <w:r>
+              <w:rPr>
+                <w:b w:val="false"/>
+                <w:bCs w:val="false"/>
+                <w:sz w:val="18"/>
+                <w:szCs w:val="18"/>
+              </w:rPr>
+              <w:t xml:space="preserve">Q4_K_M</w:t>
+            </w:r>
+          </w:p>
+        </w:tc>
+        <w:tc>
+          <w:tcPr>
+            <w:tcW w:type="dxa" w:w="2256"/>
+            <w:tcBorders>
+              <w:top w:val="single" w:color="BBBBBB" w:sz="4"/>
+              <w:left w:val="single" w:color="BBBBBB" w:sz="4"/>
+              <w:bottom w:val="single" w:color="BBBBBB" w:sz="4"/>
+              <w:right w:val="single" w:color="BBBBBB" w:sz="4"/>
+            </w:tcBorders>
+            <w:tcMar>
+              <w:top w:type="dxa" w:w="60"/>
+              <w:left w:type="dxa" w:w="100"/>
+              <w:bottom w:type="dxa" w:w="60"/>
+              <w:right w:type="dxa" w:w="100"/>
+            </w:tcMar>
+          </w:tcPr>
+          <w:p>
+            <w:r>
+              <w:rPr>
+                <w:b w:val="false"/>
+                <w:bCs w:val="false"/>
+                <w:sz w:val="18"/>
+                <w:szCs w:val="18"/>
+              </w:rPr>
+              <w:t xml:space="preserve">1,1 GB</w:t>
+            </w:r>
+          </w:p>
+        </w:tc>
+        <w:tc>
+          <w:tcPr>
+            <w:tcW w:type="dxa" w:w="2256"/>
+            <w:tcBorders>
+              <w:top w:val="single" w:color="BBBBBB" w:sz="4"/>
+              <w:left w:val="single" w:color="BBBBBB" w:sz="4"/>
+              <w:bottom w:val="single" w:color="BBBBBB" w:sz="4"/>
+              <w:right w:val="single" w:color="BBBBBB" w:sz="4"/>
+            </w:tcBorders>
+            <w:tcMar>
+              <w:top w:type="dxa" w:w="60"/>
+              <w:left w:type="dxa" w:w="100"/>
+              <w:bottom w:type="dxa" w:w="60"/>
+              <w:right w:type="dxa" w:w="100"/>
+            </w:tcMar>
+          </w:tcPr>
+          <w:p>
+            <w:r>
+              <w:rPr>
+                <w:b w:val="false"/>
+                <w:bCs w:val="false"/>
+                <w:sz w:val="18"/>
+                <w:szCs w:val="18"/>
+              </w:rPr>
+              <w:t xml:space="preserve">n/d</w:t>
+            </w:r>
+          </w:p>
+        </w:tc>
+        <w:tc>
+          <w:tcPr>
+            <w:tcW w:type="dxa" w:w="2256"/>
+            <w:tcBorders>
+              <w:top w:val="single" w:color="BBBBBB" w:sz="4"/>
+              <w:left w:val="single" w:color="BBBBBB" w:sz="4"/>
+              <w:bottom w:val="single" w:color="BBBBBB" w:sz="4"/>
+              <w:right w:val="single" w:color="BBBBBB" w:sz="4"/>
+            </w:tcBorders>
+            <w:tcMar>
+              <w:top w:type="dxa" w:w="60"/>
+              <w:left w:type="dxa" w:w="100"/>
+              <w:bottom w:type="dxa" w:w="60"/>
+              <w:right w:type="dxa" w:w="100"/>
+            </w:tcMar>
+          </w:tcPr>
+          <w:p>
+            <w:r>
+              <w:rPr>
+                <w:b w:val="false"/>
+                <w:bCs w:val="false"/>
+                <w:sz w:val="18"/>
+                <w:szCs w:val="18"/>
+              </w:rPr>
+              <w:t xml:space="preserve">quebrou: no pedido de teste saiu um arquivo sem nenhuma rota</w:t>
+            </w:r>
+          </w:p>
+        </w:tc>
+      </w:tr>
+    </w:tbl>
+    <w:p/>
+    <w:p>
+      <w:pPr>
+        <w:spacing w:after="120"/>
+      </w:pPr>
+      <w:r>
+        <w:t xml:space="preserve">O Q8_0 é o menor arquivo com resultado medido igual ao F16. O Q4_K_M confirma que o modelo é sensível a arredondamento, como já tinha mostrado a diferença entre NF4 e bf16. Os níveis intermediários ficaram sem medir porque a bateria (</w:t>
+      </w:r>
+      <w:r>
+        <w:rPr>
+          <w:rFonts w:ascii="Consolas" w:cs="Consolas" w:eastAsia="Consolas" w:hAnsi="Consolas"/>
+        </w:rPr>
+        <w:t xml:space="preserve">scripts/eval_gguf.py</w:t>
+      </w:r>
+      <w:r>
+        <w:t xml:space="preserve">, 2 pedidos por entidade) parou no meio do Q8_0.</w:t>
+      </w:r>
+    </w:p>
+    <w:p>
+      <w:pPr>
+        <w:spacing w:after="120"/>
+      </w:pPr>
+      <w:r>
+        <w:t xml:space="preserve">O modelo responde a qualquer pedido com um arquivo FastAPI, inclusive a "oi" (sai </w:t>
+      </w:r>
+      <w:r>
+        <w:rPr>
+          <w:rFonts w:ascii="Consolas" w:cs="Consolas" w:eastAsia="Consolas" w:hAnsi="Consolas"/>
+        </w:rPr>
+        <w:t xml:space="preserve">class Oi(Base)</w:t>
+      </w:r>
+      <w:r>
+        <w:t xml:space="preserve">). O SFT só teve pedidos de FastAPI, e o ponto de partida é o Manacá base, que não conversa.</w:t>
       </w:r>
     </w:p>
     <w:p>
@@ -9891,7 +10821,794 @@
         <w:pStyle w:val="Heading1"/>
       </w:pPr>
       <w:r>
-        <w:t xml:space="preserve">Fontes</w:t>
+        <w:t xml:space="preserve">Próximo passo: versão que conversa</w:t>
+      </w:r>
+    </w:p>
+    <w:p>
+      <w:pPr>
+        <w:spacing w:after="120"/>
+      </w:pPr>
+      <w:r>
+        <w:t xml:space="preserve">Para o modelo conversar e só gerar FastAPI quando pedirem, o SFT precisa misturar instruções gerais com os pedidos de FastAPI. A receita do Manacá-1B-Instruct está no </w:t>
+      </w:r>
+      <w:hyperlink w:history="1" r:id="rIdh0uaiqbenk-u7ru3y5lbf">
+        <w:r>
+          <w:rPr>
+            <w:rStyle w:val="Hyperlink"/>
+          </w:rPr>
+          <w:t xml:space="preserve">repositório do LNCC</w:t>
+        </w:r>
+      </w:hyperlink>
+      <w:r>
+        <w:t xml:space="preserve"> (</w:t>
+      </w:r>
+      <w:r>
+        <w:rPr>
+          <w:rFonts w:ascii="Consolas" w:cs="Consolas" w:eastAsia="Consolas" w:hAnsi="Consolas"/>
+        </w:rPr>
+        <w:t xml:space="preserve">sft/prepare_data.py</w:t>
+      </w:r>
+      <w:r>
+        <w:t xml:space="preserve">, </w:t>
+      </w:r>
+      <w:r>
+        <w:rPr>
+          <w:rFonts w:ascii="Consolas" w:cs="Consolas" w:eastAsia="Consolas" w:hAnsi="Consolas"/>
+        </w:rPr>
+        <w:t xml:space="preserve">sft/jaster/build_jaster.py</w:t>
+      </w:r>
+      <w:r>
+        <w:t xml:space="preserve">, </w:t>
+      </w:r>
+      <w:r>
+        <w:rPr>
+          <w:rFonts w:ascii="Consolas" w:cs="Consolas" w:eastAsia="Consolas" w:hAnsi="Consolas"/>
+        </w:rPr>
+        <w:t xml:space="preserve">docs/data/</w:t>
+      </w:r>
+      <w:r>
+        <w:t xml:space="preserve">):</w:t>
+      </w:r>
+    </w:p>
+    <w:tbl>
+      <w:tblPr>
+        <w:tblW w:type="dxa" w:w="9024"/>
+        <w:tblBorders>
+          <w:top w:val="single" w:color="auto" w:sz="4"/>
+          <w:left w:val="single" w:color="auto" w:sz="4"/>
+          <w:bottom w:val="single" w:color="auto" w:sz="4"/>
+          <w:right w:val="single" w:color="auto" w:sz="4"/>
+          <w:insideH w:val="single" w:color="auto" w:sz="4"/>
+          <w:insideV w:val="single" w:color="auto" w:sz="4"/>
+        </w:tblBorders>
+      </w:tblPr>
+      <w:tblGrid>
+        <w:gridCol w:w="3008"/>
+        <w:gridCol w:w="3008"/>
+        <w:gridCol w:w="3008"/>
+      </w:tblGrid>
+      <w:tr>
+        <w:trPr>
+          <w:tblHeader/>
+        </w:trPr>
+        <w:tc>
+          <w:tcPr>
+            <w:tcW w:type="dxa" w:w="3008"/>
+            <w:tcBorders>
+              <w:top w:val="single" w:color="BBBBBB" w:sz="4"/>
+              <w:left w:val="single" w:color="BBBBBB" w:sz="4"/>
+              <w:bottom w:val="single" w:color="BBBBBB" w:sz="4"/>
+              <w:right w:val="single" w:color="BBBBBB" w:sz="4"/>
+            </w:tcBorders>
+            <w:shd w:fill="E8EEF4" w:val="clear"/>
+            <w:tcMar>
+              <w:top w:type="dxa" w:w="60"/>
+              <w:left w:type="dxa" w:w="100"/>
+              <w:bottom w:type="dxa" w:w="60"/>
+              <w:right w:type="dxa" w:w="100"/>
+            </w:tcMar>
+          </w:tcPr>
+          <w:p>
+            <w:r>
+              <w:rPr>
+                <w:b/>
+                <w:bCs/>
+                <w:sz w:val="18"/>
+                <w:szCs w:val="18"/>
+              </w:rPr>
+              <w:t xml:space="preserve">Fonte</w:t>
+            </w:r>
+          </w:p>
+        </w:tc>
+        <w:tc>
+          <w:tcPr>
+            <w:tcW w:type="dxa" w:w="3008"/>
+            <w:tcBorders>
+              <w:top w:val="single" w:color="BBBBBB" w:sz="4"/>
+              <w:left w:val="single" w:color="BBBBBB" w:sz="4"/>
+              <w:bottom w:val="single" w:color="BBBBBB" w:sz="4"/>
+              <w:right w:val="single" w:color="BBBBBB" w:sz="4"/>
+            </w:tcBorders>
+            <w:shd w:fill="E8EEF4" w:val="clear"/>
+            <w:tcMar>
+              <w:top w:type="dxa" w:w="60"/>
+              <w:left w:type="dxa" w:w="100"/>
+              <w:bottom w:type="dxa" w:w="60"/>
+              <w:right w:type="dxa" w:w="100"/>
+            </w:tcMar>
+          </w:tcPr>
+          <w:p>
+            <w:r>
+              <w:rPr>
+                <w:b/>
+                <w:bCs/>
+                <w:sz w:val="18"/>
+                <w:szCs w:val="18"/>
+              </w:rPr>
+              <w:t xml:space="preserve">Dataset no Hugging Face</w:t>
+            </w:r>
+          </w:p>
+        </w:tc>
+        <w:tc>
+          <w:tcPr>
+            <w:tcW w:type="dxa" w:w="3008"/>
+            <w:tcBorders>
+              <w:top w:val="single" w:color="BBBBBB" w:sz="4"/>
+              <w:left w:val="single" w:color="BBBBBB" w:sz="4"/>
+              <w:bottom w:val="single" w:color="BBBBBB" w:sz="4"/>
+              <w:right w:val="single" w:color="BBBBBB" w:sz="4"/>
+            </w:tcBorders>
+            <w:shd w:fill="E8EEF4" w:val="clear"/>
+            <w:tcMar>
+              <w:top w:type="dxa" w:w="60"/>
+              <w:left w:type="dxa" w:w="100"/>
+              <w:bottom w:type="dxa" w:w="60"/>
+              <w:right w:type="dxa" w:w="100"/>
+            </w:tcMar>
+          </w:tcPr>
+          <w:p>
+            <w:r>
+              <w:rPr>
+                <w:b/>
+                <w:bCs/>
+                <w:sz w:val="18"/>
+                <w:szCs w:val="18"/>
+              </w:rPr>
+              <w:t xml:space="preserve">Conversão</w:t>
+            </w:r>
+          </w:p>
+        </w:tc>
+      </w:tr>
+      <w:tr>
+        <w:trPr>
+          <w:tblHeader w:val="off"/>
+        </w:trPr>
+        <w:tc>
+          <w:tcPr>
+            <w:tcW w:type="dxa" w:w="3008"/>
+            <w:tcBorders>
+              <w:top w:val="single" w:color="BBBBBB" w:sz="4"/>
+              <w:left w:val="single" w:color="BBBBBB" w:sz="4"/>
+              <w:bottom w:val="single" w:color="BBBBBB" w:sz="4"/>
+              <w:right w:val="single" w:color="BBBBBB" w:sz="4"/>
+            </w:tcBorders>
+            <w:tcMar>
+              <w:top w:type="dxa" w:w="60"/>
+              <w:left w:type="dxa" w:w="100"/>
+              <w:bottom w:type="dxa" w:w="60"/>
+              <w:right w:type="dxa" w:w="100"/>
+            </w:tcMar>
+          </w:tcPr>
+          <w:p>
+            <w:r>
+              <w:rPr>
+                <w:b w:val="false"/>
+                <w:bCs w:val="false"/>
+                <w:sz w:val="18"/>
+                <w:szCs w:val="18"/>
+              </w:rPr>
+              <w:t xml:space="preserve">Alpaca-PT</w:t>
+            </w:r>
+          </w:p>
+        </w:tc>
+        <w:tc>
+          <w:tcPr>
+            <w:tcW w:type="dxa" w:w="3008"/>
+            <w:tcBorders>
+              <w:top w:val="single" w:color="BBBBBB" w:sz="4"/>
+              <w:left w:val="single" w:color="BBBBBB" w:sz="4"/>
+              <w:bottom w:val="single" w:color="BBBBBB" w:sz="4"/>
+              <w:right w:val="single" w:color="BBBBBB" w:sz="4"/>
+            </w:tcBorders>
+            <w:tcMar>
+              <w:top w:type="dxa" w:w="60"/>
+              <w:left w:type="dxa" w:w="100"/>
+              <w:bottom w:type="dxa" w:w="60"/>
+              <w:right w:type="dxa" w:w="100"/>
+            </w:tcMar>
+          </w:tcPr>
+          <w:p>
+            <w:r>
+              <w:rPr>
+                <w:rFonts w:ascii="Consolas" w:cs="Consolas" w:eastAsia="Consolas" w:hAnsi="Consolas"/>
+                <w:b w:val="false"/>
+                <w:bCs w:val="false"/>
+                <w:sz w:val="18"/>
+                <w:szCs w:val="18"/>
+              </w:rPr>
+              <w:t xml:space="preserve">dominguesm/alpaca-data-pt-br</w:t>
+            </w:r>
+          </w:p>
+        </w:tc>
+        <w:tc>
+          <w:tcPr>
+            <w:tcW w:type="dxa" w:w="3008"/>
+            <w:tcBorders>
+              <w:top w:val="single" w:color="BBBBBB" w:sz="4"/>
+              <w:left w:val="single" w:color="BBBBBB" w:sz="4"/>
+              <w:bottom w:val="single" w:color="BBBBBB" w:sz="4"/>
+              <w:right w:val="single" w:color="BBBBBB" w:sz="4"/>
+            </w:tcBorders>
+            <w:tcMar>
+              <w:top w:type="dxa" w:w="60"/>
+              <w:left w:type="dxa" w:w="100"/>
+              <w:bottom w:type="dxa" w:w="60"/>
+              <w:right w:type="dxa" w:w="100"/>
+            </w:tcMar>
+          </w:tcPr>
+          <w:p>
+            <w:r>
+              <w:rPr>
+                <w:b w:val="false"/>
+                <w:bCs w:val="false"/>
+                <w:sz w:val="18"/>
+                <w:szCs w:val="18"/>
+              </w:rPr>
+              <w:t xml:space="preserve">instruction, input, output como estão</w:t>
+            </w:r>
+          </w:p>
+        </w:tc>
+      </w:tr>
+      <w:tr>
+        <w:trPr>
+          <w:tblHeader w:val="off"/>
+        </w:trPr>
+        <w:tc>
+          <w:tcPr>
+            <w:tcW w:type="dxa" w:w="3008"/>
+            <w:tcBorders>
+              <w:top w:val="single" w:color="BBBBBB" w:sz="4"/>
+              <w:left w:val="single" w:color="BBBBBB" w:sz="4"/>
+              <w:bottom w:val="single" w:color="BBBBBB" w:sz="4"/>
+              <w:right w:val="single" w:color="BBBBBB" w:sz="4"/>
+            </w:tcBorders>
+            <w:tcMar>
+              <w:top w:type="dxa" w:w="60"/>
+              <w:left w:type="dxa" w:w="100"/>
+              <w:bottom w:type="dxa" w:w="60"/>
+              <w:right w:type="dxa" w:w="100"/>
+            </w:tcMar>
+          </w:tcPr>
+          <w:p>
+            <w:r>
+              <w:rPr>
+                <w:b w:val="false"/>
+                <w:bCs w:val="false"/>
+                <w:sz w:val="18"/>
+                <w:szCs w:val="18"/>
+              </w:rPr>
+              <w:t xml:space="preserve">Aya (pt)</w:t>
+            </w:r>
+          </w:p>
+        </w:tc>
+        <w:tc>
+          <w:tcPr>
+            <w:tcW w:type="dxa" w:w="3008"/>
+            <w:tcBorders>
+              <w:top w:val="single" w:color="BBBBBB" w:sz="4"/>
+              <w:left w:val="single" w:color="BBBBBB" w:sz="4"/>
+              <w:bottom w:val="single" w:color="BBBBBB" w:sz="4"/>
+              <w:right w:val="single" w:color="BBBBBB" w:sz="4"/>
+            </w:tcBorders>
+            <w:tcMar>
+              <w:top w:type="dxa" w:w="60"/>
+              <w:left w:type="dxa" w:w="100"/>
+              <w:bottom w:type="dxa" w:w="60"/>
+              <w:right w:type="dxa" w:w="100"/>
+            </w:tcMar>
+          </w:tcPr>
+          <w:p>
+            <w:r>
+              <w:rPr>
+                <w:rFonts w:ascii="Consolas" w:cs="Consolas" w:eastAsia="Consolas" w:hAnsi="Consolas"/>
+                <w:b w:val="false"/>
+                <w:bCs w:val="false"/>
+                <w:sz w:val="18"/>
+                <w:szCs w:val="18"/>
+              </w:rPr>
+              <w:t xml:space="preserve">CohereForAI/aya_dataset</w:t>
+            </w:r>
+          </w:p>
+        </w:tc>
+        <w:tc>
+          <w:tcPr>
+            <w:tcW w:type="dxa" w:w="3008"/>
+            <w:tcBorders>
+              <w:top w:val="single" w:color="BBBBBB" w:sz="4"/>
+              <w:left w:val="single" w:color="BBBBBB" w:sz="4"/>
+              <w:bottom w:val="single" w:color="BBBBBB" w:sz="4"/>
+              <w:right w:val="single" w:color="BBBBBB" w:sz="4"/>
+            </w:tcBorders>
+            <w:tcMar>
+              <w:top w:type="dxa" w:w="60"/>
+              <w:left w:type="dxa" w:w="100"/>
+              <w:bottom w:type="dxa" w:w="60"/>
+              <w:right w:type="dxa" w:w="100"/>
+            </w:tcMar>
+          </w:tcPr>
+          <w:p>
+            <w:r>
+              <w:rPr>
+                <w:rFonts w:ascii="Consolas" w:cs="Consolas" w:eastAsia="Consolas" w:hAnsi="Consolas"/>
+                <w:b w:val="false"/>
+                <w:bCs w:val="false"/>
+                <w:sz w:val="18"/>
+                <w:szCs w:val="18"/>
+              </w:rPr>
+              <w:t xml:space="preserve">inputs</w:t>
+            </w:r>
+            <w:r>
+              <w:rPr>
+                <w:b w:val="false"/>
+                <w:bCs w:val="false"/>
+                <w:sz w:val="18"/>
+                <w:szCs w:val="18"/>
+              </w:rPr>
+              <w:t xml:space="preserve"> vira instrução, </w:t>
+            </w:r>
+            <w:r>
+              <w:rPr>
+                <w:rFonts w:ascii="Consolas" w:cs="Consolas" w:eastAsia="Consolas" w:hAnsi="Consolas"/>
+                <w:b w:val="false"/>
+                <w:bCs w:val="false"/>
+                <w:sz w:val="18"/>
+                <w:szCs w:val="18"/>
+              </w:rPr>
+              <w:t xml:space="preserve">targets</w:t>
+            </w:r>
+            <w:r>
+              <w:rPr>
+                <w:b w:val="false"/>
+                <w:bCs w:val="false"/>
+                <w:sz w:val="18"/>
+                <w:szCs w:val="18"/>
+              </w:rPr>
+              <w:t xml:space="preserve"> vira resposta, só idioma português</w:t>
+            </w:r>
+          </w:p>
+        </w:tc>
+      </w:tr>
+      <w:tr>
+        <w:trPr>
+          <w:tblHeader w:val="off"/>
+        </w:trPr>
+        <w:tc>
+          <w:tcPr>
+            <w:tcW w:type="dxa" w:w="3008"/>
+            <w:tcBorders>
+              <w:top w:val="single" w:color="BBBBBB" w:sz="4"/>
+              <w:left w:val="single" w:color="BBBBBB" w:sz="4"/>
+              <w:bottom w:val="single" w:color="BBBBBB" w:sz="4"/>
+              <w:right w:val="single" w:color="BBBBBB" w:sz="4"/>
+            </w:tcBorders>
+            <w:tcMar>
+              <w:top w:type="dxa" w:w="60"/>
+              <w:left w:type="dxa" w:w="100"/>
+              <w:bottom w:type="dxa" w:w="60"/>
+              <w:right w:type="dxa" w:w="100"/>
+            </w:tcMar>
+          </w:tcPr>
+          <w:p>
+            <w:r>
+              <w:rPr>
+                <w:b w:val="false"/>
+                <w:bCs w:val="false"/>
+                <w:sz w:val="18"/>
+                <w:szCs w:val="18"/>
+              </w:rPr>
+              <w:t xml:space="preserve">OASST1 (pt)</w:t>
+            </w:r>
+          </w:p>
+        </w:tc>
+        <w:tc>
+          <w:tcPr>
+            <w:tcW w:type="dxa" w:w="3008"/>
+            <w:tcBorders>
+              <w:top w:val="single" w:color="BBBBBB" w:sz="4"/>
+              <w:left w:val="single" w:color="BBBBBB" w:sz="4"/>
+              <w:bottom w:val="single" w:color="BBBBBB" w:sz="4"/>
+              <w:right w:val="single" w:color="BBBBBB" w:sz="4"/>
+            </w:tcBorders>
+            <w:tcMar>
+              <w:top w:type="dxa" w:w="60"/>
+              <w:left w:type="dxa" w:w="100"/>
+              <w:bottom w:type="dxa" w:w="60"/>
+              <w:right w:type="dxa" w:w="100"/>
+            </w:tcMar>
+          </w:tcPr>
+          <w:p>
+            <w:r>
+              <w:rPr>
+                <w:rFonts w:ascii="Consolas" w:cs="Consolas" w:eastAsia="Consolas" w:hAnsi="Consolas"/>
+                <w:b w:val="false"/>
+                <w:bCs w:val="false"/>
+                <w:sz w:val="18"/>
+                <w:szCs w:val="18"/>
+              </w:rPr>
+              <w:t xml:space="preserve">OpenAssistant/oasst1</w:t>
+            </w:r>
+          </w:p>
+        </w:tc>
+        <w:tc>
+          <w:tcPr>
+            <w:tcW w:type="dxa" w:w="3008"/>
+            <w:tcBorders>
+              <w:top w:val="single" w:color="BBBBBB" w:sz="4"/>
+              <w:left w:val="single" w:color="BBBBBB" w:sz="4"/>
+              <w:bottom w:val="single" w:color="BBBBBB" w:sz="4"/>
+              <w:right w:val="single" w:color="BBBBBB" w:sz="4"/>
+            </w:tcBorders>
+            <w:tcMar>
+              <w:top w:type="dxa" w:w="60"/>
+              <w:left w:type="dxa" w:w="100"/>
+              <w:bottom w:type="dxa" w:w="60"/>
+              <w:right w:type="dxa" w:w="100"/>
+            </w:tcMar>
+          </w:tcPr>
+          <w:p>
+            <w:r>
+              <w:rPr>
+                <w:b w:val="false"/>
+                <w:bCs w:val="false"/>
+                <w:sz w:val="18"/>
+                <w:szCs w:val="18"/>
+              </w:rPr>
+              <w:t xml:space="preserve">pares prompter e assistant com rank 0, só português</w:t>
+            </w:r>
+          </w:p>
+        </w:tc>
+      </w:tr>
+      <w:tr>
+        <w:trPr>
+          <w:tblHeader w:val="off"/>
+        </w:trPr>
+        <w:tc>
+          <w:tcPr>
+            <w:tcW w:type="dxa" w:w="3008"/>
+            <w:tcBorders>
+              <w:top w:val="single" w:color="BBBBBB" w:sz="4"/>
+              <w:left w:val="single" w:color="BBBBBB" w:sz="4"/>
+              <w:bottom w:val="single" w:color="BBBBBB" w:sz="4"/>
+              <w:right w:val="single" w:color="BBBBBB" w:sz="4"/>
+            </w:tcBorders>
+            <w:tcMar>
+              <w:top w:type="dxa" w:w="60"/>
+              <w:left w:type="dxa" w:w="100"/>
+              <w:bottom w:type="dxa" w:w="60"/>
+              <w:right w:type="dxa" w:w="100"/>
+            </w:tcMar>
+          </w:tcPr>
+          <w:p>
+            <w:r>
+              <w:rPr>
+                <w:b w:val="false"/>
+                <w:bCs w:val="false"/>
+                <w:sz w:val="18"/>
+                <w:szCs w:val="18"/>
+              </w:rPr>
+              <w:t xml:space="preserve">Tradução</w:t>
+            </w:r>
+          </w:p>
+        </w:tc>
+        <w:tc>
+          <w:tcPr>
+            <w:tcW w:type="dxa" w:w="3008"/>
+            <w:tcBorders>
+              <w:top w:val="single" w:color="BBBBBB" w:sz="4"/>
+              <w:left w:val="single" w:color="BBBBBB" w:sz="4"/>
+              <w:bottom w:val="single" w:color="BBBBBB" w:sz="4"/>
+              <w:right w:val="single" w:color="BBBBBB" w:sz="4"/>
+            </w:tcBorders>
+            <w:tcMar>
+              <w:top w:type="dxa" w:w="60"/>
+              <w:left w:type="dxa" w:w="100"/>
+              <w:bottom w:type="dxa" w:w="60"/>
+              <w:right w:type="dxa" w:w="100"/>
+            </w:tcMar>
+          </w:tcPr>
+          <w:p>
+            <w:r>
+              <w:rPr>
+                <w:rFonts w:ascii="Consolas" w:cs="Consolas" w:eastAsia="Consolas" w:hAnsi="Consolas"/>
+                <w:b w:val="false"/>
+                <w:bCs w:val="false"/>
+                <w:sz w:val="18"/>
+                <w:szCs w:val="18"/>
+              </w:rPr>
+              <w:t xml:space="preserve">Helsinki-NLP/opus-100</w:t>
+            </w:r>
+            <w:r>
+              <w:rPr>
+                <w:b w:val="false"/>
+                <w:bCs w:val="false"/>
+                <w:sz w:val="18"/>
+                <w:szCs w:val="18"/>
+              </w:rPr>
+              <w:t xml:space="preserve">, en-pt, 20.000 primeiros</w:t>
+            </w:r>
+          </w:p>
+        </w:tc>
+        <w:tc>
+          <w:tcPr>
+            <w:tcW w:type="dxa" w:w="3008"/>
+            <w:tcBorders>
+              <w:top w:val="single" w:color="BBBBBB" w:sz="4"/>
+              <w:left w:val="single" w:color="BBBBBB" w:sz="4"/>
+              <w:bottom w:val="single" w:color="BBBBBB" w:sz="4"/>
+              <w:right w:val="single" w:color="BBBBBB" w:sz="4"/>
+            </w:tcBorders>
+            <w:tcMar>
+              <w:top w:type="dxa" w:w="60"/>
+              <w:left w:type="dxa" w:w="100"/>
+              <w:bottom w:type="dxa" w:w="60"/>
+              <w:right w:type="dxa" w:w="100"/>
+            </w:tcMar>
+          </w:tcPr>
+          <w:p>
+            <w:r>
+              <w:rPr>
+                <w:b w:val="false"/>
+                <w:bCs w:val="false"/>
+                <w:sz w:val="18"/>
+                <w:szCs w:val="18"/>
+              </w:rPr>
+              <w:t xml:space="preserve">duas instruções por par (para inglês e para português)</w:t>
+            </w:r>
+          </w:p>
+        </w:tc>
+      </w:tr>
+      <w:tr>
+        <w:trPr>
+          <w:tblHeader w:val="off"/>
+        </w:trPr>
+        <w:tc>
+          <w:tcPr>
+            <w:tcW w:type="dxa" w:w="3008"/>
+            <w:tcBorders>
+              <w:top w:val="single" w:color="BBBBBB" w:sz="4"/>
+              <w:left w:val="single" w:color="BBBBBB" w:sz="4"/>
+              <w:bottom w:val="single" w:color="BBBBBB" w:sz="4"/>
+              <w:right w:val="single" w:color="BBBBBB" w:sz="4"/>
+            </w:tcBorders>
+            <w:tcMar>
+              <w:top w:type="dxa" w:w="60"/>
+              <w:left w:type="dxa" w:w="100"/>
+              <w:bottom w:type="dxa" w:w="60"/>
+              <w:right w:type="dxa" w:w="100"/>
+            </w:tcMar>
+          </w:tcPr>
+          <w:p>
+            <w:r>
+              <w:rPr>
+                <w:b w:val="false"/>
+                <w:bCs w:val="false"/>
+                <w:sz w:val="18"/>
+                <w:szCs w:val="18"/>
+              </w:rPr>
+              <w:t xml:space="preserve">Resumo</w:t>
+            </w:r>
+          </w:p>
+        </w:tc>
+        <w:tc>
+          <w:tcPr>
+            <w:tcW w:type="dxa" w:w="3008"/>
+            <w:tcBorders>
+              <w:top w:val="single" w:color="BBBBBB" w:sz="4"/>
+              <w:left w:val="single" w:color="BBBBBB" w:sz="4"/>
+              <w:bottom w:val="single" w:color="BBBBBB" w:sz="4"/>
+              <w:right w:val="single" w:color="BBBBBB" w:sz="4"/>
+            </w:tcBorders>
+            <w:tcMar>
+              <w:top w:type="dxa" w:w="60"/>
+              <w:left w:type="dxa" w:w="100"/>
+              <w:bottom w:type="dxa" w:w="60"/>
+              <w:right w:type="dxa" w:w="100"/>
+            </w:tcMar>
+          </w:tcPr>
+          <w:p>
+            <w:r>
+              <w:rPr>
+                <w:rFonts w:ascii="Consolas" w:cs="Consolas" w:eastAsia="Consolas" w:hAnsi="Consolas"/>
+                <w:b w:val="false"/>
+                <w:bCs w:val="false"/>
+                <w:sz w:val="18"/>
+                <w:szCs w:val="18"/>
+              </w:rPr>
+              <w:t xml:space="preserve">csebuetnlp/xlsum</w:t>
+            </w:r>
+            <w:r>
+              <w:rPr>
+                <w:b w:val="false"/>
+                <w:bCs w:val="false"/>
+                <w:sz w:val="18"/>
+                <w:szCs w:val="18"/>
+              </w:rPr>
+              <w:t xml:space="preserve">, português, 10.000 primeiros</w:t>
+            </w:r>
+          </w:p>
+        </w:tc>
+        <w:tc>
+          <w:tcPr>
+            <w:tcW w:type="dxa" w:w="3008"/>
+            <w:tcBorders>
+              <w:top w:val="single" w:color="BBBBBB" w:sz="4"/>
+              <w:left w:val="single" w:color="BBBBBB" w:sz="4"/>
+              <w:bottom w:val="single" w:color="BBBBBB" w:sz="4"/>
+              <w:right w:val="single" w:color="BBBBBB" w:sz="4"/>
+            </w:tcBorders>
+            <w:tcMar>
+              <w:top w:type="dxa" w:w="60"/>
+              <w:left w:type="dxa" w:w="100"/>
+              <w:bottom w:type="dxa" w:w="60"/>
+              <w:right w:type="dxa" w:w="100"/>
+            </w:tcMar>
+          </w:tcPr>
+          <w:p>
+            <w:r>
+              <w:rPr>
+                <w:b w:val="false"/>
+                <w:bCs w:val="false"/>
+                <w:sz w:val="18"/>
+                <w:szCs w:val="18"/>
+              </w:rPr>
+              <w:t xml:space="preserve">texto no input, resumo na resposta</w:t>
+            </w:r>
+          </w:p>
+        </w:tc>
+      </w:tr>
+      <w:tr>
+        <w:trPr>
+          <w:tblHeader w:val="off"/>
+        </w:trPr>
+        <w:tc>
+          <w:tcPr>
+            <w:tcW w:type="dxa" w:w="3008"/>
+            <w:tcBorders>
+              <w:top w:val="single" w:color="BBBBBB" w:sz="4"/>
+              <w:left w:val="single" w:color="BBBBBB" w:sz="4"/>
+              <w:bottom w:val="single" w:color="BBBBBB" w:sz="4"/>
+              <w:right w:val="single" w:color="BBBBBB" w:sz="4"/>
+            </w:tcBorders>
+            <w:tcMar>
+              <w:top w:type="dxa" w:w="60"/>
+              <w:left w:type="dxa" w:w="100"/>
+              <w:bottom w:type="dxa" w:w="60"/>
+              <w:right w:type="dxa" w:w="100"/>
+            </w:tcMar>
+          </w:tcPr>
+          <w:p>
+            <w:r>
+              <w:rPr>
+                <w:b w:val="false"/>
+                <w:bCs w:val="false"/>
+                <w:sz w:val="18"/>
+                <w:szCs w:val="18"/>
+              </w:rPr>
+              <w:t xml:space="preserve">JASTER</w:t>
+            </w:r>
+          </w:p>
+        </w:tc>
+        <w:tc>
+          <w:tcPr>
+            <w:tcW w:type="dxa" w:w="3008"/>
+            <w:tcBorders>
+              <w:top w:val="single" w:color="BBBBBB" w:sz="4"/>
+              <w:left w:val="single" w:color="BBBBBB" w:sz="4"/>
+              <w:bottom w:val="single" w:color="BBBBBB" w:sz="4"/>
+              <w:right w:val="single" w:color="BBBBBB" w:sz="4"/>
+            </w:tcBorders>
+            <w:tcMar>
+              <w:top w:type="dxa" w:w="60"/>
+              <w:left w:type="dxa" w:w="100"/>
+              <w:bottom w:type="dxa" w:w="60"/>
+              <w:right w:type="dxa" w:w="100"/>
+            </w:tcMar>
+          </w:tcPr>
+          <w:p>
+            <w:r>
+              <w:rPr>
+                <w:b w:val="false"/>
+                <w:bCs w:val="false"/>
+                <w:sz w:val="18"/>
+                <w:szCs w:val="18"/>
+              </w:rPr>
+              <w:t xml:space="preserve">ASSIN2, SICK-BR, FaQuAD, ENEM, HAREM, LeNER-Br, TweetSentBR, HateBR, Pirá, Mac-Morpho</w:t>
+            </w:r>
+          </w:p>
+        </w:tc>
+        <w:tc>
+          <w:tcPr>
+            <w:tcW w:type="dxa" w:w="3008"/>
+            <w:tcBorders>
+              <w:top w:val="single" w:color="BBBBBB" w:sz="4"/>
+              <w:left w:val="single" w:color="BBBBBB" w:sz="4"/>
+              <w:bottom w:val="single" w:color="BBBBBB" w:sz="4"/>
+              <w:right w:val="single" w:color="BBBBBB" w:sz="4"/>
+            </w:tcBorders>
+            <w:tcMar>
+              <w:top w:type="dxa" w:w="60"/>
+              <w:left w:type="dxa" w:w="100"/>
+              <w:bottom w:type="dxa" w:w="60"/>
+              <w:right w:type="dxa" w:w="100"/>
+            </w:tcMar>
+          </w:tcPr>
+          <w:p>
+            <w:r>
+              <w:rPr>
+                <w:b w:val="false"/>
+                <w:bCs w:val="false"/>
+                <w:sz w:val="18"/>
+                <w:szCs w:val="18"/>
+              </w:rPr>
+              <w:t xml:space="preserve">tarefas de PLN em formato de instrução</w:t>
+            </w:r>
+          </w:p>
+        </w:tc>
+      </w:tr>
+    </w:tbl>
+    <w:p/>
+    <w:p>
+      <w:pPr>
+        <w:spacing w:after="120"/>
+      </w:pPr>
+      <w:r>
+        <w:t xml:space="preserve">A versão v2 do LNCC tem 141.404 exemplos, com deduplicação e corte de tamanho. O template deles tem preâmbulo próprio quando há </w:t>
+      </w:r>
+      <w:r>
+        <w:rPr>
+          <w:rFonts w:ascii="Consolas" w:cs="Consolas" w:eastAsia="Consolas" w:hAnsi="Consolas"/>
+        </w:rPr>
+        <w:t xml:space="preserve">input</w:t>
+      </w:r>
+      <w:r>
+        <w:t xml:space="preserve"> e o marcador </w:t>
+      </w:r>
+      <w:r>
+        <w:rPr>
+          <w:rFonts w:ascii="Consolas" w:cs="Consolas" w:eastAsia="Consolas" w:hAnsi="Consolas"/>
+        </w:rPr>
+        <w:t xml:space="preserve">### Entrada:</w:t>
+      </w:r>
+      <w:r>
+        <w:t xml:space="preserve">, e o </w:t>
+      </w:r>
+      <w:r>
+        <w:rPr>
+          <w:rFonts w:ascii="Consolas" w:cs="Consolas" w:eastAsia="Consolas" w:hAnsi="Consolas"/>
+        </w:rPr>
+        <w:t xml:space="preserve">train_qlora.py</w:t>
+      </w:r>
+      <w:r>
+        <w:t xml:space="preserve"> deste projeto ainda ignora o campo </w:t>
+      </w:r>
+      <w:r>
+        <w:rPr>
+          <w:rFonts w:ascii="Consolas" w:cs="Consolas" w:eastAsia="Consolas" w:hAnsi="Consolas"/>
+        </w:rPr>
+        <w:t xml:space="preserve">input</w:t>
+      </w:r>
+      <w:r>
+        <w:t xml:space="preserve">. O que falta fazer:</w:t>
       </w:r>
     </w:p>
     <w:p>
@@ -9902,16 +11619,17 @@
           <w:numId w:val="2"/>
         </w:numPr>
       </w:pPr>
-      <w:hyperlink w:history="1" r:id="rIdfjlbtgz8nbx72ypdrvkmu">
-        <w:r>
-          <w:rPr>
-            <w:rStyle w:val="Hyperlink"/>
-          </w:rPr>
-          <w:t xml:space="preserve">Manacá-1B base</w:t>
-        </w:r>
-      </w:hyperlink>
-      <w:r>
-        <w:t xml:space="preserve">, modelo de partida</w:t>
+      <w:r>
+        <w:t xml:space="preserve">[ ] Rodar o </w:t>
+      </w:r>
+      <w:r>
+        <w:rPr>
+          <w:rFonts w:ascii="Consolas" w:cs="Consolas" w:eastAsia="Consolas" w:hAnsi="Consolas"/>
+        </w:rPr>
+        <w:t xml:space="preserve">sft/prepare_data.py</w:t>
+      </w:r>
+      <w:r>
+        <w:t xml:space="preserve"> do LNCC (fontes da v2) ou reproduzir os filtros dele, e gravar o resultado no formato Alpaca.</w:t>
       </w:r>
     </w:p>
     <w:p>
@@ -9922,16 +11640,44 @@
           <w:numId w:val="2"/>
         </w:numPr>
       </w:pPr>
-      <w:hyperlink w:history="1" r:id="rId2mym7y4mhdamu7dsnmwrn">
-        <w:r>
-          <w:rPr>
-            <w:rStyle w:val="Hyperlink"/>
-          </w:rPr>
-          <w:t xml:space="preserve">codeparrot/github-code-clean</w:t>
-        </w:r>
-      </w:hyperlink>
-      <w:r>
-        <w:t xml:space="preserve">, código do GitHub com licença por arquivo</w:t>
+      <w:r>
+        <w:t xml:space="preserve">[ ] Ensinar o </w:t>
+      </w:r>
+      <w:r>
+        <w:rPr>
+          <w:rFonts w:ascii="Consolas" w:cs="Consolas" w:eastAsia="Consolas" w:hAnsi="Consolas"/>
+        </w:rPr>
+        <w:t xml:space="preserve">montar_texto</w:t>
+      </w:r>
+      <w:r>
+        <w:t xml:space="preserve"> do </w:t>
+      </w:r>
+      <w:r>
+        <w:rPr>
+          <w:rFonts w:ascii="Consolas" w:cs="Consolas" w:eastAsia="Consolas" w:hAnsi="Consolas"/>
+        </w:rPr>
+        <w:t xml:space="preserve">train_qlora.py</w:t>
+      </w:r>
+      <w:r>
+        <w:t xml:space="preserve"> a usar </w:t>
+      </w:r>
+      <w:r>
+        <w:rPr>
+          <w:rFonts w:ascii="Consolas" w:cs="Consolas" w:eastAsia="Consolas" w:hAnsi="Consolas"/>
+        </w:rPr>
+        <w:t xml:space="preserve">input</w:t>
+      </w:r>
+      <w:r>
+        <w:t xml:space="preserve">, com o preâmbulo e o </w:t>
+      </w:r>
+      <w:r>
+        <w:rPr>
+          <w:rFonts w:ascii="Consolas" w:cs="Consolas" w:eastAsia="Consolas" w:hAnsi="Consolas"/>
+        </w:rPr>
+        <w:t xml:space="preserve">### Entrada:</w:t>
+      </w:r>
+      <w:r>
+        <w:t xml:space="preserve"> do LNCC, e com a mesma codificação de caixa e fronteira.</w:t>
       </w:r>
     </w:p>
     <w:p>
@@ -9942,22 +11688,8 @@
           <w:numId w:val="2"/>
         </w:numPr>
       </w:pPr>
-      <w:hyperlink w:history="1" r:id="rIdqkpfc2uly7g4wmcw336y5">
-        <w:r>
-          <w:rPr>
-            <w:rStyle w:val="Hyperlink"/>
-          </w:rPr>
-          <w:t xml:space="preserve">wikimedia/wikipedia</w:t>
-        </w:r>
-      </w:hyperlink>
-      <w:r>
-        <w:t xml:space="preserve">, dump </w:t>
-      </w:r>
-      <w:r>
-        <w:rPr>
-          <w:rFonts w:ascii="Consolas" w:cs="Consolas" w:eastAsia="Consolas" w:hAnsi="Consolas"/>
-        </w:rPr>
-        <w:t xml:space="preserve">20231101.pt</w:t>
+      <w:r>
+        <w:t xml:space="preserve">[ ] Escolher a proporção. Os 141 mil exemplos inteiros levariam dezenas de horas na 3090 (os 7.932 de FastAPI levam 2 h 30 em 3 épocas); uma amostra de 10 a 20 mil por fonte, mais os 7.932 de FastAPI, cabe em 5 a 8 horas.</w:t>
       </w:r>
     </w:p>
     <w:p>
@@ -9968,16 +11700,26 @@
           <w:numId w:val="2"/>
         </w:numPr>
       </w:pPr>
-      <w:hyperlink w:history="1" r:id="rIdit3cy628cuj6at-3lxodn">
-        <w:r>
-          <w:rPr>
-            <w:rStyle w:val="Hyperlink"/>
-          </w:rPr>
-          <w:t xml:space="preserve">FastAPI</w:t>
-        </w:r>
-      </w:hyperlink>
-      <w:r>
-        <w:t xml:space="preserve">, código e documentação em português</w:t>
+      <w:r>
+        <w:t xml:space="preserve">[ ] SFT a partir do </w:t>
+      </w:r>
+      <w:r>
+        <w:rPr>
+          <w:rFonts w:ascii="Consolas" w:cs="Consolas" w:eastAsia="Consolas" w:hAnsi="Consolas"/>
+        </w:rPr>
+        <w:t xml:space="preserve">manaca-cpt-v4</w:t>
+      </w:r>
+      <w:r>
+        <w:t xml:space="preserve">, eval no teste amplo com </w:t>
+      </w:r>
+      <w:r>
+        <w:rPr>
+          <w:rFonts w:ascii="Consolas" w:cs="Consolas" w:eastAsia="Consolas" w:hAnsi="Consolas"/>
+        </w:rPr>
+        <w:t xml:space="preserve">--base-4bit</w:t>
+      </w:r>
+      <w:r>
+        <w:t xml:space="preserve"> (tem de continuar em 1,0) e um conjunto de pedidos de conversa que não pode gerar código.</w:t>
       </w:r>
     </w:p>
     <w:p>
@@ -9989,18 +11731,31 @@
         </w:numPr>
       </w:pPr>
       <w:r>
-        <w:t xml:space="preserve">Gururangan et al., </w:t>
-      </w:r>
-      <w:hyperlink w:history="1" r:id="rIdnwiq6qktircebimzqzqwb">
-        <w:r>
-          <w:rPr>
-            <w:rStyle w:val="Hyperlink"/>
-          </w:rPr>
-          <w:t xml:space="preserve">Don't Stop Pretraining</w:t>
-        </w:r>
-      </w:hyperlink>
-      <w:r>
-        <w:t xml:space="preserve">, 2020, sobre pré-treino continuado em domínio</w:t>
+        <w:t xml:space="preserve">[ ] Licença: Alpaca-PT é CC BY-NC e XLSum é CC BY-NC-SA, por isso o instruct do LNCC é CC BY-NC 4.0. Usando a mesma receita, o modelo daqui herda essa restrição; o Instruct-Aira v3 (Apache 2.0, 50 mil conversas em português) é a alternativa sem restrição.</w:t>
+      </w:r>
+    </w:p>
+    <w:p>
+      <w:pPr>
+        <w:pStyle w:val="Heading1"/>
+      </w:pPr>
+      <w:r>
+        <w:t xml:space="preserve">Licenças</w:t>
+      </w:r>
+    </w:p>
+    <w:p>
+      <w:pPr>
+        <w:spacing w:after="120"/>
+      </w:pPr>
+      <w:r>
+        <w:t xml:space="preserve">O dataset de ajuste fino é CC0. O código do FastAPI e o código colhido do GitHub têm licenças permissivas, registradas por documento no corpus. A Wikipedia é CC BY-SA 3.0, que exige atribuição e compartilhamento pela mesma licença. Isso precisa ser resolvido antes de distribuir pesos treinados com ela. O modelo base é CC BY 4.0 e exige atribuição ao LNCC.</w:t>
+      </w:r>
+    </w:p>
+    <w:p>
+      <w:pPr>
+        <w:pStyle w:val="Heading1"/>
+      </w:pPr>
+      <w:r>
+        <w:t xml:space="preserve">Fontes</w:t>
       </w:r>
     </w:p>
     <w:p>
@@ -10011,19 +11766,16 @@
           <w:numId w:val="2"/>
         </w:numPr>
       </w:pPr>
-      <w:r>
-        <w:t xml:space="preserve">Hu et al., </w:t>
-      </w:r>
-      <w:hyperlink w:history="1" r:id="rIdz3ru1bax83og8rnkxgpow">
+      <w:hyperlink w:history="1" r:id="rId_yln1fvgxfvri_ytcntz6">
         <w:r>
           <w:rPr>
             <w:rStyle w:val="Hyperlink"/>
           </w:rPr>
-          <w:t xml:space="preserve">LoRA</w:t>
+          <w:t xml:space="preserve">Manacá-1B base</w:t>
         </w:r>
       </w:hyperlink>
       <w:r>
-        <w:t xml:space="preserve">, 2021</w:t>
+        <w:t xml:space="preserve">, modelo de partida</w:t>
       </w:r>
     </w:p>
     <w:p>
@@ -10034,19 +11786,16 @@
           <w:numId w:val="2"/>
         </w:numPr>
       </w:pPr>
-      <w:r>
-        <w:t xml:space="preserve">Dettmers et al., </w:t>
-      </w:r>
-      <w:hyperlink w:history="1" r:id="rIdbkfj8jah-uvsdljcllltl">
+      <w:hyperlink w:history="1" r:id="rIdqv8osultxxfljcgyraxaj">
         <w:r>
           <w:rPr>
             <w:rStyle w:val="Hyperlink"/>
           </w:rPr>
-          <w:t xml:space="preserve">QLoRA</w:t>
+          <w:t xml:space="preserve">codeparrot/github-code-clean</w:t>
         </w:r>
       </w:hyperlink>
       <w:r>
-        <w:t xml:space="preserve">, 2023</w:t>
+        <w:t xml:space="preserve">, código do GitHub com licença por arquivo</w:t>
       </w:r>
     </w:p>
     <w:p>
@@ -10057,10 +11806,125 @@
           <w:numId w:val="2"/>
         </w:numPr>
       </w:pPr>
+      <w:hyperlink w:history="1" r:id="rIdahatoqieswekd-y9--bvv">
+        <w:r>
+          <w:rPr>
+            <w:rStyle w:val="Hyperlink"/>
+          </w:rPr>
+          <w:t xml:space="preserve">wikimedia/wikipedia</w:t>
+        </w:r>
+      </w:hyperlink>
+      <w:r>
+        <w:t xml:space="preserve">, dump </w:t>
+      </w:r>
+      <w:r>
+        <w:rPr>
+          <w:rFonts w:ascii="Consolas" w:cs="Consolas" w:eastAsia="Consolas" w:hAnsi="Consolas"/>
+        </w:rPr>
+        <w:t xml:space="preserve">20231101.pt</w:t>
+      </w:r>
+    </w:p>
+    <w:p>
+      <w:pPr>
+        <w:pStyle w:val="ListParagraph"/>
+        <w:numPr>
+          <w:ilvl w:val="0"/>
+          <w:numId w:val="2"/>
+        </w:numPr>
+      </w:pPr>
+      <w:hyperlink w:history="1" r:id="rIdhklefgff8bs0nyvbzwn2v">
+        <w:r>
+          <w:rPr>
+            <w:rStyle w:val="Hyperlink"/>
+          </w:rPr>
+          <w:t xml:space="preserve">FastAPI</w:t>
+        </w:r>
+      </w:hyperlink>
+      <w:r>
+        <w:t xml:space="preserve">, código e documentação em português</w:t>
+      </w:r>
+    </w:p>
+    <w:p>
+      <w:pPr>
+        <w:pStyle w:val="ListParagraph"/>
+        <w:numPr>
+          <w:ilvl w:val="0"/>
+          <w:numId w:val="2"/>
+        </w:numPr>
+      </w:pPr>
+      <w:r>
+        <w:t xml:space="preserve">Gururangan et al., </w:t>
+      </w:r>
+      <w:hyperlink w:history="1" r:id="rIdvqfz_qees4dy_21wgfsog">
+        <w:r>
+          <w:rPr>
+            <w:rStyle w:val="Hyperlink"/>
+          </w:rPr>
+          <w:t xml:space="preserve">Don't Stop Pretraining</w:t>
+        </w:r>
+      </w:hyperlink>
+      <w:r>
+        <w:t xml:space="preserve">, 2020, sobre pré-treino continuado em domínio</w:t>
+      </w:r>
+    </w:p>
+    <w:p>
+      <w:pPr>
+        <w:pStyle w:val="ListParagraph"/>
+        <w:numPr>
+          <w:ilvl w:val="0"/>
+          <w:numId w:val="2"/>
+        </w:numPr>
+      </w:pPr>
+      <w:r>
+        <w:t xml:space="preserve">Hu et al., </w:t>
+      </w:r>
+      <w:hyperlink w:history="1" r:id="rIdxpldmm9b-e8bngrt9uu9w">
+        <w:r>
+          <w:rPr>
+            <w:rStyle w:val="Hyperlink"/>
+          </w:rPr>
+          <w:t xml:space="preserve">LoRA</w:t>
+        </w:r>
+      </w:hyperlink>
+      <w:r>
+        <w:t xml:space="preserve">, 2021</w:t>
+      </w:r>
+    </w:p>
+    <w:p>
+      <w:pPr>
+        <w:pStyle w:val="ListParagraph"/>
+        <w:numPr>
+          <w:ilvl w:val="0"/>
+          <w:numId w:val="2"/>
+        </w:numPr>
+      </w:pPr>
+      <w:r>
+        <w:t xml:space="preserve">Dettmers et al., </w:t>
+      </w:r>
+      <w:hyperlink w:history="1" r:id="rIdwf25v18ynge-keqfoc0gs">
+        <w:r>
+          <w:rPr>
+            <w:rStyle w:val="Hyperlink"/>
+          </w:rPr>
+          <w:t xml:space="preserve">QLoRA</w:t>
+        </w:r>
+      </w:hyperlink>
+      <w:r>
+        <w:t xml:space="preserve">, 2023</w:t>
+      </w:r>
+    </w:p>
+    <w:p>
+      <w:pPr>
+        <w:pStyle w:val="ListParagraph"/>
+        <w:numPr>
+          <w:ilvl w:val="0"/>
+          <w:numId w:val="2"/>
+        </w:numPr>
+      </w:pPr>
       <w:r>
         <w:t xml:space="preserve">Kudo e Richardson, </w:t>
       </w:r>
-      <w:hyperlink w:history="1" r:id="rIdkpygqi5jc788d497how27">
+      <w:hyperlink w:history="1" r:id="rIdbwxycwxkjhne7smgd9kz8">
         <w:r>
           <w:rPr>
             <w:rStyle w:val="Hyperlink"/>
@@ -10284,6 +12148,21 @@
   <w:style w:type="paragraph" w:styleId="Normal" w:default="1">
     <w:name w:val="Normal"/>
     <w:qFormat/>
+  </w:style>
+  <w:style w:type="table" w:styleId="TableNormal" w:default="true">
+    <w:name w:val="Normal Table"/>
+    <w:uiPriority w:val="99"/>
+    <w:semiHidden/>
+    <w:unhideWhenUsed/>
+    <w:tblPr>
+      <w:tblInd w:type="dxa" w:w="0"/>
+      <w:tblCellMar>
+        <w:top w:type="dxa" w:w="0"/>
+        <w:left w:type="dxa" w:w="108"/>
+        <w:bottom w:type="dxa" w:w="0"/>
+        <w:right w:type="dxa" w:w="108"/>
+      </w:tblCellMar>
+    </w:tblPr>
   </w:style>
   <w:style w:type="paragraph" w:styleId="Title">
     <w:name w:val="Title"/>

</xml_diff>

<commit_message>
Instruct FastAPI: mix de instrucao do LNCC no SFT, no template deles
template_alpaca junta o template legado e o do Manaca-1B-Instruct (com
### Entrada:); o adapter grava o template e eval e chats leem de la.
misturar_sft amostra por fonte o que o prepare_data.py do LNCC gera; o
train_qlora aceita varios arquivos e descarta exemplo maior que o
max_seq em vez de cortar o EOS. eval_conversa mede se pedido geral vira
FastAPI. Resultado: teste amplo compile e runs 1,0, entidade 0,978
(endereco virou Enderecamento, nome colhido do treino), conversa 18/18.
</commit_message>
<xml_diff>
--- a/docs/treino_cased.docx
+++ b/docs/treino_cased.docx
@@ -2749,7 +2749,7 @@
       <w:r>
         <w:t xml:space="preserve">O ponto de partida é o </w:t>
       </w:r>
-      <w:hyperlink w:history="1" r:id="rId9fabbknerltso8jt5e4lr">
+      <w:hyperlink w:history="1" r:id="rIdeo5bwn7i9hi0ztj9kb7bj">
         <w:r>
           <w:rPr>
             <w:rStyle w:val="Hyperlink"/>
@@ -3337,7 +3337,7 @@
             </w:tcMar>
           </w:tcPr>
           <w:p>
-            <w:hyperlink w:history="1" r:id="rIdrcc93osc5vwzbopsnecvv">
+            <w:hyperlink w:history="1" r:id="rIdtzkgo6yk7ztzksjfd08uv">
               <w:r>
                 <w:rPr>
                   <w:rStyle w:val="Hyperlink"/>
@@ -3515,7 +3515,7 @@
             </w:tcMar>
           </w:tcPr>
           <w:p>
-            <w:hyperlink w:history="1" r:id="rIdh1tm-t9ripagbjt4-aibe">
+            <w:hyperlink w:history="1" r:id="rIdfxywvfitn2snkf9v8ojyi">
               <w:r>
                 <w:rPr>
                   <w:rStyle w:val="Hyperlink"/>
@@ -3635,7 +3635,7 @@
             </w:tcMar>
           </w:tcPr>
           <w:p>
-            <w:hyperlink w:history="1" r:id="rIdp62v1uzb8jwfjum3xsi02">
+            <w:hyperlink w:history="1" r:id="rIdqtwoscoke6ybs6qz-gmhf">
               <w:r>
                 <w:rPr>
                   <w:rStyle w:val="Hyperlink"/>
@@ -7910,7 +7910,7 @@
       <w:r>
         <w:t xml:space="preserve">Para saber se o limite era do dataset ou do Manacá, o mesmo SFT (7.932 exemplos, 3 épocas, QLoRA) rodou no </w:t>
       </w:r>
-      <w:hyperlink w:history="1" r:id="rIdinhuybyotsr11kysszvyz">
+      <w:hyperlink w:history="1" r:id="rIdtnwekxcsmav2v-tklxdkc">
         <w:r>
           <w:rPr>
             <w:rStyle w:val="Hyperlink"/>
@@ -8562,7 +8562,7 @@
       <w:r>
         <w:t xml:space="preserve">O dataset e o eval estão certos: um modelo que já sabe caixa aprende a tarefa inteira só com o SFT. O limite é o pré-treino do Manacá, todo em minúsculas, que 35 milhões de tokens de CPT não corrigem. O Qwen3, por comparação, foi pré-treinado em 36 trilhões de tokens (</w:t>
       </w:r>
-      <w:hyperlink w:history="1" r:id="rIdxluypbobwd5y1athc3orr">
+      <w:hyperlink w:history="1" r:id="rIdlxd8hanxza9epbamcr3oh">
         <w:r>
           <w:rPr>
             <w:rStyle w:val="Hyperlink"/>
@@ -8607,7 +8607,7 @@
       <w:r>
         <w:t xml:space="preserve">Para manter o Manacá como base, o tokenizer v3 passou a marcar a maiúscula com uma peça própria, como em </w:t>
       </w:r>
-      <w:hyperlink w:history="1" r:id="rIdi7rotsndrymmjwwhfznct">
+      <w:hyperlink w:history="1" r:id="rIdxz16qtb6gmoj037g3cpr4">
         <w:r>
           <w:rPr>
             <w:rStyle w:val="Hyperlink"/>
@@ -8689,7 +8689,7 @@
       <w:r>
         <w:t xml:space="preserve">O v3 tem as 64.000 peças originais do Manacá (que baixam a caixa), as 43.120 peças sem espaço do v2 e os 2 marcadores, 107.122 tokens no total. O CPT partiu do CPT grande, com as linhas do embedding copiadas peça por peça, e os marcadores começaram pela média das letras maiúsculas do v2. O corpus juntou o código e a Wikipédia de antes com 65 milhões de tokens do </w:t>
       </w:r>
-      <w:hyperlink w:history="1" r:id="rIdxwp55byqnxeiz4jjh4_uj">
+      <w:hyperlink w:history="1" r:id="rId6qhfw2qwpwzacf5ekjtfe">
         <w:r>
           <w:rPr>
             <w:rStyle w:val="Hyperlink"/>
@@ -10821,7 +10821,7 @@
         <w:pStyle w:val="Heading1"/>
       </w:pPr>
       <w:r>
-        <w:t xml:space="preserve">Próximo passo: versão que conversa</w:t>
+        <w:t xml:space="preserve">Versão que conversa (instruct FastAPI)</w:t>
       </w:r>
     </w:p>
     <w:p>
@@ -10829,18 +10829,44 @@
         <w:spacing w:after="120"/>
       </w:pPr>
       <w:r>
-        <w:t xml:space="preserve">Para o modelo conversar e só gerar FastAPI quando pedirem, o SFT precisa misturar instruções gerais com os pedidos de FastAPI. A receita do Manacá-1B-Instruct está no </w:t>
-      </w:r>
-      <w:hyperlink w:history="1" r:id="rIdh0uaiqbenk-u7ru3y5lbf">
+        <w:t xml:space="preserve">O v4 respondia qualquer pedido com um arquivo FastAPI, porque o SFT só tinha esse tipo de exemplo; "oi" virava </w:t>
+      </w:r>
+      <w:r>
+        <w:rPr>
+          <w:rFonts w:ascii="Consolas" w:cs="Consolas" w:eastAsia="Consolas" w:hAnsi="Consolas"/>
+        </w:rPr>
+        <w:t xml:space="preserve">class Oi(Base)</w:t>
+      </w:r>
+      <w:r>
+        <w:t xml:space="preserve">. O instruct mistura no SFT os pedidos de FastAPI com a receita de instrução do </w:t>
+      </w:r>
+      <w:hyperlink w:history="1" r:id="rIdtgdt565sirvode7vq-moe">
         <w:r>
           <w:rPr>
             <w:rStyle w:val="Hyperlink"/>
           </w:rPr>
-          <w:t xml:space="preserve">repositório do LNCC</w:t>
+          <w:t xml:space="preserve">Manacá-1B-Instruct do LNCC</w:t>
         </w:r>
       </w:hyperlink>
       <w:r>
-        <w:t xml:space="preserve"> (</w:t>
+        <w:t xml:space="preserve">, no template deles (com acento e com </w:t>
+      </w:r>
+      <w:r>
+        <w:rPr>
+          <w:rFonts w:ascii="Consolas" w:cs="Consolas" w:eastAsia="Consolas" w:hAnsi="Consolas"/>
+        </w:rPr>
+        <w:t xml:space="preserve">### Entrada:</w:t>
+      </w:r>
+      <w:r>
+        <w:t xml:space="preserve">).</w:t>
+      </w:r>
+    </w:p>
+    <w:p>
+      <w:pPr>
+        <w:spacing w:after="120"/>
+      </w:pPr>
+      <w:r>
+        <w:t xml:space="preserve">Os dados gerais saíram do </w:t>
       </w:r>
       <w:r>
         <w:rPr>
@@ -10849,25 +10875,25 @@
         <w:t xml:space="preserve">sft/prepare_data.py</w:t>
       </w:r>
       <w:r>
-        <w:t xml:space="preserve">, </w:t>
-      </w:r>
-      <w:r>
-        <w:rPr>
-          <w:rFonts w:ascii="Consolas" w:cs="Consolas" w:eastAsia="Consolas" w:hAnsi="Consolas"/>
-        </w:rPr>
-        <w:t xml:space="preserve">sft/jaster/build_jaster.py</w:t>
-      </w:r>
-      <w:r>
-        <w:t xml:space="preserve">, </w:t>
-      </w:r>
-      <w:r>
-        <w:rPr>
-          <w:rFonts w:ascii="Consolas" w:cs="Consolas" w:eastAsia="Consolas" w:hAnsi="Consolas"/>
-        </w:rPr>
-        <w:t xml:space="preserve">docs/data/</w:t>
-      </w:r>
-      <w:r>
-        <w:t xml:space="preserve">):</w:t>
+        <w:t xml:space="preserve"> do LNCC, rodado sem mudança com as fontes da v2: Alpaca-PT, Aya (português), OASST1 (português), tradução (opus-100) e resumo (XLSum), 103.843 exemplos depois de deduplicação e corte de tamanho. As tarefas JASTER ficaram de fora. </w:t>
+      </w:r>
+      <w:r>
+        <w:rPr>
+          <w:rFonts w:ascii="Consolas" w:cs="Consolas" w:eastAsia="Consolas" w:hAnsi="Consolas"/>
+        </w:rPr>
+        <w:t xml:space="preserve">scripts/misturar_sft.py</w:t>
+      </w:r>
+      <w:r>
+        <w:t xml:space="preserve"> sorteou 12.815 deles por fonte (6.000, 3.000, os 315, 2.000 e 1.500), que entraram com os 7.932 de FastAPI. Todos cabem inteiros em 2.048 tokens. O SFT partiu do </w:t>
+      </w:r>
+      <w:r>
+        <w:rPr>
+          <w:rFonts w:ascii="Consolas" w:cs="Consolas" w:eastAsia="Consolas" w:hAnsi="Consolas"/>
+        </w:rPr>
+        <w:t xml:space="preserve">manaca-cpt-v4</w:t>
+      </w:r>
+      <w:r>
+        <w:t xml:space="preserve">, com 3 épocas, e levou 4 h 22 na RTX 3090.</w:t>
       </w:r>
     </w:p>
     <w:tbl>
@@ -10916,7 +10942,7 @@
                 <w:sz w:val="18"/>
                 <w:szCs w:val="18"/>
               </w:rPr>
-              <w:t xml:space="preserve">Fonte</w:t>
+              <w:t xml:space="preserve">Teste</w:t>
             </w:r>
           </w:p>
         </w:tc>
@@ -10945,7 +10971,7 @@
                 <w:sz w:val="18"/>
                 <w:szCs w:val="18"/>
               </w:rPr>
-              <w:t xml:space="preserve">Dataset no Hugging Face</w:t>
+              <w:t xml:space="preserve">v4 (só FastAPI)</w:t>
             </w:r>
           </w:p>
         </w:tc>
@@ -10974,7 +11000,7 @@
                 <w:sz w:val="18"/>
                 <w:szCs w:val="18"/>
               </w:rPr>
-              <w:t xml:space="preserve">Conversão</w:t>
+              <w:t xml:space="preserve">Instruct</w:t>
             </w:r>
           </w:p>
         </w:tc>
@@ -11007,7 +11033,7 @@
                 <w:sz w:val="18"/>
                 <w:szCs w:val="18"/>
               </w:rPr>
-              <w:t xml:space="preserve">Alpaca-PT</w:t>
+              <w:t xml:space="preserve">FastAPI, teste amplo: compile_rate / runs_rate</w:t>
             </w:r>
           </w:p>
         </w:tc>
@@ -11030,13 +11056,12 @@
           <w:p>
             <w:r>
               <w:rPr>
-                <w:rFonts w:ascii="Consolas" w:cs="Consolas" w:eastAsia="Consolas" w:hAnsi="Consolas"/>
-                <w:b w:val="false"/>
-                <w:bCs w:val="false"/>
-                <w:sz w:val="18"/>
-                <w:szCs w:val="18"/>
-              </w:rPr>
-              <w:t xml:space="preserve">dominguesm/alpaca-data-pt-br</w:t>
+                <w:b w:val="false"/>
+                <w:bCs w:val="false"/>
+                <w:sz w:val="18"/>
+                <w:szCs w:val="18"/>
+              </w:rPr>
+              <w:t xml:space="preserve">1,0 / 1,0</w:t>
             </w:r>
           </w:p>
         </w:tc>
@@ -11064,7 +11089,7 @@
                 <w:sz w:val="18"/>
                 <w:szCs w:val="18"/>
               </w:rPr>
-              <w:t xml:space="preserve">instruction, input, output como estão</w:t>
+              <w:t xml:space="preserve">1,0 / 1,0</w:t>
             </w:r>
           </w:p>
         </w:tc>
@@ -11097,7 +11122,7 @@
                 <w:sz w:val="18"/>
                 <w:szCs w:val="18"/>
               </w:rPr>
-              <w:t xml:space="preserve">Aya (pt)</w:t>
+              <w:t xml:space="preserve">FastAPI: entidade_rate / rotas / funcoes</w:t>
             </w:r>
           </w:p>
         </w:tc>
@@ -11120,13 +11145,12 @@
           <w:p>
             <w:r>
               <w:rPr>
-                <w:rFonts w:ascii="Consolas" w:cs="Consolas" w:eastAsia="Consolas" w:hAnsi="Consolas"/>
-                <w:b w:val="false"/>
-                <w:bCs w:val="false"/>
-                <w:sz w:val="18"/>
-                <w:szCs w:val="18"/>
-              </w:rPr>
-              <w:t xml:space="preserve">CohereForAI/aya_dataset</w:t>
+                <w:b w:val="false"/>
+                <w:bCs w:val="false"/>
+                <w:sz w:val="18"/>
+                <w:szCs w:val="18"/>
+              </w:rPr>
+              <w:t xml:space="preserve">1,0 / 1,0 / 1,0</w:t>
             </w:r>
           </w:p>
         </w:tc>
@@ -11149,41 +11173,12 @@
           <w:p>
             <w:r>
               <w:rPr>
-                <w:rFonts w:ascii="Consolas" w:cs="Consolas" w:eastAsia="Consolas" w:hAnsi="Consolas"/>
-                <w:b w:val="false"/>
-                <w:bCs w:val="false"/>
-                <w:sz w:val="18"/>
-                <w:szCs w:val="18"/>
-              </w:rPr>
-              <w:t xml:space="preserve">inputs</w:t>
-            </w:r>
-            <w:r>
-              <w:rPr>
-                <w:b w:val="false"/>
-                <w:bCs w:val="false"/>
-                <w:sz w:val="18"/>
-                <w:szCs w:val="18"/>
-              </w:rPr>
-              <w:t xml:space="preserve"> vira instrução, </w:t>
-            </w:r>
-            <w:r>
-              <w:rPr>
-                <w:rFonts w:ascii="Consolas" w:cs="Consolas" w:eastAsia="Consolas" w:hAnsi="Consolas"/>
-                <w:b w:val="false"/>
-                <w:bCs w:val="false"/>
-                <w:sz w:val="18"/>
-                <w:szCs w:val="18"/>
-              </w:rPr>
-              <w:t xml:space="preserve">targets</w:t>
-            </w:r>
-            <w:r>
-              <w:rPr>
-                <w:b w:val="false"/>
-                <w:bCs w:val="false"/>
-                <w:sz w:val="18"/>
-                <w:szCs w:val="18"/>
-              </w:rPr>
-              <w:t xml:space="preserve"> vira resposta, só idioma português</w:t>
+                <w:b w:val="false"/>
+                <w:bCs w:val="false"/>
+                <w:sz w:val="18"/>
+                <w:szCs w:val="18"/>
+              </w:rPr>
+              <w:t xml:space="preserve">0,978 / 0,978 / 0,978</w:t>
             </w:r>
           </w:p>
         </w:tc>
@@ -11216,7 +11211,7 @@
                 <w:sz w:val="18"/>
                 <w:szCs w:val="18"/>
               </w:rPr>
-              <w:t xml:space="preserve">OASST1 (pt)</w:t>
+              <w:t xml:space="preserve">Conversa (18 pedidos gerais): resposta que não vira FastAPI</w:t>
             </w:r>
           </w:p>
         </w:tc>
@@ -11239,13 +11234,22 @@
           <w:p>
             <w:r>
               <w:rPr>
+                <w:b w:val="false"/>
+                <w:bCs w:val="false"/>
+                <w:sz w:val="18"/>
+                <w:szCs w:val="18"/>
+              </w:rPr>
+              <w:t xml:space="preserve">"oi" virava </w:t>
+            </w:r>
+            <w:r>
+              <w:rPr>
                 <w:rFonts w:ascii="Consolas" w:cs="Consolas" w:eastAsia="Consolas" w:hAnsi="Consolas"/>
                 <w:b w:val="false"/>
                 <w:bCs w:val="false"/>
                 <w:sz w:val="18"/>
                 <w:szCs w:val="18"/>
               </w:rPr>
-              <w:t xml:space="preserve">OpenAssistant/oasst1</w:t>
+              <w:t xml:space="preserve">class Oi(Base)</w:t>
             </w:r>
           </w:p>
         </w:tc>
@@ -11273,294 +11277,7 @@
                 <w:sz w:val="18"/>
                 <w:szCs w:val="18"/>
               </w:rPr>
-              <w:t xml:space="preserve">pares prompter e assistant com rank 0, só português</w:t>
-            </w:r>
-          </w:p>
-        </w:tc>
-      </w:tr>
-      <w:tr>
-        <w:trPr>
-          <w:tblHeader w:val="off"/>
-        </w:trPr>
-        <w:tc>
-          <w:tcPr>
-            <w:tcW w:type="dxa" w:w="3008"/>
-            <w:tcBorders>
-              <w:top w:val="single" w:color="BBBBBB" w:sz="4"/>
-              <w:left w:val="single" w:color="BBBBBB" w:sz="4"/>
-              <w:bottom w:val="single" w:color="BBBBBB" w:sz="4"/>
-              <w:right w:val="single" w:color="BBBBBB" w:sz="4"/>
-            </w:tcBorders>
-            <w:tcMar>
-              <w:top w:type="dxa" w:w="60"/>
-              <w:left w:type="dxa" w:w="100"/>
-              <w:bottom w:type="dxa" w:w="60"/>
-              <w:right w:type="dxa" w:w="100"/>
-            </w:tcMar>
-          </w:tcPr>
-          <w:p>
-            <w:r>
-              <w:rPr>
-                <w:b w:val="false"/>
-                <w:bCs w:val="false"/>
-                <w:sz w:val="18"/>
-                <w:szCs w:val="18"/>
-              </w:rPr>
-              <w:t xml:space="preserve">Tradução</w:t>
-            </w:r>
-          </w:p>
-        </w:tc>
-        <w:tc>
-          <w:tcPr>
-            <w:tcW w:type="dxa" w:w="3008"/>
-            <w:tcBorders>
-              <w:top w:val="single" w:color="BBBBBB" w:sz="4"/>
-              <w:left w:val="single" w:color="BBBBBB" w:sz="4"/>
-              <w:bottom w:val="single" w:color="BBBBBB" w:sz="4"/>
-              <w:right w:val="single" w:color="BBBBBB" w:sz="4"/>
-            </w:tcBorders>
-            <w:tcMar>
-              <w:top w:type="dxa" w:w="60"/>
-              <w:left w:type="dxa" w:w="100"/>
-              <w:bottom w:type="dxa" w:w="60"/>
-              <w:right w:type="dxa" w:w="100"/>
-            </w:tcMar>
-          </w:tcPr>
-          <w:p>
-            <w:r>
-              <w:rPr>
-                <w:rFonts w:ascii="Consolas" w:cs="Consolas" w:eastAsia="Consolas" w:hAnsi="Consolas"/>
-                <w:b w:val="false"/>
-                <w:bCs w:val="false"/>
-                <w:sz w:val="18"/>
-                <w:szCs w:val="18"/>
-              </w:rPr>
-              <w:t xml:space="preserve">Helsinki-NLP/opus-100</w:t>
-            </w:r>
-            <w:r>
-              <w:rPr>
-                <w:b w:val="false"/>
-                <w:bCs w:val="false"/>
-                <w:sz w:val="18"/>
-                <w:szCs w:val="18"/>
-              </w:rPr>
-              <w:t xml:space="preserve">, en-pt, 20.000 primeiros</w:t>
-            </w:r>
-          </w:p>
-        </w:tc>
-        <w:tc>
-          <w:tcPr>
-            <w:tcW w:type="dxa" w:w="3008"/>
-            <w:tcBorders>
-              <w:top w:val="single" w:color="BBBBBB" w:sz="4"/>
-              <w:left w:val="single" w:color="BBBBBB" w:sz="4"/>
-              <w:bottom w:val="single" w:color="BBBBBB" w:sz="4"/>
-              <w:right w:val="single" w:color="BBBBBB" w:sz="4"/>
-            </w:tcBorders>
-            <w:tcMar>
-              <w:top w:type="dxa" w:w="60"/>
-              <w:left w:type="dxa" w:w="100"/>
-              <w:bottom w:type="dxa" w:w="60"/>
-              <w:right w:type="dxa" w:w="100"/>
-            </w:tcMar>
-          </w:tcPr>
-          <w:p>
-            <w:r>
-              <w:rPr>
-                <w:b w:val="false"/>
-                <w:bCs w:val="false"/>
-                <w:sz w:val="18"/>
-                <w:szCs w:val="18"/>
-              </w:rPr>
-              <w:t xml:space="preserve">duas instruções por par (para inglês e para português)</w:t>
-            </w:r>
-          </w:p>
-        </w:tc>
-      </w:tr>
-      <w:tr>
-        <w:trPr>
-          <w:tblHeader w:val="off"/>
-        </w:trPr>
-        <w:tc>
-          <w:tcPr>
-            <w:tcW w:type="dxa" w:w="3008"/>
-            <w:tcBorders>
-              <w:top w:val="single" w:color="BBBBBB" w:sz="4"/>
-              <w:left w:val="single" w:color="BBBBBB" w:sz="4"/>
-              <w:bottom w:val="single" w:color="BBBBBB" w:sz="4"/>
-              <w:right w:val="single" w:color="BBBBBB" w:sz="4"/>
-            </w:tcBorders>
-            <w:tcMar>
-              <w:top w:type="dxa" w:w="60"/>
-              <w:left w:type="dxa" w:w="100"/>
-              <w:bottom w:type="dxa" w:w="60"/>
-              <w:right w:type="dxa" w:w="100"/>
-            </w:tcMar>
-          </w:tcPr>
-          <w:p>
-            <w:r>
-              <w:rPr>
-                <w:b w:val="false"/>
-                <w:bCs w:val="false"/>
-                <w:sz w:val="18"/>
-                <w:szCs w:val="18"/>
-              </w:rPr>
-              <w:t xml:space="preserve">Resumo</w:t>
-            </w:r>
-          </w:p>
-        </w:tc>
-        <w:tc>
-          <w:tcPr>
-            <w:tcW w:type="dxa" w:w="3008"/>
-            <w:tcBorders>
-              <w:top w:val="single" w:color="BBBBBB" w:sz="4"/>
-              <w:left w:val="single" w:color="BBBBBB" w:sz="4"/>
-              <w:bottom w:val="single" w:color="BBBBBB" w:sz="4"/>
-              <w:right w:val="single" w:color="BBBBBB" w:sz="4"/>
-            </w:tcBorders>
-            <w:tcMar>
-              <w:top w:type="dxa" w:w="60"/>
-              <w:left w:type="dxa" w:w="100"/>
-              <w:bottom w:type="dxa" w:w="60"/>
-              <w:right w:type="dxa" w:w="100"/>
-            </w:tcMar>
-          </w:tcPr>
-          <w:p>
-            <w:r>
-              <w:rPr>
-                <w:rFonts w:ascii="Consolas" w:cs="Consolas" w:eastAsia="Consolas" w:hAnsi="Consolas"/>
-                <w:b w:val="false"/>
-                <w:bCs w:val="false"/>
-                <w:sz w:val="18"/>
-                <w:szCs w:val="18"/>
-              </w:rPr>
-              <w:t xml:space="preserve">csebuetnlp/xlsum</w:t>
-            </w:r>
-            <w:r>
-              <w:rPr>
-                <w:b w:val="false"/>
-                <w:bCs w:val="false"/>
-                <w:sz w:val="18"/>
-                <w:szCs w:val="18"/>
-              </w:rPr>
-              <w:t xml:space="preserve">, português, 10.000 primeiros</w:t>
-            </w:r>
-          </w:p>
-        </w:tc>
-        <w:tc>
-          <w:tcPr>
-            <w:tcW w:type="dxa" w:w="3008"/>
-            <w:tcBorders>
-              <w:top w:val="single" w:color="BBBBBB" w:sz="4"/>
-              <w:left w:val="single" w:color="BBBBBB" w:sz="4"/>
-              <w:bottom w:val="single" w:color="BBBBBB" w:sz="4"/>
-              <w:right w:val="single" w:color="BBBBBB" w:sz="4"/>
-            </w:tcBorders>
-            <w:tcMar>
-              <w:top w:type="dxa" w:w="60"/>
-              <w:left w:type="dxa" w:w="100"/>
-              <w:bottom w:type="dxa" w:w="60"/>
-              <w:right w:type="dxa" w:w="100"/>
-            </w:tcMar>
-          </w:tcPr>
-          <w:p>
-            <w:r>
-              <w:rPr>
-                <w:b w:val="false"/>
-                <w:bCs w:val="false"/>
-                <w:sz w:val="18"/>
-                <w:szCs w:val="18"/>
-              </w:rPr>
-              <w:t xml:space="preserve">texto no input, resumo na resposta</w:t>
-            </w:r>
-          </w:p>
-        </w:tc>
-      </w:tr>
-      <w:tr>
-        <w:trPr>
-          <w:tblHeader w:val="off"/>
-        </w:trPr>
-        <w:tc>
-          <w:tcPr>
-            <w:tcW w:type="dxa" w:w="3008"/>
-            <w:tcBorders>
-              <w:top w:val="single" w:color="BBBBBB" w:sz="4"/>
-              <w:left w:val="single" w:color="BBBBBB" w:sz="4"/>
-              <w:bottom w:val="single" w:color="BBBBBB" w:sz="4"/>
-              <w:right w:val="single" w:color="BBBBBB" w:sz="4"/>
-            </w:tcBorders>
-            <w:tcMar>
-              <w:top w:type="dxa" w:w="60"/>
-              <w:left w:type="dxa" w:w="100"/>
-              <w:bottom w:type="dxa" w:w="60"/>
-              <w:right w:type="dxa" w:w="100"/>
-            </w:tcMar>
-          </w:tcPr>
-          <w:p>
-            <w:r>
-              <w:rPr>
-                <w:b w:val="false"/>
-                <w:bCs w:val="false"/>
-                <w:sz w:val="18"/>
-                <w:szCs w:val="18"/>
-              </w:rPr>
-              <w:t xml:space="preserve">JASTER</w:t>
-            </w:r>
-          </w:p>
-        </w:tc>
-        <w:tc>
-          <w:tcPr>
-            <w:tcW w:type="dxa" w:w="3008"/>
-            <w:tcBorders>
-              <w:top w:val="single" w:color="BBBBBB" w:sz="4"/>
-              <w:left w:val="single" w:color="BBBBBB" w:sz="4"/>
-              <w:bottom w:val="single" w:color="BBBBBB" w:sz="4"/>
-              <w:right w:val="single" w:color="BBBBBB" w:sz="4"/>
-            </w:tcBorders>
-            <w:tcMar>
-              <w:top w:type="dxa" w:w="60"/>
-              <w:left w:type="dxa" w:w="100"/>
-              <w:bottom w:type="dxa" w:w="60"/>
-              <w:right w:type="dxa" w:w="100"/>
-            </w:tcMar>
-          </w:tcPr>
-          <w:p>
-            <w:r>
-              <w:rPr>
-                <w:b w:val="false"/>
-                <w:bCs w:val="false"/>
-                <w:sz w:val="18"/>
-                <w:szCs w:val="18"/>
-              </w:rPr>
-              <w:t xml:space="preserve">ASSIN2, SICK-BR, FaQuAD, ENEM, HAREM, LeNER-Br, TweetSentBR, HateBR, Pirá, Mac-Morpho</w:t>
-            </w:r>
-          </w:p>
-        </w:tc>
-        <w:tc>
-          <w:tcPr>
-            <w:tcW w:type="dxa" w:w="3008"/>
-            <w:tcBorders>
-              <w:top w:val="single" w:color="BBBBBB" w:sz="4"/>
-              <w:left w:val="single" w:color="BBBBBB" w:sz="4"/>
-              <w:bottom w:val="single" w:color="BBBBBB" w:sz="4"/>
-              <w:right w:val="single" w:color="BBBBBB" w:sz="4"/>
-            </w:tcBorders>
-            <w:tcMar>
-              <w:top w:type="dxa" w:w="60"/>
-              <w:left w:type="dxa" w:w="100"/>
-              <w:bottom w:type="dxa" w:w="60"/>
-              <w:right w:type="dxa" w:w="100"/>
-            </w:tcMar>
-          </w:tcPr>
-          <w:p>
-            <w:r>
-              <w:rPr>
-                <w:b w:val="false"/>
-                <w:bCs w:val="false"/>
-                <w:sz w:val="18"/>
-                <w:szCs w:val="18"/>
-              </w:rPr>
-              <w:t xml:space="preserve">tarefas de PLN em formato de instrução</w:t>
+              <w:t xml:space="preserve">18 de 18</w:t>
             </w:r>
           </w:p>
         </w:tc>
@@ -11572,43 +11289,83 @@
         <w:spacing w:after="120"/>
       </w:pPr>
       <w:r>
-        <w:t xml:space="preserve">A versão v2 do LNCC tem 141.404 exemplos, com deduplicação e corte de tamanho. O template deles tem preâmbulo próprio quando há </w:t>
-      </w:r>
-      <w:r>
-        <w:rPr>
-          <w:rFonts w:ascii="Consolas" w:cs="Consolas" w:eastAsia="Consolas" w:hAnsi="Consolas"/>
-        </w:rPr>
-        <w:t xml:space="preserve">input</w:t>
-      </w:r>
-      <w:r>
-        <w:t xml:space="preserve"> e o marcador </w:t>
-      </w:r>
-      <w:r>
-        <w:rPr>
-          <w:rFonts w:ascii="Consolas" w:cs="Consolas" w:eastAsia="Consolas" w:hAnsi="Consolas"/>
-        </w:rPr>
-        <w:t xml:space="preserve">### Entrada:</w:t>
-      </w:r>
-      <w:r>
-        <w:t xml:space="preserve">, e o </w:t>
-      </w:r>
-      <w:r>
-        <w:rPr>
-          <w:rFonts w:ascii="Consolas" w:cs="Consolas" w:eastAsia="Consolas" w:hAnsi="Consolas"/>
-        </w:rPr>
-        <w:t xml:space="preserve">train_qlora.py</w:t>
-      </w:r>
-      <w:r>
-        <w:t xml:space="preserve"> deste projeto ainda ignora o campo </w:t>
-      </w:r>
-      <w:r>
-        <w:rPr>
-          <w:rFonts w:ascii="Consolas" w:cs="Consolas" w:eastAsia="Consolas" w:hAnsi="Consolas"/>
-        </w:rPr>
-        <w:t xml:space="preserve">input</w:t>
-      </w:r>
-      <w:r>
-        <w:t xml:space="preserve">. O que falta fazer:</w:t>
+        <w:t xml:space="preserve">Os 4 erros de FastAPI do instruct são todos </w:t>
+      </w:r>
+      <w:r>
+        <w:rPr>
+          <w:rFonts w:ascii="Consolas" w:cs="Consolas" w:eastAsia="Consolas" w:hAnsi="Consolas"/>
+        </w:rPr>
+        <w:t xml:space="preserve">endereco</w:t>
+      </w:r>
+      <w:r>
+        <w:t xml:space="preserve"> virando </w:t>
+      </w:r>
+      <w:r>
+        <w:rPr>
+          <w:rFonts w:ascii="Consolas" w:cs="Consolas" w:eastAsia="Consolas" w:hAnsi="Consolas"/>
+        </w:rPr>
+        <w:t xml:space="preserve">Enderecamento</w:t>
+      </w:r>
+      <w:r>
+        <w:t xml:space="preserve">. </w:t>
+      </w:r>
+      <w:r>
+        <w:rPr>
+          <w:rFonts w:ascii="Consolas" w:cs="Consolas" w:eastAsia="Consolas" w:hAnsi="Consolas"/>
+        </w:rPr>
+        <w:t xml:space="preserve">enderecamento</w:t>
+      </w:r>
+      <w:r>
+        <w:t xml:space="preserve"> é um dos 2.000 nomes colhidos da Wikipédia e entrou no treino como entidade; a colheita tirava os nomes de teste exatos, mas não as palavras que começam com eles. O v4 resistiu a isso, e o instruct, que divide o treino com conversa, não. Falta recusar na colheita e no </w:t>
+      </w:r>
+      <w:r>
+        <w:rPr>
+          <w:rFonts w:ascii="Consolas" w:cs="Consolas" w:eastAsia="Consolas" w:hAnsi="Consolas"/>
+        </w:rPr>
+        <w:t xml:space="preserve">gen_dataset.py</w:t>
+      </w:r>
+      <w:r>
+        <w:t xml:space="preserve"> todo nome que comece com uma entidade de teste, e refazer o SFT.</w:t>
+      </w:r>
+    </w:p>
+    <w:p>
+      <w:pPr>
+        <w:spacing w:after="120"/>
+      </w:pPr>
+      <w:r>
+        <w:t xml:space="preserve">As respostas de conversa saem com maiúsculas certas ("Machado de Assis", "Canberra", "The cat sleeps in the sofa."), o que o Manacá original não fazia. Saudação, dicas, tradução, sentimento e mensagem de aniversário saíram razoáveis. Os defeitos são os de um modelo de 1,7 bilhão de parâmetros: repetição (a explicação da fotossíntese repete uma frase, o poema entra em loop), erros de fato ("o céu é azul porque é a cor do mar", "15 vezes 4 é 40 vezes 4") e um resumo que inventa detalhe. A geração do eval é greedy, que favorece repetição; uma penalidade de repetição no chat pode ajudar sem retreinar.</w:t>
+      </w:r>
+    </w:p>
+    <w:p>
+      <w:pPr>
+        <w:spacing w:after="120"/>
+      </w:pPr>
+      <w:r>
+        <w:t xml:space="preserve">Licença: Alpaca-PT é CC BY-NC e XLSum é CC BY-NC-SA, por isso o instruct do LNCC é CC BY-NC 4.0, e este instruct, treinado com a mesma receita, herda a restrição de uso não comercial.</w:t>
+      </w:r>
+    </w:p>
+    <w:p>
+      <w:pPr>
+        <w:pStyle w:val="Heading1"/>
+      </w:pPr>
+      <w:r>
+        <w:t xml:space="preserve">Licenças</w:t>
+      </w:r>
+    </w:p>
+    <w:p>
+      <w:pPr>
+        <w:spacing w:after="120"/>
+      </w:pPr>
+      <w:r>
+        <w:t xml:space="preserve">O dataset de ajuste fino é CC0. O código do FastAPI e o código colhido do GitHub têm licenças permissivas, registradas por documento no corpus. A Wikipedia é CC BY-SA 3.0, que exige atribuição e compartilhamento pela mesma licença. Isso precisa ser resolvido antes de distribuir pesos treinados com ela. O modelo base é CC BY 4.0 e exige atribuição ao LNCC.</w:t>
+      </w:r>
+    </w:p>
+    <w:p>
+      <w:pPr>
+        <w:pStyle w:val="Heading1"/>
+      </w:pPr>
+      <w:r>
+        <w:t xml:space="preserve">Fontes</w:t>
       </w:r>
     </w:p>
     <w:p>
@@ -11619,17 +11376,16 @@
           <w:numId w:val="2"/>
         </w:numPr>
       </w:pPr>
-      <w:r>
-        <w:t xml:space="preserve">[ ] Rodar o </w:t>
-      </w:r>
-      <w:r>
-        <w:rPr>
-          <w:rFonts w:ascii="Consolas" w:cs="Consolas" w:eastAsia="Consolas" w:hAnsi="Consolas"/>
-        </w:rPr>
-        <w:t xml:space="preserve">sft/prepare_data.py</w:t>
-      </w:r>
-      <w:r>
-        <w:t xml:space="preserve"> do LNCC (fontes da v2) ou reproduzir os filtros dele, e gravar o resultado no formato Alpaca.</w:t>
+      <w:hyperlink w:history="1" r:id="rIdtxhk3ckmmmj8nsaygt4ap">
+        <w:r>
+          <w:rPr>
+            <w:rStyle w:val="Hyperlink"/>
+          </w:rPr>
+          <w:t xml:space="preserve">Manacá-1B base</w:t>
+        </w:r>
+      </w:hyperlink>
+      <w:r>
+        <w:t xml:space="preserve">, modelo de partida</w:t>
       </w:r>
     </w:p>
     <w:p>
@@ -11640,44 +11396,16 @@
           <w:numId w:val="2"/>
         </w:numPr>
       </w:pPr>
-      <w:r>
-        <w:t xml:space="preserve">[ ] Ensinar o </w:t>
-      </w:r>
-      <w:r>
-        <w:rPr>
-          <w:rFonts w:ascii="Consolas" w:cs="Consolas" w:eastAsia="Consolas" w:hAnsi="Consolas"/>
-        </w:rPr>
-        <w:t xml:space="preserve">montar_texto</w:t>
-      </w:r>
-      <w:r>
-        <w:t xml:space="preserve"> do </w:t>
-      </w:r>
-      <w:r>
-        <w:rPr>
-          <w:rFonts w:ascii="Consolas" w:cs="Consolas" w:eastAsia="Consolas" w:hAnsi="Consolas"/>
-        </w:rPr>
-        <w:t xml:space="preserve">train_qlora.py</w:t>
-      </w:r>
-      <w:r>
-        <w:t xml:space="preserve"> a usar </w:t>
-      </w:r>
-      <w:r>
-        <w:rPr>
-          <w:rFonts w:ascii="Consolas" w:cs="Consolas" w:eastAsia="Consolas" w:hAnsi="Consolas"/>
-        </w:rPr>
-        <w:t xml:space="preserve">input</w:t>
-      </w:r>
-      <w:r>
-        <w:t xml:space="preserve">, com o preâmbulo e o </w:t>
-      </w:r>
-      <w:r>
-        <w:rPr>
-          <w:rFonts w:ascii="Consolas" w:cs="Consolas" w:eastAsia="Consolas" w:hAnsi="Consolas"/>
-        </w:rPr>
-        <w:t xml:space="preserve">### Entrada:</w:t>
-      </w:r>
-      <w:r>
-        <w:t xml:space="preserve"> do LNCC, e com a mesma codificação de caixa e fronteira.</w:t>
+      <w:hyperlink w:history="1" r:id="rIdpn9llgockckynced1po-z">
+        <w:r>
+          <w:rPr>
+            <w:rStyle w:val="Hyperlink"/>
+          </w:rPr>
+          <w:t xml:space="preserve">codeparrot/github-code-clean</w:t>
+        </w:r>
+      </w:hyperlink>
+      <w:r>
+        <w:t xml:space="preserve">, código do GitHub com licença por arquivo</w:t>
       </w:r>
     </w:p>
     <w:p>
@@ -11688,8 +11416,22 @@
           <w:numId w:val="2"/>
         </w:numPr>
       </w:pPr>
-      <w:r>
-        <w:t xml:space="preserve">[ ] Escolher a proporção. Os 141 mil exemplos inteiros levariam dezenas de horas na 3090 (os 7.932 de FastAPI levam 2 h 30 em 3 épocas); uma amostra de 10 a 20 mil por fonte, mais os 7.932 de FastAPI, cabe em 5 a 8 horas.</w:t>
+      <w:hyperlink w:history="1" r:id="rId2sctjjepqize-gxlnzkom">
+        <w:r>
+          <w:rPr>
+            <w:rStyle w:val="Hyperlink"/>
+          </w:rPr>
+          <w:t xml:space="preserve">wikimedia/wikipedia</w:t>
+        </w:r>
+      </w:hyperlink>
+      <w:r>
+        <w:t xml:space="preserve">, dump </w:t>
+      </w:r>
+      <w:r>
+        <w:rPr>
+          <w:rFonts w:ascii="Consolas" w:cs="Consolas" w:eastAsia="Consolas" w:hAnsi="Consolas"/>
+        </w:rPr>
+        <w:t xml:space="preserve">20231101.pt</w:t>
       </w:r>
     </w:p>
     <w:p>
@@ -11700,26 +11442,16 @@
           <w:numId w:val="2"/>
         </w:numPr>
       </w:pPr>
-      <w:r>
-        <w:t xml:space="preserve">[ ] SFT a partir do </w:t>
-      </w:r>
-      <w:r>
-        <w:rPr>
-          <w:rFonts w:ascii="Consolas" w:cs="Consolas" w:eastAsia="Consolas" w:hAnsi="Consolas"/>
-        </w:rPr>
-        <w:t xml:space="preserve">manaca-cpt-v4</w:t>
-      </w:r>
-      <w:r>
-        <w:t xml:space="preserve">, eval no teste amplo com </w:t>
-      </w:r>
-      <w:r>
-        <w:rPr>
-          <w:rFonts w:ascii="Consolas" w:cs="Consolas" w:eastAsia="Consolas" w:hAnsi="Consolas"/>
-        </w:rPr>
-        <w:t xml:space="preserve">--base-4bit</w:t>
-      </w:r>
-      <w:r>
-        <w:t xml:space="preserve"> (tem de continuar em 1,0) e um conjunto de pedidos de conversa que não pode gerar código.</w:t>
+      <w:hyperlink w:history="1" r:id="rIdxpz0-leedpvaivt6ie3oi">
+        <w:r>
+          <w:rPr>
+            <w:rStyle w:val="Hyperlink"/>
+          </w:rPr>
+          <w:t xml:space="preserve">FastAPI</w:t>
+        </w:r>
+      </w:hyperlink>
+      <w:r>
+        <w:t xml:space="preserve">, código e documentação em português</w:t>
       </w:r>
     </w:p>
     <w:p>
@@ -11731,31 +11463,18 @@
         </w:numPr>
       </w:pPr>
       <w:r>
-        <w:t xml:space="preserve">[ ] Licença: Alpaca-PT é CC BY-NC e XLSum é CC BY-NC-SA, por isso o instruct do LNCC é CC BY-NC 4.0. Usando a mesma receita, o modelo daqui herda essa restrição; o Instruct-Aira v3 (Apache 2.0, 50 mil conversas em português) é a alternativa sem restrição.</w:t>
-      </w:r>
-    </w:p>
-    <w:p>
-      <w:pPr>
-        <w:pStyle w:val="Heading1"/>
-      </w:pPr>
-      <w:r>
-        <w:t xml:space="preserve">Licenças</w:t>
-      </w:r>
-    </w:p>
-    <w:p>
-      <w:pPr>
-        <w:spacing w:after="120"/>
-      </w:pPr>
-      <w:r>
-        <w:t xml:space="preserve">O dataset de ajuste fino é CC0. O código do FastAPI e o código colhido do GitHub têm licenças permissivas, registradas por documento no corpus. A Wikipedia é CC BY-SA 3.0, que exige atribuição e compartilhamento pela mesma licença. Isso precisa ser resolvido antes de distribuir pesos treinados com ela. O modelo base é CC BY 4.0 e exige atribuição ao LNCC.</w:t>
-      </w:r>
-    </w:p>
-    <w:p>
-      <w:pPr>
-        <w:pStyle w:val="Heading1"/>
-      </w:pPr>
-      <w:r>
-        <w:t xml:space="preserve">Fontes</w:t>
+        <w:t xml:space="preserve">Gururangan et al., </w:t>
+      </w:r>
+      <w:hyperlink w:history="1" r:id="rIdfojehcyxmipxtqoef-jv5">
+        <w:r>
+          <w:rPr>
+            <w:rStyle w:val="Hyperlink"/>
+          </w:rPr>
+          <w:t xml:space="preserve">Don't Stop Pretraining</w:t>
+        </w:r>
+      </w:hyperlink>
+      <w:r>
+        <w:t xml:space="preserve">, 2020, sobre pré-treino continuado em domínio</w:t>
       </w:r>
     </w:p>
     <w:p>
@@ -11766,16 +11485,19 @@
           <w:numId w:val="2"/>
         </w:numPr>
       </w:pPr>
-      <w:hyperlink w:history="1" r:id="rId_yln1fvgxfvri_ytcntz6">
+      <w:r>
+        <w:t xml:space="preserve">Hu et al., </w:t>
+      </w:r>
+      <w:hyperlink w:history="1" r:id="rIdttlhtcnplev5ju_tta5he">
         <w:r>
           <w:rPr>
             <w:rStyle w:val="Hyperlink"/>
           </w:rPr>
-          <w:t xml:space="preserve">Manacá-1B base</w:t>
+          <w:t xml:space="preserve">LoRA</w:t>
         </w:r>
       </w:hyperlink>
       <w:r>
-        <w:t xml:space="preserve">, modelo de partida</w:t>
+        <w:t xml:space="preserve">, 2021</w:t>
       </w:r>
     </w:p>
     <w:p>
@@ -11786,16 +11508,19 @@
           <w:numId w:val="2"/>
         </w:numPr>
       </w:pPr>
-      <w:hyperlink w:history="1" r:id="rIdqv8osultxxfljcgyraxaj">
+      <w:r>
+        <w:t xml:space="preserve">Dettmers et al., </w:t>
+      </w:r>
+      <w:hyperlink w:history="1" r:id="rIdisxkuh3efugqwgmrrdbqn">
         <w:r>
           <w:rPr>
             <w:rStyle w:val="Hyperlink"/>
           </w:rPr>
-          <w:t xml:space="preserve">codeparrot/github-code-clean</w:t>
+          <w:t xml:space="preserve">QLoRA</w:t>
         </w:r>
       </w:hyperlink>
       <w:r>
-        <w:t xml:space="preserve">, código do GitHub com licença por arquivo</w:t>
+        <w:t xml:space="preserve">, 2023</w:t>
       </w:r>
     </w:p>
     <w:p>
@@ -11806,125 +11531,10 @@
           <w:numId w:val="2"/>
         </w:numPr>
       </w:pPr>
-      <w:hyperlink w:history="1" r:id="rIdahatoqieswekd-y9--bvv">
-        <w:r>
-          <w:rPr>
-            <w:rStyle w:val="Hyperlink"/>
-          </w:rPr>
-          <w:t xml:space="preserve">wikimedia/wikipedia</w:t>
-        </w:r>
-      </w:hyperlink>
-      <w:r>
-        <w:t xml:space="preserve">, dump </w:t>
-      </w:r>
-      <w:r>
-        <w:rPr>
-          <w:rFonts w:ascii="Consolas" w:cs="Consolas" w:eastAsia="Consolas" w:hAnsi="Consolas"/>
-        </w:rPr>
-        <w:t xml:space="preserve">20231101.pt</w:t>
-      </w:r>
-    </w:p>
-    <w:p>
-      <w:pPr>
-        <w:pStyle w:val="ListParagraph"/>
-        <w:numPr>
-          <w:ilvl w:val="0"/>
-          <w:numId w:val="2"/>
-        </w:numPr>
-      </w:pPr>
-      <w:hyperlink w:history="1" r:id="rIdhklefgff8bs0nyvbzwn2v">
-        <w:r>
-          <w:rPr>
-            <w:rStyle w:val="Hyperlink"/>
-          </w:rPr>
-          <w:t xml:space="preserve">FastAPI</w:t>
-        </w:r>
-      </w:hyperlink>
-      <w:r>
-        <w:t xml:space="preserve">, código e documentação em português</w:t>
-      </w:r>
-    </w:p>
-    <w:p>
-      <w:pPr>
-        <w:pStyle w:val="ListParagraph"/>
-        <w:numPr>
-          <w:ilvl w:val="0"/>
-          <w:numId w:val="2"/>
-        </w:numPr>
-      </w:pPr>
-      <w:r>
-        <w:t xml:space="preserve">Gururangan et al., </w:t>
-      </w:r>
-      <w:hyperlink w:history="1" r:id="rIdvqfz_qees4dy_21wgfsog">
-        <w:r>
-          <w:rPr>
-            <w:rStyle w:val="Hyperlink"/>
-          </w:rPr>
-          <w:t xml:space="preserve">Don't Stop Pretraining</w:t>
-        </w:r>
-      </w:hyperlink>
-      <w:r>
-        <w:t xml:space="preserve">, 2020, sobre pré-treino continuado em domínio</w:t>
-      </w:r>
-    </w:p>
-    <w:p>
-      <w:pPr>
-        <w:pStyle w:val="ListParagraph"/>
-        <w:numPr>
-          <w:ilvl w:val="0"/>
-          <w:numId w:val="2"/>
-        </w:numPr>
-      </w:pPr>
-      <w:r>
-        <w:t xml:space="preserve">Hu et al., </w:t>
-      </w:r>
-      <w:hyperlink w:history="1" r:id="rIdxpldmm9b-e8bngrt9uu9w">
-        <w:r>
-          <w:rPr>
-            <w:rStyle w:val="Hyperlink"/>
-          </w:rPr>
-          <w:t xml:space="preserve">LoRA</w:t>
-        </w:r>
-      </w:hyperlink>
-      <w:r>
-        <w:t xml:space="preserve">, 2021</w:t>
-      </w:r>
-    </w:p>
-    <w:p>
-      <w:pPr>
-        <w:pStyle w:val="ListParagraph"/>
-        <w:numPr>
-          <w:ilvl w:val="0"/>
-          <w:numId w:val="2"/>
-        </w:numPr>
-      </w:pPr>
-      <w:r>
-        <w:t xml:space="preserve">Dettmers et al., </w:t>
-      </w:r>
-      <w:hyperlink w:history="1" r:id="rIdwf25v18ynge-keqfoc0gs">
-        <w:r>
-          <w:rPr>
-            <w:rStyle w:val="Hyperlink"/>
-          </w:rPr>
-          <w:t xml:space="preserve">QLoRA</w:t>
-        </w:r>
-      </w:hyperlink>
-      <w:r>
-        <w:t xml:space="preserve">, 2023</w:t>
-      </w:r>
-    </w:p>
-    <w:p>
-      <w:pPr>
-        <w:pStyle w:val="ListParagraph"/>
-        <w:numPr>
-          <w:ilvl w:val="0"/>
-          <w:numId w:val="2"/>
-        </w:numPr>
-      </w:pPr>
       <w:r>
         <w:t xml:space="preserve">Kudo e Richardson, </w:t>
       </w:r>
-      <w:hyperlink w:history="1" r:id="rIdbwxycwxkjhne7smgd9kz8">
+      <w:hyperlink w:history="1" r:id="rIdc3mvkscw89ewcghzgzaya">
         <w:r>
           <w:rPr>
             <w:rStyle w:val="Hyperlink"/>

</xml_diff>

<commit_message>
Documento de entrega e chat local em um comando
docs/ENTREGA.md (e .docx) resume o resultado, como ver o modelo
funcionando, os arquivos, como gerar o GGUF, por que o Ollama nao serve,
como reproduzir o treino e as limitacoes. scripts/rodar_chat_local.sh
sobe o llama-server com o GGUF, abre o chat com o template certo e
derruba o servidor na saida. O conversor md->docx passa a ler negrito.
</commit_message>
<xml_diff>
--- a/docs/treino_cased.docx
+++ b/docs/treino_cased.docx
@@ -2749,7 +2749,7 @@
       <w:r>
         <w:t xml:space="preserve">O ponto de partida é o </w:t>
       </w:r>
-      <w:hyperlink w:history="1" r:id="rIdeo5bwn7i9hi0ztj9kb7bj">
+      <w:hyperlink w:history="1" r:id="rIdz9futtgkr-dpsfuwv9lwl">
         <w:r>
           <w:rPr>
             <w:rStyle w:val="Hyperlink"/>
@@ -3337,7 +3337,7 @@
             </w:tcMar>
           </w:tcPr>
           <w:p>
-            <w:hyperlink w:history="1" r:id="rIdtzkgo6yk7ztzksjfd08uv">
+            <w:hyperlink w:history="1" r:id="rIdt2imbw26dlvobpxgwitri">
               <w:r>
                 <w:rPr>
                   <w:rStyle w:val="Hyperlink"/>
@@ -3515,7 +3515,7 @@
             </w:tcMar>
           </w:tcPr>
           <w:p>
-            <w:hyperlink w:history="1" r:id="rIdfxywvfitn2snkf9v8ojyi">
+            <w:hyperlink w:history="1" r:id="rId7x0um7rdy4_zzsznnsbnl">
               <w:r>
                 <w:rPr>
                   <w:rStyle w:val="Hyperlink"/>
@@ -3635,7 +3635,7 @@
             </w:tcMar>
           </w:tcPr>
           <w:p>
-            <w:hyperlink w:history="1" r:id="rIdqtwoscoke6ybs6qz-gmhf">
+            <w:hyperlink w:history="1" r:id="rIdipoxjpfgy2ymk-h6lyla5">
               <w:r>
                 <w:rPr>
                   <w:rStyle w:val="Hyperlink"/>
@@ -7910,7 +7910,7 @@
       <w:r>
         <w:t xml:space="preserve">Para saber se o limite era do dataset ou do Manacá, o mesmo SFT (7.932 exemplos, 3 épocas, QLoRA) rodou no </w:t>
       </w:r>
-      <w:hyperlink w:history="1" r:id="rIdtnwekxcsmav2v-tklxdkc">
+      <w:hyperlink w:history="1" r:id="rId3xgagkhkb7qpml5ysqzec">
         <w:r>
           <w:rPr>
             <w:rStyle w:val="Hyperlink"/>
@@ -8562,7 +8562,7 @@
       <w:r>
         <w:t xml:space="preserve">O dataset e o eval estão certos: um modelo que já sabe caixa aprende a tarefa inteira só com o SFT. O limite é o pré-treino do Manacá, todo em minúsculas, que 35 milhões de tokens de CPT não corrigem. O Qwen3, por comparação, foi pré-treinado em 36 trilhões de tokens (</w:t>
       </w:r>
-      <w:hyperlink w:history="1" r:id="rIdlxd8hanxza9epbamcr3oh">
+      <w:hyperlink w:history="1" r:id="rIdkvekpzosfupbupov2eusf">
         <w:r>
           <w:rPr>
             <w:rStyle w:val="Hyperlink"/>
@@ -8607,7 +8607,7 @@
       <w:r>
         <w:t xml:space="preserve">Para manter o Manacá como base, o tokenizer v3 passou a marcar a maiúscula com uma peça própria, como em </w:t>
       </w:r>
-      <w:hyperlink w:history="1" r:id="rIdxz16qtb6gmoj037g3cpr4">
+      <w:hyperlink w:history="1" r:id="rIdvobhbyh5ll30abfivvrox">
         <w:r>
           <w:rPr>
             <w:rStyle w:val="Hyperlink"/>
@@ -8689,7 +8689,7 @@
       <w:r>
         <w:t xml:space="preserve">O v3 tem as 64.000 peças originais do Manacá (que baixam a caixa), as 43.120 peças sem espaço do v2 e os 2 marcadores, 107.122 tokens no total. O CPT partiu do CPT grande, com as linhas do embedding copiadas peça por peça, e os marcadores começaram pela média das letras maiúsculas do v2. O corpus juntou o código e a Wikipédia de antes com 65 milhões de tokens do </w:t>
       </w:r>
-      <w:hyperlink w:history="1" r:id="rId6qhfw2qwpwzacf5ekjtfe">
+      <w:hyperlink w:history="1" r:id="rIdlevoa3v0z88eox7xmaxjf">
         <w:r>
           <w:rPr>
             <w:rStyle w:val="Hyperlink"/>
@@ -10840,7 +10840,7 @@
       <w:r>
         <w:t xml:space="preserve">. O instruct mistura no SFT os pedidos de FastAPI com a receita de instrução do </w:t>
       </w:r>
-      <w:hyperlink w:history="1" r:id="rIdtgdt565sirvode7vq-moe">
+      <w:hyperlink w:history="1" r:id="rIdjthfau-mtffishqrft7u6">
         <w:r>
           <w:rPr>
             <w:rStyle w:val="Hyperlink"/>
@@ -11376,7 +11376,7 @@
           <w:numId w:val="2"/>
         </w:numPr>
       </w:pPr>
-      <w:hyperlink w:history="1" r:id="rIdtxhk3ckmmmj8nsaygt4ap">
+      <w:hyperlink w:history="1" r:id="rIdvkfcoqawaj2lsx7x0nkcm">
         <w:r>
           <w:rPr>
             <w:rStyle w:val="Hyperlink"/>
@@ -11396,7 +11396,7 @@
           <w:numId w:val="2"/>
         </w:numPr>
       </w:pPr>
-      <w:hyperlink w:history="1" r:id="rIdpn9llgockckynced1po-z">
+      <w:hyperlink w:history="1" r:id="rIdl3vdyzsvb_ednlwg_vvhr">
         <w:r>
           <w:rPr>
             <w:rStyle w:val="Hyperlink"/>
@@ -11416,7 +11416,7 @@
           <w:numId w:val="2"/>
         </w:numPr>
       </w:pPr>
-      <w:hyperlink w:history="1" r:id="rId2sctjjepqize-gxlnzkom">
+      <w:hyperlink w:history="1" r:id="rIdeqgevqj0y6nuz-h2i_6ps">
         <w:r>
           <w:rPr>
             <w:rStyle w:val="Hyperlink"/>
@@ -11442,7 +11442,7 @@
           <w:numId w:val="2"/>
         </w:numPr>
       </w:pPr>
-      <w:hyperlink w:history="1" r:id="rIdxpz0-leedpvaivt6ie3oi">
+      <w:hyperlink w:history="1" r:id="rIdu6zhre3f10hwbszlyqdyk">
         <w:r>
           <w:rPr>
             <w:rStyle w:val="Hyperlink"/>
@@ -11465,7 +11465,7 @@
       <w:r>
         <w:t xml:space="preserve">Gururangan et al., </w:t>
       </w:r>
-      <w:hyperlink w:history="1" r:id="rIdfojehcyxmipxtqoef-jv5">
+      <w:hyperlink w:history="1" r:id="rId7c2gr_wdplkvdytoznoqz">
         <w:r>
           <w:rPr>
             <w:rStyle w:val="Hyperlink"/>
@@ -11488,7 +11488,7 @@
       <w:r>
         <w:t xml:space="preserve">Hu et al., </w:t>
       </w:r>
-      <w:hyperlink w:history="1" r:id="rIdttlhtcnplev5ju_tta5he">
+      <w:hyperlink w:history="1" r:id="rIdkug2jjopelf3d3gn4tgeq">
         <w:r>
           <w:rPr>
             <w:rStyle w:val="Hyperlink"/>
@@ -11511,7 +11511,7 @@
       <w:r>
         <w:t xml:space="preserve">Dettmers et al., </w:t>
       </w:r>
-      <w:hyperlink w:history="1" r:id="rIdisxkuh3efugqwgmrrdbqn">
+      <w:hyperlink w:history="1" r:id="rId7sm9v9kgg_kejvneulrin">
         <w:r>
           <w:rPr>
             <w:rStyle w:val="Hyperlink"/>
@@ -11534,7 +11534,7 @@
       <w:r>
         <w:t xml:space="preserve">Kudo e Richardson, </w:t>
       </w:r>
-      <w:hyperlink w:history="1" r:id="rIdc3mvkscw89ewcghzgzaya">
+      <w:hyperlink w:history="1" r:id="rIdjqqexgbv59cvtddqpkj_p">
         <w:r>
           <w:rPr>
             <w:rStyle w:val="Hyperlink"/>

</xml_diff>